<commit_message>
done some changes in notes
</commit_message>
<xml_diff>
--- a/Asp.Net Core Notes.docx
+++ b/Asp.Net Core Notes.docx
@@ -7240,8 +7240,8 @@
         </w:rPr>
       </w:pPr>
       <w:r>
-        <w:object w:dxaOrig="8189" w:dyaOrig="3435">
-          <v:rect xmlns:o="urn:schemas-microsoft-com:office:office" xmlns:v="urn:schemas-microsoft-com:vml" id="rectole0000000000" style="width:409.450000pt;height:171.750000pt" o:preferrelative="t" o:ole="">
+        <w:object w:dxaOrig="8281" w:dyaOrig="3482">
+          <v:rect xmlns:o="urn:schemas-microsoft-com:office:office" xmlns:v="urn:schemas-microsoft-com:vml" id="rectole0000000000" style="width:414.050000pt;height:174.100000pt" o:preferrelative="t" o:ole="">
             <o:lock v:ext="edit"/>
             <v:imagedata xmlns:r="http://schemas.openxmlformats.org/officeDocument/2006/relationships" r:id="docRId1" o:title=""/>
           </v:rect>
@@ -7549,8 +7549,8 @@
         </w:rPr>
       </w:pPr>
       <w:r>
-        <w:object w:dxaOrig="7799" w:dyaOrig="8909">
-          <v:rect xmlns:o="urn:schemas-microsoft-com:office:office" xmlns:v="urn:schemas-microsoft-com:vml" id="rectole0000000001" style="width:389.950000pt;height:445.450000pt" o:preferrelative="t" o:ole="">
+        <w:object w:dxaOrig="7896" w:dyaOrig="9010">
+          <v:rect xmlns:o="urn:schemas-microsoft-com:office:office" xmlns:v="urn:schemas-microsoft-com:vml" id="rectole0000000001" style="width:394.800000pt;height:450.500000pt" o:preferrelative="t" o:ole="">
             <o:lock v:ext="edit"/>
             <v:imagedata xmlns:r="http://schemas.openxmlformats.org/officeDocument/2006/relationships" r:id="docRId3" o:title=""/>
           </v:rect>
@@ -7585,7 +7585,7 @@
           <w:sz w:val="20"/>
           <w:shd w:fill="auto" w:val="clear"/>
         </w:rPr>
-        <w:t xml:space="preserve">To revert we use update-database (migration name)</w:t>
+        <w:t xml:space="preserve">To revert we use update-database (migration name) if we have already run update-database command which we run just after add-migration </w:t>
       </w:r>
     </w:p>
     <w:p>

</xml_diff>

<commit_message>
Lecture :- ( File upload in asp net core mvc ) ( Completed )
</commit_message>
<xml_diff>
--- a/Asp.Net Core Notes.docx
+++ b/Asp.Net Core Notes.docx
@@ -7240,8 +7240,8 @@
         </w:rPr>
       </w:pPr>
       <w:r>
-        <w:object w:dxaOrig="8281" w:dyaOrig="3482">
-          <v:rect xmlns:o="urn:schemas-microsoft-com:office:office" xmlns:v="urn:schemas-microsoft-com:vml" id="rectole0000000000" style="width:414.050000pt;height:174.100000pt" o:preferrelative="t" o:ole="">
+        <w:object w:dxaOrig="8382" w:dyaOrig="3522">
+          <v:rect xmlns:o="urn:schemas-microsoft-com:office:office" xmlns:v="urn:schemas-microsoft-com:vml" id="rectole0000000000" style="width:419.100000pt;height:176.100000pt" o:preferrelative="t" o:ole="">
             <o:lock v:ext="edit"/>
             <v:imagedata xmlns:r="http://schemas.openxmlformats.org/officeDocument/2006/relationships" r:id="docRId1" o:title=""/>
           </v:rect>
@@ -7549,8 +7549,8 @@
         </w:rPr>
       </w:pPr>
       <w:r>
-        <w:object w:dxaOrig="7896" w:dyaOrig="9010">
-          <v:rect xmlns:o="urn:schemas-microsoft-com:office:office" xmlns:v="urn:schemas-microsoft-com:vml" id="rectole0000000001" style="width:394.800000pt;height:450.500000pt" o:preferrelative="t" o:ole="">
+        <w:object w:dxaOrig="7997" w:dyaOrig="9131">
+          <v:rect xmlns:o="urn:schemas-microsoft-com:office:office" xmlns:v="urn:schemas-microsoft-com:vml" id="rectole0000000001" style="width:399.850000pt;height:456.550000pt" o:preferrelative="t" o:ole="">
             <o:lock v:ext="edit"/>
             <v:imagedata xmlns:r="http://schemas.openxmlformats.org/officeDocument/2006/relationships" r:id="docRId3" o:title=""/>
           </v:rect>
@@ -7607,6 +7607,144 @@
       <w:pPr>
         <w:spacing w:before="0" w:after="60" w:line="240"/>
         <w:ind w:right="0" w:left="0" w:firstLine="0"/>
+        <w:jc w:val="left"/>
+        <w:rPr>
+          <w:rFonts w:ascii="Cascadia Code" w:hAnsi="Cascadia Code" w:cs="Cascadia Code" w:eastAsia="Cascadia Code"/>
+          <w:b/>
+          <w:color w:val="auto"/>
+          <w:spacing w:val="0"/>
+          <w:position w:val="0"/>
+          <w:sz w:val="20"/>
+          <w:shd w:fill="auto" w:val="clear"/>
+        </w:rPr>
+      </w:pPr>
+      <w:r>
+        <w:rPr>
+          <w:rFonts w:ascii="Cascadia Code" w:hAnsi="Cascadia Code" w:cs="Cascadia Code" w:eastAsia="Cascadia Code"/>
+          <w:b/>
+          <w:color w:val="auto"/>
+          <w:spacing w:val="0"/>
+          <w:position w:val="0"/>
+          <w:sz w:val="20"/>
+          <w:shd w:fill="auto" w:val="clear"/>
+        </w:rPr>
+        <w:t xml:space="preserve">Lecture :- ( File upload in asp net core mvc )</w:t>
+      </w:r>
+    </w:p>
+    <w:p>
+      <w:pPr>
+        <w:spacing w:before="0" w:after="60" w:line="240"/>
+        <w:ind w:right="0" w:left="0" w:firstLine="0"/>
+        <w:jc w:val="left"/>
+        <w:rPr>
+          <w:rFonts w:ascii="Cascadia Code" w:hAnsi="Cascadia Code" w:cs="Cascadia Code" w:eastAsia="Cascadia Code"/>
+          <w:b/>
+          <w:color w:val="auto"/>
+          <w:spacing w:val="0"/>
+          <w:position w:val="0"/>
+          <w:sz w:val="20"/>
+          <w:shd w:fill="auto" w:val="clear"/>
+        </w:rPr>
+      </w:pPr>
+    </w:p>
+    <w:p>
+      <w:pPr>
+        <w:numPr>
+          <w:ilvl w:val="0"/>
+          <w:numId w:val="144"/>
+        </w:numPr>
+        <w:spacing w:before="0" w:after="60" w:line="240"/>
+        <w:ind w:right="0" w:left="720" w:hanging="360"/>
+        <w:jc w:val="left"/>
+        <w:rPr>
+          <w:rFonts w:ascii="Cascadia Code" w:hAnsi="Cascadia Code" w:cs="Cascadia Code" w:eastAsia="Cascadia Code"/>
+          <w:color w:val="auto"/>
+          <w:spacing w:val="0"/>
+          <w:position w:val="0"/>
+          <w:sz w:val="20"/>
+          <w:shd w:fill="auto" w:val="clear"/>
+        </w:rPr>
+      </w:pPr>
+      <w:r>
+        <w:rPr>
+          <w:rFonts w:ascii="Cascadia Code" w:hAnsi="Cascadia Code" w:cs="Cascadia Code" w:eastAsia="Cascadia Code"/>
+          <w:color w:val="auto"/>
+          <w:spacing w:val="0"/>
+          <w:position w:val="0"/>
+          <w:sz w:val="20"/>
+          <w:shd w:fill="auto" w:val="clear"/>
+        </w:rPr>
+        <w:t xml:space="preserve">if we are taking property type as a Ifornfile , then it automatically knows that some file is going to select </w:t>
+      </w:r>
+    </w:p>
+    <w:p>
+      <w:pPr>
+        <w:numPr>
+          <w:ilvl w:val="0"/>
+          <w:numId w:val="144"/>
+        </w:numPr>
+        <w:spacing w:before="0" w:after="60" w:line="240"/>
+        <w:ind w:right="0" w:left="720" w:hanging="360"/>
+        <w:jc w:val="left"/>
+        <w:rPr>
+          <w:rFonts w:ascii="Cascadia Code" w:hAnsi="Cascadia Code" w:cs="Cascadia Code" w:eastAsia="Cascadia Code"/>
+          <w:color w:val="auto"/>
+          <w:spacing w:val="0"/>
+          <w:position w:val="0"/>
+          <w:sz w:val="20"/>
+          <w:shd w:fill="auto" w:val="clear"/>
+        </w:rPr>
+      </w:pPr>
+      <w:r>
+        <w:rPr>
+          <w:rFonts w:ascii="Cascadia Code" w:hAnsi="Cascadia Code" w:cs="Cascadia Code" w:eastAsia="Cascadia Code"/>
+          <w:color w:val="auto"/>
+          <w:spacing w:val="0"/>
+          <w:position w:val="0"/>
+          <w:sz w:val="20"/>
+          <w:shd w:fill="auto" w:val="clear"/>
+        </w:rPr>
+        <w:t xml:space="preserve">If we wanna upload that selected file in wwwroot folder too , so for that we use IHostingEnviornment</w:t>
+      </w:r>
+    </w:p>
+    <w:p>
+      <w:pPr>
+        <w:numPr>
+          <w:ilvl w:val="0"/>
+          <w:numId w:val="144"/>
+        </w:numPr>
+        <w:spacing w:before="0" w:after="60" w:line="240"/>
+        <w:ind w:right="0" w:left="720" w:hanging="360"/>
+        <w:jc w:val="left"/>
+        <w:rPr>
+          <w:rFonts w:ascii="Cascadia Code" w:hAnsi="Cascadia Code" w:cs="Cascadia Code" w:eastAsia="Cascadia Code"/>
+          <w:color w:val="auto"/>
+          <w:spacing w:val="0"/>
+          <w:position w:val="0"/>
+          <w:sz w:val="20"/>
+          <w:shd w:fill="auto" w:val="clear"/>
+        </w:rPr>
+      </w:pPr>
+      <w:r>
+        <w:rPr>
+          <w:rFonts w:ascii="Cascadia Code" w:hAnsi="Cascadia Code" w:cs="Cascadia Code" w:eastAsia="Cascadia Code"/>
+          <w:color w:val="auto"/>
+          <w:spacing w:val="0"/>
+          <w:position w:val="0"/>
+          <w:sz w:val="20"/>
+          <w:shd w:fill="auto" w:val="clear"/>
+        </w:rPr>
+        <w:t xml:space="preserve">To upload file in wwwroot folder , so for that we use this Path.Combine(_hostingenviornment.WebRootPath, "images");</w:t>
+      </w:r>
+    </w:p>
+    <w:p>
+      <w:pPr>
+        <w:numPr>
+          <w:ilvl w:val="0"/>
+          <w:numId w:val="144"/>
+        </w:numPr>
+        <w:spacing w:before="0" w:after="60" w:line="240"/>
+        <w:ind w:right="0" w:left="720" w:hanging="360"/>
         <w:jc w:val="left"/>
         <w:rPr>
           <w:rFonts w:ascii="Cascadia Code" w:hAnsi="Cascadia Code" w:cs="Cascadia Code" w:eastAsia="Cascadia Code"/>
@@ -8904,154 +9042,164 @@
       <w:lvlText w:val="•"/>
     </w:lvl>
   </w:abstractNum>
+  <w:abstractNum w:abstractNumId="300">
+    <w:lvl w:ilvl="0">
+      <w:start w:val="1"/>
+      <w:numFmt w:val="bullet"/>
+      <w:lvlText w:val="•"/>
+    </w:lvl>
+  </w:abstractNum>
   <w:num w:numId="2">
+    <w:abstractNumId w:val="300"/>
+  </w:num>
+  <w:num w:numId="5">
     <w:abstractNumId w:val="294"/>
   </w:num>
-  <w:num w:numId="5">
+  <w:num w:numId="8">
     <w:abstractNumId w:val="288"/>
   </w:num>
-  <w:num w:numId="8">
+  <w:num w:numId="10">
     <w:abstractNumId w:val="282"/>
   </w:num>
-  <w:num w:numId="10">
+  <w:num w:numId="13">
     <w:abstractNumId w:val="276"/>
   </w:num>
-  <w:num w:numId="13">
+  <w:num w:numId="19">
     <w:abstractNumId w:val="270"/>
   </w:num>
-  <w:num w:numId="19">
+  <w:num w:numId="22">
     <w:abstractNumId w:val="264"/>
   </w:num>
-  <w:num w:numId="22">
+  <w:num w:numId="25">
     <w:abstractNumId w:val="258"/>
   </w:num>
-  <w:num w:numId="25">
+  <w:num w:numId="30">
     <w:abstractNumId w:val="252"/>
   </w:num>
-  <w:num w:numId="30">
+  <w:num w:numId="33">
     <w:abstractNumId w:val="246"/>
   </w:num>
-  <w:num w:numId="33">
+  <w:num w:numId="36">
     <w:abstractNumId w:val="240"/>
   </w:num>
-  <w:num w:numId="36">
+  <w:num w:numId="39">
     <w:abstractNumId w:val="234"/>
   </w:num>
-  <w:num w:numId="39">
+  <w:num w:numId="42">
     <w:abstractNumId w:val="228"/>
   </w:num>
-  <w:num w:numId="42">
+  <w:num w:numId="46">
     <w:abstractNumId w:val="222"/>
   </w:num>
-  <w:num w:numId="46">
+  <w:num w:numId="49">
     <w:abstractNumId w:val="216"/>
   </w:num>
-  <w:num w:numId="49">
+  <w:num w:numId="52">
     <w:abstractNumId w:val="210"/>
   </w:num>
-  <w:num w:numId="52">
+  <w:num w:numId="55">
     <w:abstractNumId w:val="204"/>
   </w:num>
-  <w:num w:numId="55">
+  <w:num w:numId="57">
     <w:abstractNumId w:val="198"/>
   </w:num>
-  <w:num w:numId="57">
+  <w:num w:numId="59">
     <w:abstractNumId w:val="192"/>
   </w:num>
-  <w:num w:numId="59">
+  <w:num w:numId="62">
     <w:abstractNumId w:val="186"/>
   </w:num>
-  <w:num w:numId="62">
+  <w:num w:numId="65">
     <w:abstractNumId w:val="180"/>
   </w:num>
-  <w:num w:numId="65">
+  <w:num w:numId="68">
     <w:abstractNumId w:val="174"/>
   </w:num>
-  <w:num w:numId="68">
+  <w:num w:numId="71">
     <w:abstractNumId w:val="168"/>
   </w:num>
-  <w:num w:numId="71">
+  <w:num w:numId="74">
     <w:abstractNumId w:val="162"/>
   </w:num>
-  <w:num w:numId="74">
+  <w:num w:numId="77">
     <w:abstractNumId w:val="156"/>
   </w:num>
-  <w:num w:numId="77">
+  <w:num w:numId="80">
     <w:abstractNumId w:val="150"/>
   </w:num>
-  <w:num w:numId="80">
+  <w:num w:numId="83">
     <w:abstractNumId w:val="144"/>
   </w:num>
-  <w:num w:numId="83">
+  <w:num w:numId="86">
     <w:abstractNumId w:val="138"/>
   </w:num>
-  <w:num w:numId="86">
+  <w:num w:numId="88">
     <w:abstractNumId w:val="132"/>
   </w:num>
-  <w:num w:numId="88">
+  <w:num w:numId="91">
     <w:abstractNumId w:val="126"/>
   </w:num>
-  <w:num w:numId="91">
+  <w:num w:numId="94">
     <w:abstractNumId w:val="120"/>
   </w:num>
-  <w:num w:numId="94">
+  <w:num w:numId="97">
     <w:abstractNumId w:val="114"/>
   </w:num>
-  <w:num w:numId="97">
+  <w:num w:numId="99">
     <w:abstractNumId w:val="108"/>
   </w:num>
-  <w:num w:numId="99">
+  <w:num w:numId="101">
     <w:abstractNumId w:val="102"/>
   </w:num>
-  <w:num w:numId="101">
+  <w:num w:numId="103">
     <w:abstractNumId w:val="96"/>
   </w:num>
-  <w:num w:numId="103">
+  <w:num w:numId="106">
     <w:abstractNumId w:val="90"/>
   </w:num>
-  <w:num w:numId="106">
+  <w:num w:numId="108">
     <w:abstractNumId w:val="84"/>
   </w:num>
-  <w:num w:numId="108">
+  <w:num w:numId="110">
     <w:abstractNumId w:val="78"/>
   </w:num>
-  <w:num w:numId="110">
+  <w:num w:numId="112">
     <w:abstractNumId w:val="72"/>
   </w:num>
-  <w:num w:numId="112">
+  <w:num w:numId="115">
     <w:abstractNumId w:val="66"/>
   </w:num>
-  <w:num w:numId="115">
+  <w:num w:numId="118">
     <w:abstractNumId w:val="60"/>
   </w:num>
-  <w:num w:numId="118">
+  <w:num w:numId="121">
     <w:abstractNumId w:val="54"/>
   </w:num>
-  <w:num w:numId="121">
+  <w:num w:numId="124">
     <w:abstractNumId w:val="48"/>
   </w:num>
-  <w:num w:numId="124">
+  <w:num w:numId="127">
     <w:abstractNumId w:val="42"/>
   </w:num>
-  <w:num w:numId="127">
+  <w:num w:numId="130">
     <w:abstractNumId w:val="36"/>
   </w:num>
-  <w:num w:numId="130">
+  <w:num w:numId="133">
     <w:abstractNumId w:val="30"/>
   </w:num>
-  <w:num w:numId="133">
+  <w:num w:numId="136">
     <w:abstractNumId w:val="24"/>
   </w:num>
-  <w:num w:numId="136">
+  <w:num w:numId="138">
     <w:abstractNumId w:val="18"/>
   </w:num>
-  <w:num w:numId="138">
+  <w:num w:numId="140">
     <w:abstractNumId w:val="12"/>
   </w:num>
-  <w:num w:numId="140">
+  <w:num w:numId="142">
     <w:abstractNumId w:val="6"/>
   </w:num>
-  <w:num w:numId="142">
+  <w:num w:numId="144">
     <w:abstractNumId w:val="0"/>
   </w:num>
 </w:numbering>

</xml_diff>

<commit_message>
Upload multiple files in asp net core mvc
</commit_message>
<xml_diff>
--- a/Asp.Net Core Notes.docx
+++ b/Asp.Net Core Notes.docx
@@ -7739,22 +7739,91 @@
     </w:p>
     <w:p>
       <w:pPr>
-        <w:numPr>
-          <w:ilvl w:val="0"/>
-          <w:numId w:val="144"/>
-        </w:numPr>
-        <w:spacing w:before="0" w:after="60" w:line="240"/>
-        <w:ind w:right="0" w:left="720" w:hanging="360"/>
-        <w:jc w:val="left"/>
-        <w:rPr>
-          <w:rFonts w:ascii="Cascadia Code" w:hAnsi="Cascadia Code" w:cs="Cascadia Code" w:eastAsia="Cascadia Code"/>
-          <w:color w:val="auto"/>
-          <w:spacing w:val="0"/>
-          <w:position w:val="0"/>
-          <w:sz w:val="20"/>
-          <w:shd w:fill="auto" w:val="clear"/>
-        </w:rPr>
-      </w:pPr>
+        <w:spacing w:before="0" w:after="60" w:line="240"/>
+        <w:ind w:right="0" w:left="0" w:firstLine="0"/>
+        <w:jc w:val="left"/>
+        <w:rPr>
+          <w:rFonts w:ascii="Cascadia Code" w:hAnsi="Cascadia Code" w:cs="Cascadia Code" w:eastAsia="Cascadia Code"/>
+          <w:color w:val="auto"/>
+          <w:spacing w:val="0"/>
+          <w:position w:val="0"/>
+          <w:sz w:val="20"/>
+          <w:shd w:fill="auto" w:val="clear"/>
+        </w:rPr>
+      </w:pPr>
+    </w:p>
+    <w:p>
+      <w:pPr>
+        <w:spacing w:before="0" w:after="60" w:line="240"/>
+        <w:ind w:right="0" w:left="0" w:firstLine="0"/>
+        <w:jc w:val="left"/>
+        <w:rPr>
+          <w:rFonts w:ascii="Cascadia Code" w:hAnsi="Cascadia Code" w:cs="Cascadia Code" w:eastAsia="Cascadia Code"/>
+          <w:color w:val="auto"/>
+          <w:spacing w:val="0"/>
+          <w:position w:val="0"/>
+          <w:sz w:val="20"/>
+          <w:shd w:fill="auto" w:val="clear"/>
+        </w:rPr>
+      </w:pPr>
+    </w:p>
+    <w:p>
+      <w:pPr>
+        <w:spacing w:before="0" w:after="60" w:line="240"/>
+        <w:ind w:right="0" w:left="0" w:firstLine="0"/>
+        <w:jc w:val="left"/>
+        <w:rPr>
+          <w:rFonts w:ascii="Cascadia Code" w:hAnsi="Cascadia Code" w:cs="Cascadia Code" w:eastAsia="Cascadia Code"/>
+          <w:b/>
+          <w:color w:val="auto"/>
+          <w:spacing w:val="0"/>
+          <w:position w:val="0"/>
+          <w:sz w:val="20"/>
+          <w:shd w:fill="auto" w:val="clear"/>
+        </w:rPr>
+      </w:pPr>
+      <w:r>
+        <w:rPr>
+          <w:rFonts w:ascii="Cascadia Code" w:hAnsi="Cascadia Code" w:cs="Cascadia Code" w:eastAsia="Cascadia Code"/>
+          <w:b/>
+          <w:color w:val="auto"/>
+          <w:spacing w:val="0"/>
+          <w:position w:val="0"/>
+          <w:sz w:val="20"/>
+          <w:shd w:fill="auto" w:val="clear"/>
+        </w:rPr>
+        <w:t xml:space="preserve">Lecture :- ( Upload multiple files in asp net core mvc )</w:t>
+      </w:r>
+    </w:p>
+    <w:p>
+      <w:pPr>
+        <w:numPr>
+          <w:ilvl w:val="0"/>
+          <w:numId w:val="146"/>
+        </w:numPr>
+        <w:spacing w:before="0" w:after="60" w:line="240"/>
+        <w:ind w:right="0" w:left="720" w:hanging="360"/>
+        <w:jc w:val="left"/>
+        <w:rPr>
+          <w:rFonts w:ascii="Cascadia Code" w:hAnsi="Cascadia Code" w:cs="Cascadia Code" w:eastAsia="Cascadia Code"/>
+          <w:color w:val="auto"/>
+          <w:spacing w:val="0"/>
+          <w:position w:val="0"/>
+          <w:sz w:val="20"/>
+          <w:shd w:fill="auto" w:val="clear"/>
+        </w:rPr>
+      </w:pPr>
+      <w:r>
+        <w:rPr>
+          <w:rFonts w:ascii="Cascadia Code" w:hAnsi="Cascadia Code" w:cs="Cascadia Code" w:eastAsia="Cascadia Code"/>
+          <w:color w:val="auto"/>
+          <w:spacing w:val="0"/>
+          <w:position w:val="0"/>
+          <w:sz w:val="20"/>
+          <w:shd w:fill="auto" w:val="clear"/>
+        </w:rPr>
+        <w:t xml:space="preserve">To select multiple files , for that we use multiple attribute </w:t>
+      </w:r>
     </w:p>
     <w:p>
       <w:pPr>
@@ -9049,157 +9118,167 @@
       <w:lvlText w:val="•"/>
     </w:lvl>
   </w:abstractNum>
+  <w:abstractNum w:abstractNumId="306">
+    <w:lvl w:ilvl="0">
+      <w:start w:val="1"/>
+      <w:numFmt w:val="bullet"/>
+      <w:lvlText w:val="•"/>
+    </w:lvl>
+  </w:abstractNum>
   <w:num w:numId="2">
+    <w:abstractNumId w:val="306"/>
+  </w:num>
+  <w:num w:numId="5">
     <w:abstractNumId w:val="300"/>
   </w:num>
-  <w:num w:numId="5">
+  <w:num w:numId="8">
     <w:abstractNumId w:val="294"/>
   </w:num>
-  <w:num w:numId="8">
+  <w:num w:numId="10">
     <w:abstractNumId w:val="288"/>
   </w:num>
-  <w:num w:numId="10">
+  <w:num w:numId="13">
     <w:abstractNumId w:val="282"/>
   </w:num>
-  <w:num w:numId="13">
+  <w:num w:numId="19">
     <w:abstractNumId w:val="276"/>
   </w:num>
-  <w:num w:numId="19">
+  <w:num w:numId="22">
     <w:abstractNumId w:val="270"/>
   </w:num>
-  <w:num w:numId="22">
+  <w:num w:numId="25">
     <w:abstractNumId w:val="264"/>
   </w:num>
-  <w:num w:numId="25">
+  <w:num w:numId="30">
     <w:abstractNumId w:val="258"/>
   </w:num>
-  <w:num w:numId="30">
+  <w:num w:numId="33">
     <w:abstractNumId w:val="252"/>
   </w:num>
-  <w:num w:numId="33">
+  <w:num w:numId="36">
     <w:abstractNumId w:val="246"/>
   </w:num>
-  <w:num w:numId="36">
+  <w:num w:numId="39">
     <w:abstractNumId w:val="240"/>
   </w:num>
-  <w:num w:numId="39">
+  <w:num w:numId="42">
     <w:abstractNumId w:val="234"/>
   </w:num>
-  <w:num w:numId="42">
+  <w:num w:numId="46">
     <w:abstractNumId w:val="228"/>
   </w:num>
-  <w:num w:numId="46">
+  <w:num w:numId="49">
     <w:abstractNumId w:val="222"/>
   </w:num>
-  <w:num w:numId="49">
+  <w:num w:numId="52">
     <w:abstractNumId w:val="216"/>
   </w:num>
-  <w:num w:numId="52">
+  <w:num w:numId="55">
     <w:abstractNumId w:val="210"/>
   </w:num>
-  <w:num w:numId="55">
+  <w:num w:numId="57">
     <w:abstractNumId w:val="204"/>
   </w:num>
-  <w:num w:numId="57">
+  <w:num w:numId="59">
     <w:abstractNumId w:val="198"/>
   </w:num>
-  <w:num w:numId="59">
+  <w:num w:numId="62">
     <w:abstractNumId w:val="192"/>
   </w:num>
-  <w:num w:numId="62">
+  <w:num w:numId="65">
     <w:abstractNumId w:val="186"/>
   </w:num>
-  <w:num w:numId="65">
+  <w:num w:numId="68">
     <w:abstractNumId w:val="180"/>
   </w:num>
-  <w:num w:numId="68">
+  <w:num w:numId="71">
     <w:abstractNumId w:val="174"/>
   </w:num>
-  <w:num w:numId="71">
+  <w:num w:numId="74">
     <w:abstractNumId w:val="168"/>
   </w:num>
-  <w:num w:numId="74">
+  <w:num w:numId="77">
     <w:abstractNumId w:val="162"/>
   </w:num>
-  <w:num w:numId="77">
+  <w:num w:numId="80">
     <w:abstractNumId w:val="156"/>
   </w:num>
-  <w:num w:numId="80">
+  <w:num w:numId="83">
     <w:abstractNumId w:val="150"/>
   </w:num>
-  <w:num w:numId="83">
+  <w:num w:numId="86">
     <w:abstractNumId w:val="144"/>
   </w:num>
-  <w:num w:numId="86">
+  <w:num w:numId="88">
     <w:abstractNumId w:val="138"/>
   </w:num>
-  <w:num w:numId="88">
+  <w:num w:numId="91">
     <w:abstractNumId w:val="132"/>
   </w:num>
-  <w:num w:numId="91">
+  <w:num w:numId="94">
     <w:abstractNumId w:val="126"/>
   </w:num>
-  <w:num w:numId="94">
+  <w:num w:numId="97">
     <w:abstractNumId w:val="120"/>
   </w:num>
-  <w:num w:numId="97">
+  <w:num w:numId="99">
     <w:abstractNumId w:val="114"/>
   </w:num>
-  <w:num w:numId="99">
+  <w:num w:numId="101">
     <w:abstractNumId w:val="108"/>
   </w:num>
-  <w:num w:numId="101">
+  <w:num w:numId="103">
     <w:abstractNumId w:val="102"/>
   </w:num>
-  <w:num w:numId="103">
+  <w:num w:numId="106">
     <w:abstractNumId w:val="96"/>
   </w:num>
-  <w:num w:numId="106">
+  <w:num w:numId="108">
     <w:abstractNumId w:val="90"/>
   </w:num>
-  <w:num w:numId="108">
+  <w:num w:numId="110">
     <w:abstractNumId w:val="84"/>
   </w:num>
-  <w:num w:numId="110">
+  <w:num w:numId="112">
     <w:abstractNumId w:val="78"/>
   </w:num>
-  <w:num w:numId="112">
+  <w:num w:numId="115">
     <w:abstractNumId w:val="72"/>
   </w:num>
-  <w:num w:numId="115">
+  <w:num w:numId="118">
     <w:abstractNumId w:val="66"/>
   </w:num>
-  <w:num w:numId="118">
+  <w:num w:numId="121">
     <w:abstractNumId w:val="60"/>
   </w:num>
-  <w:num w:numId="121">
+  <w:num w:numId="124">
     <w:abstractNumId w:val="54"/>
   </w:num>
-  <w:num w:numId="124">
+  <w:num w:numId="127">
     <w:abstractNumId w:val="48"/>
   </w:num>
-  <w:num w:numId="127">
+  <w:num w:numId="130">
     <w:abstractNumId w:val="42"/>
   </w:num>
-  <w:num w:numId="130">
+  <w:num w:numId="133">
     <w:abstractNumId w:val="36"/>
   </w:num>
-  <w:num w:numId="133">
+  <w:num w:numId="136">
     <w:abstractNumId w:val="30"/>
   </w:num>
-  <w:num w:numId="136">
+  <w:num w:numId="138">
     <w:abstractNumId w:val="24"/>
   </w:num>
-  <w:num w:numId="138">
+  <w:num w:numId="140">
     <w:abstractNumId w:val="18"/>
   </w:num>
-  <w:num w:numId="140">
+  <w:num w:numId="142">
     <w:abstractNumId w:val="12"/>
   </w:num>
-  <w:num w:numId="142">
+  <w:num w:numId="144">
     <w:abstractNumId w:val="6"/>
   </w:num>
-  <w:num w:numId="144">
+  <w:num w:numId="146">
     <w:abstractNumId w:val="0"/>
   </w:num>
 </w:numbering>

</xml_diff>

<commit_message>
Edit view in asp net core mvc
</commit_message>
<xml_diff>
--- a/Asp.Net Core Notes.docx
+++ b/Asp.Net Core Notes.docx
@@ -7240,8 +7240,8 @@
         </w:rPr>
       </w:pPr>
       <w:r>
-        <w:object w:dxaOrig="8382" w:dyaOrig="3522">
-          <v:rect xmlns:o="urn:schemas-microsoft-com:office:office" xmlns:v="urn:schemas-microsoft-com:vml" id="rectole0000000000" style="width:419.100000pt;height:176.100000pt" o:preferrelative="t" o:ole="">
+        <w:object w:dxaOrig="8483" w:dyaOrig="3563">
+          <v:rect xmlns:o="urn:schemas-microsoft-com:office:office" xmlns:v="urn:schemas-microsoft-com:vml" id="rectole0000000000" style="width:424.150000pt;height:178.150000pt" o:preferrelative="t" o:ole="">
             <o:lock v:ext="edit"/>
             <v:imagedata xmlns:r="http://schemas.openxmlformats.org/officeDocument/2006/relationships" r:id="docRId1" o:title=""/>
           </v:rect>
@@ -7549,8 +7549,8 @@
         </w:rPr>
       </w:pPr>
       <w:r>
-        <w:object w:dxaOrig="7997" w:dyaOrig="9131">
-          <v:rect xmlns:o="urn:schemas-microsoft-com:office:office" xmlns:v="urn:schemas-microsoft-com:vml" id="rectole0000000001" style="width:399.850000pt;height:456.550000pt" o:preferrelative="t" o:ole="">
+        <w:object w:dxaOrig="8099" w:dyaOrig="9252">
+          <v:rect xmlns:o="urn:schemas-microsoft-com:office:office" xmlns:v="urn:schemas-microsoft-com:vml" id="rectole0000000001" style="width:404.950000pt;height:462.600000pt" o:preferrelative="t" o:ole="">
             <o:lock v:ext="edit"/>
             <v:imagedata xmlns:r="http://schemas.openxmlformats.org/officeDocument/2006/relationships" r:id="docRId3" o:title=""/>
           </v:rect>

</xml_diff>

<commit_message>
Handling 404 not found in asp net core mvc
</commit_message>
<xml_diff>
--- a/Asp.Net Core Notes.docx
+++ b/Asp.Net Core Notes.docx
@@ -7240,8 +7240,8 @@
         </w:rPr>
       </w:pPr>
       <w:r>
-        <w:object w:dxaOrig="8483" w:dyaOrig="3563">
-          <v:rect xmlns:o="urn:schemas-microsoft-com:office:office" xmlns:v="urn:schemas-microsoft-com:vml" id="rectole0000000000" style="width:424.150000pt;height:178.150000pt" o:preferrelative="t" o:ole="">
+        <w:object w:dxaOrig="8585" w:dyaOrig="3603">
+          <v:rect xmlns:o="urn:schemas-microsoft-com:office:office" xmlns:v="urn:schemas-microsoft-com:vml" id="rectole0000000000" style="width:429.250000pt;height:180.150000pt" o:preferrelative="t" o:ole="">
             <o:lock v:ext="edit"/>
             <v:imagedata xmlns:r="http://schemas.openxmlformats.org/officeDocument/2006/relationships" r:id="docRId1" o:title=""/>
           </v:rect>
@@ -7549,8 +7549,8 @@
         </w:rPr>
       </w:pPr>
       <w:r>
-        <w:object w:dxaOrig="8099" w:dyaOrig="9252">
-          <v:rect xmlns:o="urn:schemas-microsoft-com:office:office" xmlns:v="urn:schemas-microsoft-com:vml" id="rectole0000000001" style="width:404.950000pt;height:462.600000pt" o:preferrelative="t" o:ole="">
+        <w:object w:dxaOrig="8200" w:dyaOrig="9374">
+          <v:rect xmlns:o="urn:schemas-microsoft-com:office:office" xmlns:v="urn:schemas-microsoft-com:vml" id="rectole0000000001" style="width:410.000000pt;height:468.700000pt" o:preferrelative="t" o:ole="">
             <o:lock v:ext="edit"/>
             <v:imagedata xmlns:r="http://schemas.openxmlformats.org/officeDocument/2006/relationships" r:id="docRId3" o:title=""/>
           </v:rect>
@@ -7824,6 +7824,184 @@
         </w:rPr>
         <w:t xml:space="preserve">To select multiple files , for that we use multiple attribute </w:t>
       </w:r>
+    </w:p>
+    <w:p>
+      <w:pPr>
+        <w:spacing w:before="0" w:after="60" w:line="240"/>
+        <w:ind w:right="0" w:left="0" w:firstLine="0"/>
+        <w:jc w:val="left"/>
+        <w:rPr>
+          <w:rFonts w:ascii="Cascadia Code" w:hAnsi="Cascadia Code" w:cs="Cascadia Code" w:eastAsia="Cascadia Code"/>
+          <w:color w:val="auto"/>
+          <w:spacing w:val="0"/>
+          <w:position w:val="0"/>
+          <w:sz w:val="20"/>
+          <w:shd w:fill="auto" w:val="clear"/>
+        </w:rPr>
+      </w:pPr>
+    </w:p>
+    <w:p>
+      <w:pPr>
+        <w:spacing w:before="0" w:after="60" w:line="240"/>
+        <w:ind w:right="0" w:left="0" w:firstLine="0"/>
+        <w:jc w:val="left"/>
+        <w:rPr>
+          <w:rFonts w:ascii="Cascadia Code" w:hAnsi="Cascadia Code" w:cs="Cascadia Code" w:eastAsia="Cascadia Code"/>
+          <w:color w:val="auto"/>
+          <w:spacing w:val="0"/>
+          <w:position w:val="0"/>
+          <w:sz w:val="20"/>
+          <w:shd w:fill="auto" w:val="clear"/>
+        </w:rPr>
+      </w:pPr>
+    </w:p>
+    <w:p>
+      <w:pPr>
+        <w:spacing w:before="0" w:after="60" w:line="240"/>
+        <w:ind w:right="0" w:left="0" w:firstLine="0"/>
+        <w:jc w:val="left"/>
+        <w:rPr>
+          <w:rFonts w:ascii="Cascadia Code" w:hAnsi="Cascadia Code" w:cs="Cascadia Code" w:eastAsia="Cascadia Code"/>
+          <w:b/>
+          <w:color w:val="auto"/>
+          <w:spacing w:val="0"/>
+          <w:position w:val="0"/>
+          <w:sz w:val="20"/>
+          <w:shd w:fill="auto" w:val="clear"/>
+        </w:rPr>
+      </w:pPr>
+      <w:r>
+        <w:rPr>
+          <w:rFonts w:ascii="Cascadia Code" w:hAnsi="Cascadia Code" w:cs="Cascadia Code" w:eastAsia="Cascadia Code"/>
+          <w:b/>
+          <w:color w:val="auto"/>
+          <w:spacing w:val="0"/>
+          <w:position w:val="0"/>
+          <w:sz w:val="20"/>
+          <w:shd w:fill="auto" w:val="clear"/>
+        </w:rPr>
+        <w:t xml:space="preserve">Lecture :- ( Handling 404 not found in asp net core mvc )</w:t>
+      </w:r>
+    </w:p>
+    <w:p>
+      <w:pPr>
+        <w:numPr>
+          <w:ilvl w:val="0"/>
+          <w:numId w:val="148"/>
+        </w:numPr>
+        <w:spacing w:before="0" w:after="60" w:line="240"/>
+        <w:ind w:right="0" w:left="720" w:hanging="360"/>
+        <w:jc w:val="left"/>
+        <w:rPr>
+          <w:rFonts w:ascii="Cascadia Code" w:hAnsi="Cascadia Code" w:cs="Cascadia Code" w:eastAsia="Cascadia Code"/>
+          <w:color w:val="auto"/>
+          <w:spacing w:val="0"/>
+          <w:position w:val="0"/>
+          <w:sz w:val="20"/>
+          <w:shd w:fill="auto" w:val="clear"/>
+        </w:rPr>
+      </w:pPr>
+      <w:r>
+        <w:rPr>
+          <w:rFonts w:ascii="Cascadia Code" w:hAnsi="Cascadia Code" w:cs="Cascadia Code" w:eastAsia="Cascadia Code"/>
+          <w:color w:val="auto"/>
+          <w:spacing w:val="0"/>
+          <w:position w:val="0"/>
+          <w:sz w:val="20"/>
+          <w:shd w:fill="auto" w:val="clear"/>
+        </w:rPr>
+        <w:t xml:space="preserve">There are 2 type of 404 errors :-</w:t>
+      </w:r>
+    </w:p>
+    <w:p>
+      <w:pPr>
+        <w:numPr>
+          <w:ilvl w:val="0"/>
+          <w:numId w:val="149"/>
+        </w:numPr>
+        <w:spacing w:before="0" w:after="60" w:line="240"/>
+        <w:ind w:right="0" w:left="1080" w:hanging="360"/>
+        <w:jc w:val="left"/>
+        <w:rPr>
+          <w:rFonts w:ascii="Cascadia Code" w:hAnsi="Cascadia Code" w:cs="Cascadia Code" w:eastAsia="Cascadia Code"/>
+          <w:color w:val="auto"/>
+          <w:spacing w:val="0"/>
+          <w:position w:val="0"/>
+          <w:sz w:val="20"/>
+          <w:shd w:fill="auto" w:val="clear"/>
+        </w:rPr>
+      </w:pPr>
+      <w:r>
+        <w:rPr>
+          <w:rFonts w:ascii="Cascadia Code" w:hAnsi="Cascadia Code" w:cs="Cascadia Code" w:eastAsia="Cascadia Code"/>
+          <w:color w:val="auto"/>
+          <w:spacing w:val="0"/>
+          <w:position w:val="0"/>
+          <w:sz w:val="20"/>
+          <w:shd w:fill="auto" w:val="clear"/>
+        </w:rPr>
+        <w:t xml:space="preserve">Resource with the specified id does not exist</w:t>
+      </w:r>
+    </w:p>
+    <w:p>
+      <w:pPr>
+        <w:numPr>
+          <w:ilvl w:val="0"/>
+          <w:numId w:val="149"/>
+        </w:numPr>
+        <w:spacing w:before="0" w:after="60" w:line="240"/>
+        <w:ind w:right="0" w:left="1080" w:hanging="360"/>
+        <w:jc w:val="left"/>
+        <w:rPr>
+          <w:rFonts w:ascii="Cascadia Code" w:hAnsi="Cascadia Code" w:cs="Cascadia Code" w:eastAsia="Cascadia Code"/>
+          <w:color w:val="auto"/>
+          <w:spacing w:val="0"/>
+          <w:position w:val="0"/>
+          <w:sz w:val="20"/>
+          <w:shd w:fill="auto" w:val="clear"/>
+        </w:rPr>
+      </w:pPr>
+      <w:r>
+        <w:rPr>
+          <w:rFonts w:ascii="Cascadia Code" w:hAnsi="Cascadia Code" w:cs="Cascadia Code" w:eastAsia="Cascadia Code"/>
+          <w:color w:val="auto"/>
+          <w:spacing w:val="0"/>
+          <w:position w:val="0"/>
+          <w:sz w:val="20"/>
+          <w:shd w:fill="auto" w:val="clear"/>
+        </w:rPr>
+        <w:t xml:space="preserve">The url that does not match with any route</w:t>
+      </w:r>
+    </w:p>
+    <w:p>
+      <w:pPr>
+        <w:spacing w:before="0" w:after="60" w:line="240"/>
+        <w:ind w:right="0" w:left="0" w:firstLine="0"/>
+        <w:jc w:val="left"/>
+        <w:rPr>
+          <w:rFonts w:ascii="Cascadia Code" w:hAnsi="Cascadia Code" w:cs="Cascadia Code" w:eastAsia="Cascadia Code"/>
+          <w:color w:val="auto"/>
+          <w:spacing w:val="0"/>
+          <w:position w:val="0"/>
+          <w:sz w:val="20"/>
+          <w:shd w:fill="auto" w:val="clear"/>
+        </w:rPr>
+      </w:pPr>
+    </w:p>
+    <w:p>
+      <w:pPr>
+        <w:spacing w:before="0" w:after="60" w:line="240"/>
+        <w:ind w:right="0" w:left="0" w:firstLine="0"/>
+        <w:jc w:val="left"/>
+        <w:rPr>
+          <w:rFonts w:ascii="Cascadia Code" w:hAnsi="Cascadia Code" w:cs="Cascadia Code" w:eastAsia="Cascadia Code"/>
+          <w:color w:val="auto"/>
+          <w:spacing w:val="0"/>
+          <w:position w:val="0"/>
+          <w:sz w:val="20"/>
+          <w:shd w:fill="auto" w:val="clear"/>
+        </w:rPr>
+      </w:pPr>
     </w:p>
     <w:p>
       <w:pPr>
@@ -9125,161 +9303,181 @@
       <w:lvlText w:val="•"/>
     </w:lvl>
   </w:abstractNum>
+  <w:abstractNum w:abstractNumId="312">
+    <w:lvl w:ilvl="0">
+      <w:start w:val="1"/>
+      <w:numFmt w:val="bullet"/>
+      <w:lvlText w:val="•"/>
+    </w:lvl>
+  </w:abstractNum>
+  <w:abstractNum w:abstractNumId="1">
+    <w:lvl w:ilvl="0">
+      <w:start w:val="1"/>
+      <w:numFmt w:val="decimal"/>
+      <w:lvlText w:val="%1."/>
+    </w:lvl>
+  </w:abstractNum>
   <w:num w:numId="2">
+    <w:abstractNumId w:val="312"/>
+  </w:num>
+  <w:num w:numId="5">
     <w:abstractNumId w:val="306"/>
   </w:num>
-  <w:num w:numId="5">
+  <w:num w:numId="8">
     <w:abstractNumId w:val="300"/>
   </w:num>
-  <w:num w:numId="8">
+  <w:num w:numId="10">
     <w:abstractNumId w:val="294"/>
   </w:num>
-  <w:num w:numId="10">
+  <w:num w:numId="13">
     <w:abstractNumId w:val="288"/>
   </w:num>
-  <w:num w:numId="13">
+  <w:num w:numId="19">
     <w:abstractNumId w:val="282"/>
   </w:num>
-  <w:num w:numId="19">
+  <w:num w:numId="22">
     <w:abstractNumId w:val="276"/>
   </w:num>
-  <w:num w:numId="22">
+  <w:num w:numId="25">
     <w:abstractNumId w:val="270"/>
   </w:num>
-  <w:num w:numId="25">
+  <w:num w:numId="30">
     <w:abstractNumId w:val="264"/>
   </w:num>
-  <w:num w:numId="30">
+  <w:num w:numId="33">
     <w:abstractNumId w:val="258"/>
   </w:num>
-  <w:num w:numId="33">
+  <w:num w:numId="36">
     <w:abstractNumId w:val="252"/>
   </w:num>
-  <w:num w:numId="36">
+  <w:num w:numId="39">
     <w:abstractNumId w:val="246"/>
   </w:num>
-  <w:num w:numId="39">
+  <w:num w:numId="42">
     <w:abstractNumId w:val="240"/>
   </w:num>
-  <w:num w:numId="42">
+  <w:num w:numId="46">
     <w:abstractNumId w:val="234"/>
   </w:num>
-  <w:num w:numId="46">
+  <w:num w:numId="49">
     <w:abstractNumId w:val="228"/>
   </w:num>
-  <w:num w:numId="49">
+  <w:num w:numId="52">
     <w:abstractNumId w:val="222"/>
   </w:num>
-  <w:num w:numId="52">
+  <w:num w:numId="55">
     <w:abstractNumId w:val="216"/>
   </w:num>
-  <w:num w:numId="55">
+  <w:num w:numId="57">
     <w:abstractNumId w:val="210"/>
   </w:num>
-  <w:num w:numId="57">
+  <w:num w:numId="59">
     <w:abstractNumId w:val="204"/>
   </w:num>
-  <w:num w:numId="59">
+  <w:num w:numId="62">
     <w:abstractNumId w:val="198"/>
   </w:num>
-  <w:num w:numId="62">
+  <w:num w:numId="65">
     <w:abstractNumId w:val="192"/>
   </w:num>
-  <w:num w:numId="65">
+  <w:num w:numId="68">
     <w:abstractNumId w:val="186"/>
   </w:num>
-  <w:num w:numId="68">
+  <w:num w:numId="71">
     <w:abstractNumId w:val="180"/>
   </w:num>
-  <w:num w:numId="71">
+  <w:num w:numId="74">
     <w:abstractNumId w:val="174"/>
   </w:num>
-  <w:num w:numId="74">
+  <w:num w:numId="77">
     <w:abstractNumId w:val="168"/>
   </w:num>
-  <w:num w:numId="77">
+  <w:num w:numId="80">
     <w:abstractNumId w:val="162"/>
   </w:num>
-  <w:num w:numId="80">
+  <w:num w:numId="83">
     <w:abstractNumId w:val="156"/>
   </w:num>
-  <w:num w:numId="83">
+  <w:num w:numId="86">
     <w:abstractNumId w:val="150"/>
   </w:num>
-  <w:num w:numId="86">
+  <w:num w:numId="88">
     <w:abstractNumId w:val="144"/>
   </w:num>
-  <w:num w:numId="88">
+  <w:num w:numId="91">
     <w:abstractNumId w:val="138"/>
   </w:num>
-  <w:num w:numId="91">
+  <w:num w:numId="94">
     <w:abstractNumId w:val="132"/>
   </w:num>
-  <w:num w:numId="94">
+  <w:num w:numId="97">
     <w:abstractNumId w:val="126"/>
   </w:num>
-  <w:num w:numId="97">
+  <w:num w:numId="99">
     <w:abstractNumId w:val="120"/>
   </w:num>
-  <w:num w:numId="99">
+  <w:num w:numId="101">
     <w:abstractNumId w:val="114"/>
   </w:num>
-  <w:num w:numId="101">
+  <w:num w:numId="103">
     <w:abstractNumId w:val="108"/>
   </w:num>
-  <w:num w:numId="103">
+  <w:num w:numId="106">
     <w:abstractNumId w:val="102"/>
   </w:num>
-  <w:num w:numId="106">
+  <w:num w:numId="108">
     <w:abstractNumId w:val="96"/>
   </w:num>
-  <w:num w:numId="108">
+  <w:num w:numId="110">
     <w:abstractNumId w:val="90"/>
   </w:num>
-  <w:num w:numId="110">
+  <w:num w:numId="112">
     <w:abstractNumId w:val="84"/>
   </w:num>
-  <w:num w:numId="112">
+  <w:num w:numId="115">
     <w:abstractNumId w:val="78"/>
   </w:num>
-  <w:num w:numId="115">
+  <w:num w:numId="118">
     <w:abstractNumId w:val="72"/>
   </w:num>
-  <w:num w:numId="118">
+  <w:num w:numId="121">
     <w:abstractNumId w:val="66"/>
   </w:num>
-  <w:num w:numId="121">
+  <w:num w:numId="124">
     <w:abstractNumId w:val="60"/>
   </w:num>
-  <w:num w:numId="124">
+  <w:num w:numId="127">
     <w:abstractNumId w:val="54"/>
   </w:num>
-  <w:num w:numId="127">
+  <w:num w:numId="130">
     <w:abstractNumId w:val="48"/>
   </w:num>
-  <w:num w:numId="130">
+  <w:num w:numId="133">
     <w:abstractNumId w:val="42"/>
   </w:num>
-  <w:num w:numId="133">
+  <w:num w:numId="136">
     <w:abstractNumId w:val="36"/>
   </w:num>
-  <w:num w:numId="136">
+  <w:num w:numId="138">
     <w:abstractNumId w:val="30"/>
   </w:num>
-  <w:num w:numId="138">
+  <w:num w:numId="140">
     <w:abstractNumId w:val="24"/>
   </w:num>
-  <w:num w:numId="140">
+  <w:num w:numId="142">
     <w:abstractNumId w:val="18"/>
   </w:num>
-  <w:num w:numId="142">
+  <w:num w:numId="144">
     <w:abstractNumId w:val="12"/>
   </w:num>
-  <w:num w:numId="144">
+  <w:num w:numId="146">
     <w:abstractNumId w:val="6"/>
   </w:num>
-  <w:num w:numId="146">
+  <w:num w:numId="148">
     <w:abstractNumId w:val="0"/>
+  </w:num>
+  <w:num w:numId="149">
+    <w:abstractNumId w:val="1"/>
   </w:num>
 </w:numbering>
 </file>

</xml_diff>

<commit_message>
Centralised 404 error handling in ASP NET Core
</commit_message>
<xml_diff>
--- a/Asp.Net Core Notes.docx
+++ b/Asp.Net Core Notes.docx
@@ -8010,13 +8010,86 @@
         <w:jc w:val="left"/>
         <w:rPr>
           <w:rFonts w:ascii="Cascadia Code" w:hAnsi="Cascadia Code" w:cs="Cascadia Code" w:eastAsia="Cascadia Code"/>
-          <w:color w:val="auto"/>
-          <w:spacing w:val="0"/>
-          <w:position w:val="0"/>
-          <w:sz w:val="20"/>
-          <w:shd w:fill="auto" w:val="clear"/>
-        </w:rPr>
-      </w:pPr>
+          <w:b/>
+          <w:color w:val="auto"/>
+          <w:spacing w:val="0"/>
+          <w:position w:val="0"/>
+          <w:sz w:val="20"/>
+          <w:shd w:fill="auto" w:val="clear"/>
+        </w:rPr>
+      </w:pPr>
+      <w:r>
+        <w:rPr>
+          <w:rFonts w:ascii="Cascadia Code" w:hAnsi="Cascadia Code" w:cs="Cascadia Code" w:eastAsia="Cascadia Code"/>
+          <w:b/>
+          <w:color w:val="auto"/>
+          <w:spacing w:val="0"/>
+          <w:position w:val="0"/>
+          <w:sz w:val="20"/>
+          <w:shd w:fill="auto" w:val="clear"/>
+        </w:rPr>
+        <w:t xml:space="preserve">Lecture :- ( Centralised 404 error handling in ASP NET Core )</w:t>
+      </w:r>
+    </w:p>
+    <w:p>
+      <w:pPr>
+        <w:numPr>
+          <w:ilvl w:val="0"/>
+          <w:numId w:val="152"/>
+        </w:numPr>
+        <w:spacing w:before="0" w:after="60" w:line="240"/>
+        <w:ind w:right="0" w:left="720" w:hanging="360"/>
+        <w:jc w:val="left"/>
+        <w:rPr>
+          <w:rFonts w:ascii="Cascadia Code" w:hAnsi="Cascadia Code" w:cs="Cascadia Code" w:eastAsia="Cascadia Code"/>
+          <w:color w:val="auto"/>
+          <w:spacing w:val="0"/>
+          <w:position w:val="0"/>
+          <w:sz w:val="20"/>
+          <w:shd w:fill="auto" w:val="clear"/>
+        </w:rPr>
+      </w:pPr>
+      <w:r>
+        <w:rPr>
+          <w:rFonts w:ascii="Cascadia Code" w:hAnsi="Cascadia Code" w:cs="Cascadia Code" w:eastAsia="Cascadia Code"/>
+          <w:color w:val="auto"/>
+          <w:spacing w:val="0"/>
+          <w:position w:val="0"/>
+          <w:sz w:val="20"/>
+          <w:shd w:fill="auto" w:val="clear"/>
+        </w:rPr>
+        <w:t xml:space="preserve">There are some middlware which we use in program.cs file to show an error whatever we are getting</w:t>
+      </w:r>
+    </w:p>
+    <w:p>
+      <w:pPr>
+        <w:numPr>
+          <w:ilvl w:val="0"/>
+          <w:numId w:val="152"/>
+        </w:numPr>
+        <w:spacing w:before="0" w:after="60" w:line="240"/>
+        <w:ind w:right="0" w:left="720" w:hanging="360"/>
+        <w:jc w:val="left"/>
+        <w:rPr>
+          <w:rFonts w:ascii="Cascadia Code" w:hAnsi="Cascadia Code" w:cs="Cascadia Code" w:eastAsia="Cascadia Code"/>
+          <w:color w:val="auto"/>
+          <w:spacing w:val="0"/>
+          <w:position w:val="0"/>
+          <w:sz w:val="20"/>
+          <w:shd w:fill="auto" w:val="clear"/>
+        </w:rPr>
+      </w:pPr>
+      <w:r>
+        <w:rPr>
+          <w:rFonts w:ascii="Cascadia Code" w:hAnsi="Cascadia Code" w:cs="Cascadia Code" w:eastAsia="Cascadia Code"/>
+          <w:color w:val="auto"/>
+          <w:spacing w:val="0"/>
+          <w:position w:val="0"/>
+          <w:sz w:val="20"/>
+          <w:shd w:fill="auto" w:val="clear"/>
+        </w:rPr>
+        <w:t xml:space="preserve">Here are some :- Usestatuscodepages() , usestatuscodepageswithredirects() , usestatuscodepageswithreexecute()</w:t>
+      </w:r>
     </w:p>
     <w:p>
       <w:pPr>
@@ -9317,167 +9390,177 @@
       <w:lvlText w:val="%1."/>
     </w:lvl>
   </w:abstractNum>
+  <w:abstractNum w:abstractNumId="318">
+    <w:lvl w:ilvl="0">
+      <w:start w:val="1"/>
+      <w:numFmt w:val="bullet"/>
+      <w:lvlText w:val="•"/>
+    </w:lvl>
+  </w:abstractNum>
   <w:num w:numId="2">
+    <w:abstractNumId w:val="318"/>
+  </w:num>
+  <w:num w:numId="5">
     <w:abstractNumId w:val="312"/>
   </w:num>
-  <w:num w:numId="5">
+  <w:num w:numId="8">
     <w:abstractNumId w:val="306"/>
   </w:num>
-  <w:num w:numId="8">
+  <w:num w:numId="10">
     <w:abstractNumId w:val="300"/>
   </w:num>
-  <w:num w:numId="10">
+  <w:num w:numId="13">
     <w:abstractNumId w:val="294"/>
   </w:num>
-  <w:num w:numId="13">
+  <w:num w:numId="19">
     <w:abstractNumId w:val="288"/>
   </w:num>
-  <w:num w:numId="19">
+  <w:num w:numId="22">
     <w:abstractNumId w:val="282"/>
   </w:num>
-  <w:num w:numId="22">
+  <w:num w:numId="25">
     <w:abstractNumId w:val="276"/>
   </w:num>
-  <w:num w:numId="25">
+  <w:num w:numId="30">
     <w:abstractNumId w:val="270"/>
   </w:num>
-  <w:num w:numId="30">
+  <w:num w:numId="33">
     <w:abstractNumId w:val="264"/>
   </w:num>
-  <w:num w:numId="33">
+  <w:num w:numId="36">
     <w:abstractNumId w:val="258"/>
   </w:num>
-  <w:num w:numId="36">
+  <w:num w:numId="39">
     <w:abstractNumId w:val="252"/>
   </w:num>
-  <w:num w:numId="39">
+  <w:num w:numId="42">
     <w:abstractNumId w:val="246"/>
   </w:num>
-  <w:num w:numId="42">
+  <w:num w:numId="46">
     <w:abstractNumId w:val="240"/>
   </w:num>
-  <w:num w:numId="46">
+  <w:num w:numId="49">
     <w:abstractNumId w:val="234"/>
   </w:num>
-  <w:num w:numId="49">
+  <w:num w:numId="52">
     <w:abstractNumId w:val="228"/>
   </w:num>
-  <w:num w:numId="52">
+  <w:num w:numId="55">
     <w:abstractNumId w:val="222"/>
   </w:num>
-  <w:num w:numId="55">
+  <w:num w:numId="57">
     <w:abstractNumId w:val="216"/>
   </w:num>
-  <w:num w:numId="57">
+  <w:num w:numId="59">
     <w:abstractNumId w:val="210"/>
   </w:num>
-  <w:num w:numId="59">
+  <w:num w:numId="62">
     <w:abstractNumId w:val="204"/>
   </w:num>
-  <w:num w:numId="62">
+  <w:num w:numId="65">
     <w:abstractNumId w:val="198"/>
   </w:num>
-  <w:num w:numId="65">
+  <w:num w:numId="68">
     <w:abstractNumId w:val="192"/>
   </w:num>
-  <w:num w:numId="68">
+  <w:num w:numId="71">
     <w:abstractNumId w:val="186"/>
   </w:num>
-  <w:num w:numId="71">
+  <w:num w:numId="74">
     <w:abstractNumId w:val="180"/>
   </w:num>
-  <w:num w:numId="74">
+  <w:num w:numId="77">
     <w:abstractNumId w:val="174"/>
   </w:num>
-  <w:num w:numId="77">
+  <w:num w:numId="80">
     <w:abstractNumId w:val="168"/>
   </w:num>
-  <w:num w:numId="80">
+  <w:num w:numId="83">
     <w:abstractNumId w:val="162"/>
   </w:num>
-  <w:num w:numId="83">
+  <w:num w:numId="86">
     <w:abstractNumId w:val="156"/>
   </w:num>
-  <w:num w:numId="86">
+  <w:num w:numId="88">
     <w:abstractNumId w:val="150"/>
   </w:num>
-  <w:num w:numId="88">
+  <w:num w:numId="91">
     <w:abstractNumId w:val="144"/>
   </w:num>
-  <w:num w:numId="91">
+  <w:num w:numId="94">
     <w:abstractNumId w:val="138"/>
   </w:num>
-  <w:num w:numId="94">
+  <w:num w:numId="97">
     <w:abstractNumId w:val="132"/>
   </w:num>
-  <w:num w:numId="97">
+  <w:num w:numId="99">
     <w:abstractNumId w:val="126"/>
   </w:num>
-  <w:num w:numId="99">
+  <w:num w:numId="101">
     <w:abstractNumId w:val="120"/>
   </w:num>
-  <w:num w:numId="101">
+  <w:num w:numId="103">
     <w:abstractNumId w:val="114"/>
   </w:num>
-  <w:num w:numId="103">
+  <w:num w:numId="106">
     <w:abstractNumId w:val="108"/>
   </w:num>
-  <w:num w:numId="106">
+  <w:num w:numId="108">
     <w:abstractNumId w:val="102"/>
   </w:num>
-  <w:num w:numId="108">
+  <w:num w:numId="110">
     <w:abstractNumId w:val="96"/>
   </w:num>
-  <w:num w:numId="110">
+  <w:num w:numId="112">
     <w:abstractNumId w:val="90"/>
   </w:num>
-  <w:num w:numId="112">
+  <w:num w:numId="115">
     <w:abstractNumId w:val="84"/>
   </w:num>
-  <w:num w:numId="115">
+  <w:num w:numId="118">
     <w:abstractNumId w:val="78"/>
   </w:num>
-  <w:num w:numId="118">
+  <w:num w:numId="121">
     <w:abstractNumId w:val="72"/>
   </w:num>
-  <w:num w:numId="121">
+  <w:num w:numId="124">
     <w:abstractNumId w:val="66"/>
   </w:num>
-  <w:num w:numId="124">
+  <w:num w:numId="127">
     <w:abstractNumId w:val="60"/>
   </w:num>
-  <w:num w:numId="127">
+  <w:num w:numId="130">
     <w:abstractNumId w:val="54"/>
   </w:num>
-  <w:num w:numId="130">
+  <w:num w:numId="133">
     <w:abstractNumId w:val="48"/>
   </w:num>
-  <w:num w:numId="133">
+  <w:num w:numId="136">
     <w:abstractNumId w:val="42"/>
   </w:num>
-  <w:num w:numId="136">
+  <w:num w:numId="138">
     <w:abstractNumId w:val="36"/>
   </w:num>
-  <w:num w:numId="138">
+  <w:num w:numId="140">
     <w:abstractNumId w:val="30"/>
   </w:num>
-  <w:num w:numId="140">
+  <w:num w:numId="142">
     <w:abstractNumId w:val="24"/>
   </w:num>
-  <w:num w:numId="142">
+  <w:num w:numId="144">
     <w:abstractNumId w:val="18"/>
   </w:num>
-  <w:num w:numId="144">
+  <w:num w:numId="146">
     <w:abstractNumId w:val="12"/>
   </w:num>
-  <w:num w:numId="146">
+  <w:num w:numId="148">
     <w:abstractNumId w:val="6"/>
-  </w:num>
-  <w:num w:numId="148">
-    <w:abstractNumId w:val="0"/>
   </w:num>
   <w:num w:numId="149">
     <w:abstractNumId w:val="1"/>
+  </w:num>
+  <w:num w:numId="152">
+    <w:abstractNumId w:val="0"/>
   </w:num>
 </w:numbering>
 </file>

</xml_diff>

<commit_message>
Global exception handling in asp net core mvc
</commit_message>
<xml_diff>
--- a/Asp.Net Core Notes.docx
+++ b/Asp.Net Core Notes.docx
@@ -8089,6 +8089,176 @@
           <w:shd w:fill="auto" w:val="clear"/>
         </w:rPr>
         <w:t xml:space="preserve">Here are some :- Usestatuscodepages() , usestatuscodepageswithredirects() , usestatuscodepageswithreexecute()</w:t>
+      </w:r>
+    </w:p>
+    <w:p>
+      <w:pPr>
+        <w:spacing w:before="0" w:after="60" w:line="240"/>
+        <w:ind w:right="0" w:left="0" w:firstLine="0"/>
+        <w:jc w:val="left"/>
+        <w:rPr>
+          <w:rFonts w:ascii="Cascadia Code" w:hAnsi="Cascadia Code" w:cs="Cascadia Code" w:eastAsia="Cascadia Code"/>
+          <w:color w:val="auto"/>
+          <w:spacing w:val="0"/>
+          <w:position w:val="0"/>
+          <w:sz w:val="20"/>
+          <w:shd w:fill="auto" w:val="clear"/>
+        </w:rPr>
+      </w:pPr>
+    </w:p>
+    <w:p>
+      <w:pPr>
+        <w:spacing w:before="0" w:after="60" w:line="240"/>
+        <w:ind w:right="0" w:left="0" w:firstLine="0"/>
+        <w:jc w:val="left"/>
+        <w:rPr>
+          <w:rFonts w:ascii="Cascadia Code" w:hAnsi="Cascadia Code" w:cs="Cascadia Code" w:eastAsia="Cascadia Code"/>
+          <w:color w:val="auto"/>
+          <w:spacing w:val="0"/>
+          <w:position w:val="0"/>
+          <w:sz w:val="20"/>
+          <w:shd w:fill="auto" w:val="clear"/>
+        </w:rPr>
+      </w:pPr>
+    </w:p>
+    <w:p>
+      <w:pPr>
+        <w:spacing w:before="0" w:after="60" w:line="240"/>
+        <w:ind w:right="0" w:left="0" w:firstLine="0"/>
+        <w:jc w:val="left"/>
+        <w:rPr>
+          <w:rFonts w:ascii="Cascadia Code" w:hAnsi="Cascadia Code" w:cs="Cascadia Code" w:eastAsia="Cascadia Code"/>
+          <w:b/>
+          <w:color w:val="auto"/>
+          <w:spacing w:val="0"/>
+          <w:position w:val="0"/>
+          <w:sz w:val="20"/>
+          <w:shd w:fill="auto" w:val="clear"/>
+        </w:rPr>
+      </w:pPr>
+      <w:r>
+        <w:rPr>
+          <w:rFonts w:ascii="Cascadia Code" w:hAnsi="Cascadia Code" w:cs="Cascadia Code" w:eastAsia="Cascadia Code"/>
+          <w:b/>
+          <w:color w:val="auto"/>
+          <w:spacing w:val="0"/>
+          <w:position w:val="0"/>
+          <w:sz w:val="20"/>
+          <w:shd w:fill="auto" w:val="clear"/>
+        </w:rPr>
+        <w:t xml:space="preserve">Lecture :- ( Global exception handling in asp net core mvc )</w:t>
+      </w:r>
+    </w:p>
+    <w:p>
+      <w:pPr>
+        <w:numPr>
+          <w:ilvl w:val="0"/>
+          <w:numId w:val="154"/>
+        </w:numPr>
+        <w:spacing w:before="0" w:after="60" w:line="240"/>
+        <w:ind w:right="0" w:left="720" w:hanging="360"/>
+        <w:jc w:val="left"/>
+        <w:rPr>
+          <w:rFonts w:ascii="Cascadia Code" w:hAnsi="Cascadia Code" w:cs="Cascadia Code" w:eastAsia="Cascadia Code"/>
+          <w:color w:val="auto"/>
+          <w:spacing w:val="0"/>
+          <w:position w:val="0"/>
+          <w:sz w:val="20"/>
+          <w:shd w:fill="auto" w:val="clear"/>
+        </w:rPr>
+      </w:pPr>
+      <w:r>
+        <w:rPr>
+          <w:rFonts w:ascii="Cascadia Code" w:hAnsi="Cascadia Code" w:cs="Cascadia Code" w:eastAsia="Cascadia Code"/>
+          <w:color w:val="auto"/>
+          <w:spacing w:val="0"/>
+          <w:position w:val="0"/>
+          <w:sz w:val="20"/>
+          <w:shd w:fill="auto" w:val="clear"/>
+        </w:rPr>
+        <w:t xml:space="preserve">There are 3 ways to do this :-</w:t>
+      </w:r>
+    </w:p>
+    <w:p>
+      <w:pPr>
+        <w:spacing w:before="0" w:after="60" w:line="240"/>
+        <w:ind w:right="0" w:left="0" w:firstLine="0"/>
+        <w:jc w:val="left"/>
+        <w:rPr>
+          <w:rFonts w:ascii="Cascadia Code" w:hAnsi="Cascadia Code" w:cs="Cascadia Code" w:eastAsia="Cascadia Code"/>
+          <w:color w:val="auto"/>
+          <w:spacing w:val="0"/>
+          <w:position w:val="0"/>
+          <w:sz w:val="20"/>
+          <w:shd w:fill="auto" w:val="clear"/>
+        </w:rPr>
+      </w:pPr>
+      <w:r>
+        <w:rPr>
+          <w:rFonts w:ascii="Cascadia Code" w:hAnsi="Cascadia Code" w:cs="Cascadia Code" w:eastAsia="Cascadia Code"/>
+          <w:color w:val="auto"/>
+          <w:spacing w:val="0"/>
+          <w:position w:val="0"/>
+          <w:sz w:val="20"/>
+          <w:shd w:fill="auto" w:val="clear"/>
+        </w:rPr>
+        <w:t xml:space="preserve">      1. UseExceptionHandler middleware</w:t>
+      </w:r>
+    </w:p>
+    <w:p>
+      <w:pPr>
+        <w:spacing w:before="0" w:after="60" w:line="240"/>
+        <w:ind w:right="0" w:left="0" w:firstLine="0"/>
+        <w:jc w:val="left"/>
+        <w:rPr>
+          <w:rFonts w:ascii="Cascadia Code" w:hAnsi="Cascadia Code" w:cs="Cascadia Code" w:eastAsia="Cascadia Code"/>
+          <w:color w:val="auto"/>
+          <w:spacing w:val="0"/>
+          <w:position w:val="0"/>
+          <w:sz w:val="20"/>
+          <w:shd w:fill="auto" w:val="clear"/>
+        </w:rPr>
+      </w:pPr>
+      <w:r>
+        <w:rPr>
+          <w:rFonts w:ascii="Cascadia Code" w:hAnsi="Cascadia Code" w:cs="Cascadia Code" w:eastAsia="Cascadia Code"/>
+          <w:color w:val="auto"/>
+          <w:spacing w:val="0"/>
+          <w:position w:val="0"/>
+          <w:sz w:val="20"/>
+          <w:shd w:fill="auto" w:val="clear"/>
+        </w:rPr>
+        <w:tab/>
+        <w:t xml:space="preserve">2. Next step is to implement that controller which we are going to    </w:t>
+        <w:tab/>
+        <w:t xml:space="preserve">   pass inside this usexceptionhandler</w:t>
+      </w:r>
+    </w:p>
+    <w:p>
+      <w:pPr>
+        <w:spacing w:before="0" w:after="60" w:line="240"/>
+        <w:ind w:right="0" w:left="0" w:firstLine="0"/>
+        <w:jc w:val="left"/>
+        <w:rPr>
+          <w:rFonts w:ascii="Cascadia Code" w:hAnsi="Cascadia Code" w:cs="Cascadia Code" w:eastAsia="Cascadia Code"/>
+          <w:color w:val="auto"/>
+          <w:spacing w:val="0"/>
+          <w:position w:val="0"/>
+          <w:sz w:val="20"/>
+          <w:shd w:fill="auto" w:val="clear"/>
+        </w:rPr>
+      </w:pPr>
+      <w:r>
+        <w:rPr>
+          <w:rFonts w:ascii="Cascadia Code" w:hAnsi="Cascadia Code" w:cs="Cascadia Code" w:eastAsia="Cascadia Code"/>
+          <w:color w:val="auto"/>
+          <w:spacing w:val="0"/>
+          <w:position w:val="0"/>
+          <w:sz w:val="20"/>
+          <w:shd w:fill="auto" w:val="clear"/>
+        </w:rPr>
+        <w:tab/>
+        <w:t xml:space="preserve">3. To implement an error view which e are going to return</w:t>
       </w:r>
     </w:p>
     <w:p>
@@ -9397,169 +9567,179 @@
       <w:lvlText w:val="•"/>
     </w:lvl>
   </w:abstractNum>
+  <w:abstractNum w:abstractNumId="324">
+    <w:lvl w:ilvl="0">
+      <w:start w:val="1"/>
+      <w:numFmt w:val="bullet"/>
+      <w:lvlText w:val="•"/>
+    </w:lvl>
+  </w:abstractNum>
   <w:num w:numId="2">
+    <w:abstractNumId w:val="324"/>
+  </w:num>
+  <w:num w:numId="5">
     <w:abstractNumId w:val="318"/>
   </w:num>
-  <w:num w:numId="5">
+  <w:num w:numId="8">
     <w:abstractNumId w:val="312"/>
   </w:num>
-  <w:num w:numId="8">
+  <w:num w:numId="10">
     <w:abstractNumId w:val="306"/>
   </w:num>
-  <w:num w:numId="10">
+  <w:num w:numId="13">
     <w:abstractNumId w:val="300"/>
   </w:num>
-  <w:num w:numId="13">
+  <w:num w:numId="19">
     <w:abstractNumId w:val="294"/>
   </w:num>
-  <w:num w:numId="19">
+  <w:num w:numId="22">
     <w:abstractNumId w:val="288"/>
   </w:num>
-  <w:num w:numId="22">
+  <w:num w:numId="25">
     <w:abstractNumId w:val="282"/>
   </w:num>
-  <w:num w:numId="25">
+  <w:num w:numId="30">
     <w:abstractNumId w:val="276"/>
   </w:num>
-  <w:num w:numId="30">
+  <w:num w:numId="33">
     <w:abstractNumId w:val="270"/>
   </w:num>
-  <w:num w:numId="33">
+  <w:num w:numId="36">
     <w:abstractNumId w:val="264"/>
   </w:num>
-  <w:num w:numId="36">
+  <w:num w:numId="39">
     <w:abstractNumId w:val="258"/>
   </w:num>
-  <w:num w:numId="39">
+  <w:num w:numId="42">
     <w:abstractNumId w:val="252"/>
   </w:num>
-  <w:num w:numId="42">
+  <w:num w:numId="46">
     <w:abstractNumId w:val="246"/>
   </w:num>
-  <w:num w:numId="46">
+  <w:num w:numId="49">
     <w:abstractNumId w:val="240"/>
   </w:num>
-  <w:num w:numId="49">
+  <w:num w:numId="52">
     <w:abstractNumId w:val="234"/>
   </w:num>
-  <w:num w:numId="52">
+  <w:num w:numId="55">
     <w:abstractNumId w:val="228"/>
   </w:num>
-  <w:num w:numId="55">
+  <w:num w:numId="57">
     <w:abstractNumId w:val="222"/>
   </w:num>
-  <w:num w:numId="57">
+  <w:num w:numId="59">
     <w:abstractNumId w:val="216"/>
   </w:num>
-  <w:num w:numId="59">
+  <w:num w:numId="62">
     <w:abstractNumId w:val="210"/>
   </w:num>
-  <w:num w:numId="62">
+  <w:num w:numId="65">
     <w:abstractNumId w:val="204"/>
   </w:num>
-  <w:num w:numId="65">
+  <w:num w:numId="68">
     <w:abstractNumId w:val="198"/>
   </w:num>
-  <w:num w:numId="68">
+  <w:num w:numId="71">
     <w:abstractNumId w:val="192"/>
   </w:num>
-  <w:num w:numId="71">
+  <w:num w:numId="74">
     <w:abstractNumId w:val="186"/>
   </w:num>
-  <w:num w:numId="74">
+  <w:num w:numId="77">
     <w:abstractNumId w:val="180"/>
   </w:num>
-  <w:num w:numId="77">
+  <w:num w:numId="80">
     <w:abstractNumId w:val="174"/>
   </w:num>
-  <w:num w:numId="80">
+  <w:num w:numId="83">
     <w:abstractNumId w:val="168"/>
   </w:num>
-  <w:num w:numId="83">
+  <w:num w:numId="86">
     <w:abstractNumId w:val="162"/>
   </w:num>
-  <w:num w:numId="86">
+  <w:num w:numId="88">
     <w:abstractNumId w:val="156"/>
   </w:num>
-  <w:num w:numId="88">
+  <w:num w:numId="91">
     <w:abstractNumId w:val="150"/>
   </w:num>
-  <w:num w:numId="91">
+  <w:num w:numId="94">
     <w:abstractNumId w:val="144"/>
   </w:num>
-  <w:num w:numId="94">
+  <w:num w:numId="97">
     <w:abstractNumId w:val="138"/>
   </w:num>
-  <w:num w:numId="97">
+  <w:num w:numId="99">
     <w:abstractNumId w:val="132"/>
   </w:num>
-  <w:num w:numId="99">
+  <w:num w:numId="101">
     <w:abstractNumId w:val="126"/>
   </w:num>
-  <w:num w:numId="101">
+  <w:num w:numId="103">
     <w:abstractNumId w:val="120"/>
   </w:num>
-  <w:num w:numId="103">
+  <w:num w:numId="106">
     <w:abstractNumId w:val="114"/>
   </w:num>
-  <w:num w:numId="106">
+  <w:num w:numId="108">
     <w:abstractNumId w:val="108"/>
   </w:num>
-  <w:num w:numId="108">
+  <w:num w:numId="110">
     <w:abstractNumId w:val="102"/>
   </w:num>
-  <w:num w:numId="110">
+  <w:num w:numId="112">
     <w:abstractNumId w:val="96"/>
   </w:num>
-  <w:num w:numId="112">
+  <w:num w:numId="115">
     <w:abstractNumId w:val="90"/>
   </w:num>
-  <w:num w:numId="115">
+  <w:num w:numId="118">
     <w:abstractNumId w:val="84"/>
   </w:num>
-  <w:num w:numId="118">
+  <w:num w:numId="121">
     <w:abstractNumId w:val="78"/>
   </w:num>
-  <w:num w:numId="121">
+  <w:num w:numId="124">
     <w:abstractNumId w:val="72"/>
   </w:num>
-  <w:num w:numId="124">
+  <w:num w:numId="127">
     <w:abstractNumId w:val="66"/>
   </w:num>
-  <w:num w:numId="127">
+  <w:num w:numId="130">
     <w:abstractNumId w:val="60"/>
   </w:num>
-  <w:num w:numId="130">
+  <w:num w:numId="133">
     <w:abstractNumId w:val="54"/>
   </w:num>
-  <w:num w:numId="133">
+  <w:num w:numId="136">
     <w:abstractNumId w:val="48"/>
   </w:num>
-  <w:num w:numId="136">
+  <w:num w:numId="138">
     <w:abstractNumId w:val="42"/>
   </w:num>
-  <w:num w:numId="138">
+  <w:num w:numId="140">
     <w:abstractNumId w:val="36"/>
   </w:num>
-  <w:num w:numId="140">
+  <w:num w:numId="142">
     <w:abstractNumId w:val="30"/>
   </w:num>
-  <w:num w:numId="142">
+  <w:num w:numId="144">
     <w:abstractNumId w:val="24"/>
   </w:num>
-  <w:num w:numId="144">
+  <w:num w:numId="146">
     <w:abstractNumId w:val="18"/>
   </w:num>
-  <w:num w:numId="146">
+  <w:num w:numId="148">
     <w:abstractNumId w:val="12"/>
-  </w:num>
-  <w:num w:numId="148">
-    <w:abstractNumId w:val="6"/>
   </w:num>
   <w:num w:numId="149">
     <w:abstractNumId w:val="1"/>
   </w:num>
   <w:num w:numId="152">
+    <w:abstractNumId w:val="6"/>
+  </w:num>
+  <w:num w:numId="154">
     <w:abstractNumId w:val="0"/>
   </w:num>
 </w:numbering>

</xml_diff>

<commit_message>
Logging in ASP.NET Core
</commit_message>
<xml_diff>
--- a/Asp.Net Core Notes.docx
+++ b/Asp.Net Core Notes.docx
@@ -8259,6 +8259,725 @@
         </w:rPr>
         <w:tab/>
         <w:t xml:space="preserve">3. To implement an error view which e are going to return</w:t>
+      </w:r>
+    </w:p>
+    <w:p>
+      <w:pPr>
+        <w:spacing w:before="0" w:after="60" w:line="240"/>
+        <w:ind w:right="0" w:left="0" w:firstLine="0"/>
+        <w:jc w:val="left"/>
+        <w:rPr>
+          <w:rFonts w:ascii="Cascadia Code" w:hAnsi="Cascadia Code" w:cs="Cascadia Code" w:eastAsia="Cascadia Code"/>
+          <w:color w:val="auto"/>
+          <w:spacing w:val="0"/>
+          <w:position w:val="0"/>
+          <w:sz w:val="20"/>
+          <w:shd w:fill="auto" w:val="clear"/>
+        </w:rPr>
+      </w:pPr>
+    </w:p>
+    <w:p>
+      <w:pPr>
+        <w:spacing w:before="0" w:after="60" w:line="240"/>
+        <w:ind w:right="0" w:left="0" w:firstLine="0"/>
+        <w:jc w:val="left"/>
+        <w:rPr>
+          <w:rFonts w:ascii="Cascadia Code" w:hAnsi="Cascadia Code" w:cs="Cascadia Code" w:eastAsia="Cascadia Code"/>
+          <w:color w:val="auto"/>
+          <w:spacing w:val="0"/>
+          <w:position w:val="0"/>
+          <w:sz w:val="20"/>
+          <w:shd w:fill="auto" w:val="clear"/>
+        </w:rPr>
+      </w:pPr>
+    </w:p>
+    <w:p>
+      <w:pPr>
+        <w:spacing w:before="0" w:after="60" w:line="240"/>
+        <w:ind w:right="0" w:left="0" w:firstLine="0"/>
+        <w:jc w:val="left"/>
+        <w:rPr>
+          <w:rFonts w:ascii="Cascadia Code" w:hAnsi="Cascadia Code" w:cs="Cascadia Code" w:eastAsia="Cascadia Code"/>
+          <w:b/>
+          <w:color w:val="auto"/>
+          <w:spacing w:val="0"/>
+          <w:position w:val="0"/>
+          <w:sz w:val="20"/>
+          <w:shd w:fill="auto" w:val="clear"/>
+        </w:rPr>
+      </w:pPr>
+      <w:r>
+        <w:rPr>
+          <w:rFonts w:ascii="Cascadia Code" w:hAnsi="Cascadia Code" w:cs="Cascadia Code" w:eastAsia="Cascadia Code"/>
+          <w:b/>
+          <w:color w:val="auto"/>
+          <w:spacing w:val="0"/>
+          <w:position w:val="0"/>
+          <w:sz w:val="20"/>
+          <w:shd w:fill="auto" w:val="clear"/>
+        </w:rPr>
+        <w:t xml:space="preserve">Lecture :- ( Logging in ASP.NET Core )</w:t>
+      </w:r>
+    </w:p>
+    <w:p>
+      <w:pPr>
+        <w:numPr>
+          <w:ilvl w:val="0"/>
+          <w:numId w:val="157"/>
+        </w:numPr>
+        <w:spacing w:before="0" w:after="60" w:line="240"/>
+        <w:ind w:right="0" w:left="720" w:hanging="360"/>
+        <w:jc w:val="left"/>
+        <w:rPr>
+          <w:rFonts w:ascii="Cascadia Code" w:hAnsi="Cascadia Code" w:cs="Cascadia Code" w:eastAsia="Cascadia Code"/>
+          <w:color w:val="auto"/>
+          <w:spacing w:val="0"/>
+          <w:position w:val="0"/>
+          <w:sz w:val="20"/>
+          <w:shd w:fill="auto" w:val="clear"/>
+        </w:rPr>
+      </w:pPr>
+      <w:r>
+        <w:rPr>
+          <w:rFonts w:ascii="Cascadia Code" w:hAnsi="Cascadia Code" w:cs="Cascadia Code" w:eastAsia="Cascadia Code"/>
+          <w:color w:val="auto"/>
+          <w:spacing w:val="0"/>
+          <w:position w:val="0"/>
+          <w:sz w:val="20"/>
+          <w:shd w:fill="auto" w:val="clear"/>
+        </w:rPr>
+        <w:t xml:space="preserve">Logging means storing applications , events , errors , warnings and etc while application is running</w:t>
+      </w:r>
+    </w:p>
+    <w:p>
+      <w:pPr>
+        <w:numPr>
+          <w:ilvl w:val="0"/>
+          <w:numId w:val="157"/>
+        </w:numPr>
+        <w:spacing w:before="0" w:after="60" w:line="240"/>
+        <w:ind w:right="0" w:left="720" w:hanging="360"/>
+        <w:jc w:val="left"/>
+        <w:rPr>
+          <w:rFonts w:ascii="Cascadia Code" w:hAnsi="Cascadia Code" w:cs="Cascadia Code" w:eastAsia="Cascadia Code"/>
+          <w:color w:val="auto"/>
+          <w:spacing w:val="0"/>
+          <w:position w:val="0"/>
+          <w:sz w:val="20"/>
+          <w:shd w:fill="auto" w:val="clear"/>
+        </w:rPr>
+      </w:pPr>
+      <w:r>
+        <w:rPr>
+          <w:rFonts w:ascii="Cascadia Code" w:hAnsi="Cascadia Code" w:cs="Cascadia Code" w:eastAsia="Cascadia Code"/>
+          <w:color w:val="auto"/>
+          <w:spacing w:val="0"/>
+          <w:position w:val="0"/>
+          <w:sz w:val="20"/>
+          <w:shd w:fill="auto" w:val="clear"/>
+        </w:rPr>
+        <w:t xml:space="preserve">Example :- basically when user wanna to save and at that time something crash , during that logging requires</w:t>
+      </w:r>
+    </w:p>
+    <w:p>
+      <w:pPr>
+        <w:spacing w:before="0" w:after="60" w:line="240"/>
+        <w:ind w:right="0" w:left="0" w:firstLine="0"/>
+        <w:jc w:val="left"/>
+        <w:rPr>
+          <w:rFonts w:ascii="Cascadia Code" w:hAnsi="Cascadia Code" w:cs="Cascadia Code" w:eastAsia="Cascadia Code"/>
+          <w:color w:val="auto"/>
+          <w:spacing w:val="0"/>
+          <w:position w:val="0"/>
+          <w:sz w:val="20"/>
+          <w:shd w:fill="auto" w:val="clear"/>
+        </w:rPr>
+      </w:pPr>
+    </w:p>
+    <w:p>
+      <w:pPr>
+        <w:spacing w:before="0" w:after="60" w:line="240"/>
+        <w:ind w:right="0" w:left="0" w:firstLine="0"/>
+        <w:jc w:val="left"/>
+        <w:rPr>
+          <w:rFonts w:ascii="Cascadia Code" w:hAnsi="Cascadia Code" w:cs="Cascadia Code" w:eastAsia="Cascadia Code"/>
+          <w:b/>
+          <w:color w:val="auto"/>
+          <w:spacing w:val="0"/>
+          <w:position w:val="0"/>
+          <w:sz w:val="20"/>
+          <w:shd w:fill="auto" w:val="clear"/>
+        </w:rPr>
+      </w:pPr>
+      <w:r>
+        <w:rPr>
+          <w:rFonts w:ascii="Cascadia Code" w:hAnsi="Cascadia Code" w:cs="Cascadia Code" w:eastAsia="Cascadia Code"/>
+          <w:b/>
+          <w:color w:val="auto"/>
+          <w:spacing w:val="0"/>
+          <w:position w:val="0"/>
+          <w:sz w:val="20"/>
+          <w:shd w:fill="auto" w:val="clear"/>
+        </w:rPr>
+        <w:t xml:space="preserve">How logging works :-</w:t>
+      </w:r>
+    </w:p>
+    <w:p>
+      <w:pPr>
+        <w:numPr>
+          <w:ilvl w:val="0"/>
+          <w:numId w:val="159"/>
+        </w:numPr>
+        <w:spacing w:before="0" w:after="60" w:line="240"/>
+        <w:ind w:right="0" w:left="720" w:hanging="360"/>
+        <w:jc w:val="left"/>
+        <w:rPr>
+          <w:rFonts w:ascii="Cascadia Code" w:hAnsi="Cascadia Code" w:cs="Cascadia Code" w:eastAsia="Cascadia Code"/>
+          <w:color w:val="auto"/>
+          <w:spacing w:val="0"/>
+          <w:position w:val="0"/>
+          <w:sz w:val="20"/>
+          <w:shd w:fill="auto" w:val="clear"/>
+        </w:rPr>
+      </w:pPr>
+      <w:r>
+        <w:rPr>
+          <w:rFonts w:ascii="Cascadia Code" w:hAnsi="Cascadia Code" w:cs="Cascadia Code" w:eastAsia="Cascadia Code"/>
+          <w:color w:val="auto"/>
+          <w:spacing w:val="0"/>
+          <w:position w:val="0"/>
+          <w:sz w:val="20"/>
+          <w:shd w:fill="auto" w:val="clear"/>
+        </w:rPr>
+        <w:t xml:space="preserve">Asp.net core provide built in logging system , main interface Ilogger&lt;T&gt;</w:t>
+      </w:r>
+    </w:p>
+    <w:p>
+      <w:pPr>
+        <w:numPr>
+          <w:ilvl w:val="0"/>
+          <w:numId w:val="159"/>
+        </w:numPr>
+        <w:spacing w:before="0" w:after="60" w:line="240"/>
+        <w:ind w:right="0" w:left="720" w:hanging="360"/>
+        <w:jc w:val="left"/>
+        <w:rPr>
+          <w:rFonts w:ascii="Cascadia Code" w:hAnsi="Cascadia Code" w:cs="Cascadia Code" w:eastAsia="Cascadia Code"/>
+          <w:color w:val="auto"/>
+          <w:spacing w:val="0"/>
+          <w:position w:val="0"/>
+          <w:sz w:val="20"/>
+          <w:shd w:fill="auto" w:val="clear"/>
+        </w:rPr>
+      </w:pPr>
+      <w:r>
+        <w:rPr>
+          <w:rFonts w:ascii="Cascadia Code" w:hAnsi="Cascadia Code" w:cs="Cascadia Code" w:eastAsia="Cascadia Code"/>
+          <w:color w:val="auto"/>
+          <w:spacing w:val="0"/>
+          <w:position w:val="0"/>
+          <w:sz w:val="20"/>
+          <w:shd w:fill="auto" w:val="clear"/>
+        </w:rPr>
+        <w:t xml:space="preserve">It create logger internally</w:t>
+      </w:r>
+    </w:p>
+    <w:p>
+      <w:pPr>
+        <w:spacing w:before="0" w:after="60" w:line="240"/>
+        <w:ind w:right="0" w:left="0" w:firstLine="0"/>
+        <w:jc w:val="left"/>
+        <w:rPr>
+          <w:rFonts w:ascii="Cascadia Code" w:hAnsi="Cascadia Code" w:cs="Cascadia Code" w:eastAsia="Cascadia Code"/>
+          <w:color w:val="auto"/>
+          <w:spacing w:val="0"/>
+          <w:position w:val="0"/>
+          <w:sz w:val="20"/>
+          <w:shd w:fill="auto" w:val="clear"/>
+        </w:rPr>
+      </w:pPr>
+    </w:p>
+    <w:p>
+      <w:pPr>
+        <w:spacing w:before="0" w:after="60" w:line="240"/>
+        <w:ind w:right="0" w:left="0" w:firstLine="0"/>
+        <w:jc w:val="left"/>
+        <w:rPr>
+          <w:rFonts w:ascii="Cascadia Code" w:hAnsi="Cascadia Code" w:cs="Cascadia Code" w:eastAsia="Cascadia Code"/>
+          <w:b/>
+          <w:color w:val="auto"/>
+          <w:spacing w:val="0"/>
+          <w:position w:val="0"/>
+          <w:sz w:val="20"/>
+          <w:shd w:fill="auto" w:val="clear"/>
+        </w:rPr>
+      </w:pPr>
+      <w:r>
+        <w:rPr>
+          <w:rFonts w:ascii="Cascadia Code" w:hAnsi="Cascadia Code" w:cs="Cascadia Code" w:eastAsia="Cascadia Code"/>
+          <w:b/>
+          <w:color w:val="auto"/>
+          <w:spacing w:val="0"/>
+          <w:position w:val="0"/>
+          <w:sz w:val="20"/>
+          <w:shd w:fill="auto" w:val="clear"/>
+        </w:rPr>
+        <w:t xml:space="preserve">Basic logging methods :-</w:t>
+      </w:r>
+    </w:p>
+    <w:p>
+      <w:pPr>
+        <w:numPr>
+          <w:ilvl w:val="0"/>
+          <w:numId w:val="161"/>
+        </w:numPr>
+        <w:spacing w:before="0" w:after="60" w:line="240"/>
+        <w:ind w:right="0" w:left="720" w:hanging="360"/>
+        <w:jc w:val="left"/>
+        <w:rPr>
+          <w:rFonts w:ascii="Cascadia Code" w:hAnsi="Cascadia Code" w:cs="Cascadia Code" w:eastAsia="Cascadia Code"/>
+          <w:color w:val="auto"/>
+          <w:spacing w:val="0"/>
+          <w:position w:val="0"/>
+          <w:sz w:val="20"/>
+          <w:shd w:fill="auto" w:val="clear"/>
+        </w:rPr>
+      </w:pPr>
+      <w:r>
+        <w:rPr>
+          <w:rFonts w:ascii="Cascadia Code" w:hAnsi="Cascadia Code" w:cs="Cascadia Code" w:eastAsia="Cascadia Code"/>
+          <w:color w:val="auto"/>
+          <w:spacing w:val="0"/>
+          <w:position w:val="0"/>
+          <w:sz w:val="20"/>
+          <w:shd w:fill="auto" w:val="clear"/>
+        </w:rPr>
+        <w:t xml:space="preserve">Information :- loginformation ( normal application flow &amp; successfull operations )</w:t>
+      </w:r>
+    </w:p>
+    <w:p>
+      <w:pPr>
+        <w:numPr>
+          <w:ilvl w:val="0"/>
+          <w:numId w:val="161"/>
+        </w:numPr>
+        <w:spacing w:before="0" w:after="60" w:line="240"/>
+        <w:ind w:right="0" w:left="720" w:hanging="360"/>
+        <w:jc w:val="left"/>
+        <w:rPr>
+          <w:rFonts w:ascii="Cascadia Code" w:hAnsi="Cascadia Code" w:cs="Cascadia Code" w:eastAsia="Cascadia Code"/>
+          <w:color w:val="auto"/>
+          <w:spacing w:val="0"/>
+          <w:position w:val="0"/>
+          <w:sz w:val="20"/>
+          <w:shd w:fill="auto" w:val="clear"/>
+        </w:rPr>
+      </w:pPr>
+      <w:r>
+        <w:rPr>
+          <w:rFonts w:ascii="Cascadia Code" w:hAnsi="Cascadia Code" w:cs="Cascadia Code" w:eastAsia="Cascadia Code"/>
+          <w:color w:val="auto"/>
+          <w:spacing w:val="0"/>
+          <w:position w:val="0"/>
+          <w:sz w:val="20"/>
+          <w:shd w:fill="auto" w:val="clear"/>
+        </w:rPr>
+        <w:t xml:space="preserve">warning :- logwarning ( unexpected situation but application still runs )</w:t>
+      </w:r>
+    </w:p>
+    <w:p>
+      <w:pPr>
+        <w:numPr>
+          <w:ilvl w:val="0"/>
+          <w:numId w:val="161"/>
+        </w:numPr>
+        <w:spacing w:before="0" w:after="60" w:line="240"/>
+        <w:ind w:right="0" w:left="720" w:hanging="360"/>
+        <w:jc w:val="left"/>
+        <w:rPr>
+          <w:rFonts w:ascii="Cascadia Code" w:hAnsi="Cascadia Code" w:cs="Cascadia Code" w:eastAsia="Cascadia Code"/>
+          <w:color w:val="auto"/>
+          <w:spacing w:val="0"/>
+          <w:position w:val="0"/>
+          <w:sz w:val="20"/>
+          <w:shd w:fill="auto" w:val="clear"/>
+        </w:rPr>
+      </w:pPr>
+      <w:r>
+        <w:rPr>
+          <w:rFonts w:ascii="Cascadia Code" w:hAnsi="Cascadia Code" w:cs="Cascadia Code" w:eastAsia="Cascadia Code"/>
+          <w:color w:val="auto"/>
+          <w:spacing w:val="0"/>
+          <w:position w:val="0"/>
+          <w:sz w:val="20"/>
+          <w:shd w:fill="auto" w:val="clear"/>
+        </w:rPr>
+        <w:t xml:space="preserve">error :- logerror ( exceptions &amp; failures )</w:t>
+      </w:r>
+    </w:p>
+    <w:p>
+      <w:pPr>
+        <w:numPr>
+          <w:ilvl w:val="0"/>
+          <w:numId w:val="161"/>
+        </w:numPr>
+        <w:spacing w:before="0" w:after="60" w:line="240"/>
+        <w:ind w:right="0" w:left="720" w:hanging="360"/>
+        <w:jc w:val="left"/>
+        <w:rPr>
+          <w:rFonts w:ascii="Cascadia Code" w:hAnsi="Cascadia Code" w:cs="Cascadia Code" w:eastAsia="Cascadia Code"/>
+          <w:color w:val="auto"/>
+          <w:spacing w:val="0"/>
+          <w:position w:val="0"/>
+          <w:sz w:val="20"/>
+          <w:shd w:fill="auto" w:val="clear"/>
+        </w:rPr>
+      </w:pPr>
+      <w:r>
+        <w:rPr>
+          <w:rFonts w:ascii="Cascadia Code" w:hAnsi="Cascadia Code" w:cs="Cascadia Code" w:eastAsia="Cascadia Code"/>
+          <w:color w:val="auto"/>
+          <w:spacing w:val="0"/>
+          <w:position w:val="0"/>
+          <w:sz w:val="20"/>
+          <w:shd w:fill="auto" w:val="clear"/>
+        </w:rPr>
+        <w:t xml:space="preserve">critical :- logcritical ( application shitdown &amp; servere failures )</w:t>
+      </w:r>
+    </w:p>
+    <w:p>
+      <w:pPr>
+        <w:numPr>
+          <w:ilvl w:val="0"/>
+          <w:numId w:val="161"/>
+        </w:numPr>
+        <w:spacing w:before="0" w:after="60" w:line="240"/>
+        <w:ind w:right="0" w:left="720" w:hanging="360"/>
+        <w:jc w:val="left"/>
+        <w:rPr>
+          <w:rFonts w:ascii="Cascadia Code" w:hAnsi="Cascadia Code" w:cs="Cascadia Code" w:eastAsia="Cascadia Code"/>
+          <w:color w:val="auto"/>
+          <w:spacing w:val="0"/>
+          <w:position w:val="0"/>
+          <w:sz w:val="20"/>
+          <w:shd w:fill="auto" w:val="clear"/>
+        </w:rPr>
+      </w:pPr>
+      <w:r>
+        <w:rPr>
+          <w:rFonts w:ascii="Cascadia Code" w:hAnsi="Cascadia Code" w:cs="Cascadia Code" w:eastAsia="Cascadia Code"/>
+          <w:color w:val="auto"/>
+          <w:spacing w:val="0"/>
+          <w:position w:val="0"/>
+          <w:sz w:val="20"/>
+          <w:shd w:fill="auto" w:val="clear"/>
+        </w:rPr>
+        <w:t xml:space="preserve">We majorly use logerror which comes in exception logging</w:t>
+      </w:r>
+    </w:p>
+    <w:p>
+      <w:pPr>
+        <w:spacing w:before="0" w:after="60" w:line="240"/>
+        <w:ind w:right="0" w:left="0" w:firstLine="0"/>
+        <w:jc w:val="left"/>
+        <w:rPr>
+          <w:rFonts w:ascii="Cascadia Code" w:hAnsi="Cascadia Code" w:cs="Cascadia Code" w:eastAsia="Cascadia Code"/>
+          <w:color w:val="auto"/>
+          <w:spacing w:val="0"/>
+          <w:position w:val="0"/>
+          <w:sz w:val="20"/>
+          <w:shd w:fill="auto" w:val="clear"/>
+        </w:rPr>
+      </w:pPr>
+    </w:p>
+    <w:p>
+      <w:pPr>
+        <w:spacing w:before="0" w:after="60" w:line="240"/>
+        <w:ind w:right="0" w:left="0" w:firstLine="0"/>
+        <w:jc w:val="left"/>
+        <w:rPr>
+          <w:rFonts w:ascii="Cascadia Code" w:hAnsi="Cascadia Code" w:cs="Cascadia Code" w:eastAsia="Cascadia Code"/>
+          <w:b/>
+          <w:color w:val="auto"/>
+          <w:spacing w:val="0"/>
+          <w:position w:val="0"/>
+          <w:sz w:val="20"/>
+          <w:shd w:fill="auto" w:val="clear"/>
+        </w:rPr>
+      </w:pPr>
+      <w:r>
+        <w:rPr>
+          <w:rFonts w:ascii="Cascadia Code" w:hAnsi="Cascadia Code" w:cs="Cascadia Code" w:eastAsia="Cascadia Code"/>
+          <w:b/>
+          <w:color w:val="auto"/>
+          <w:spacing w:val="0"/>
+          <w:position w:val="0"/>
+          <w:sz w:val="20"/>
+          <w:shd w:fill="auto" w:val="clear"/>
+        </w:rPr>
+        <w:t xml:space="preserve">Where logs are stored :-</w:t>
+      </w:r>
+    </w:p>
+    <w:p>
+      <w:pPr>
+        <w:numPr>
+          <w:ilvl w:val="0"/>
+          <w:numId w:val="163"/>
+        </w:numPr>
+        <w:spacing w:before="0" w:after="60" w:line="240"/>
+        <w:ind w:right="0" w:left="720" w:hanging="360"/>
+        <w:jc w:val="left"/>
+        <w:rPr>
+          <w:rFonts w:ascii="Cascadia Code" w:hAnsi="Cascadia Code" w:cs="Cascadia Code" w:eastAsia="Cascadia Code"/>
+          <w:color w:val="auto"/>
+          <w:spacing w:val="0"/>
+          <w:position w:val="0"/>
+          <w:sz w:val="20"/>
+          <w:shd w:fill="auto" w:val="clear"/>
+        </w:rPr>
+      </w:pPr>
+      <w:r>
+        <w:rPr>
+          <w:rFonts w:ascii="Cascadia Code" w:hAnsi="Cascadia Code" w:cs="Cascadia Code" w:eastAsia="Cascadia Code"/>
+          <w:color w:val="auto"/>
+          <w:spacing w:val="0"/>
+          <w:position w:val="0"/>
+          <w:sz w:val="20"/>
+          <w:shd w:fill="auto" w:val="clear"/>
+        </w:rPr>
+        <w:t xml:space="preserve">common places :- console , text files , database and etc</w:t>
+      </w:r>
+    </w:p>
+    <w:p>
+      <w:pPr>
+        <w:spacing w:before="0" w:after="60" w:line="240"/>
+        <w:ind w:right="0" w:left="0" w:firstLine="0"/>
+        <w:jc w:val="left"/>
+        <w:rPr>
+          <w:rFonts w:ascii="Cascadia Code" w:hAnsi="Cascadia Code" w:cs="Cascadia Code" w:eastAsia="Cascadia Code"/>
+          <w:color w:val="auto"/>
+          <w:spacing w:val="0"/>
+          <w:position w:val="0"/>
+          <w:sz w:val="20"/>
+          <w:shd w:fill="auto" w:val="clear"/>
+        </w:rPr>
+      </w:pPr>
+    </w:p>
+    <w:p>
+      <w:pPr>
+        <w:spacing w:before="0" w:after="60" w:line="240"/>
+        <w:ind w:right="0" w:left="0" w:firstLine="0"/>
+        <w:jc w:val="left"/>
+        <w:rPr>
+          <w:rFonts w:ascii="Cascadia Code" w:hAnsi="Cascadia Code" w:cs="Cascadia Code" w:eastAsia="Cascadia Code"/>
+          <w:b/>
+          <w:color w:val="auto"/>
+          <w:spacing w:val="0"/>
+          <w:position w:val="0"/>
+          <w:sz w:val="20"/>
+          <w:shd w:fill="auto" w:val="clear"/>
+        </w:rPr>
+      </w:pPr>
+      <w:r>
+        <w:rPr>
+          <w:rFonts w:ascii="Cascadia Code" w:hAnsi="Cascadia Code" w:cs="Cascadia Code" w:eastAsia="Cascadia Code"/>
+          <w:b/>
+          <w:color w:val="auto"/>
+          <w:spacing w:val="0"/>
+          <w:position w:val="0"/>
+          <w:sz w:val="20"/>
+          <w:shd w:fill="auto" w:val="clear"/>
+        </w:rPr>
+        <w:t xml:space="preserve">What companies mostly use :-</w:t>
+      </w:r>
+    </w:p>
+    <w:p>
+      <w:pPr>
+        <w:numPr>
+          <w:ilvl w:val="0"/>
+          <w:numId w:val="165"/>
+        </w:numPr>
+        <w:spacing w:before="0" w:after="60" w:line="240"/>
+        <w:ind w:right="0" w:left="720" w:hanging="360"/>
+        <w:jc w:val="left"/>
+        <w:rPr>
+          <w:rFonts w:ascii="Cascadia Code" w:hAnsi="Cascadia Code" w:cs="Cascadia Code" w:eastAsia="Cascadia Code"/>
+          <w:color w:val="auto"/>
+          <w:spacing w:val="0"/>
+          <w:position w:val="0"/>
+          <w:sz w:val="20"/>
+          <w:shd w:fill="auto" w:val="clear"/>
+        </w:rPr>
+      </w:pPr>
+      <w:r>
+        <w:rPr>
+          <w:rFonts w:ascii="Cascadia Code" w:hAnsi="Cascadia Code" w:cs="Cascadia Code" w:eastAsia="Cascadia Code"/>
+          <w:color w:val="auto"/>
+          <w:spacing w:val="0"/>
+          <w:position w:val="0"/>
+          <w:sz w:val="20"/>
+          <w:shd w:fill="auto" w:val="clear"/>
+        </w:rPr>
+        <w:t xml:space="preserve">They use serilog , Nlog , Ilogger , application insights</w:t>
+      </w:r>
+    </w:p>
+    <w:p>
+      <w:pPr>
+        <w:numPr>
+          <w:ilvl w:val="0"/>
+          <w:numId w:val="165"/>
+        </w:numPr>
+        <w:spacing w:before="0" w:after="60" w:line="240"/>
+        <w:ind w:right="0" w:left="720" w:hanging="360"/>
+        <w:jc w:val="left"/>
+        <w:rPr>
+          <w:rFonts w:ascii="Cascadia Code" w:hAnsi="Cascadia Code" w:cs="Cascadia Code" w:eastAsia="Cascadia Code"/>
+          <w:color w:val="auto"/>
+          <w:spacing w:val="0"/>
+          <w:position w:val="0"/>
+          <w:sz w:val="20"/>
+          <w:shd w:fill="auto" w:val="clear"/>
+        </w:rPr>
+      </w:pPr>
+      <w:r>
+        <w:rPr>
+          <w:rFonts w:ascii="Cascadia Code" w:hAnsi="Cascadia Code" w:cs="Cascadia Code" w:eastAsia="Cascadia Code"/>
+          <w:color w:val="auto"/>
+          <w:spacing w:val="0"/>
+          <w:position w:val="0"/>
+          <w:sz w:val="20"/>
+          <w:shd w:fill="auto" w:val="clear"/>
+        </w:rPr>
+        <w:t xml:space="preserve">Companies use Serilog &amp; Nlog because they provide file loggig , structure logging , centralized logging , better formatting and cloud intergrations</w:t>
+      </w:r>
+    </w:p>
+    <w:p>
+      <w:pPr>
+        <w:spacing w:before="0" w:after="60" w:line="240"/>
+        <w:ind w:right="0" w:left="0" w:firstLine="0"/>
+        <w:jc w:val="left"/>
+        <w:rPr>
+          <w:rFonts w:ascii="Cascadia Code" w:hAnsi="Cascadia Code" w:cs="Cascadia Code" w:eastAsia="Cascadia Code"/>
+          <w:color w:val="auto"/>
+          <w:spacing w:val="0"/>
+          <w:position w:val="0"/>
+          <w:sz w:val="20"/>
+          <w:shd w:fill="auto" w:val="clear"/>
+        </w:rPr>
+      </w:pPr>
+    </w:p>
+    <w:p>
+      <w:pPr>
+        <w:spacing w:before="0" w:after="60" w:line="240"/>
+        <w:ind w:right="0" w:left="0" w:firstLine="0"/>
+        <w:jc w:val="left"/>
+        <w:rPr>
+          <w:rFonts w:ascii="Cascadia Code" w:hAnsi="Cascadia Code" w:cs="Cascadia Code" w:eastAsia="Cascadia Code"/>
+          <w:b/>
+          <w:color w:val="auto"/>
+          <w:spacing w:val="0"/>
+          <w:position w:val="0"/>
+          <w:sz w:val="20"/>
+          <w:shd w:fill="auto" w:val="clear"/>
+        </w:rPr>
+      </w:pPr>
+      <w:r>
+        <w:rPr>
+          <w:rFonts w:ascii="Cascadia Code" w:hAnsi="Cascadia Code" w:cs="Cascadia Code" w:eastAsia="Cascadia Code"/>
+          <w:b/>
+          <w:color w:val="auto"/>
+          <w:spacing w:val="0"/>
+          <w:position w:val="0"/>
+          <w:sz w:val="20"/>
+          <w:shd w:fill="auto" w:val="clear"/>
+        </w:rPr>
+        <w:t xml:space="preserve">Structured Logging vs Traditional logging :- </w:t>
+      </w:r>
+    </w:p>
+    <w:p>
+      <w:pPr>
+        <w:numPr>
+          <w:ilvl w:val="0"/>
+          <w:numId w:val="167"/>
+        </w:numPr>
+        <w:spacing w:before="0" w:after="60" w:line="240"/>
+        <w:ind w:right="0" w:left="720" w:hanging="360"/>
+        <w:jc w:val="left"/>
+        <w:rPr>
+          <w:rFonts w:ascii="Cascadia Code" w:hAnsi="Cascadia Code" w:cs="Cascadia Code" w:eastAsia="Cascadia Code"/>
+          <w:color w:val="auto"/>
+          <w:spacing w:val="0"/>
+          <w:position w:val="0"/>
+          <w:sz w:val="20"/>
+          <w:shd w:fill="auto" w:val="clear"/>
+        </w:rPr>
+      </w:pPr>
+      <w:r>
+        <w:rPr>
+          <w:rFonts w:ascii="Cascadia Code" w:hAnsi="Cascadia Code" w:cs="Cascadia Code" w:eastAsia="Cascadia Code"/>
+          <w:color w:val="auto"/>
+          <w:spacing w:val="0"/>
+          <w:position w:val="0"/>
+          <w:sz w:val="20"/>
+          <w:shd w:fill="auto" w:val="clear"/>
+        </w:rPr>
+        <w:t xml:space="preserve">Traditional logging :- _logger.loginformation("")</w:t>
+      </w:r>
+    </w:p>
+    <w:p>
+      <w:pPr>
+        <w:numPr>
+          <w:ilvl w:val="0"/>
+          <w:numId w:val="167"/>
+        </w:numPr>
+        <w:spacing w:before="0" w:after="60" w:line="240"/>
+        <w:ind w:right="0" w:left="720" w:hanging="360"/>
+        <w:jc w:val="left"/>
+        <w:rPr>
+          <w:rFonts w:ascii="Cascadia Code" w:hAnsi="Cascadia Code" w:cs="Cascadia Code" w:eastAsia="Cascadia Code"/>
+          <w:color w:val="auto"/>
+          <w:spacing w:val="0"/>
+          <w:position w:val="0"/>
+          <w:sz w:val="20"/>
+          <w:shd w:fill="auto" w:val="clear"/>
+        </w:rPr>
+      </w:pPr>
+      <w:r>
+        <w:rPr>
+          <w:rFonts w:ascii="Cascadia Code" w:hAnsi="Cascadia Code" w:cs="Cascadia Code" w:eastAsia="Cascadia Code"/>
+          <w:color w:val="auto"/>
+          <w:spacing w:val="0"/>
+          <w:position w:val="0"/>
+          <w:sz w:val="20"/>
+          <w:shd w:fill="auto" w:val="clear"/>
+        </w:rPr>
+        <w:t xml:space="preserve">Structured logging :- _logger.loginformation("",emp.id)</w:t>
+      </w:r>
+    </w:p>
+    <w:p>
+      <w:pPr>
+        <w:spacing w:before="0" w:after="60" w:line="240"/>
+        <w:ind w:right="0" w:left="0" w:firstLine="0"/>
+        <w:jc w:val="left"/>
+        <w:rPr>
+          <w:rFonts w:ascii="Cascadia Code" w:hAnsi="Cascadia Code" w:cs="Cascadia Code" w:eastAsia="Cascadia Code"/>
+          <w:color w:val="auto"/>
+          <w:spacing w:val="0"/>
+          <w:position w:val="0"/>
+          <w:sz w:val="20"/>
+          <w:shd w:fill="auto" w:val="clear"/>
+        </w:rPr>
+      </w:pPr>
+      <w:r>
+        <w:rPr>
+          <w:rFonts w:ascii="Cascadia Code" w:hAnsi="Cascadia Code" w:cs="Cascadia Code" w:eastAsia="Cascadia Code"/>
+          <w:color w:val="auto"/>
+          <w:spacing w:val="0"/>
+          <w:position w:val="0"/>
+          <w:sz w:val="20"/>
+          <w:shd w:fill="auto" w:val="clear"/>
+        </w:rPr>
+        <w:t xml:space="preserve">You can use logging inside middleware too</w:t>
       </w:r>
     </w:p>
     <w:p>
@@ -9574,172 +10293,232 @@
       <w:lvlText w:val="•"/>
     </w:lvl>
   </w:abstractNum>
+  <w:abstractNum w:abstractNumId="330">
+    <w:lvl w:ilvl="0">
+      <w:start w:val="1"/>
+      <w:numFmt w:val="bullet"/>
+      <w:lvlText w:val="•"/>
+    </w:lvl>
+  </w:abstractNum>
+  <w:abstractNum w:abstractNumId="336">
+    <w:lvl w:ilvl="0">
+      <w:start w:val="1"/>
+      <w:numFmt w:val="bullet"/>
+      <w:lvlText w:val="•"/>
+    </w:lvl>
+  </w:abstractNum>
+  <w:abstractNum w:abstractNumId="342">
+    <w:lvl w:ilvl="0">
+      <w:start w:val="1"/>
+      <w:numFmt w:val="bullet"/>
+      <w:lvlText w:val="•"/>
+    </w:lvl>
+  </w:abstractNum>
+  <w:abstractNum w:abstractNumId="348">
+    <w:lvl w:ilvl="0">
+      <w:start w:val="1"/>
+      <w:numFmt w:val="bullet"/>
+      <w:lvlText w:val="•"/>
+    </w:lvl>
+  </w:abstractNum>
+  <w:abstractNum w:abstractNumId="354">
+    <w:lvl w:ilvl="0">
+      <w:start w:val="1"/>
+      <w:numFmt w:val="bullet"/>
+      <w:lvlText w:val="•"/>
+    </w:lvl>
+  </w:abstractNum>
+  <w:abstractNum w:abstractNumId="360">
+    <w:lvl w:ilvl="0">
+      <w:start w:val="1"/>
+      <w:numFmt w:val="bullet"/>
+      <w:lvlText w:val="•"/>
+    </w:lvl>
+  </w:abstractNum>
   <w:num w:numId="2">
+    <w:abstractNumId w:val="360"/>
+  </w:num>
+  <w:num w:numId="5">
+    <w:abstractNumId w:val="354"/>
+  </w:num>
+  <w:num w:numId="8">
+    <w:abstractNumId w:val="348"/>
+  </w:num>
+  <w:num w:numId="10">
+    <w:abstractNumId w:val="342"/>
+  </w:num>
+  <w:num w:numId="13">
+    <w:abstractNumId w:val="336"/>
+  </w:num>
+  <w:num w:numId="19">
+    <w:abstractNumId w:val="330"/>
+  </w:num>
+  <w:num w:numId="22">
     <w:abstractNumId w:val="324"/>
   </w:num>
-  <w:num w:numId="5">
+  <w:num w:numId="25">
     <w:abstractNumId w:val="318"/>
   </w:num>
-  <w:num w:numId="8">
+  <w:num w:numId="30">
     <w:abstractNumId w:val="312"/>
   </w:num>
-  <w:num w:numId="10">
+  <w:num w:numId="33">
     <w:abstractNumId w:val="306"/>
   </w:num>
-  <w:num w:numId="13">
+  <w:num w:numId="36">
     <w:abstractNumId w:val="300"/>
   </w:num>
-  <w:num w:numId="19">
+  <w:num w:numId="39">
     <w:abstractNumId w:val="294"/>
   </w:num>
-  <w:num w:numId="22">
+  <w:num w:numId="42">
     <w:abstractNumId w:val="288"/>
   </w:num>
-  <w:num w:numId="25">
+  <w:num w:numId="46">
     <w:abstractNumId w:val="282"/>
   </w:num>
-  <w:num w:numId="30">
+  <w:num w:numId="49">
     <w:abstractNumId w:val="276"/>
   </w:num>
-  <w:num w:numId="33">
+  <w:num w:numId="52">
     <w:abstractNumId w:val="270"/>
   </w:num>
-  <w:num w:numId="36">
+  <w:num w:numId="55">
     <w:abstractNumId w:val="264"/>
   </w:num>
-  <w:num w:numId="39">
+  <w:num w:numId="57">
     <w:abstractNumId w:val="258"/>
   </w:num>
-  <w:num w:numId="42">
+  <w:num w:numId="59">
     <w:abstractNumId w:val="252"/>
   </w:num>
-  <w:num w:numId="46">
+  <w:num w:numId="62">
     <w:abstractNumId w:val="246"/>
   </w:num>
-  <w:num w:numId="49">
+  <w:num w:numId="65">
     <w:abstractNumId w:val="240"/>
   </w:num>
-  <w:num w:numId="52">
+  <w:num w:numId="68">
     <w:abstractNumId w:val="234"/>
   </w:num>
-  <w:num w:numId="55">
+  <w:num w:numId="71">
     <w:abstractNumId w:val="228"/>
   </w:num>
-  <w:num w:numId="57">
+  <w:num w:numId="74">
     <w:abstractNumId w:val="222"/>
   </w:num>
-  <w:num w:numId="59">
+  <w:num w:numId="77">
     <w:abstractNumId w:val="216"/>
   </w:num>
-  <w:num w:numId="62">
+  <w:num w:numId="80">
     <w:abstractNumId w:val="210"/>
   </w:num>
-  <w:num w:numId="65">
+  <w:num w:numId="83">
     <w:abstractNumId w:val="204"/>
   </w:num>
-  <w:num w:numId="68">
+  <w:num w:numId="86">
     <w:abstractNumId w:val="198"/>
   </w:num>
-  <w:num w:numId="71">
+  <w:num w:numId="88">
     <w:abstractNumId w:val="192"/>
   </w:num>
-  <w:num w:numId="74">
+  <w:num w:numId="91">
     <w:abstractNumId w:val="186"/>
   </w:num>
-  <w:num w:numId="77">
+  <w:num w:numId="94">
     <w:abstractNumId w:val="180"/>
   </w:num>
-  <w:num w:numId="80">
+  <w:num w:numId="97">
     <w:abstractNumId w:val="174"/>
   </w:num>
-  <w:num w:numId="83">
+  <w:num w:numId="99">
     <w:abstractNumId w:val="168"/>
   </w:num>
-  <w:num w:numId="86">
+  <w:num w:numId="101">
     <w:abstractNumId w:val="162"/>
   </w:num>
-  <w:num w:numId="88">
+  <w:num w:numId="103">
     <w:abstractNumId w:val="156"/>
   </w:num>
-  <w:num w:numId="91">
+  <w:num w:numId="106">
     <w:abstractNumId w:val="150"/>
   </w:num>
-  <w:num w:numId="94">
+  <w:num w:numId="108">
     <w:abstractNumId w:val="144"/>
   </w:num>
-  <w:num w:numId="97">
+  <w:num w:numId="110">
     <w:abstractNumId w:val="138"/>
   </w:num>
-  <w:num w:numId="99">
+  <w:num w:numId="112">
     <w:abstractNumId w:val="132"/>
   </w:num>
-  <w:num w:numId="101">
+  <w:num w:numId="115">
     <w:abstractNumId w:val="126"/>
   </w:num>
-  <w:num w:numId="103">
+  <w:num w:numId="118">
     <w:abstractNumId w:val="120"/>
   </w:num>
-  <w:num w:numId="106">
+  <w:num w:numId="121">
     <w:abstractNumId w:val="114"/>
   </w:num>
-  <w:num w:numId="108">
+  <w:num w:numId="124">
     <w:abstractNumId w:val="108"/>
   </w:num>
-  <w:num w:numId="110">
+  <w:num w:numId="127">
     <w:abstractNumId w:val="102"/>
   </w:num>
-  <w:num w:numId="112">
+  <w:num w:numId="130">
     <w:abstractNumId w:val="96"/>
   </w:num>
-  <w:num w:numId="115">
+  <w:num w:numId="133">
     <w:abstractNumId w:val="90"/>
   </w:num>
-  <w:num w:numId="118">
+  <w:num w:numId="136">
     <w:abstractNumId w:val="84"/>
   </w:num>
-  <w:num w:numId="121">
+  <w:num w:numId="138">
     <w:abstractNumId w:val="78"/>
   </w:num>
-  <w:num w:numId="124">
+  <w:num w:numId="140">
     <w:abstractNumId w:val="72"/>
   </w:num>
-  <w:num w:numId="127">
+  <w:num w:numId="142">
     <w:abstractNumId w:val="66"/>
   </w:num>
-  <w:num w:numId="130">
+  <w:num w:numId="144">
     <w:abstractNumId w:val="60"/>
   </w:num>
-  <w:num w:numId="133">
+  <w:num w:numId="146">
     <w:abstractNumId w:val="54"/>
   </w:num>
-  <w:num w:numId="136">
+  <w:num w:numId="148">
     <w:abstractNumId w:val="48"/>
-  </w:num>
-  <w:num w:numId="138">
-    <w:abstractNumId w:val="42"/>
-  </w:num>
-  <w:num w:numId="140">
-    <w:abstractNumId w:val="36"/>
-  </w:num>
-  <w:num w:numId="142">
-    <w:abstractNumId w:val="30"/>
-  </w:num>
-  <w:num w:numId="144">
-    <w:abstractNumId w:val="24"/>
-  </w:num>
-  <w:num w:numId="146">
-    <w:abstractNumId w:val="18"/>
-  </w:num>
-  <w:num w:numId="148">
-    <w:abstractNumId w:val="12"/>
   </w:num>
   <w:num w:numId="149">
     <w:abstractNumId w:val="1"/>
   </w:num>
   <w:num w:numId="152">
+    <w:abstractNumId w:val="42"/>
+  </w:num>
+  <w:num w:numId="154">
+    <w:abstractNumId w:val="36"/>
+  </w:num>
+  <w:num w:numId="157">
+    <w:abstractNumId w:val="30"/>
+  </w:num>
+  <w:num w:numId="159">
+    <w:abstractNumId w:val="24"/>
+  </w:num>
+  <w:num w:numId="161">
+    <w:abstractNumId w:val="18"/>
+  </w:num>
+  <w:num w:numId="163">
+    <w:abstractNumId w:val="12"/>
+  </w:num>
+  <w:num w:numId="165">
     <w:abstractNumId w:val="6"/>
   </w:num>
-  <w:num w:numId="154">
+  <w:num w:numId="167">
     <w:abstractNumId w:val="0"/>
   </w:num>
 </w:numbering>

</xml_diff>

<commit_message>
Logging to file in asp net core using nlog
</commit_message>
<xml_diff>
--- a/Asp.Net Core Notes.docx
+++ b/Asp.Net Core Notes.docx
@@ -8994,6 +8994,478 @@
           <w:shd w:fill="auto" w:val="clear"/>
         </w:rPr>
       </w:pPr>
+    </w:p>
+    <w:p>
+      <w:pPr>
+        <w:spacing w:before="0" w:after="60" w:line="240"/>
+        <w:ind w:right="0" w:left="0" w:firstLine="0"/>
+        <w:jc w:val="left"/>
+        <w:rPr>
+          <w:rFonts w:ascii="Cascadia Code" w:hAnsi="Cascadia Code" w:cs="Cascadia Code" w:eastAsia="Cascadia Code"/>
+          <w:b/>
+          <w:color w:val="auto"/>
+          <w:spacing w:val="0"/>
+          <w:position w:val="0"/>
+          <w:sz w:val="20"/>
+          <w:shd w:fill="auto" w:val="clear"/>
+        </w:rPr>
+      </w:pPr>
+      <w:r>
+        <w:rPr>
+          <w:rFonts w:ascii="Cascadia Code" w:hAnsi="Cascadia Code" w:cs="Cascadia Code" w:eastAsia="Cascadia Code"/>
+          <w:b/>
+          <w:color w:val="auto"/>
+          <w:spacing w:val="0"/>
+          <w:position w:val="0"/>
+          <w:sz w:val="20"/>
+          <w:shd w:fill="auto" w:val="clear"/>
+        </w:rPr>
+        <w:t xml:space="preserve">Lecture :- ( Logging to file in asp net core using nlog )</w:t>
+      </w:r>
+    </w:p>
+    <w:p>
+      <w:pPr>
+        <w:numPr>
+          <w:ilvl w:val="0"/>
+          <w:numId w:val="170"/>
+        </w:numPr>
+        <w:spacing w:before="0" w:after="60" w:line="240"/>
+        <w:ind w:right="0" w:left="720" w:hanging="360"/>
+        <w:jc w:val="left"/>
+        <w:rPr>
+          <w:rFonts w:ascii="Cascadia Code" w:hAnsi="Cascadia Code" w:cs="Cascadia Code" w:eastAsia="Cascadia Code"/>
+          <w:color w:val="auto"/>
+          <w:spacing w:val="0"/>
+          <w:position w:val="0"/>
+          <w:sz w:val="20"/>
+          <w:shd w:fill="auto" w:val="clear"/>
+        </w:rPr>
+      </w:pPr>
+      <w:r>
+        <w:rPr>
+          <w:rFonts w:ascii="Cascadia Code" w:hAnsi="Cascadia Code" w:cs="Cascadia Code" w:eastAsia="Cascadia Code"/>
+          <w:color w:val="auto"/>
+          <w:spacing w:val="0"/>
+          <w:position w:val="0"/>
+          <w:sz w:val="20"/>
+          <w:shd w:fill="auto" w:val="clear"/>
+        </w:rPr>
+        <w:t xml:space="preserve">Nlog is a logging framework which is used to store applications logs into files , databasea , console etc</w:t>
+      </w:r>
+    </w:p>
+    <w:p>
+      <w:pPr>
+        <w:numPr>
+          <w:ilvl w:val="0"/>
+          <w:numId w:val="170"/>
+        </w:numPr>
+        <w:spacing w:before="0" w:after="60" w:line="240"/>
+        <w:ind w:right="0" w:left="720" w:hanging="360"/>
+        <w:jc w:val="left"/>
+        <w:rPr>
+          <w:rFonts w:ascii="Cascadia Code" w:hAnsi="Cascadia Code" w:cs="Cascadia Code" w:eastAsia="Cascadia Code"/>
+          <w:color w:val="auto"/>
+          <w:spacing w:val="0"/>
+          <w:position w:val="0"/>
+          <w:sz w:val="20"/>
+          <w:shd w:fill="auto" w:val="clear"/>
+        </w:rPr>
+      </w:pPr>
+      <w:r>
+        <w:rPr>
+          <w:rFonts w:ascii="Cascadia Code" w:hAnsi="Cascadia Code" w:cs="Cascadia Code" w:eastAsia="Cascadia Code"/>
+          <w:color w:val="auto"/>
+          <w:spacing w:val="0"/>
+          <w:position w:val="0"/>
+          <w:sz w:val="20"/>
+          <w:shd w:fill="auto" w:val="clear"/>
+        </w:rPr>
+        <w:t xml:space="preserve">It's majorly used for storing logs in text files , production debugging and centralized monitoring</w:t>
+      </w:r>
+    </w:p>
+    <w:p>
+      <w:pPr>
+        <w:spacing w:before="0" w:after="60" w:line="240"/>
+        <w:ind w:right="0" w:left="0" w:firstLine="0"/>
+        <w:jc w:val="left"/>
+        <w:rPr>
+          <w:rFonts w:ascii="Cascadia Code" w:hAnsi="Cascadia Code" w:cs="Cascadia Code" w:eastAsia="Cascadia Code"/>
+          <w:b/>
+          <w:color w:val="auto"/>
+          <w:spacing w:val="0"/>
+          <w:position w:val="0"/>
+          <w:sz w:val="20"/>
+          <w:shd w:fill="auto" w:val="clear"/>
+        </w:rPr>
+      </w:pPr>
+    </w:p>
+    <w:p>
+      <w:pPr>
+        <w:spacing w:before="0" w:after="60" w:line="240"/>
+        <w:ind w:right="0" w:left="0" w:firstLine="0"/>
+        <w:jc w:val="left"/>
+        <w:rPr>
+          <w:rFonts w:ascii="Cascadia Code" w:hAnsi="Cascadia Code" w:cs="Cascadia Code" w:eastAsia="Cascadia Code"/>
+          <w:b/>
+          <w:color w:val="auto"/>
+          <w:spacing w:val="0"/>
+          <w:position w:val="0"/>
+          <w:sz w:val="20"/>
+          <w:shd w:fill="auto" w:val="clear"/>
+        </w:rPr>
+      </w:pPr>
+      <w:r>
+        <w:rPr>
+          <w:rFonts w:ascii="Cascadia Code" w:hAnsi="Cascadia Code" w:cs="Cascadia Code" w:eastAsia="Cascadia Code"/>
+          <w:b/>
+          <w:color w:val="auto"/>
+          <w:spacing w:val="0"/>
+          <w:position w:val="0"/>
+          <w:sz w:val="20"/>
+          <w:shd w:fill="auto" w:val="clear"/>
+        </w:rPr>
+        <w:t xml:space="preserve">Why Required :-</w:t>
+      </w:r>
+    </w:p>
+    <w:p>
+      <w:pPr>
+        <w:numPr>
+          <w:ilvl w:val="0"/>
+          <w:numId w:val="172"/>
+        </w:numPr>
+        <w:spacing w:before="0" w:after="60" w:line="240"/>
+        <w:ind w:right="0" w:left="720" w:hanging="360"/>
+        <w:jc w:val="left"/>
+        <w:rPr>
+          <w:rFonts w:ascii="Cascadia Code" w:hAnsi="Cascadia Code" w:cs="Cascadia Code" w:eastAsia="Cascadia Code"/>
+          <w:color w:val="auto"/>
+          <w:spacing w:val="0"/>
+          <w:position w:val="0"/>
+          <w:sz w:val="20"/>
+          <w:shd w:fill="auto" w:val="clear"/>
+        </w:rPr>
+      </w:pPr>
+      <w:r>
+        <w:rPr>
+          <w:rFonts w:ascii="Cascadia Code" w:hAnsi="Cascadia Code" w:cs="Cascadia Code" w:eastAsia="Cascadia Code"/>
+          <w:color w:val="auto"/>
+          <w:spacing w:val="0"/>
+          <w:position w:val="0"/>
+          <w:sz w:val="20"/>
+          <w:shd w:fill="auto" w:val="clear"/>
+        </w:rPr>
+        <w:t xml:space="preserve">Default asp.net core logging mostly shows logs ins console</w:t>
+      </w:r>
+    </w:p>
+    <w:p>
+      <w:pPr>
+        <w:numPr>
+          <w:ilvl w:val="0"/>
+          <w:numId w:val="172"/>
+        </w:numPr>
+        <w:spacing w:before="0" w:after="60" w:line="240"/>
+        <w:ind w:right="0" w:left="720" w:hanging="360"/>
+        <w:jc w:val="left"/>
+        <w:rPr>
+          <w:rFonts w:ascii="Cascadia Code" w:hAnsi="Cascadia Code" w:cs="Cascadia Code" w:eastAsia="Cascadia Code"/>
+          <w:color w:val="auto"/>
+          <w:spacing w:val="0"/>
+          <w:position w:val="0"/>
+          <w:sz w:val="20"/>
+          <w:shd w:fill="auto" w:val="clear"/>
+        </w:rPr>
+      </w:pPr>
+      <w:r>
+        <w:rPr>
+          <w:rFonts w:ascii="Cascadia Code" w:hAnsi="Cascadia Code" w:cs="Cascadia Code" w:eastAsia="Cascadia Code"/>
+          <w:color w:val="auto"/>
+          <w:spacing w:val="0"/>
+          <w:position w:val="0"/>
+          <w:sz w:val="20"/>
+          <w:shd w:fill="auto" w:val="clear"/>
+        </w:rPr>
+        <w:t xml:space="preserve">But in rteal production :-</w:t>
+      </w:r>
+    </w:p>
+    <w:p>
+      <w:pPr>
+        <w:spacing w:before="0" w:after="60" w:line="240"/>
+        <w:ind w:right="0" w:left="0" w:firstLine="0"/>
+        <w:jc w:val="left"/>
+        <w:rPr>
+          <w:rFonts w:ascii="Cascadia Code" w:hAnsi="Cascadia Code" w:cs="Cascadia Code" w:eastAsia="Cascadia Code"/>
+          <w:color w:val="auto"/>
+          <w:spacing w:val="0"/>
+          <w:position w:val="0"/>
+          <w:sz w:val="20"/>
+          <w:shd w:fill="auto" w:val="clear"/>
+        </w:rPr>
+      </w:pPr>
+      <w:r>
+        <w:rPr>
+          <w:rFonts w:ascii="Cascadia Code" w:hAnsi="Cascadia Code" w:cs="Cascadia Code" w:eastAsia="Cascadia Code"/>
+          <w:color w:val="auto"/>
+          <w:spacing w:val="0"/>
+          <w:position w:val="0"/>
+          <w:sz w:val="20"/>
+          <w:shd w:fill="auto" w:val="clear"/>
+        </w:rPr>
+        <w:t xml:space="preserve">      1. console logs are not enough</w:t>
+      </w:r>
+    </w:p>
+    <w:p>
+      <w:pPr>
+        <w:spacing w:before="0" w:after="60" w:line="240"/>
+        <w:ind w:right="0" w:left="0" w:firstLine="0"/>
+        <w:jc w:val="left"/>
+        <w:rPr>
+          <w:rFonts w:ascii="Cascadia Code" w:hAnsi="Cascadia Code" w:cs="Cascadia Code" w:eastAsia="Cascadia Code"/>
+          <w:color w:val="auto"/>
+          <w:spacing w:val="0"/>
+          <w:position w:val="0"/>
+          <w:sz w:val="20"/>
+          <w:shd w:fill="auto" w:val="clear"/>
+        </w:rPr>
+      </w:pPr>
+      <w:r>
+        <w:rPr>
+          <w:rFonts w:ascii="Cascadia Code" w:hAnsi="Cascadia Code" w:cs="Cascadia Code" w:eastAsia="Cascadia Code"/>
+          <w:color w:val="auto"/>
+          <w:spacing w:val="0"/>
+          <w:position w:val="0"/>
+          <w:sz w:val="20"/>
+          <w:shd w:fill="auto" w:val="clear"/>
+        </w:rPr>
+        <w:t xml:space="preserve">      2. application may run on server/background</w:t>
+      </w:r>
+    </w:p>
+    <w:p>
+      <w:pPr>
+        <w:spacing w:before="0" w:after="60" w:line="240"/>
+        <w:ind w:right="0" w:left="0" w:firstLine="0"/>
+        <w:jc w:val="left"/>
+        <w:rPr>
+          <w:rFonts w:ascii="Cascadia Code" w:hAnsi="Cascadia Code" w:cs="Cascadia Code" w:eastAsia="Cascadia Code"/>
+          <w:color w:val="auto"/>
+          <w:spacing w:val="0"/>
+          <w:position w:val="0"/>
+          <w:sz w:val="20"/>
+          <w:shd w:fill="auto" w:val="clear"/>
+        </w:rPr>
+      </w:pPr>
+      <w:r>
+        <w:rPr>
+          <w:rFonts w:ascii="Cascadia Code" w:hAnsi="Cascadia Code" w:cs="Cascadia Code" w:eastAsia="Cascadia Code"/>
+          <w:color w:val="auto"/>
+          <w:spacing w:val="0"/>
+          <w:position w:val="0"/>
+          <w:sz w:val="20"/>
+          <w:shd w:fill="auto" w:val="clear"/>
+        </w:rPr>
+        <w:t xml:space="preserve">      3. logs need to be store permanently</w:t>
+      </w:r>
+    </w:p>
+    <w:p>
+      <w:pPr>
+        <w:numPr>
+          <w:ilvl w:val="0"/>
+          <w:numId w:val="174"/>
+        </w:numPr>
+        <w:spacing w:before="0" w:after="60" w:line="240"/>
+        <w:ind w:right="0" w:left="720" w:hanging="360"/>
+        <w:jc w:val="left"/>
+        <w:rPr>
+          <w:rFonts w:ascii="Cascadia Code" w:hAnsi="Cascadia Code" w:cs="Cascadia Code" w:eastAsia="Cascadia Code"/>
+          <w:color w:val="auto"/>
+          <w:spacing w:val="0"/>
+          <w:position w:val="0"/>
+          <w:sz w:val="20"/>
+          <w:shd w:fill="auto" w:val="clear"/>
+        </w:rPr>
+      </w:pPr>
+      <w:r>
+        <w:rPr>
+          <w:rFonts w:ascii="Cascadia Code" w:hAnsi="Cascadia Code" w:cs="Cascadia Code" w:eastAsia="Cascadia Code"/>
+          <w:color w:val="auto"/>
+          <w:spacing w:val="0"/>
+          <w:position w:val="0"/>
+          <w:sz w:val="20"/>
+          <w:shd w:fill="auto" w:val="clear"/>
+        </w:rPr>
+        <w:t xml:space="preserve">These types of logging is important because let suppose u have updated something on production and it got crash in some kind of demo , now without taking someone help , if u wanna see those logs . at that if those are not stored somewhere that's an issue then . So for this we  use these type of logging frameworks</w:t>
+      </w:r>
+    </w:p>
+    <w:p>
+      <w:pPr>
+        <w:numPr>
+          <w:ilvl w:val="0"/>
+          <w:numId w:val="174"/>
+        </w:numPr>
+        <w:spacing w:before="0" w:after="60" w:line="240"/>
+        <w:ind w:right="0" w:left="720" w:hanging="360"/>
+        <w:jc w:val="left"/>
+        <w:rPr>
+          <w:rFonts w:ascii="Cascadia Code" w:hAnsi="Cascadia Code" w:cs="Cascadia Code" w:eastAsia="Cascadia Code"/>
+          <w:color w:val="auto"/>
+          <w:spacing w:val="0"/>
+          <w:position w:val="0"/>
+          <w:sz w:val="20"/>
+          <w:shd w:fill="auto" w:val="clear"/>
+        </w:rPr>
+      </w:pPr>
+      <w:r>
+        <w:rPr>
+          <w:rFonts w:ascii="Cascadia Code" w:hAnsi="Cascadia Code" w:cs="Cascadia Code" w:eastAsia="Cascadia Code"/>
+          <w:color w:val="auto"/>
+          <w:spacing w:val="0"/>
+          <w:position w:val="0"/>
+          <w:sz w:val="20"/>
+          <w:shd w:fill="auto" w:val="clear"/>
+        </w:rPr>
+        <w:t xml:space="preserve">if u wanna use nlog then u have to install nlog using this Install-Package NLog.Web.AspNetCore</w:t>
+      </w:r>
+    </w:p>
+    <w:p>
+      <w:pPr>
+        <w:spacing w:before="0" w:after="60" w:line="240"/>
+        <w:ind w:right="0" w:left="0" w:firstLine="0"/>
+        <w:jc w:val="left"/>
+        <w:rPr>
+          <w:rFonts w:ascii="Cascadia Code" w:hAnsi="Cascadia Code" w:cs="Cascadia Code" w:eastAsia="Cascadia Code"/>
+          <w:color w:val="auto"/>
+          <w:spacing w:val="0"/>
+          <w:position w:val="0"/>
+          <w:sz w:val="20"/>
+          <w:shd w:fill="auto" w:val="clear"/>
+        </w:rPr>
+      </w:pPr>
+      <w:r>
+        <w:rPr>
+          <w:rFonts w:ascii="Cascadia Code" w:hAnsi="Cascadia Code" w:cs="Cascadia Code" w:eastAsia="Cascadia Code"/>
+          <w:color w:val="auto"/>
+          <w:spacing w:val="0"/>
+          <w:position w:val="0"/>
+          <w:sz w:val="20"/>
+          <w:shd w:fill="auto" w:val="clear"/>
+        </w:rPr>
+        <w:tab/>
+      </w:r>
+    </w:p>
+    <w:p>
+      <w:pPr>
+        <w:spacing w:before="0" w:after="60" w:line="240"/>
+        <w:ind w:right="0" w:left="0" w:firstLine="0"/>
+        <w:jc w:val="left"/>
+        <w:rPr>
+          <w:rFonts w:ascii="Cascadia Code" w:hAnsi="Cascadia Code" w:cs="Cascadia Code" w:eastAsia="Cascadia Code"/>
+          <w:color w:val="auto"/>
+          <w:spacing w:val="0"/>
+          <w:position w:val="0"/>
+          <w:sz w:val="20"/>
+          <w:shd w:fill="auto" w:val="clear"/>
+        </w:rPr>
+      </w:pPr>
+      <w:r>
+        <w:rPr>
+          <w:rFonts w:ascii="Cascadia Code" w:hAnsi="Cascadia Code" w:cs="Cascadia Code" w:eastAsia="Cascadia Code"/>
+          <w:color w:val="auto"/>
+          <w:spacing w:val="0"/>
+          <w:position w:val="0"/>
+          <w:sz w:val="20"/>
+          <w:shd w:fill="auto" w:val="clear"/>
+        </w:rPr>
+        <w:t xml:space="preserve">   //remove default loggers</w:t>
+      </w:r>
+    </w:p>
+    <w:p>
+      <w:pPr>
+        <w:numPr>
+          <w:ilvl w:val="0"/>
+          <w:numId w:val="176"/>
+        </w:numPr>
+        <w:spacing w:before="0" w:after="60" w:line="240"/>
+        <w:ind w:right="0" w:left="720" w:hanging="360"/>
+        <w:jc w:val="left"/>
+        <w:rPr>
+          <w:rFonts w:ascii="Cascadia Code" w:hAnsi="Cascadia Code" w:cs="Cascadia Code" w:eastAsia="Cascadia Code"/>
+          <w:color w:val="auto"/>
+          <w:spacing w:val="0"/>
+          <w:position w:val="0"/>
+          <w:sz w:val="20"/>
+          <w:shd w:fill="auto" w:val="clear"/>
+        </w:rPr>
+      </w:pPr>
+      <w:r>
+        <w:rPr>
+          <w:rFonts w:ascii="Cascadia Code" w:hAnsi="Cascadia Code" w:cs="Cascadia Code" w:eastAsia="Cascadia Code"/>
+          <w:color w:val="auto"/>
+          <w:spacing w:val="0"/>
+          <w:position w:val="0"/>
+          <w:sz w:val="20"/>
+          <w:shd w:fill="auto" w:val="clear"/>
+        </w:rPr>
+        <w:t xml:space="preserve">builder.Logging.ClearProviders();</w:t>
+      </w:r>
+    </w:p>
+    <w:p>
+      <w:pPr>
+        <w:numPr>
+          <w:ilvl w:val="0"/>
+          <w:numId w:val="176"/>
+        </w:numPr>
+        <w:spacing w:before="0" w:after="60" w:line="240"/>
+        <w:ind w:right="0" w:left="720" w:hanging="360"/>
+        <w:jc w:val="left"/>
+        <w:rPr>
+          <w:rFonts w:ascii="Cascadia Code" w:hAnsi="Cascadia Code" w:cs="Cascadia Code" w:eastAsia="Cascadia Code"/>
+          <w:color w:val="auto"/>
+          <w:spacing w:val="0"/>
+          <w:position w:val="0"/>
+          <w:sz w:val="20"/>
+          <w:shd w:fill="auto" w:val="clear"/>
+        </w:rPr>
+      </w:pPr>
+      <w:r>
+        <w:rPr>
+          <w:rFonts w:ascii="Cascadia Code" w:hAnsi="Cascadia Code" w:cs="Cascadia Code" w:eastAsia="Cascadia Code"/>
+          <w:color w:val="auto"/>
+          <w:spacing w:val="0"/>
+          <w:position w:val="0"/>
+          <w:sz w:val="20"/>
+          <w:shd w:fill="auto" w:val="clear"/>
+        </w:rPr>
+        <w:t xml:space="preserve">builder.Host.UseNLog()</w:t>
+      </w:r>
+    </w:p>
+    <w:p>
+      <w:pPr>
+        <w:numPr>
+          <w:ilvl w:val="0"/>
+          <w:numId w:val="176"/>
+        </w:numPr>
+        <w:spacing w:before="0" w:after="60" w:line="240"/>
+        <w:ind w:right="0" w:left="720" w:hanging="360"/>
+        <w:jc w:val="left"/>
+        <w:rPr>
+          <w:rFonts w:ascii="Cascadia Code" w:hAnsi="Cascadia Code" w:cs="Cascadia Code" w:eastAsia="Cascadia Code"/>
+          <w:color w:val="auto"/>
+          <w:spacing w:val="0"/>
+          <w:position w:val="0"/>
+          <w:sz w:val="20"/>
+          <w:shd w:fill="auto" w:val="clear"/>
+        </w:rPr>
+      </w:pPr>
+      <w:r>
+        <w:rPr>
+          <w:rFonts w:ascii="Cascadia Code" w:hAnsi="Cascadia Code" w:cs="Cascadia Code" w:eastAsia="Cascadia Code"/>
+          <w:color w:val="auto"/>
+          <w:spacing w:val="0"/>
+          <w:position w:val="0"/>
+          <w:sz w:val="20"/>
+          <w:shd w:fill="auto" w:val="clear"/>
+        </w:rPr>
+        <w:t xml:space="preserve">and we create nlog.config manually in which log are going to stored</w:t>
+      </w:r>
     </w:p>
     <w:p>
       <w:pPr>
@@ -10335,190 +10807,230 @@
       <w:lvlText w:val="•"/>
     </w:lvl>
   </w:abstractNum>
+  <w:abstractNum w:abstractNumId="366">
+    <w:lvl w:ilvl="0">
+      <w:start w:val="1"/>
+      <w:numFmt w:val="bullet"/>
+      <w:lvlText w:val="•"/>
+    </w:lvl>
+  </w:abstractNum>
+  <w:abstractNum w:abstractNumId="372">
+    <w:lvl w:ilvl="0">
+      <w:start w:val="1"/>
+      <w:numFmt w:val="bullet"/>
+      <w:lvlText w:val="•"/>
+    </w:lvl>
+  </w:abstractNum>
+  <w:abstractNum w:abstractNumId="378">
+    <w:lvl w:ilvl="0">
+      <w:start w:val="1"/>
+      <w:numFmt w:val="bullet"/>
+      <w:lvlText w:val="•"/>
+    </w:lvl>
+  </w:abstractNum>
+  <w:abstractNum w:abstractNumId="384">
+    <w:lvl w:ilvl="0">
+      <w:start w:val="1"/>
+      <w:numFmt w:val="bullet"/>
+      <w:lvlText w:val="•"/>
+    </w:lvl>
+  </w:abstractNum>
   <w:num w:numId="2">
+    <w:abstractNumId w:val="384"/>
+  </w:num>
+  <w:num w:numId="5">
+    <w:abstractNumId w:val="378"/>
+  </w:num>
+  <w:num w:numId="8">
+    <w:abstractNumId w:val="372"/>
+  </w:num>
+  <w:num w:numId="10">
+    <w:abstractNumId w:val="366"/>
+  </w:num>
+  <w:num w:numId="13">
     <w:abstractNumId w:val="360"/>
   </w:num>
-  <w:num w:numId="5">
+  <w:num w:numId="19">
     <w:abstractNumId w:val="354"/>
   </w:num>
-  <w:num w:numId="8">
+  <w:num w:numId="22">
     <w:abstractNumId w:val="348"/>
   </w:num>
-  <w:num w:numId="10">
+  <w:num w:numId="25">
     <w:abstractNumId w:val="342"/>
   </w:num>
-  <w:num w:numId="13">
+  <w:num w:numId="30">
     <w:abstractNumId w:val="336"/>
   </w:num>
-  <w:num w:numId="19">
+  <w:num w:numId="33">
     <w:abstractNumId w:val="330"/>
   </w:num>
-  <w:num w:numId="22">
+  <w:num w:numId="36">
     <w:abstractNumId w:val="324"/>
   </w:num>
-  <w:num w:numId="25">
+  <w:num w:numId="39">
     <w:abstractNumId w:val="318"/>
   </w:num>
-  <w:num w:numId="30">
+  <w:num w:numId="42">
     <w:abstractNumId w:val="312"/>
   </w:num>
-  <w:num w:numId="33">
+  <w:num w:numId="46">
     <w:abstractNumId w:val="306"/>
   </w:num>
-  <w:num w:numId="36">
+  <w:num w:numId="49">
     <w:abstractNumId w:val="300"/>
   </w:num>
-  <w:num w:numId="39">
+  <w:num w:numId="52">
     <w:abstractNumId w:val="294"/>
   </w:num>
-  <w:num w:numId="42">
+  <w:num w:numId="55">
     <w:abstractNumId w:val="288"/>
   </w:num>
-  <w:num w:numId="46">
+  <w:num w:numId="57">
     <w:abstractNumId w:val="282"/>
   </w:num>
-  <w:num w:numId="49">
+  <w:num w:numId="59">
     <w:abstractNumId w:val="276"/>
   </w:num>
-  <w:num w:numId="52">
+  <w:num w:numId="62">
     <w:abstractNumId w:val="270"/>
   </w:num>
-  <w:num w:numId="55">
+  <w:num w:numId="65">
     <w:abstractNumId w:val="264"/>
   </w:num>
-  <w:num w:numId="57">
+  <w:num w:numId="68">
     <w:abstractNumId w:val="258"/>
   </w:num>
-  <w:num w:numId="59">
+  <w:num w:numId="71">
     <w:abstractNumId w:val="252"/>
   </w:num>
-  <w:num w:numId="62">
+  <w:num w:numId="74">
     <w:abstractNumId w:val="246"/>
   </w:num>
-  <w:num w:numId="65">
+  <w:num w:numId="77">
     <w:abstractNumId w:val="240"/>
   </w:num>
-  <w:num w:numId="68">
+  <w:num w:numId="80">
     <w:abstractNumId w:val="234"/>
   </w:num>
-  <w:num w:numId="71">
+  <w:num w:numId="83">
     <w:abstractNumId w:val="228"/>
   </w:num>
-  <w:num w:numId="74">
+  <w:num w:numId="86">
     <w:abstractNumId w:val="222"/>
   </w:num>
-  <w:num w:numId="77">
+  <w:num w:numId="88">
     <w:abstractNumId w:val="216"/>
   </w:num>
-  <w:num w:numId="80">
+  <w:num w:numId="91">
     <w:abstractNumId w:val="210"/>
   </w:num>
-  <w:num w:numId="83">
+  <w:num w:numId="94">
     <w:abstractNumId w:val="204"/>
   </w:num>
-  <w:num w:numId="86">
+  <w:num w:numId="97">
     <w:abstractNumId w:val="198"/>
   </w:num>
-  <w:num w:numId="88">
+  <w:num w:numId="99">
     <w:abstractNumId w:val="192"/>
   </w:num>
-  <w:num w:numId="91">
+  <w:num w:numId="101">
     <w:abstractNumId w:val="186"/>
   </w:num>
-  <w:num w:numId="94">
+  <w:num w:numId="103">
     <w:abstractNumId w:val="180"/>
   </w:num>
-  <w:num w:numId="97">
+  <w:num w:numId="106">
     <w:abstractNumId w:val="174"/>
   </w:num>
-  <w:num w:numId="99">
+  <w:num w:numId="108">
     <w:abstractNumId w:val="168"/>
   </w:num>
-  <w:num w:numId="101">
+  <w:num w:numId="110">
     <w:abstractNumId w:val="162"/>
   </w:num>
-  <w:num w:numId="103">
+  <w:num w:numId="112">
     <w:abstractNumId w:val="156"/>
   </w:num>
-  <w:num w:numId="106">
+  <w:num w:numId="115">
     <w:abstractNumId w:val="150"/>
   </w:num>
-  <w:num w:numId="108">
+  <w:num w:numId="118">
     <w:abstractNumId w:val="144"/>
   </w:num>
-  <w:num w:numId="110">
+  <w:num w:numId="121">
     <w:abstractNumId w:val="138"/>
   </w:num>
-  <w:num w:numId="112">
+  <w:num w:numId="124">
     <w:abstractNumId w:val="132"/>
   </w:num>
-  <w:num w:numId="115">
+  <w:num w:numId="127">
     <w:abstractNumId w:val="126"/>
   </w:num>
-  <w:num w:numId="118">
+  <w:num w:numId="130">
     <w:abstractNumId w:val="120"/>
   </w:num>
-  <w:num w:numId="121">
+  <w:num w:numId="133">
     <w:abstractNumId w:val="114"/>
   </w:num>
-  <w:num w:numId="124">
+  <w:num w:numId="136">
     <w:abstractNumId w:val="108"/>
   </w:num>
-  <w:num w:numId="127">
+  <w:num w:numId="138">
     <w:abstractNumId w:val="102"/>
   </w:num>
-  <w:num w:numId="130">
+  <w:num w:numId="140">
     <w:abstractNumId w:val="96"/>
   </w:num>
-  <w:num w:numId="133">
+  <w:num w:numId="142">
     <w:abstractNumId w:val="90"/>
   </w:num>
-  <w:num w:numId="136">
+  <w:num w:numId="144">
     <w:abstractNumId w:val="84"/>
   </w:num>
-  <w:num w:numId="138">
+  <w:num w:numId="146">
     <w:abstractNumId w:val="78"/>
   </w:num>
-  <w:num w:numId="140">
+  <w:num w:numId="148">
     <w:abstractNumId w:val="72"/>
-  </w:num>
-  <w:num w:numId="142">
-    <w:abstractNumId w:val="66"/>
-  </w:num>
-  <w:num w:numId="144">
-    <w:abstractNumId w:val="60"/>
-  </w:num>
-  <w:num w:numId="146">
-    <w:abstractNumId w:val="54"/>
-  </w:num>
-  <w:num w:numId="148">
-    <w:abstractNumId w:val="48"/>
   </w:num>
   <w:num w:numId="149">
     <w:abstractNumId w:val="1"/>
   </w:num>
   <w:num w:numId="152">
+    <w:abstractNumId w:val="66"/>
+  </w:num>
+  <w:num w:numId="154">
+    <w:abstractNumId w:val="60"/>
+  </w:num>
+  <w:num w:numId="157">
+    <w:abstractNumId w:val="54"/>
+  </w:num>
+  <w:num w:numId="159">
+    <w:abstractNumId w:val="48"/>
+  </w:num>
+  <w:num w:numId="161">
     <w:abstractNumId w:val="42"/>
   </w:num>
-  <w:num w:numId="154">
+  <w:num w:numId="163">
     <w:abstractNumId w:val="36"/>
   </w:num>
-  <w:num w:numId="157">
+  <w:num w:numId="165">
     <w:abstractNumId w:val="30"/>
   </w:num>
-  <w:num w:numId="159">
+  <w:num w:numId="167">
     <w:abstractNumId w:val="24"/>
   </w:num>
-  <w:num w:numId="161">
+  <w:num w:numId="170">
     <w:abstractNumId w:val="18"/>
   </w:num>
-  <w:num w:numId="163">
+  <w:num w:numId="172">
     <w:abstractNumId w:val="12"/>
   </w:num>
-  <w:num w:numId="165">
+  <w:num w:numId="174">
     <w:abstractNumId w:val="6"/>
   </w:num>
-  <w:num w:numId="167">
+  <w:num w:numId="176">
     <w:abstractNumId w:val="0"/>
   </w:num>
 </w:numbering>

</xml_diff>

<commit_message>
ASP NET Core Identity tutorial
</commit_message>
<xml_diff>
--- a/Asp.Net Core Notes.docx
+++ b/Asp.Net Core Notes.docx
@@ -9489,13 +9489,410 @@
         <w:jc w:val="left"/>
         <w:rPr>
           <w:rFonts w:ascii="Cascadia Code" w:hAnsi="Cascadia Code" w:cs="Cascadia Code" w:eastAsia="Cascadia Code"/>
-          <w:color w:val="auto"/>
-          <w:spacing w:val="0"/>
-          <w:position w:val="0"/>
-          <w:sz w:val="20"/>
-          <w:shd w:fill="auto" w:val="clear"/>
-        </w:rPr>
-      </w:pPr>
+          <w:b/>
+          <w:color w:val="auto"/>
+          <w:spacing w:val="0"/>
+          <w:position w:val="0"/>
+          <w:sz w:val="20"/>
+          <w:shd w:fill="auto" w:val="clear"/>
+        </w:rPr>
+      </w:pPr>
+      <w:r>
+        <w:rPr>
+          <w:rFonts w:ascii="Cascadia Code" w:hAnsi="Cascadia Code" w:cs="Cascadia Code" w:eastAsia="Cascadia Code"/>
+          <w:b/>
+          <w:color w:val="auto"/>
+          <w:spacing w:val="0"/>
+          <w:position w:val="0"/>
+          <w:sz w:val="20"/>
+          <w:shd w:fill="auto" w:val="clear"/>
+        </w:rPr>
+        <w:t xml:space="preserve">Lecture :- ( ASP NET Core Identity tutorial )</w:t>
+      </w:r>
+    </w:p>
+    <w:p>
+      <w:pPr>
+        <w:numPr>
+          <w:ilvl w:val="0"/>
+          <w:numId w:val="179"/>
+        </w:numPr>
+        <w:spacing w:before="0" w:after="60" w:line="240"/>
+        <w:ind w:right="0" w:left="720" w:hanging="360"/>
+        <w:jc w:val="left"/>
+        <w:rPr>
+          <w:rFonts w:ascii="Cascadia Code" w:hAnsi="Cascadia Code" w:cs="Cascadia Code" w:eastAsia="Cascadia Code"/>
+          <w:color w:val="auto"/>
+          <w:spacing w:val="0"/>
+          <w:position w:val="0"/>
+          <w:sz w:val="20"/>
+          <w:shd w:fill="auto" w:val="clear"/>
+        </w:rPr>
+      </w:pPr>
+      <w:r>
+        <w:rPr>
+          <w:rFonts w:ascii="Cascadia Code" w:hAnsi="Cascadia Code" w:cs="Cascadia Code" w:eastAsia="Cascadia Code"/>
+          <w:color w:val="auto"/>
+          <w:spacing w:val="0"/>
+          <w:position w:val="0"/>
+          <w:sz w:val="20"/>
+          <w:shd w:fill="auto" w:val="clear"/>
+        </w:rPr>
+        <w:t xml:space="preserve">It's in built authentication and user management system provided by asp.net core</w:t>
+      </w:r>
+    </w:p>
+    <w:p>
+      <w:pPr>
+        <w:spacing w:before="0" w:after="60" w:line="240"/>
+        <w:ind w:right="0" w:left="0" w:firstLine="0"/>
+        <w:jc w:val="left"/>
+        <w:rPr>
+          <w:rFonts w:ascii="Cascadia Code" w:hAnsi="Cascadia Code" w:cs="Cascadia Code" w:eastAsia="Cascadia Code"/>
+          <w:color w:val="auto"/>
+          <w:spacing w:val="0"/>
+          <w:position w:val="0"/>
+          <w:sz w:val="20"/>
+          <w:shd w:fill="auto" w:val="clear"/>
+        </w:rPr>
+      </w:pPr>
+    </w:p>
+    <w:p>
+      <w:pPr>
+        <w:spacing w:before="0" w:after="60" w:line="240"/>
+        <w:ind w:right="0" w:left="0" w:firstLine="0"/>
+        <w:jc w:val="left"/>
+        <w:rPr>
+          <w:rFonts w:ascii="Cascadia Code" w:hAnsi="Cascadia Code" w:cs="Cascadia Code" w:eastAsia="Cascadia Code"/>
+          <w:b/>
+          <w:color w:val="auto"/>
+          <w:spacing w:val="0"/>
+          <w:position w:val="0"/>
+          <w:sz w:val="20"/>
+          <w:shd w:fill="auto" w:val="clear"/>
+        </w:rPr>
+      </w:pPr>
+      <w:r>
+        <w:rPr>
+          <w:rFonts w:ascii="Cascadia Code" w:hAnsi="Cascadia Code" w:cs="Cascadia Code" w:eastAsia="Cascadia Code"/>
+          <w:b/>
+          <w:color w:val="auto"/>
+          <w:spacing w:val="0"/>
+          <w:position w:val="0"/>
+          <w:sz w:val="20"/>
+          <w:shd w:fill="auto" w:val="clear"/>
+        </w:rPr>
+        <w:t xml:space="preserve">Why Required :-</w:t>
+      </w:r>
+    </w:p>
+    <w:p>
+      <w:pPr>
+        <w:numPr>
+          <w:ilvl w:val="0"/>
+          <w:numId w:val="181"/>
+        </w:numPr>
+        <w:spacing w:before="0" w:after="60" w:line="240"/>
+        <w:ind w:right="0" w:left="720" w:hanging="360"/>
+        <w:jc w:val="left"/>
+        <w:rPr>
+          <w:rFonts w:ascii="Cascadia Code" w:hAnsi="Cascadia Code" w:cs="Cascadia Code" w:eastAsia="Cascadia Code"/>
+          <w:color w:val="auto"/>
+          <w:spacing w:val="0"/>
+          <w:position w:val="0"/>
+          <w:sz w:val="20"/>
+          <w:shd w:fill="auto" w:val="clear"/>
+        </w:rPr>
+      </w:pPr>
+      <w:r>
+        <w:rPr>
+          <w:rFonts w:ascii="Cascadia Code" w:hAnsi="Cascadia Code" w:cs="Cascadia Code" w:eastAsia="Cascadia Code"/>
+          <w:color w:val="auto"/>
+          <w:spacing w:val="0"/>
+          <w:position w:val="0"/>
+          <w:sz w:val="20"/>
+          <w:shd w:fill="auto" w:val="clear"/>
+        </w:rPr>
+        <w:t xml:space="preserve">Because almost every application needs login , signup , password handling etc , so instead of building everything manually asp.net core identity provides ready mande secure implementaion</w:t>
+      </w:r>
+    </w:p>
+    <w:p>
+      <w:pPr>
+        <w:spacing w:before="0" w:after="60" w:line="240"/>
+        <w:ind w:right="0" w:left="0" w:firstLine="0"/>
+        <w:jc w:val="left"/>
+        <w:rPr>
+          <w:rFonts w:ascii="Cascadia Code" w:hAnsi="Cascadia Code" w:cs="Cascadia Code" w:eastAsia="Cascadia Code"/>
+          <w:color w:val="auto"/>
+          <w:spacing w:val="0"/>
+          <w:position w:val="0"/>
+          <w:sz w:val="20"/>
+          <w:shd w:fill="auto" w:val="clear"/>
+        </w:rPr>
+      </w:pPr>
+    </w:p>
+    <w:p>
+      <w:pPr>
+        <w:spacing w:before="0" w:after="60" w:line="240"/>
+        <w:ind w:right="0" w:left="0" w:firstLine="0"/>
+        <w:jc w:val="left"/>
+        <w:rPr>
+          <w:rFonts w:ascii="Cascadia Code" w:hAnsi="Cascadia Code" w:cs="Cascadia Code" w:eastAsia="Cascadia Code"/>
+          <w:b/>
+          <w:color w:val="auto"/>
+          <w:spacing w:val="0"/>
+          <w:position w:val="0"/>
+          <w:sz w:val="20"/>
+          <w:shd w:fill="auto" w:val="clear"/>
+        </w:rPr>
+      </w:pPr>
+      <w:r>
+        <w:rPr>
+          <w:rFonts w:ascii="Cascadia Code" w:hAnsi="Cascadia Code" w:cs="Cascadia Code" w:eastAsia="Cascadia Code"/>
+          <w:b/>
+          <w:color w:val="auto"/>
+          <w:spacing w:val="0"/>
+          <w:position w:val="0"/>
+          <w:sz w:val="20"/>
+          <w:shd w:fill="auto" w:val="clear"/>
+        </w:rPr>
+        <w:t xml:space="preserve">Most important concepts :-</w:t>
+      </w:r>
+    </w:p>
+    <w:p>
+      <w:pPr>
+        <w:numPr>
+          <w:ilvl w:val="0"/>
+          <w:numId w:val="183"/>
+        </w:numPr>
+        <w:spacing w:before="0" w:after="60" w:line="240"/>
+        <w:ind w:right="0" w:left="720" w:hanging="360"/>
+        <w:jc w:val="left"/>
+        <w:rPr>
+          <w:rFonts w:ascii="Cascadia Code" w:hAnsi="Cascadia Code" w:cs="Cascadia Code" w:eastAsia="Cascadia Code"/>
+          <w:color w:val="auto"/>
+          <w:spacing w:val="0"/>
+          <w:position w:val="0"/>
+          <w:sz w:val="20"/>
+          <w:shd w:fill="auto" w:val="clear"/>
+        </w:rPr>
+      </w:pPr>
+      <w:r>
+        <w:rPr>
+          <w:rFonts w:ascii="Cascadia Code" w:hAnsi="Cascadia Code" w:cs="Cascadia Code" w:eastAsia="Cascadia Code"/>
+          <w:color w:val="auto"/>
+          <w:spacing w:val="0"/>
+          <w:position w:val="0"/>
+          <w:sz w:val="20"/>
+          <w:shd w:fill="auto" w:val="clear"/>
+        </w:rPr>
+        <w:t xml:space="preserve">Authentication :- like user kaun hai</w:t>
+      </w:r>
+    </w:p>
+    <w:p>
+      <w:pPr>
+        <w:numPr>
+          <w:ilvl w:val="0"/>
+          <w:numId w:val="183"/>
+        </w:numPr>
+        <w:spacing w:before="0" w:after="60" w:line="240"/>
+        <w:ind w:right="0" w:left="720" w:hanging="360"/>
+        <w:jc w:val="left"/>
+        <w:rPr>
+          <w:rFonts w:ascii="Cascadia Code" w:hAnsi="Cascadia Code" w:cs="Cascadia Code" w:eastAsia="Cascadia Code"/>
+          <w:color w:val="auto"/>
+          <w:spacing w:val="0"/>
+          <w:position w:val="0"/>
+          <w:sz w:val="20"/>
+          <w:shd w:fill="auto" w:val="clear"/>
+        </w:rPr>
+      </w:pPr>
+      <w:r>
+        <w:rPr>
+          <w:rFonts w:ascii="Cascadia Code" w:hAnsi="Cascadia Code" w:cs="Cascadia Code" w:eastAsia="Cascadia Code"/>
+          <w:color w:val="auto"/>
+          <w:spacing w:val="0"/>
+          <w:position w:val="0"/>
+          <w:sz w:val="20"/>
+          <w:shd w:fill="auto" w:val="clear"/>
+        </w:rPr>
+        <w:t xml:space="preserve">Authorization :- like what user is trying to access</w:t>
+      </w:r>
+    </w:p>
+    <w:p>
+      <w:pPr>
+        <w:spacing w:before="0" w:after="60" w:line="240"/>
+        <w:ind w:right="0" w:left="0" w:firstLine="0"/>
+        <w:jc w:val="left"/>
+        <w:rPr>
+          <w:rFonts w:ascii="Cascadia Code" w:hAnsi="Cascadia Code" w:cs="Cascadia Code" w:eastAsia="Cascadia Code"/>
+          <w:color w:val="auto"/>
+          <w:spacing w:val="0"/>
+          <w:position w:val="0"/>
+          <w:sz w:val="20"/>
+          <w:shd w:fill="auto" w:val="clear"/>
+        </w:rPr>
+      </w:pPr>
+    </w:p>
+    <w:p>
+      <w:pPr>
+        <w:spacing w:before="0" w:after="60" w:line="240"/>
+        <w:ind w:right="0" w:left="0" w:firstLine="0"/>
+        <w:jc w:val="left"/>
+        <w:rPr>
+          <w:rFonts w:ascii="Cascadia Code" w:hAnsi="Cascadia Code" w:cs="Cascadia Code" w:eastAsia="Cascadia Code"/>
+          <w:color w:val="auto"/>
+          <w:spacing w:val="0"/>
+          <w:position w:val="0"/>
+          <w:sz w:val="20"/>
+          <w:shd w:fill="auto" w:val="clear"/>
+        </w:rPr>
+      </w:pPr>
+      <w:r>
+        <w:rPr>
+          <w:rFonts w:ascii="Cascadia Code" w:hAnsi="Cascadia Code" w:cs="Cascadia Code" w:eastAsia="Cascadia Code"/>
+          <w:color w:val="auto"/>
+          <w:spacing w:val="0"/>
+          <w:position w:val="0"/>
+          <w:sz w:val="20"/>
+          <w:shd w:fill="auto" w:val="clear"/>
+        </w:rPr>
+        <w:t xml:space="preserve">Important identity classes :-</w:t>
+      </w:r>
+    </w:p>
+    <w:p>
+      <w:pPr>
+        <w:numPr>
+          <w:ilvl w:val="0"/>
+          <w:numId w:val="185"/>
+        </w:numPr>
+        <w:spacing w:before="0" w:after="60" w:line="240"/>
+        <w:ind w:right="0" w:left="720" w:hanging="360"/>
+        <w:jc w:val="left"/>
+        <w:rPr>
+          <w:rFonts w:ascii="Cascadia Code" w:hAnsi="Cascadia Code" w:cs="Cascadia Code" w:eastAsia="Cascadia Code"/>
+          <w:color w:val="auto"/>
+          <w:spacing w:val="0"/>
+          <w:position w:val="0"/>
+          <w:sz w:val="20"/>
+          <w:shd w:fill="auto" w:val="clear"/>
+        </w:rPr>
+      </w:pPr>
+      <w:r>
+        <w:rPr>
+          <w:rFonts w:ascii="Cascadia Code" w:hAnsi="Cascadia Code" w:cs="Cascadia Code" w:eastAsia="Cascadia Code"/>
+          <w:color w:val="auto"/>
+          <w:spacing w:val="0"/>
+          <w:position w:val="0"/>
+          <w:sz w:val="20"/>
+          <w:shd w:fill="auto" w:val="clear"/>
+        </w:rPr>
+        <w:t xml:space="preserve">IdentityUser </w:t>
+        <w:br/>
+      </w:r>
+    </w:p>
+    <w:p>
+      <w:pPr>
+        <w:spacing w:before="0" w:after="60" w:line="240"/>
+        <w:ind w:right="0" w:left="0" w:firstLine="0"/>
+        <w:jc w:val="left"/>
+        <w:rPr>
+          <w:rFonts w:ascii="Cascadia Code" w:hAnsi="Cascadia Code" w:cs="Cascadia Code" w:eastAsia="Cascadia Code"/>
+          <w:color w:val="auto"/>
+          <w:spacing w:val="0"/>
+          <w:position w:val="0"/>
+          <w:sz w:val="20"/>
+          <w:shd w:fill="auto" w:val="clear"/>
+        </w:rPr>
+      </w:pPr>
+      <w:r>
+        <w:rPr>
+          <w:rFonts w:ascii="Cascadia Code" w:hAnsi="Cascadia Code" w:cs="Cascadia Code" w:eastAsia="Cascadia Code"/>
+          <w:color w:val="auto"/>
+          <w:spacing w:val="0"/>
+          <w:position w:val="0"/>
+          <w:sz w:val="20"/>
+          <w:shd w:fill="auto" w:val="clear"/>
+        </w:rPr>
+        <w:t xml:space="preserve">      public class useraccess : IdentityUser</w:t>
+      </w:r>
+    </w:p>
+    <w:p>
+      <w:pPr>
+        <w:spacing w:before="0" w:after="60" w:line="240"/>
+        <w:ind w:right="0" w:left="0" w:firstLine="0"/>
+        <w:jc w:val="left"/>
+        <w:rPr>
+          <w:rFonts w:ascii="Cascadia Code" w:hAnsi="Cascadia Code" w:cs="Cascadia Code" w:eastAsia="Cascadia Code"/>
+          <w:color w:val="auto"/>
+          <w:spacing w:val="0"/>
+          <w:position w:val="0"/>
+          <w:sz w:val="20"/>
+          <w:shd w:fill="auto" w:val="clear"/>
+        </w:rPr>
+      </w:pPr>
+      <w:r>
+        <w:rPr>
+          <w:rFonts w:ascii="Cascadia Code" w:hAnsi="Cascadia Code" w:cs="Cascadia Code" w:eastAsia="Cascadia Code"/>
+          <w:color w:val="auto"/>
+          <w:spacing w:val="0"/>
+          <w:position w:val="0"/>
+          <w:sz w:val="20"/>
+          <w:shd w:fill="auto" w:val="clear"/>
+        </w:rPr>
+        <w:t xml:space="preserve"> </w:t>
+        <w:tab/>
+        <w:t xml:space="preserve">{</w:t>
+      </w:r>
+    </w:p>
+    <w:p>
+      <w:pPr>
+        <w:spacing w:before="0" w:after="60" w:line="240"/>
+        <w:ind w:right="0" w:left="0" w:firstLine="0"/>
+        <w:jc w:val="left"/>
+        <w:rPr>
+          <w:rFonts w:ascii="Cascadia Code" w:hAnsi="Cascadia Code" w:cs="Cascadia Code" w:eastAsia="Cascadia Code"/>
+          <w:color w:val="auto"/>
+          <w:spacing w:val="0"/>
+          <w:position w:val="0"/>
+          <w:sz w:val="20"/>
+          <w:shd w:fill="auto" w:val="clear"/>
+        </w:rPr>
+      </w:pPr>
+      <w:r>
+        <w:rPr>
+          <w:rFonts w:ascii="Cascadia Code" w:hAnsi="Cascadia Code" w:cs="Cascadia Code" w:eastAsia="Cascadia Code"/>
+          <w:color w:val="auto"/>
+          <w:spacing w:val="0"/>
+          <w:position w:val="0"/>
+          <w:sz w:val="20"/>
+          <w:shd w:fill="auto" w:val="clear"/>
+        </w:rPr>
+        <w:t xml:space="preserve">      }</w:t>
+      </w:r>
+    </w:p>
+    <w:p>
+      <w:pPr>
+        <w:spacing w:before="0" w:after="60" w:line="240"/>
+        <w:ind w:right="0" w:left="0" w:firstLine="0"/>
+        <w:jc w:val="left"/>
+        <w:rPr>
+          <w:rFonts w:ascii="Cascadia Code" w:hAnsi="Cascadia Code" w:cs="Cascadia Code" w:eastAsia="Cascadia Code"/>
+          <w:color w:val="auto"/>
+          <w:spacing w:val="0"/>
+          <w:position w:val="0"/>
+          <w:sz w:val="20"/>
+          <w:shd w:fill="auto" w:val="clear"/>
+        </w:rPr>
+      </w:pPr>
+      <w:r>
+        <w:rPr>
+          <w:rFonts w:ascii="Cascadia Code" w:hAnsi="Cascadia Code" w:cs="Cascadia Code" w:eastAsia="Cascadia Code"/>
+          <w:color w:val="auto"/>
+          <w:spacing w:val="0"/>
+          <w:position w:val="0"/>
+          <w:sz w:val="20"/>
+          <w:shd w:fill="auto" w:val="clear"/>
+        </w:rPr>
+        <w:t xml:space="preserve">   2. UserManager</w:t>
+      </w:r>
     </w:p>
     <w:p>
       <w:pPr>
@@ -10835,203 +11232,243 @@
       <w:lvlText w:val="•"/>
     </w:lvl>
   </w:abstractNum>
+  <w:abstractNum w:abstractNumId="390">
+    <w:lvl w:ilvl="0">
+      <w:start w:val="1"/>
+      <w:numFmt w:val="bullet"/>
+      <w:lvlText w:val="•"/>
+    </w:lvl>
+  </w:abstractNum>
+  <w:abstractNum w:abstractNumId="396">
+    <w:lvl w:ilvl="0">
+      <w:start w:val="1"/>
+      <w:numFmt w:val="bullet"/>
+      <w:lvlText w:val="•"/>
+    </w:lvl>
+  </w:abstractNum>
+  <w:abstractNum w:abstractNumId="7">
+    <w:lvl w:ilvl="0">
+      <w:start w:val="1"/>
+      <w:numFmt w:val="decimal"/>
+      <w:lvlText w:val="%1."/>
+    </w:lvl>
+  </w:abstractNum>
+  <w:abstractNum w:abstractNumId="13">
+    <w:lvl w:ilvl="0">
+      <w:start w:val="1"/>
+      <w:numFmt w:val="decimal"/>
+      <w:lvlText w:val="%1."/>
+    </w:lvl>
+  </w:abstractNum>
   <w:num w:numId="2">
+    <w:abstractNumId w:val="396"/>
+  </w:num>
+  <w:num w:numId="5">
+    <w:abstractNumId w:val="390"/>
+  </w:num>
+  <w:num w:numId="8">
     <w:abstractNumId w:val="384"/>
   </w:num>
-  <w:num w:numId="5">
+  <w:num w:numId="10">
     <w:abstractNumId w:val="378"/>
   </w:num>
-  <w:num w:numId="8">
+  <w:num w:numId="13">
     <w:abstractNumId w:val="372"/>
   </w:num>
-  <w:num w:numId="10">
+  <w:num w:numId="19">
     <w:abstractNumId w:val="366"/>
   </w:num>
-  <w:num w:numId="13">
+  <w:num w:numId="22">
     <w:abstractNumId w:val="360"/>
   </w:num>
-  <w:num w:numId="19">
+  <w:num w:numId="25">
     <w:abstractNumId w:val="354"/>
   </w:num>
-  <w:num w:numId="22">
+  <w:num w:numId="30">
     <w:abstractNumId w:val="348"/>
   </w:num>
-  <w:num w:numId="25">
+  <w:num w:numId="33">
     <w:abstractNumId w:val="342"/>
   </w:num>
-  <w:num w:numId="30">
+  <w:num w:numId="36">
     <w:abstractNumId w:val="336"/>
   </w:num>
-  <w:num w:numId="33">
+  <w:num w:numId="39">
     <w:abstractNumId w:val="330"/>
   </w:num>
-  <w:num w:numId="36">
+  <w:num w:numId="42">
     <w:abstractNumId w:val="324"/>
   </w:num>
-  <w:num w:numId="39">
+  <w:num w:numId="46">
     <w:abstractNumId w:val="318"/>
   </w:num>
-  <w:num w:numId="42">
+  <w:num w:numId="49">
     <w:abstractNumId w:val="312"/>
   </w:num>
-  <w:num w:numId="46">
+  <w:num w:numId="52">
     <w:abstractNumId w:val="306"/>
   </w:num>
-  <w:num w:numId="49">
+  <w:num w:numId="55">
     <w:abstractNumId w:val="300"/>
   </w:num>
-  <w:num w:numId="52">
+  <w:num w:numId="57">
     <w:abstractNumId w:val="294"/>
   </w:num>
-  <w:num w:numId="55">
+  <w:num w:numId="59">
     <w:abstractNumId w:val="288"/>
   </w:num>
-  <w:num w:numId="57">
+  <w:num w:numId="62">
     <w:abstractNumId w:val="282"/>
   </w:num>
-  <w:num w:numId="59">
+  <w:num w:numId="65">
     <w:abstractNumId w:val="276"/>
   </w:num>
-  <w:num w:numId="62">
+  <w:num w:numId="68">
     <w:abstractNumId w:val="270"/>
   </w:num>
-  <w:num w:numId="65">
+  <w:num w:numId="71">
     <w:abstractNumId w:val="264"/>
   </w:num>
-  <w:num w:numId="68">
+  <w:num w:numId="74">
     <w:abstractNumId w:val="258"/>
   </w:num>
-  <w:num w:numId="71">
+  <w:num w:numId="77">
     <w:abstractNumId w:val="252"/>
   </w:num>
-  <w:num w:numId="74">
+  <w:num w:numId="80">
     <w:abstractNumId w:val="246"/>
   </w:num>
-  <w:num w:numId="77">
+  <w:num w:numId="83">
     <w:abstractNumId w:val="240"/>
   </w:num>
-  <w:num w:numId="80">
+  <w:num w:numId="86">
     <w:abstractNumId w:val="234"/>
   </w:num>
-  <w:num w:numId="83">
+  <w:num w:numId="88">
     <w:abstractNumId w:val="228"/>
   </w:num>
-  <w:num w:numId="86">
+  <w:num w:numId="91">
     <w:abstractNumId w:val="222"/>
   </w:num>
-  <w:num w:numId="88">
+  <w:num w:numId="94">
     <w:abstractNumId w:val="216"/>
   </w:num>
-  <w:num w:numId="91">
+  <w:num w:numId="97">
     <w:abstractNumId w:val="210"/>
   </w:num>
-  <w:num w:numId="94">
+  <w:num w:numId="99">
     <w:abstractNumId w:val="204"/>
   </w:num>
-  <w:num w:numId="97">
+  <w:num w:numId="101">
     <w:abstractNumId w:val="198"/>
   </w:num>
-  <w:num w:numId="99">
+  <w:num w:numId="103">
     <w:abstractNumId w:val="192"/>
   </w:num>
-  <w:num w:numId="101">
+  <w:num w:numId="106">
     <w:abstractNumId w:val="186"/>
   </w:num>
-  <w:num w:numId="103">
+  <w:num w:numId="108">
     <w:abstractNumId w:val="180"/>
   </w:num>
-  <w:num w:numId="106">
+  <w:num w:numId="110">
     <w:abstractNumId w:val="174"/>
   </w:num>
-  <w:num w:numId="108">
+  <w:num w:numId="112">
     <w:abstractNumId w:val="168"/>
   </w:num>
-  <w:num w:numId="110">
+  <w:num w:numId="115">
     <w:abstractNumId w:val="162"/>
   </w:num>
-  <w:num w:numId="112">
+  <w:num w:numId="118">
     <w:abstractNumId w:val="156"/>
   </w:num>
-  <w:num w:numId="115">
+  <w:num w:numId="121">
     <w:abstractNumId w:val="150"/>
   </w:num>
-  <w:num w:numId="118">
+  <w:num w:numId="124">
     <w:abstractNumId w:val="144"/>
   </w:num>
-  <w:num w:numId="121">
+  <w:num w:numId="127">
     <w:abstractNumId w:val="138"/>
   </w:num>
-  <w:num w:numId="124">
+  <w:num w:numId="130">
     <w:abstractNumId w:val="132"/>
   </w:num>
-  <w:num w:numId="127">
+  <w:num w:numId="133">
     <w:abstractNumId w:val="126"/>
   </w:num>
-  <w:num w:numId="130">
+  <w:num w:numId="136">
     <w:abstractNumId w:val="120"/>
   </w:num>
-  <w:num w:numId="133">
+  <w:num w:numId="138">
     <w:abstractNumId w:val="114"/>
   </w:num>
-  <w:num w:numId="136">
+  <w:num w:numId="140">
     <w:abstractNumId w:val="108"/>
   </w:num>
-  <w:num w:numId="138">
+  <w:num w:numId="142">
     <w:abstractNumId w:val="102"/>
   </w:num>
-  <w:num w:numId="140">
+  <w:num w:numId="144">
     <w:abstractNumId w:val="96"/>
   </w:num>
-  <w:num w:numId="142">
+  <w:num w:numId="146">
     <w:abstractNumId w:val="90"/>
   </w:num>
-  <w:num w:numId="144">
+  <w:num w:numId="148">
     <w:abstractNumId w:val="84"/>
   </w:num>
-  <w:num w:numId="146">
+  <w:num w:numId="149">
+    <w:abstractNumId w:val="13"/>
+  </w:num>
+  <w:num w:numId="152">
     <w:abstractNumId w:val="78"/>
   </w:num>
-  <w:num w:numId="148">
+  <w:num w:numId="154">
     <w:abstractNumId w:val="72"/>
   </w:num>
-  <w:num w:numId="149">
-    <w:abstractNumId w:val="1"/>
-  </w:num>
-  <w:num w:numId="152">
+  <w:num w:numId="157">
     <w:abstractNumId w:val="66"/>
   </w:num>
-  <w:num w:numId="154">
+  <w:num w:numId="159">
     <w:abstractNumId w:val="60"/>
   </w:num>
-  <w:num w:numId="157">
+  <w:num w:numId="161">
     <w:abstractNumId w:val="54"/>
   </w:num>
-  <w:num w:numId="159">
+  <w:num w:numId="163">
     <w:abstractNumId w:val="48"/>
   </w:num>
-  <w:num w:numId="161">
+  <w:num w:numId="165">
     <w:abstractNumId w:val="42"/>
   </w:num>
-  <w:num w:numId="163">
+  <w:num w:numId="167">
     <w:abstractNumId w:val="36"/>
   </w:num>
-  <w:num w:numId="165">
+  <w:num w:numId="170">
     <w:abstractNumId w:val="30"/>
   </w:num>
-  <w:num w:numId="167">
+  <w:num w:numId="172">
     <w:abstractNumId w:val="24"/>
   </w:num>
-  <w:num w:numId="170">
+  <w:num w:numId="174">
     <w:abstractNumId w:val="18"/>
   </w:num>
-  <w:num w:numId="172">
+  <w:num w:numId="176">
     <w:abstractNumId w:val="12"/>
   </w:num>
-  <w:num w:numId="174">
+  <w:num w:numId="179">
     <w:abstractNumId w:val="6"/>
   </w:num>
-  <w:num w:numId="176">
+  <w:num w:numId="181">
     <w:abstractNumId w:val="0"/>
+  </w:num>
+  <w:num w:numId="183">
+    <w:abstractNumId w:val="7"/>
+  </w:num>
+  <w:num w:numId="185">
+    <w:abstractNumId w:val="1"/>
   </w:num>
 </w:numbering>
 </file>

</xml_diff>

<commit_message>
Authorization in ASP NET Core
</commit_message>
<xml_diff>
--- a/Asp.Net Core Notes.docx
+++ b/Asp.Net Core Notes.docx
@@ -7240,8 +7240,8 @@
         </w:rPr>
       </w:pPr>
       <w:r>
-        <w:object w:dxaOrig="8585" w:dyaOrig="3603">
-          <v:rect xmlns:o="urn:schemas-microsoft-com:office:office" xmlns:v="urn:schemas-microsoft-com:vml" id="rectole0000000000" style="width:429.250000pt;height:180.150000pt" o:preferrelative="t" o:ole="">
+        <w:object w:dxaOrig="8685" w:dyaOrig="3644">
+          <v:rect xmlns:o="urn:schemas-microsoft-com:office:office" xmlns:v="urn:schemas-microsoft-com:vml" id="rectole0000000000" style="width:434.250000pt;height:182.200000pt" o:preferrelative="t" o:ole="">
             <o:lock v:ext="edit"/>
             <v:imagedata xmlns:r="http://schemas.openxmlformats.org/officeDocument/2006/relationships" r:id="docRId1" o:title=""/>
           </v:rect>
@@ -7549,8 +7549,8 @@
         </w:rPr>
       </w:pPr>
       <w:r>
-        <w:object w:dxaOrig="8200" w:dyaOrig="9374">
-          <v:rect xmlns:o="urn:schemas-microsoft-com:office:office" xmlns:v="urn:schemas-microsoft-com:vml" id="rectole0000000001" style="width:410.000000pt;height:468.700000pt" o:preferrelative="t" o:ole="">
+        <w:object w:dxaOrig="8301" w:dyaOrig="9496">
+          <v:rect xmlns:o="urn:schemas-microsoft-com:office:office" xmlns:v="urn:schemas-microsoft-com:vml" id="rectole0000000001" style="width:415.050000pt;height:474.800000pt" o:preferrelative="t" o:ole="">
             <o:lock v:ext="edit"/>
             <v:imagedata xmlns:r="http://schemas.openxmlformats.org/officeDocument/2006/relationships" r:id="docRId3" o:title=""/>
           </v:rect>
@@ -8035,7 +8035,7 @@
       <w:pPr>
         <w:numPr>
           <w:ilvl w:val="0"/>
-          <w:numId w:val="152"/>
+          <w:numId w:val="151"/>
         </w:numPr>
         <w:spacing w:before="0" w:after="60" w:line="240"/>
         <w:ind w:right="0" w:left="720" w:hanging="360"/>
@@ -8065,7 +8065,7 @@
       <w:pPr>
         <w:numPr>
           <w:ilvl w:val="0"/>
-          <w:numId w:val="152"/>
+          <w:numId w:val="151"/>
         </w:numPr>
         <w:spacing w:before="0" w:after="60" w:line="240"/>
         <w:ind w:right="0" w:left="720" w:hanging="360"/>
@@ -8153,7 +8153,7 @@
       <w:pPr>
         <w:numPr>
           <w:ilvl w:val="0"/>
-          <w:numId w:val="154"/>
+          <w:numId w:val="153"/>
         </w:numPr>
         <w:spacing w:before="0" w:after="60" w:line="240"/>
         <w:ind w:right="0" w:left="720" w:hanging="360"/>
@@ -8323,6 +8323,109 @@
       <w:pPr>
         <w:numPr>
           <w:ilvl w:val="0"/>
+          <w:numId w:val="155"/>
+        </w:numPr>
+        <w:spacing w:before="0" w:after="60" w:line="240"/>
+        <w:ind w:right="0" w:left="720" w:hanging="360"/>
+        <w:jc w:val="left"/>
+        <w:rPr>
+          <w:rFonts w:ascii="Cascadia Code" w:hAnsi="Cascadia Code" w:cs="Cascadia Code" w:eastAsia="Cascadia Code"/>
+          <w:color w:val="auto"/>
+          <w:spacing w:val="0"/>
+          <w:position w:val="0"/>
+          <w:sz w:val="20"/>
+          <w:shd w:fill="auto" w:val="clear"/>
+        </w:rPr>
+      </w:pPr>
+      <w:r>
+        <w:rPr>
+          <w:rFonts w:ascii="Cascadia Code" w:hAnsi="Cascadia Code" w:cs="Cascadia Code" w:eastAsia="Cascadia Code"/>
+          <w:color w:val="auto"/>
+          <w:spacing w:val="0"/>
+          <w:position w:val="0"/>
+          <w:sz w:val="20"/>
+          <w:shd w:fill="auto" w:val="clear"/>
+        </w:rPr>
+        <w:t xml:space="preserve">Logging means storing applications , events , errors , warnings and etc while application is running</w:t>
+      </w:r>
+    </w:p>
+    <w:p>
+      <w:pPr>
+        <w:numPr>
+          <w:ilvl w:val="0"/>
+          <w:numId w:val="155"/>
+        </w:numPr>
+        <w:spacing w:before="0" w:after="60" w:line="240"/>
+        <w:ind w:right="0" w:left="720" w:hanging="360"/>
+        <w:jc w:val="left"/>
+        <w:rPr>
+          <w:rFonts w:ascii="Cascadia Code" w:hAnsi="Cascadia Code" w:cs="Cascadia Code" w:eastAsia="Cascadia Code"/>
+          <w:color w:val="auto"/>
+          <w:spacing w:val="0"/>
+          <w:position w:val="0"/>
+          <w:sz w:val="20"/>
+          <w:shd w:fill="auto" w:val="clear"/>
+        </w:rPr>
+      </w:pPr>
+      <w:r>
+        <w:rPr>
+          <w:rFonts w:ascii="Cascadia Code" w:hAnsi="Cascadia Code" w:cs="Cascadia Code" w:eastAsia="Cascadia Code"/>
+          <w:color w:val="auto"/>
+          <w:spacing w:val="0"/>
+          <w:position w:val="0"/>
+          <w:sz w:val="20"/>
+          <w:shd w:fill="auto" w:val="clear"/>
+        </w:rPr>
+        <w:t xml:space="preserve">Example :- basically when user wanna to save and at that time something crash , during that logging requires</w:t>
+      </w:r>
+    </w:p>
+    <w:p>
+      <w:pPr>
+        <w:spacing w:before="0" w:after="60" w:line="240"/>
+        <w:ind w:right="0" w:left="0" w:firstLine="0"/>
+        <w:jc w:val="left"/>
+        <w:rPr>
+          <w:rFonts w:ascii="Cascadia Code" w:hAnsi="Cascadia Code" w:cs="Cascadia Code" w:eastAsia="Cascadia Code"/>
+          <w:color w:val="auto"/>
+          <w:spacing w:val="0"/>
+          <w:position w:val="0"/>
+          <w:sz w:val="20"/>
+          <w:shd w:fill="auto" w:val="clear"/>
+        </w:rPr>
+      </w:pPr>
+    </w:p>
+    <w:p>
+      <w:pPr>
+        <w:spacing w:before="0" w:after="60" w:line="240"/>
+        <w:ind w:right="0" w:left="0" w:firstLine="0"/>
+        <w:jc w:val="left"/>
+        <w:rPr>
+          <w:rFonts w:ascii="Cascadia Code" w:hAnsi="Cascadia Code" w:cs="Cascadia Code" w:eastAsia="Cascadia Code"/>
+          <w:b/>
+          <w:color w:val="auto"/>
+          <w:spacing w:val="0"/>
+          <w:position w:val="0"/>
+          <w:sz w:val="20"/>
+          <w:shd w:fill="auto" w:val="clear"/>
+        </w:rPr>
+      </w:pPr>
+      <w:r>
+        <w:rPr>
+          <w:rFonts w:ascii="Cascadia Code" w:hAnsi="Cascadia Code" w:cs="Cascadia Code" w:eastAsia="Cascadia Code"/>
+          <w:b/>
+          <w:color w:val="auto"/>
+          <w:spacing w:val="0"/>
+          <w:position w:val="0"/>
+          <w:sz w:val="20"/>
+          <w:shd w:fill="auto" w:val="clear"/>
+        </w:rPr>
+        <w:t xml:space="preserve">How logging works :-</w:t>
+      </w:r>
+    </w:p>
+    <w:p>
+      <w:pPr>
+        <w:numPr>
+          <w:ilvl w:val="0"/>
           <w:numId w:val="157"/>
         </w:numPr>
         <w:spacing w:before="0" w:after="60" w:line="240"/>
@@ -8346,7 +8449,7 @@
           <w:sz w:val="20"/>
           <w:shd w:fill="auto" w:val="clear"/>
         </w:rPr>
-        <w:t xml:space="preserve">Logging means storing applications , events , errors , warnings and etc while application is running</w:t>
+        <w:t xml:space="preserve">Asp.net core provide built in logging system , main interface Ilogger&lt;T&gt;</w:t>
       </w:r>
     </w:p>
     <w:p>
@@ -8376,50 +8479,50 @@
           <w:sz w:val="20"/>
           <w:shd w:fill="auto" w:val="clear"/>
         </w:rPr>
-        <w:t xml:space="preserve">Example :- basically when user wanna to save and at that time something crash , during that logging requires</w:t>
-      </w:r>
-    </w:p>
-    <w:p>
-      <w:pPr>
-        <w:spacing w:before="0" w:after="60" w:line="240"/>
-        <w:ind w:right="0" w:left="0" w:firstLine="0"/>
-        <w:jc w:val="left"/>
-        <w:rPr>
-          <w:rFonts w:ascii="Cascadia Code" w:hAnsi="Cascadia Code" w:cs="Cascadia Code" w:eastAsia="Cascadia Code"/>
-          <w:color w:val="auto"/>
-          <w:spacing w:val="0"/>
-          <w:position w:val="0"/>
-          <w:sz w:val="20"/>
-          <w:shd w:fill="auto" w:val="clear"/>
-        </w:rPr>
-      </w:pPr>
-    </w:p>
-    <w:p>
-      <w:pPr>
-        <w:spacing w:before="0" w:after="60" w:line="240"/>
-        <w:ind w:right="0" w:left="0" w:firstLine="0"/>
-        <w:jc w:val="left"/>
-        <w:rPr>
-          <w:rFonts w:ascii="Cascadia Code" w:hAnsi="Cascadia Code" w:cs="Cascadia Code" w:eastAsia="Cascadia Code"/>
-          <w:b/>
-          <w:color w:val="auto"/>
-          <w:spacing w:val="0"/>
-          <w:position w:val="0"/>
-          <w:sz w:val="20"/>
-          <w:shd w:fill="auto" w:val="clear"/>
-        </w:rPr>
-      </w:pPr>
-      <w:r>
-        <w:rPr>
-          <w:rFonts w:ascii="Cascadia Code" w:hAnsi="Cascadia Code" w:cs="Cascadia Code" w:eastAsia="Cascadia Code"/>
-          <w:b/>
-          <w:color w:val="auto"/>
-          <w:spacing w:val="0"/>
-          <w:position w:val="0"/>
-          <w:sz w:val="20"/>
-          <w:shd w:fill="auto" w:val="clear"/>
-        </w:rPr>
-        <w:t xml:space="preserve">How logging works :-</w:t>
+        <w:t xml:space="preserve">It create logger internally</w:t>
+      </w:r>
+    </w:p>
+    <w:p>
+      <w:pPr>
+        <w:spacing w:before="0" w:after="60" w:line="240"/>
+        <w:ind w:right="0" w:left="0" w:firstLine="0"/>
+        <w:jc w:val="left"/>
+        <w:rPr>
+          <w:rFonts w:ascii="Cascadia Code" w:hAnsi="Cascadia Code" w:cs="Cascadia Code" w:eastAsia="Cascadia Code"/>
+          <w:color w:val="auto"/>
+          <w:spacing w:val="0"/>
+          <w:position w:val="0"/>
+          <w:sz w:val="20"/>
+          <w:shd w:fill="auto" w:val="clear"/>
+        </w:rPr>
+      </w:pPr>
+    </w:p>
+    <w:p>
+      <w:pPr>
+        <w:spacing w:before="0" w:after="60" w:line="240"/>
+        <w:ind w:right="0" w:left="0" w:firstLine="0"/>
+        <w:jc w:val="left"/>
+        <w:rPr>
+          <w:rFonts w:ascii="Cascadia Code" w:hAnsi="Cascadia Code" w:cs="Cascadia Code" w:eastAsia="Cascadia Code"/>
+          <w:b/>
+          <w:color w:val="auto"/>
+          <w:spacing w:val="0"/>
+          <w:position w:val="0"/>
+          <w:sz w:val="20"/>
+          <w:shd w:fill="auto" w:val="clear"/>
+        </w:rPr>
+      </w:pPr>
+      <w:r>
+        <w:rPr>
+          <w:rFonts w:ascii="Cascadia Code" w:hAnsi="Cascadia Code" w:cs="Cascadia Code" w:eastAsia="Cascadia Code"/>
+          <w:b/>
+          <w:color w:val="auto"/>
+          <w:spacing w:val="0"/>
+          <w:position w:val="0"/>
+          <w:sz w:val="20"/>
+          <w:shd w:fill="auto" w:val="clear"/>
+        </w:rPr>
+        <w:t xml:space="preserve">Basic logging methods :-</w:t>
       </w:r>
     </w:p>
     <w:p>
@@ -8449,7 +8552,7 @@
           <w:sz w:val="20"/>
           <w:shd w:fill="auto" w:val="clear"/>
         </w:rPr>
-        <w:t xml:space="preserve">Asp.net core provide built in logging system , main interface Ilogger&lt;T&gt;</w:t>
+        <w:t xml:space="preserve">Information :- loginformation ( normal application flow &amp; successfull operations )</w:t>
       </w:r>
     </w:p>
     <w:p>
@@ -8479,50 +8582,140 @@
           <w:sz w:val="20"/>
           <w:shd w:fill="auto" w:val="clear"/>
         </w:rPr>
-        <w:t xml:space="preserve">It create logger internally</w:t>
-      </w:r>
-    </w:p>
-    <w:p>
-      <w:pPr>
-        <w:spacing w:before="0" w:after="60" w:line="240"/>
-        <w:ind w:right="0" w:left="0" w:firstLine="0"/>
-        <w:jc w:val="left"/>
-        <w:rPr>
-          <w:rFonts w:ascii="Cascadia Code" w:hAnsi="Cascadia Code" w:cs="Cascadia Code" w:eastAsia="Cascadia Code"/>
-          <w:color w:val="auto"/>
-          <w:spacing w:val="0"/>
-          <w:position w:val="0"/>
-          <w:sz w:val="20"/>
-          <w:shd w:fill="auto" w:val="clear"/>
-        </w:rPr>
-      </w:pPr>
-    </w:p>
-    <w:p>
-      <w:pPr>
-        <w:spacing w:before="0" w:after="60" w:line="240"/>
-        <w:ind w:right="0" w:left="0" w:firstLine="0"/>
-        <w:jc w:val="left"/>
-        <w:rPr>
-          <w:rFonts w:ascii="Cascadia Code" w:hAnsi="Cascadia Code" w:cs="Cascadia Code" w:eastAsia="Cascadia Code"/>
-          <w:b/>
-          <w:color w:val="auto"/>
-          <w:spacing w:val="0"/>
-          <w:position w:val="0"/>
-          <w:sz w:val="20"/>
-          <w:shd w:fill="auto" w:val="clear"/>
-        </w:rPr>
-      </w:pPr>
-      <w:r>
-        <w:rPr>
-          <w:rFonts w:ascii="Cascadia Code" w:hAnsi="Cascadia Code" w:cs="Cascadia Code" w:eastAsia="Cascadia Code"/>
-          <w:b/>
-          <w:color w:val="auto"/>
-          <w:spacing w:val="0"/>
-          <w:position w:val="0"/>
-          <w:sz w:val="20"/>
-          <w:shd w:fill="auto" w:val="clear"/>
-        </w:rPr>
-        <w:t xml:space="preserve">Basic logging methods :-</w:t>
+        <w:t xml:space="preserve">warning :- logwarning ( unexpected situation but application still runs )</w:t>
+      </w:r>
+    </w:p>
+    <w:p>
+      <w:pPr>
+        <w:numPr>
+          <w:ilvl w:val="0"/>
+          <w:numId w:val="159"/>
+        </w:numPr>
+        <w:spacing w:before="0" w:after="60" w:line="240"/>
+        <w:ind w:right="0" w:left="720" w:hanging="360"/>
+        <w:jc w:val="left"/>
+        <w:rPr>
+          <w:rFonts w:ascii="Cascadia Code" w:hAnsi="Cascadia Code" w:cs="Cascadia Code" w:eastAsia="Cascadia Code"/>
+          <w:color w:val="auto"/>
+          <w:spacing w:val="0"/>
+          <w:position w:val="0"/>
+          <w:sz w:val="20"/>
+          <w:shd w:fill="auto" w:val="clear"/>
+        </w:rPr>
+      </w:pPr>
+      <w:r>
+        <w:rPr>
+          <w:rFonts w:ascii="Cascadia Code" w:hAnsi="Cascadia Code" w:cs="Cascadia Code" w:eastAsia="Cascadia Code"/>
+          <w:color w:val="auto"/>
+          <w:spacing w:val="0"/>
+          <w:position w:val="0"/>
+          <w:sz w:val="20"/>
+          <w:shd w:fill="auto" w:val="clear"/>
+        </w:rPr>
+        <w:t xml:space="preserve">error :- logerror ( exceptions &amp; failures )</w:t>
+      </w:r>
+    </w:p>
+    <w:p>
+      <w:pPr>
+        <w:numPr>
+          <w:ilvl w:val="0"/>
+          <w:numId w:val="159"/>
+        </w:numPr>
+        <w:spacing w:before="0" w:after="60" w:line="240"/>
+        <w:ind w:right="0" w:left="720" w:hanging="360"/>
+        <w:jc w:val="left"/>
+        <w:rPr>
+          <w:rFonts w:ascii="Cascadia Code" w:hAnsi="Cascadia Code" w:cs="Cascadia Code" w:eastAsia="Cascadia Code"/>
+          <w:color w:val="auto"/>
+          <w:spacing w:val="0"/>
+          <w:position w:val="0"/>
+          <w:sz w:val="20"/>
+          <w:shd w:fill="auto" w:val="clear"/>
+        </w:rPr>
+      </w:pPr>
+      <w:r>
+        <w:rPr>
+          <w:rFonts w:ascii="Cascadia Code" w:hAnsi="Cascadia Code" w:cs="Cascadia Code" w:eastAsia="Cascadia Code"/>
+          <w:color w:val="auto"/>
+          <w:spacing w:val="0"/>
+          <w:position w:val="0"/>
+          <w:sz w:val="20"/>
+          <w:shd w:fill="auto" w:val="clear"/>
+        </w:rPr>
+        <w:t xml:space="preserve">critical :- logcritical ( application shitdown &amp; servere failures )</w:t>
+      </w:r>
+    </w:p>
+    <w:p>
+      <w:pPr>
+        <w:numPr>
+          <w:ilvl w:val="0"/>
+          <w:numId w:val="159"/>
+        </w:numPr>
+        <w:spacing w:before="0" w:after="60" w:line="240"/>
+        <w:ind w:right="0" w:left="720" w:hanging="360"/>
+        <w:jc w:val="left"/>
+        <w:rPr>
+          <w:rFonts w:ascii="Cascadia Code" w:hAnsi="Cascadia Code" w:cs="Cascadia Code" w:eastAsia="Cascadia Code"/>
+          <w:color w:val="auto"/>
+          <w:spacing w:val="0"/>
+          <w:position w:val="0"/>
+          <w:sz w:val="20"/>
+          <w:shd w:fill="auto" w:val="clear"/>
+        </w:rPr>
+      </w:pPr>
+      <w:r>
+        <w:rPr>
+          <w:rFonts w:ascii="Cascadia Code" w:hAnsi="Cascadia Code" w:cs="Cascadia Code" w:eastAsia="Cascadia Code"/>
+          <w:color w:val="auto"/>
+          <w:spacing w:val="0"/>
+          <w:position w:val="0"/>
+          <w:sz w:val="20"/>
+          <w:shd w:fill="auto" w:val="clear"/>
+        </w:rPr>
+        <w:t xml:space="preserve">We majorly use logerror which comes in exception logging</w:t>
+      </w:r>
+    </w:p>
+    <w:p>
+      <w:pPr>
+        <w:spacing w:before="0" w:after="60" w:line="240"/>
+        <w:ind w:right="0" w:left="0" w:firstLine="0"/>
+        <w:jc w:val="left"/>
+        <w:rPr>
+          <w:rFonts w:ascii="Cascadia Code" w:hAnsi="Cascadia Code" w:cs="Cascadia Code" w:eastAsia="Cascadia Code"/>
+          <w:color w:val="auto"/>
+          <w:spacing w:val="0"/>
+          <w:position w:val="0"/>
+          <w:sz w:val="20"/>
+          <w:shd w:fill="auto" w:val="clear"/>
+        </w:rPr>
+      </w:pPr>
+    </w:p>
+    <w:p>
+      <w:pPr>
+        <w:spacing w:before="0" w:after="60" w:line="240"/>
+        <w:ind w:right="0" w:left="0" w:firstLine="0"/>
+        <w:jc w:val="left"/>
+        <w:rPr>
+          <w:rFonts w:ascii="Cascadia Code" w:hAnsi="Cascadia Code" w:cs="Cascadia Code" w:eastAsia="Cascadia Code"/>
+          <w:b/>
+          <w:color w:val="auto"/>
+          <w:spacing w:val="0"/>
+          <w:position w:val="0"/>
+          <w:sz w:val="20"/>
+          <w:shd w:fill="auto" w:val="clear"/>
+        </w:rPr>
+      </w:pPr>
+      <w:r>
+        <w:rPr>
+          <w:rFonts w:ascii="Cascadia Code" w:hAnsi="Cascadia Code" w:cs="Cascadia Code" w:eastAsia="Cascadia Code"/>
+          <w:b/>
+          <w:color w:val="auto"/>
+          <w:spacing w:val="0"/>
+          <w:position w:val="0"/>
+          <w:sz w:val="20"/>
+          <w:shd w:fill="auto" w:val="clear"/>
+        </w:rPr>
+        <w:t xml:space="preserve">Where logs are stored :-</w:t>
       </w:r>
     </w:p>
     <w:p>
@@ -8552,170 +8745,50 @@
           <w:sz w:val="20"/>
           <w:shd w:fill="auto" w:val="clear"/>
         </w:rPr>
-        <w:t xml:space="preserve">Information :- loginformation ( normal application flow &amp; successfull operations )</w:t>
-      </w:r>
-    </w:p>
-    <w:p>
-      <w:pPr>
-        <w:numPr>
-          <w:ilvl w:val="0"/>
-          <w:numId w:val="161"/>
-        </w:numPr>
-        <w:spacing w:before="0" w:after="60" w:line="240"/>
-        <w:ind w:right="0" w:left="720" w:hanging="360"/>
-        <w:jc w:val="left"/>
-        <w:rPr>
-          <w:rFonts w:ascii="Cascadia Code" w:hAnsi="Cascadia Code" w:cs="Cascadia Code" w:eastAsia="Cascadia Code"/>
-          <w:color w:val="auto"/>
-          <w:spacing w:val="0"/>
-          <w:position w:val="0"/>
-          <w:sz w:val="20"/>
-          <w:shd w:fill="auto" w:val="clear"/>
-        </w:rPr>
-      </w:pPr>
-      <w:r>
-        <w:rPr>
-          <w:rFonts w:ascii="Cascadia Code" w:hAnsi="Cascadia Code" w:cs="Cascadia Code" w:eastAsia="Cascadia Code"/>
-          <w:color w:val="auto"/>
-          <w:spacing w:val="0"/>
-          <w:position w:val="0"/>
-          <w:sz w:val="20"/>
-          <w:shd w:fill="auto" w:val="clear"/>
-        </w:rPr>
-        <w:t xml:space="preserve">warning :- logwarning ( unexpected situation but application still runs )</w:t>
-      </w:r>
-    </w:p>
-    <w:p>
-      <w:pPr>
-        <w:numPr>
-          <w:ilvl w:val="0"/>
-          <w:numId w:val="161"/>
-        </w:numPr>
-        <w:spacing w:before="0" w:after="60" w:line="240"/>
-        <w:ind w:right="0" w:left="720" w:hanging="360"/>
-        <w:jc w:val="left"/>
-        <w:rPr>
-          <w:rFonts w:ascii="Cascadia Code" w:hAnsi="Cascadia Code" w:cs="Cascadia Code" w:eastAsia="Cascadia Code"/>
-          <w:color w:val="auto"/>
-          <w:spacing w:val="0"/>
-          <w:position w:val="0"/>
-          <w:sz w:val="20"/>
-          <w:shd w:fill="auto" w:val="clear"/>
-        </w:rPr>
-      </w:pPr>
-      <w:r>
-        <w:rPr>
-          <w:rFonts w:ascii="Cascadia Code" w:hAnsi="Cascadia Code" w:cs="Cascadia Code" w:eastAsia="Cascadia Code"/>
-          <w:color w:val="auto"/>
-          <w:spacing w:val="0"/>
-          <w:position w:val="0"/>
-          <w:sz w:val="20"/>
-          <w:shd w:fill="auto" w:val="clear"/>
-        </w:rPr>
-        <w:t xml:space="preserve">error :- logerror ( exceptions &amp; failures )</w:t>
-      </w:r>
-    </w:p>
-    <w:p>
-      <w:pPr>
-        <w:numPr>
-          <w:ilvl w:val="0"/>
-          <w:numId w:val="161"/>
-        </w:numPr>
-        <w:spacing w:before="0" w:after="60" w:line="240"/>
-        <w:ind w:right="0" w:left="720" w:hanging="360"/>
-        <w:jc w:val="left"/>
-        <w:rPr>
-          <w:rFonts w:ascii="Cascadia Code" w:hAnsi="Cascadia Code" w:cs="Cascadia Code" w:eastAsia="Cascadia Code"/>
-          <w:color w:val="auto"/>
-          <w:spacing w:val="0"/>
-          <w:position w:val="0"/>
-          <w:sz w:val="20"/>
-          <w:shd w:fill="auto" w:val="clear"/>
-        </w:rPr>
-      </w:pPr>
-      <w:r>
-        <w:rPr>
-          <w:rFonts w:ascii="Cascadia Code" w:hAnsi="Cascadia Code" w:cs="Cascadia Code" w:eastAsia="Cascadia Code"/>
-          <w:color w:val="auto"/>
-          <w:spacing w:val="0"/>
-          <w:position w:val="0"/>
-          <w:sz w:val="20"/>
-          <w:shd w:fill="auto" w:val="clear"/>
-        </w:rPr>
-        <w:t xml:space="preserve">critical :- logcritical ( application shitdown &amp; servere failures )</w:t>
-      </w:r>
-    </w:p>
-    <w:p>
-      <w:pPr>
-        <w:numPr>
-          <w:ilvl w:val="0"/>
-          <w:numId w:val="161"/>
-        </w:numPr>
-        <w:spacing w:before="0" w:after="60" w:line="240"/>
-        <w:ind w:right="0" w:left="720" w:hanging="360"/>
-        <w:jc w:val="left"/>
-        <w:rPr>
-          <w:rFonts w:ascii="Cascadia Code" w:hAnsi="Cascadia Code" w:cs="Cascadia Code" w:eastAsia="Cascadia Code"/>
-          <w:color w:val="auto"/>
-          <w:spacing w:val="0"/>
-          <w:position w:val="0"/>
-          <w:sz w:val="20"/>
-          <w:shd w:fill="auto" w:val="clear"/>
-        </w:rPr>
-      </w:pPr>
-      <w:r>
-        <w:rPr>
-          <w:rFonts w:ascii="Cascadia Code" w:hAnsi="Cascadia Code" w:cs="Cascadia Code" w:eastAsia="Cascadia Code"/>
-          <w:color w:val="auto"/>
-          <w:spacing w:val="0"/>
-          <w:position w:val="0"/>
-          <w:sz w:val="20"/>
-          <w:shd w:fill="auto" w:val="clear"/>
-        </w:rPr>
-        <w:t xml:space="preserve">We majorly use logerror which comes in exception logging</w:t>
-      </w:r>
-    </w:p>
-    <w:p>
-      <w:pPr>
-        <w:spacing w:before="0" w:after="60" w:line="240"/>
-        <w:ind w:right="0" w:left="0" w:firstLine="0"/>
-        <w:jc w:val="left"/>
-        <w:rPr>
-          <w:rFonts w:ascii="Cascadia Code" w:hAnsi="Cascadia Code" w:cs="Cascadia Code" w:eastAsia="Cascadia Code"/>
-          <w:color w:val="auto"/>
-          <w:spacing w:val="0"/>
-          <w:position w:val="0"/>
-          <w:sz w:val="20"/>
-          <w:shd w:fill="auto" w:val="clear"/>
-        </w:rPr>
-      </w:pPr>
-    </w:p>
-    <w:p>
-      <w:pPr>
-        <w:spacing w:before="0" w:after="60" w:line="240"/>
-        <w:ind w:right="0" w:left="0" w:firstLine="0"/>
-        <w:jc w:val="left"/>
-        <w:rPr>
-          <w:rFonts w:ascii="Cascadia Code" w:hAnsi="Cascadia Code" w:cs="Cascadia Code" w:eastAsia="Cascadia Code"/>
-          <w:b/>
-          <w:color w:val="auto"/>
-          <w:spacing w:val="0"/>
-          <w:position w:val="0"/>
-          <w:sz w:val="20"/>
-          <w:shd w:fill="auto" w:val="clear"/>
-        </w:rPr>
-      </w:pPr>
-      <w:r>
-        <w:rPr>
-          <w:rFonts w:ascii="Cascadia Code" w:hAnsi="Cascadia Code" w:cs="Cascadia Code" w:eastAsia="Cascadia Code"/>
-          <w:b/>
-          <w:color w:val="auto"/>
-          <w:spacing w:val="0"/>
-          <w:position w:val="0"/>
-          <w:sz w:val="20"/>
-          <w:shd w:fill="auto" w:val="clear"/>
-        </w:rPr>
-        <w:t xml:space="preserve">Where logs are stored :-</w:t>
+        <w:t xml:space="preserve">common places :- console , text files , database and etc</w:t>
+      </w:r>
+    </w:p>
+    <w:p>
+      <w:pPr>
+        <w:spacing w:before="0" w:after="60" w:line="240"/>
+        <w:ind w:right="0" w:left="0" w:firstLine="0"/>
+        <w:jc w:val="left"/>
+        <w:rPr>
+          <w:rFonts w:ascii="Cascadia Code" w:hAnsi="Cascadia Code" w:cs="Cascadia Code" w:eastAsia="Cascadia Code"/>
+          <w:color w:val="auto"/>
+          <w:spacing w:val="0"/>
+          <w:position w:val="0"/>
+          <w:sz w:val="20"/>
+          <w:shd w:fill="auto" w:val="clear"/>
+        </w:rPr>
+      </w:pPr>
+    </w:p>
+    <w:p>
+      <w:pPr>
+        <w:spacing w:before="0" w:after="60" w:line="240"/>
+        <w:ind w:right="0" w:left="0" w:firstLine="0"/>
+        <w:jc w:val="left"/>
+        <w:rPr>
+          <w:rFonts w:ascii="Cascadia Code" w:hAnsi="Cascadia Code" w:cs="Cascadia Code" w:eastAsia="Cascadia Code"/>
+          <w:b/>
+          <w:color w:val="auto"/>
+          <w:spacing w:val="0"/>
+          <w:position w:val="0"/>
+          <w:sz w:val="20"/>
+          <w:shd w:fill="auto" w:val="clear"/>
+        </w:rPr>
+      </w:pPr>
+      <w:r>
+        <w:rPr>
+          <w:rFonts w:ascii="Cascadia Code" w:hAnsi="Cascadia Code" w:cs="Cascadia Code" w:eastAsia="Cascadia Code"/>
+          <w:b/>
+          <w:color w:val="auto"/>
+          <w:spacing w:val="0"/>
+          <w:position w:val="0"/>
+          <w:sz w:val="20"/>
+          <w:shd w:fill="auto" w:val="clear"/>
+        </w:rPr>
+        <w:t xml:space="preserve">What companies mostly use :-</w:t>
       </w:r>
     </w:p>
     <w:p>
@@ -8745,50 +8818,80 @@
           <w:sz w:val="20"/>
           <w:shd w:fill="auto" w:val="clear"/>
         </w:rPr>
-        <w:t xml:space="preserve">common places :- console , text files , database and etc</w:t>
-      </w:r>
-    </w:p>
-    <w:p>
-      <w:pPr>
-        <w:spacing w:before="0" w:after="60" w:line="240"/>
-        <w:ind w:right="0" w:left="0" w:firstLine="0"/>
-        <w:jc w:val="left"/>
-        <w:rPr>
-          <w:rFonts w:ascii="Cascadia Code" w:hAnsi="Cascadia Code" w:cs="Cascadia Code" w:eastAsia="Cascadia Code"/>
-          <w:color w:val="auto"/>
-          <w:spacing w:val="0"/>
-          <w:position w:val="0"/>
-          <w:sz w:val="20"/>
-          <w:shd w:fill="auto" w:val="clear"/>
-        </w:rPr>
-      </w:pPr>
-    </w:p>
-    <w:p>
-      <w:pPr>
-        <w:spacing w:before="0" w:after="60" w:line="240"/>
-        <w:ind w:right="0" w:left="0" w:firstLine="0"/>
-        <w:jc w:val="left"/>
-        <w:rPr>
-          <w:rFonts w:ascii="Cascadia Code" w:hAnsi="Cascadia Code" w:cs="Cascadia Code" w:eastAsia="Cascadia Code"/>
-          <w:b/>
-          <w:color w:val="auto"/>
-          <w:spacing w:val="0"/>
-          <w:position w:val="0"/>
-          <w:sz w:val="20"/>
-          <w:shd w:fill="auto" w:val="clear"/>
-        </w:rPr>
-      </w:pPr>
-      <w:r>
-        <w:rPr>
-          <w:rFonts w:ascii="Cascadia Code" w:hAnsi="Cascadia Code" w:cs="Cascadia Code" w:eastAsia="Cascadia Code"/>
-          <w:b/>
-          <w:color w:val="auto"/>
-          <w:spacing w:val="0"/>
-          <w:position w:val="0"/>
-          <w:sz w:val="20"/>
-          <w:shd w:fill="auto" w:val="clear"/>
-        </w:rPr>
-        <w:t xml:space="preserve">What companies mostly use :-</w:t>
+        <w:t xml:space="preserve">They use serilog , Nlog , Ilogger , application insights</w:t>
+      </w:r>
+    </w:p>
+    <w:p>
+      <w:pPr>
+        <w:numPr>
+          <w:ilvl w:val="0"/>
+          <w:numId w:val="163"/>
+        </w:numPr>
+        <w:spacing w:before="0" w:after="60" w:line="240"/>
+        <w:ind w:right="0" w:left="720" w:hanging="360"/>
+        <w:jc w:val="left"/>
+        <w:rPr>
+          <w:rFonts w:ascii="Cascadia Code" w:hAnsi="Cascadia Code" w:cs="Cascadia Code" w:eastAsia="Cascadia Code"/>
+          <w:color w:val="auto"/>
+          <w:spacing w:val="0"/>
+          <w:position w:val="0"/>
+          <w:sz w:val="20"/>
+          <w:shd w:fill="auto" w:val="clear"/>
+        </w:rPr>
+      </w:pPr>
+      <w:r>
+        <w:rPr>
+          <w:rFonts w:ascii="Cascadia Code" w:hAnsi="Cascadia Code" w:cs="Cascadia Code" w:eastAsia="Cascadia Code"/>
+          <w:color w:val="auto"/>
+          <w:spacing w:val="0"/>
+          <w:position w:val="0"/>
+          <w:sz w:val="20"/>
+          <w:shd w:fill="auto" w:val="clear"/>
+        </w:rPr>
+        <w:t xml:space="preserve">Companies use Serilog &amp; Nlog because they provide file loggig , structure logging , centralized logging , better formatting and cloud intergrations</w:t>
+      </w:r>
+    </w:p>
+    <w:p>
+      <w:pPr>
+        <w:spacing w:before="0" w:after="60" w:line="240"/>
+        <w:ind w:right="0" w:left="0" w:firstLine="0"/>
+        <w:jc w:val="left"/>
+        <w:rPr>
+          <w:rFonts w:ascii="Cascadia Code" w:hAnsi="Cascadia Code" w:cs="Cascadia Code" w:eastAsia="Cascadia Code"/>
+          <w:color w:val="auto"/>
+          <w:spacing w:val="0"/>
+          <w:position w:val="0"/>
+          <w:sz w:val="20"/>
+          <w:shd w:fill="auto" w:val="clear"/>
+        </w:rPr>
+      </w:pPr>
+    </w:p>
+    <w:p>
+      <w:pPr>
+        <w:spacing w:before="0" w:after="60" w:line="240"/>
+        <w:ind w:right="0" w:left="0" w:firstLine="0"/>
+        <w:jc w:val="left"/>
+        <w:rPr>
+          <w:rFonts w:ascii="Cascadia Code" w:hAnsi="Cascadia Code" w:cs="Cascadia Code" w:eastAsia="Cascadia Code"/>
+          <w:b/>
+          <w:color w:val="auto"/>
+          <w:spacing w:val="0"/>
+          <w:position w:val="0"/>
+          <w:sz w:val="20"/>
+          <w:shd w:fill="auto" w:val="clear"/>
+        </w:rPr>
+      </w:pPr>
+      <w:r>
+        <w:rPr>
+          <w:rFonts w:ascii="Cascadia Code" w:hAnsi="Cascadia Code" w:cs="Cascadia Code" w:eastAsia="Cascadia Code"/>
+          <w:b/>
+          <w:color w:val="auto"/>
+          <w:spacing w:val="0"/>
+          <w:position w:val="0"/>
+          <w:sz w:val="20"/>
+          <w:shd w:fill="auto" w:val="clear"/>
+        </w:rPr>
+        <w:t xml:space="preserve">Structured Logging vs Traditional logging :- </w:t>
       </w:r>
     </w:p>
     <w:p>
@@ -8818,7 +8921,7 @@
           <w:sz w:val="20"/>
           <w:shd w:fill="auto" w:val="clear"/>
         </w:rPr>
-        <w:t xml:space="preserve">They use serilog , Nlog , Ilogger , application insights</w:t>
+        <w:t xml:space="preserve">Traditional logging :- _logger.loginformation("")</w:t>
       </w:r>
     </w:p>
     <w:p>
@@ -8848,50 +8951,76 @@
           <w:sz w:val="20"/>
           <w:shd w:fill="auto" w:val="clear"/>
         </w:rPr>
-        <w:t xml:space="preserve">Companies use Serilog &amp; Nlog because they provide file loggig , structure logging , centralized logging , better formatting and cloud intergrations</w:t>
-      </w:r>
-    </w:p>
-    <w:p>
-      <w:pPr>
-        <w:spacing w:before="0" w:after="60" w:line="240"/>
-        <w:ind w:right="0" w:left="0" w:firstLine="0"/>
-        <w:jc w:val="left"/>
-        <w:rPr>
-          <w:rFonts w:ascii="Cascadia Code" w:hAnsi="Cascadia Code" w:cs="Cascadia Code" w:eastAsia="Cascadia Code"/>
-          <w:color w:val="auto"/>
-          <w:spacing w:val="0"/>
-          <w:position w:val="0"/>
-          <w:sz w:val="20"/>
-          <w:shd w:fill="auto" w:val="clear"/>
-        </w:rPr>
-      </w:pPr>
-    </w:p>
-    <w:p>
-      <w:pPr>
-        <w:spacing w:before="0" w:after="60" w:line="240"/>
-        <w:ind w:right="0" w:left="0" w:firstLine="0"/>
-        <w:jc w:val="left"/>
-        <w:rPr>
-          <w:rFonts w:ascii="Cascadia Code" w:hAnsi="Cascadia Code" w:cs="Cascadia Code" w:eastAsia="Cascadia Code"/>
-          <w:b/>
-          <w:color w:val="auto"/>
-          <w:spacing w:val="0"/>
-          <w:position w:val="0"/>
-          <w:sz w:val="20"/>
-          <w:shd w:fill="auto" w:val="clear"/>
-        </w:rPr>
-      </w:pPr>
-      <w:r>
-        <w:rPr>
-          <w:rFonts w:ascii="Cascadia Code" w:hAnsi="Cascadia Code" w:cs="Cascadia Code" w:eastAsia="Cascadia Code"/>
-          <w:b/>
-          <w:color w:val="auto"/>
-          <w:spacing w:val="0"/>
-          <w:position w:val="0"/>
-          <w:sz w:val="20"/>
-          <w:shd w:fill="auto" w:val="clear"/>
-        </w:rPr>
-        <w:t xml:space="preserve">Structured Logging vs Traditional logging :- </w:t>
+        <w:t xml:space="preserve">Structured logging :- _logger.loginformation("",emp.id)</w:t>
+      </w:r>
+    </w:p>
+    <w:p>
+      <w:pPr>
+        <w:spacing w:before="0" w:after="60" w:line="240"/>
+        <w:ind w:right="0" w:left="0" w:firstLine="0"/>
+        <w:jc w:val="left"/>
+        <w:rPr>
+          <w:rFonts w:ascii="Cascadia Code" w:hAnsi="Cascadia Code" w:cs="Cascadia Code" w:eastAsia="Cascadia Code"/>
+          <w:color w:val="auto"/>
+          <w:spacing w:val="0"/>
+          <w:position w:val="0"/>
+          <w:sz w:val="20"/>
+          <w:shd w:fill="auto" w:val="clear"/>
+        </w:rPr>
+      </w:pPr>
+      <w:r>
+        <w:rPr>
+          <w:rFonts w:ascii="Cascadia Code" w:hAnsi="Cascadia Code" w:cs="Cascadia Code" w:eastAsia="Cascadia Code"/>
+          <w:color w:val="auto"/>
+          <w:spacing w:val="0"/>
+          <w:position w:val="0"/>
+          <w:sz w:val="20"/>
+          <w:shd w:fill="auto" w:val="clear"/>
+        </w:rPr>
+        <w:t xml:space="preserve">You can use logging inside middleware too</w:t>
+      </w:r>
+    </w:p>
+    <w:p>
+      <w:pPr>
+        <w:spacing w:before="0" w:after="60" w:line="240"/>
+        <w:ind w:right="0" w:left="0" w:firstLine="0"/>
+        <w:jc w:val="left"/>
+        <w:rPr>
+          <w:rFonts w:ascii="Cascadia Code" w:hAnsi="Cascadia Code" w:cs="Cascadia Code" w:eastAsia="Cascadia Code"/>
+          <w:color w:val="auto"/>
+          <w:spacing w:val="0"/>
+          <w:position w:val="0"/>
+          <w:sz w:val="20"/>
+          <w:shd w:fill="auto" w:val="clear"/>
+        </w:rPr>
+      </w:pPr>
+    </w:p>
+    <w:p>
+      <w:pPr>
+        <w:spacing w:before="0" w:after="60" w:line="240"/>
+        <w:ind w:right="0" w:left="0" w:firstLine="0"/>
+        <w:jc w:val="left"/>
+        <w:rPr>
+          <w:rFonts w:ascii="Cascadia Code" w:hAnsi="Cascadia Code" w:cs="Cascadia Code" w:eastAsia="Cascadia Code"/>
+          <w:b/>
+          <w:color w:val="auto"/>
+          <w:spacing w:val="0"/>
+          <w:position w:val="0"/>
+          <w:sz w:val="20"/>
+          <w:shd w:fill="auto" w:val="clear"/>
+        </w:rPr>
+      </w:pPr>
+      <w:r>
+        <w:rPr>
+          <w:rFonts w:ascii="Cascadia Code" w:hAnsi="Cascadia Code" w:cs="Cascadia Code" w:eastAsia="Cascadia Code"/>
+          <w:b/>
+          <w:color w:val="auto"/>
+          <w:spacing w:val="0"/>
+          <w:position w:val="0"/>
+          <w:sz w:val="20"/>
+          <w:shd w:fill="auto" w:val="clear"/>
+        </w:rPr>
+        <w:t xml:space="preserve">Lecture :- ( Logging to file in asp net core using nlog )</w:t>
       </w:r>
     </w:p>
     <w:p>
@@ -8921,7 +9050,7 @@
           <w:sz w:val="20"/>
           <w:shd w:fill="auto" w:val="clear"/>
         </w:rPr>
-        <w:t xml:space="preserve">Traditional logging :- _logger.loginformation("")</w:t>
+        <w:t xml:space="preserve">Nlog is a logging framework which is used to store applications logs into files , databasea , console etc</w:t>
       </w:r>
     </w:p>
     <w:p>
@@ -8951,135 +9080,6 @@
           <w:sz w:val="20"/>
           <w:shd w:fill="auto" w:val="clear"/>
         </w:rPr>
-        <w:t xml:space="preserve">Structured logging :- _logger.loginformation("",emp.id)</w:t>
-      </w:r>
-    </w:p>
-    <w:p>
-      <w:pPr>
-        <w:spacing w:before="0" w:after="60" w:line="240"/>
-        <w:ind w:right="0" w:left="0" w:firstLine="0"/>
-        <w:jc w:val="left"/>
-        <w:rPr>
-          <w:rFonts w:ascii="Cascadia Code" w:hAnsi="Cascadia Code" w:cs="Cascadia Code" w:eastAsia="Cascadia Code"/>
-          <w:color w:val="auto"/>
-          <w:spacing w:val="0"/>
-          <w:position w:val="0"/>
-          <w:sz w:val="20"/>
-          <w:shd w:fill="auto" w:val="clear"/>
-        </w:rPr>
-      </w:pPr>
-      <w:r>
-        <w:rPr>
-          <w:rFonts w:ascii="Cascadia Code" w:hAnsi="Cascadia Code" w:cs="Cascadia Code" w:eastAsia="Cascadia Code"/>
-          <w:color w:val="auto"/>
-          <w:spacing w:val="0"/>
-          <w:position w:val="0"/>
-          <w:sz w:val="20"/>
-          <w:shd w:fill="auto" w:val="clear"/>
-        </w:rPr>
-        <w:t xml:space="preserve">You can use logging inside middleware too</w:t>
-      </w:r>
-    </w:p>
-    <w:p>
-      <w:pPr>
-        <w:spacing w:before="0" w:after="60" w:line="240"/>
-        <w:ind w:right="0" w:left="0" w:firstLine="0"/>
-        <w:jc w:val="left"/>
-        <w:rPr>
-          <w:rFonts w:ascii="Cascadia Code" w:hAnsi="Cascadia Code" w:cs="Cascadia Code" w:eastAsia="Cascadia Code"/>
-          <w:color w:val="auto"/>
-          <w:spacing w:val="0"/>
-          <w:position w:val="0"/>
-          <w:sz w:val="20"/>
-          <w:shd w:fill="auto" w:val="clear"/>
-        </w:rPr>
-      </w:pPr>
-    </w:p>
-    <w:p>
-      <w:pPr>
-        <w:spacing w:before="0" w:after="60" w:line="240"/>
-        <w:ind w:right="0" w:left="0" w:firstLine="0"/>
-        <w:jc w:val="left"/>
-        <w:rPr>
-          <w:rFonts w:ascii="Cascadia Code" w:hAnsi="Cascadia Code" w:cs="Cascadia Code" w:eastAsia="Cascadia Code"/>
-          <w:b/>
-          <w:color w:val="auto"/>
-          <w:spacing w:val="0"/>
-          <w:position w:val="0"/>
-          <w:sz w:val="20"/>
-          <w:shd w:fill="auto" w:val="clear"/>
-        </w:rPr>
-      </w:pPr>
-      <w:r>
-        <w:rPr>
-          <w:rFonts w:ascii="Cascadia Code" w:hAnsi="Cascadia Code" w:cs="Cascadia Code" w:eastAsia="Cascadia Code"/>
-          <w:b/>
-          <w:color w:val="auto"/>
-          <w:spacing w:val="0"/>
-          <w:position w:val="0"/>
-          <w:sz w:val="20"/>
-          <w:shd w:fill="auto" w:val="clear"/>
-        </w:rPr>
-        <w:t xml:space="preserve">Lecture :- ( Logging to file in asp net core using nlog )</w:t>
-      </w:r>
-    </w:p>
-    <w:p>
-      <w:pPr>
-        <w:numPr>
-          <w:ilvl w:val="0"/>
-          <w:numId w:val="170"/>
-        </w:numPr>
-        <w:spacing w:before="0" w:after="60" w:line="240"/>
-        <w:ind w:right="0" w:left="720" w:hanging="360"/>
-        <w:jc w:val="left"/>
-        <w:rPr>
-          <w:rFonts w:ascii="Cascadia Code" w:hAnsi="Cascadia Code" w:cs="Cascadia Code" w:eastAsia="Cascadia Code"/>
-          <w:color w:val="auto"/>
-          <w:spacing w:val="0"/>
-          <w:position w:val="0"/>
-          <w:sz w:val="20"/>
-          <w:shd w:fill="auto" w:val="clear"/>
-        </w:rPr>
-      </w:pPr>
-      <w:r>
-        <w:rPr>
-          <w:rFonts w:ascii="Cascadia Code" w:hAnsi="Cascadia Code" w:cs="Cascadia Code" w:eastAsia="Cascadia Code"/>
-          <w:color w:val="auto"/>
-          <w:spacing w:val="0"/>
-          <w:position w:val="0"/>
-          <w:sz w:val="20"/>
-          <w:shd w:fill="auto" w:val="clear"/>
-        </w:rPr>
-        <w:t xml:space="preserve">Nlog is a logging framework which is used to store applications logs into files , databasea , console etc</w:t>
-      </w:r>
-    </w:p>
-    <w:p>
-      <w:pPr>
-        <w:numPr>
-          <w:ilvl w:val="0"/>
-          <w:numId w:val="170"/>
-        </w:numPr>
-        <w:spacing w:before="0" w:after="60" w:line="240"/>
-        <w:ind w:right="0" w:left="720" w:hanging="360"/>
-        <w:jc w:val="left"/>
-        <w:rPr>
-          <w:rFonts w:ascii="Cascadia Code" w:hAnsi="Cascadia Code" w:cs="Cascadia Code" w:eastAsia="Cascadia Code"/>
-          <w:color w:val="auto"/>
-          <w:spacing w:val="0"/>
-          <w:position w:val="0"/>
-          <w:sz w:val="20"/>
-          <w:shd w:fill="auto" w:val="clear"/>
-        </w:rPr>
-      </w:pPr>
-      <w:r>
-        <w:rPr>
-          <w:rFonts w:ascii="Cascadia Code" w:hAnsi="Cascadia Code" w:cs="Cascadia Code" w:eastAsia="Cascadia Code"/>
-          <w:color w:val="auto"/>
-          <w:spacing w:val="0"/>
-          <w:position w:val="0"/>
-          <w:sz w:val="20"/>
-          <w:shd w:fill="auto" w:val="clear"/>
-        </w:rPr>
         <w:t xml:space="preserve">It's majorly used for storing logs in text files , production debugging and centralized monitoring</w:t>
       </w:r>
     </w:p>
@@ -9131,7 +9131,7 @@
       <w:pPr>
         <w:numPr>
           <w:ilvl w:val="0"/>
-          <w:numId w:val="172"/>
+          <w:numId w:val="169"/>
         </w:numPr>
         <w:spacing w:before="0" w:after="60" w:line="240"/>
         <w:ind w:right="0" w:left="720" w:hanging="360"/>
@@ -9161,7 +9161,7 @@
       <w:pPr>
         <w:numPr>
           <w:ilvl w:val="0"/>
-          <w:numId w:val="172"/>
+          <w:numId w:val="169"/>
         </w:numPr>
         <w:spacing w:before="0" w:after="60" w:line="240"/>
         <w:ind w:right="0" w:left="720" w:hanging="360"/>
@@ -9269,7 +9269,7 @@
       <w:pPr>
         <w:numPr>
           <w:ilvl w:val="0"/>
-          <w:numId w:val="174"/>
+          <w:numId w:val="171"/>
         </w:numPr>
         <w:spacing w:before="0" w:after="60" w:line="240"/>
         <w:ind w:right="0" w:left="720" w:hanging="360"/>
@@ -9299,7 +9299,7 @@
       <w:pPr>
         <w:numPr>
           <w:ilvl w:val="0"/>
-          <w:numId w:val="174"/>
+          <w:numId w:val="171"/>
         </w:numPr>
         <w:spacing w:before="0" w:after="60" w:line="240"/>
         <w:ind w:right="0" w:left="720" w:hanging="360"/>
@@ -9381,7 +9381,7 @@
       <w:pPr>
         <w:numPr>
           <w:ilvl w:val="0"/>
-          <w:numId w:val="176"/>
+          <w:numId w:val="173"/>
         </w:numPr>
         <w:spacing w:before="0" w:after="60" w:line="240"/>
         <w:ind w:right="0" w:left="720" w:hanging="360"/>
@@ -9411,7 +9411,7 @@
       <w:pPr>
         <w:numPr>
           <w:ilvl w:val="0"/>
-          <w:numId w:val="176"/>
+          <w:numId w:val="173"/>
         </w:numPr>
         <w:spacing w:before="0" w:after="60" w:line="240"/>
         <w:ind w:right="0" w:left="720" w:hanging="360"/>
@@ -9441,7 +9441,7 @@
       <w:pPr>
         <w:numPr>
           <w:ilvl w:val="0"/>
-          <w:numId w:val="176"/>
+          <w:numId w:val="173"/>
         </w:numPr>
         <w:spacing w:before="0" w:after="60" w:line="240"/>
         <w:ind w:right="0" w:left="720" w:hanging="360"/>
@@ -9514,6 +9514,152 @@
       <w:pPr>
         <w:numPr>
           <w:ilvl w:val="0"/>
+          <w:numId w:val="175"/>
+        </w:numPr>
+        <w:spacing w:before="0" w:after="60" w:line="240"/>
+        <w:ind w:right="0" w:left="720" w:hanging="360"/>
+        <w:jc w:val="left"/>
+        <w:rPr>
+          <w:rFonts w:ascii="Cascadia Code" w:hAnsi="Cascadia Code" w:cs="Cascadia Code" w:eastAsia="Cascadia Code"/>
+          <w:color w:val="auto"/>
+          <w:spacing w:val="0"/>
+          <w:position w:val="0"/>
+          <w:sz w:val="20"/>
+          <w:shd w:fill="auto" w:val="clear"/>
+        </w:rPr>
+      </w:pPr>
+      <w:r>
+        <w:rPr>
+          <w:rFonts w:ascii="Cascadia Code" w:hAnsi="Cascadia Code" w:cs="Cascadia Code" w:eastAsia="Cascadia Code"/>
+          <w:color w:val="auto"/>
+          <w:spacing w:val="0"/>
+          <w:position w:val="0"/>
+          <w:sz w:val="20"/>
+          <w:shd w:fill="auto" w:val="clear"/>
+        </w:rPr>
+        <w:t xml:space="preserve">It's in built authentication and user management system provided by asp.net core</w:t>
+      </w:r>
+    </w:p>
+    <w:p>
+      <w:pPr>
+        <w:spacing w:before="0" w:after="60" w:line="240"/>
+        <w:ind w:right="0" w:left="0" w:firstLine="0"/>
+        <w:jc w:val="left"/>
+        <w:rPr>
+          <w:rFonts w:ascii="Cascadia Code" w:hAnsi="Cascadia Code" w:cs="Cascadia Code" w:eastAsia="Cascadia Code"/>
+          <w:color w:val="auto"/>
+          <w:spacing w:val="0"/>
+          <w:position w:val="0"/>
+          <w:sz w:val="20"/>
+          <w:shd w:fill="auto" w:val="clear"/>
+        </w:rPr>
+      </w:pPr>
+    </w:p>
+    <w:p>
+      <w:pPr>
+        <w:spacing w:before="0" w:after="60" w:line="240"/>
+        <w:ind w:right="0" w:left="0" w:firstLine="0"/>
+        <w:jc w:val="left"/>
+        <w:rPr>
+          <w:rFonts w:ascii="Cascadia Code" w:hAnsi="Cascadia Code" w:cs="Cascadia Code" w:eastAsia="Cascadia Code"/>
+          <w:b/>
+          <w:color w:val="auto"/>
+          <w:spacing w:val="0"/>
+          <w:position w:val="0"/>
+          <w:sz w:val="20"/>
+          <w:shd w:fill="auto" w:val="clear"/>
+        </w:rPr>
+      </w:pPr>
+      <w:r>
+        <w:rPr>
+          <w:rFonts w:ascii="Cascadia Code" w:hAnsi="Cascadia Code" w:cs="Cascadia Code" w:eastAsia="Cascadia Code"/>
+          <w:b/>
+          <w:color w:val="auto"/>
+          <w:spacing w:val="0"/>
+          <w:position w:val="0"/>
+          <w:sz w:val="20"/>
+          <w:shd w:fill="auto" w:val="clear"/>
+        </w:rPr>
+        <w:t xml:space="preserve">Why Required :-</w:t>
+      </w:r>
+    </w:p>
+    <w:p>
+      <w:pPr>
+        <w:numPr>
+          <w:ilvl w:val="0"/>
+          <w:numId w:val="177"/>
+        </w:numPr>
+        <w:spacing w:before="0" w:after="60" w:line="240"/>
+        <w:ind w:right="0" w:left="720" w:hanging="360"/>
+        <w:jc w:val="left"/>
+        <w:rPr>
+          <w:rFonts w:ascii="Cascadia Code" w:hAnsi="Cascadia Code" w:cs="Cascadia Code" w:eastAsia="Cascadia Code"/>
+          <w:color w:val="auto"/>
+          <w:spacing w:val="0"/>
+          <w:position w:val="0"/>
+          <w:sz w:val="20"/>
+          <w:shd w:fill="auto" w:val="clear"/>
+        </w:rPr>
+      </w:pPr>
+      <w:r>
+        <w:rPr>
+          <w:rFonts w:ascii="Cascadia Code" w:hAnsi="Cascadia Code" w:cs="Cascadia Code" w:eastAsia="Cascadia Code"/>
+          <w:color w:val="auto"/>
+          <w:spacing w:val="0"/>
+          <w:position w:val="0"/>
+          <w:sz w:val="20"/>
+          <w:shd w:fill="auto" w:val="clear"/>
+        </w:rPr>
+        <w:t xml:space="preserve">Because almost every application needs login , signup , password handling etc , so instead of building everything manually asp.net core identity provides ready mande secure implementaion</w:t>
+      </w:r>
+    </w:p>
+    <w:p>
+      <w:pPr>
+        <w:spacing w:before="0" w:after="60" w:line="240"/>
+        <w:ind w:right="0" w:left="0" w:firstLine="0"/>
+        <w:jc w:val="left"/>
+        <w:rPr>
+          <w:rFonts w:ascii="Cascadia Code" w:hAnsi="Cascadia Code" w:cs="Cascadia Code" w:eastAsia="Cascadia Code"/>
+          <w:color w:val="auto"/>
+          <w:spacing w:val="0"/>
+          <w:position w:val="0"/>
+          <w:sz w:val="20"/>
+          <w:shd w:fill="auto" w:val="clear"/>
+        </w:rPr>
+      </w:pPr>
+    </w:p>
+    <w:p>
+      <w:pPr>
+        <w:spacing w:before="0" w:after="60" w:line="240"/>
+        <w:ind w:right="0" w:left="0" w:firstLine="0"/>
+        <w:jc w:val="left"/>
+        <w:rPr>
+          <w:rFonts w:ascii="Cascadia Code" w:hAnsi="Cascadia Code" w:cs="Cascadia Code" w:eastAsia="Cascadia Code"/>
+          <w:b/>
+          <w:color w:val="auto"/>
+          <w:spacing w:val="0"/>
+          <w:position w:val="0"/>
+          <w:sz w:val="20"/>
+          <w:shd w:fill="auto" w:val="clear"/>
+        </w:rPr>
+      </w:pPr>
+      <w:r>
+        <w:rPr>
+          <w:rFonts w:ascii="Cascadia Code" w:hAnsi="Cascadia Code" w:cs="Cascadia Code" w:eastAsia="Cascadia Code"/>
+          <w:b/>
+          <w:color w:val="auto"/>
+          <w:spacing w:val="0"/>
+          <w:position w:val="0"/>
+          <w:sz w:val="20"/>
+          <w:shd w:fill="auto" w:val="clear"/>
+        </w:rPr>
+        <w:t xml:space="preserve">Most important concepts :-</w:t>
+      </w:r>
+    </w:p>
+    <w:p>
+      <w:pPr>
+        <w:numPr>
+          <w:ilvl w:val="0"/>
           <w:numId w:val="179"/>
         </w:numPr>
         <w:spacing w:before="0" w:after="60" w:line="240"/>
@@ -9537,50 +9683,78 @@
           <w:sz w:val="20"/>
           <w:shd w:fill="auto" w:val="clear"/>
         </w:rPr>
-        <w:t xml:space="preserve">It's in built authentication and user management system provided by asp.net core</w:t>
-      </w:r>
-    </w:p>
-    <w:p>
-      <w:pPr>
-        <w:spacing w:before="0" w:after="60" w:line="240"/>
-        <w:ind w:right="0" w:left="0" w:firstLine="0"/>
-        <w:jc w:val="left"/>
-        <w:rPr>
-          <w:rFonts w:ascii="Cascadia Code" w:hAnsi="Cascadia Code" w:cs="Cascadia Code" w:eastAsia="Cascadia Code"/>
-          <w:color w:val="auto"/>
-          <w:spacing w:val="0"/>
-          <w:position w:val="0"/>
-          <w:sz w:val="20"/>
-          <w:shd w:fill="auto" w:val="clear"/>
-        </w:rPr>
-      </w:pPr>
-    </w:p>
-    <w:p>
-      <w:pPr>
-        <w:spacing w:before="0" w:after="60" w:line="240"/>
-        <w:ind w:right="0" w:left="0" w:firstLine="0"/>
-        <w:jc w:val="left"/>
-        <w:rPr>
-          <w:rFonts w:ascii="Cascadia Code" w:hAnsi="Cascadia Code" w:cs="Cascadia Code" w:eastAsia="Cascadia Code"/>
-          <w:b/>
-          <w:color w:val="auto"/>
-          <w:spacing w:val="0"/>
-          <w:position w:val="0"/>
-          <w:sz w:val="20"/>
-          <w:shd w:fill="auto" w:val="clear"/>
-        </w:rPr>
-      </w:pPr>
-      <w:r>
-        <w:rPr>
-          <w:rFonts w:ascii="Cascadia Code" w:hAnsi="Cascadia Code" w:cs="Cascadia Code" w:eastAsia="Cascadia Code"/>
-          <w:b/>
-          <w:color w:val="auto"/>
-          <w:spacing w:val="0"/>
-          <w:position w:val="0"/>
-          <w:sz w:val="20"/>
-          <w:shd w:fill="auto" w:val="clear"/>
-        </w:rPr>
-        <w:t xml:space="preserve">Why Required :-</w:t>
+        <w:t xml:space="preserve">Authentication :- like user kaun hai</w:t>
+      </w:r>
+    </w:p>
+    <w:p>
+      <w:pPr>
+        <w:numPr>
+          <w:ilvl w:val="0"/>
+          <w:numId w:val="179"/>
+        </w:numPr>
+        <w:spacing w:before="0" w:after="60" w:line="240"/>
+        <w:ind w:right="0" w:left="720" w:hanging="360"/>
+        <w:jc w:val="left"/>
+        <w:rPr>
+          <w:rFonts w:ascii="Cascadia Code" w:hAnsi="Cascadia Code" w:cs="Cascadia Code" w:eastAsia="Cascadia Code"/>
+          <w:color w:val="auto"/>
+          <w:spacing w:val="0"/>
+          <w:position w:val="0"/>
+          <w:sz w:val="20"/>
+          <w:shd w:fill="auto" w:val="clear"/>
+        </w:rPr>
+      </w:pPr>
+      <w:r>
+        <w:rPr>
+          <w:rFonts w:ascii="Cascadia Code" w:hAnsi="Cascadia Code" w:cs="Cascadia Code" w:eastAsia="Cascadia Code"/>
+          <w:color w:val="auto"/>
+          <w:spacing w:val="0"/>
+          <w:position w:val="0"/>
+          <w:sz w:val="20"/>
+          <w:shd w:fill="auto" w:val="clear"/>
+        </w:rPr>
+        <w:t xml:space="preserve">Authorization :- like what user is trying to access</w:t>
+      </w:r>
+    </w:p>
+    <w:p>
+      <w:pPr>
+        <w:spacing w:before="0" w:after="60" w:line="240"/>
+        <w:ind w:right="0" w:left="0" w:firstLine="0"/>
+        <w:jc w:val="left"/>
+        <w:rPr>
+          <w:rFonts w:ascii="Cascadia Code" w:hAnsi="Cascadia Code" w:cs="Cascadia Code" w:eastAsia="Cascadia Code"/>
+          <w:color w:val="auto"/>
+          <w:spacing w:val="0"/>
+          <w:position w:val="0"/>
+          <w:sz w:val="20"/>
+          <w:shd w:fill="auto" w:val="clear"/>
+        </w:rPr>
+      </w:pPr>
+    </w:p>
+    <w:p>
+      <w:pPr>
+        <w:spacing w:before="0" w:after="60" w:line="240"/>
+        <w:ind w:right="0" w:left="0" w:firstLine="0"/>
+        <w:jc w:val="left"/>
+        <w:rPr>
+          <w:rFonts w:ascii="Cascadia Code" w:hAnsi="Cascadia Code" w:cs="Cascadia Code" w:eastAsia="Cascadia Code"/>
+          <w:color w:val="auto"/>
+          <w:spacing w:val="0"/>
+          <w:position w:val="0"/>
+          <w:sz w:val="20"/>
+          <w:shd w:fill="auto" w:val="clear"/>
+        </w:rPr>
+      </w:pPr>
+      <w:r>
+        <w:rPr>
+          <w:rFonts w:ascii="Cascadia Code" w:hAnsi="Cascadia Code" w:cs="Cascadia Code" w:eastAsia="Cascadia Code"/>
+          <w:color w:val="auto"/>
+          <w:spacing w:val="0"/>
+          <w:position w:val="0"/>
+          <w:sz w:val="20"/>
+          <w:shd w:fill="auto" w:val="clear"/>
+        </w:rPr>
+        <w:t xml:space="preserve">Important identity classes :-</w:t>
       </w:r>
     </w:p>
     <w:p>
@@ -9588,180 +9762,6 @@
         <w:numPr>
           <w:ilvl w:val="0"/>
           <w:numId w:val="181"/>
-        </w:numPr>
-        <w:spacing w:before="0" w:after="60" w:line="240"/>
-        <w:ind w:right="0" w:left="720" w:hanging="360"/>
-        <w:jc w:val="left"/>
-        <w:rPr>
-          <w:rFonts w:ascii="Cascadia Code" w:hAnsi="Cascadia Code" w:cs="Cascadia Code" w:eastAsia="Cascadia Code"/>
-          <w:color w:val="auto"/>
-          <w:spacing w:val="0"/>
-          <w:position w:val="0"/>
-          <w:sz w:val="20"/>
-          <w:shd w:fill="auto" w:val="clear"/>
-        </w:rPr>
-      </w:pPr>
-      <w:r>
-        <w:rPr>
-          <w:rFonts w:ascii="Cascadia Code" w:hAnsi="Cascadia Code" w:cs="Cascadia Code" w:eastAsia="Cascadia Code"/>
-          <w:color w:val="auto"/>
-          <w:spacing w:val="0"/>
-          <w:position w:val="0"/>
-          <w:sz w:val="20"/>
-          <w:shd w:fill="auto" w:val="clear"/>
-        </w:rPr>
-        <w:t xml:space="preserve">Because almost every application needs login , signup , password handling etc , so instead of building everything manually asp.net core identity provides ready mande secure implementaion</w:t>
-      </w:r>
-    </w:p>
-    <w:p>
-      <w:pPr>
-        <w:spacing w:before="0" w:after="60" w:line="240"/>
-        <w:ind w:right="0" w:left="0" w:firstLine="0"/>
-        <w:jc w:val="left"/>
-        <w:rPr>
-          <w:rFonts w:ascii="Cascadia Code" w:hAnsi="Cascadia Code" w:cs="Cascadia Code" w:eastAsia="Cascadia Code"/>
-          <w:color w:val="auto"/>
-          <w:spacing w:val="0"/>
-          <w:position w:val="0"/>
-          <w:sz w:val="20"/>
-          <w:shd w:fill="auto" w:val="clear"/>
-        </w:rPr>
-      </w:pPr>
-    </w:p>
-    <w:p>
-      <w:pPr>
-        <w:spacing w:before="0" w:after="60" w:line="240"/>
-        <w:ind w:right="0" w:left="0" w:firstLine="0"/>
-        <w:jc w:val="left"/>
-        <w:rPr>
-          <w:rFonts w:ascii="Cascadia Code" w:hAnsi="Cascadia Code" w:cs="Cascadia Code" w:eastAsia="Cascadia Code"/>
-          <w:b/>
-          <w:color w:val="auto"/>
-          <w:spacing w:val="0"/>
-          <w:position w:val="0"/>
-          <w:sz w:val="20"/>
-          <w:shd w:fill="auto" w:val="clear"/>
-        </w:rPr>
-      </w:pPr>
-      <w:r>
-        <w:rPr>
-          <w:rFonts w:ascii="Cascadia Code" w:hAnsi="Cascadia Code" w:cs="Cascadia Code" w:eastAsia="Cascadia Code"/>
-          <w:b/>
-          <w:color w:val="auto"/>
-          <w:spacing w:val="0"/>
-          <w:position w:val="0"/>
-          <w:sz w:val="20"/>
-          <w:shd w:fill="auto" w:val="clear"/>
-        </w:rPr>
-        <w:t xml:space="preserve">Most important concepts :-</w:t>
-      </w:r>
-    </w:p>
-    <w:p>
-      <w:pPr>
-        <w:numPr>
-          <w:ilvl w:val="0"/>
-          <w:numId w:val="183"/>
-        </w:numPr>
-        <w:spacing w:before="0" w:after="60" w:line="240"/>
-        <w:ind w:right="0" w:left="720" w:hanging="360"/>
-        <w:jc w:val="left"/>
-        <w:rPr>
-          <w:rFonts w:ascii="Cascadia Code" w:hAnsi="Cascadia Code" w:cs="Cascadia Code" w:eastAsia="Cascadia Code"/>
-          <w:color w:val="auto"/>
-          <w:spacing w:val="0"/>
-          <w:position w:val="0"/>
-          <w:sz w:val="20"/>
-          <w:shd w:fill="auto" w:val="clear"/>
-        </w:rPr>
-      </w:pPr>
-      <w:r>
-        <w:rPr>
-          <w:rFonts w:ascii="Cascadia Code" w:hAnsi="Cascadia Code" w:cs="Cascadia Code" w:eastAsia="Cascadia Code"/>
-          <w:color w:val="auto"/>
-          <w:spacing w:val="0"/>
-          <w:position w:val="0"/>
-          <w:sz w:val="20"/>
-          <w:shd w:fill="auto" w:val="clear"/>
-        </w:rPr>
-        <w:t xml:space="preserve">Authentication :- like user kaun hai</w:t>
-      </w:r>
-    </w:p>
-    <w:p>
-      <w:pPr>
-        <w:numPr>
-          <w:ilvl w:val="0"/>
-          <w:numId w:val="183"/>
-        </w:numPr>
-        <w:spacing w:before="0" w:after="60" w:line="240"/>
-        <w:ind w:right="0" w:left="720" w:hanging="360"/>
-        <w:jc w:val="left"/>
-        <w:rPr>
-          <w:rFonts w:ascii="Cascadia Code" w:hAnsi="Cascadia Code" w:cs="Cascadia Code" w:eastAsia="Cascadia Code"/>
-          <w:color w:val="auto"/>
-          <w:spacing w:val="0"/>
-          <w:position w:val="0"/>
-          <w:sz w:val="20"/>
-          <w:shd w:fill="auto" w:val="clear"/>
-        </w:rPr>
-      </w:pPr>
-      <w:r>
-        <w:rPr>
-          <w:rFonts w:ascii="Cascadia Code" w:hAnsi="Cascadia Code" w:cs="Cascadia Code" w:eastAsia="Cascadia Code"/>
-          <w:color w:val="auto"/>
-          <w:spacing w:val="0"/>
-          <w:position w:val="0"/>
-          <w:sz w:val="20"/>
-          <w:shd w:fill="auto" w:val="clear"/>
-        </w:rPr>
-        <w:t xml:space="preserve">Authorization :- like what user is trying to access</w:t>
-      </w:r>
-    </w:p>
-    <w:p>
-      <w:pPr>
-        <w:spacing w:before="0" w:after="60" w:line="240"/>
-        <w:ind w:right="0" w:left="0" w:firstLine="0"/>
-        <w:jc w:val="left"/>
-        <w:rPr>
-          <w:rFonts w:ascii="Cascadia Code" w:hAnsi="Cascadia Code" w:cs="Cascadia Code" w:eastAsia="Cascadia Code"/>
-          <w:color w:val="auto"/>
-          <w:spacing w:val="0"/>
-          <w:position w:val="0"/>
-          <w:sz w:val="20"/>
-          <w:shd w:fill="auto" w:val="clear"/>
-        </w:rPr>
-      </w:pPr>
-    </w:p>
-    <w:p>
-      <w:pPr>
-        <w:spacing w:before="0" w:after="60" w:line="240"/>
-        <w:ind w:right="0" w:left="0" w:firstLine="0"/>
-        <w:jc w:val="left"/>
-        <w:rPr>
-          <w:rFonts w:ascii="Cascadia Code" w:hAnsi="Cascadia Code" w:cs="Cascadia Code" w:eastAsia="Cascadia Code"/>
-          <w:color w:val="auto"/>
-          <w:spacing w:val="0"/>
-          <w:position w:val="0"/>
-          <w:sz w:val="20"/>
-          <w:shd w:fill="auto" w:val="clear"/>
-        </w:rPr>
-      </w:pPr>
-      <w:r>
-        <w:rPr>
-          <w:rFonts w:ascii="Cascadia Code" w:hAnsi="Cascadia Code" w:cs="Cascadia Code" w:eastAsia="Cascadia Code"/>
-          <w:color w:val="auto"/>
-          <w:spacing w:val="0"/>
-          <w:position w:val="0"/>
-          <w:sz w:val="20"/>
-          <w:shd w:fill="auto" w:val="clear"/>
-        </w:rPr>
-        <w:t xml:space="preserve">Important identity classes :-</w:t>
-      </w:r>
-    </w:p>
-    <w:p>
-      <w:pPr>
-        <w:numPr>
-          <w:ilvl w:val="0"/>
-          <w:numId w:val="185"/>
         </w:numPr>
         <w:spacing w:before="0" w:after="60" w:line="240"/>
         <w:ind w:right="0" w:left="720" w:hanging="360"/>
@@ -9893,6 +9893,951 @@
         </w:rPr>
         <w:t xml:space="preserve">   2. UserManager</w:t>
       </w:r>
+    </w:p>
+    <w:p>
+      <w:pPr>
+        <w:spacing w:before="0" w:after="60" w:line="240"/>
+        <w:ind w:right="0" w:left="0" w:firstLine="0"/>
+        <w:jc w:val="left"/>
+        <w:rPr>
+          <w:rFonts w:ascii="Cascadia Code" w:hAnsi="Cascadia Code" w:cs="Cascadia Code" w:eastAsia="Cascadia Code"/>
+          <w:color w:val="auto"/>
+          <w:spacing w:val="0"/>
+          <w:position w:val="0"/>
+          <w:sz w:val="20"/>
+          <w:shd w:fill="auto" w:val="clear"/>
+        </w:rPr>
+      </w:pPr>
+    </w:p>
+    <w:p>
+      <w:pPr>
+        <w:spacing w:before="0" w:after="60" w:line="240"/>
+        <w:ind w:right="0" w:left="0" w:firstLine="0"/>
+        <w:jc w:val="left"/>
+        <w:rPr>
+          <w:rFonts w:ascii="Cascadia Code" w:hAnsi="Cascadia Code" w:cs="Cascadia Code" w:eastAsia="Cascadia Code"/>
+          <w:color w:val="auto"/>
+          <w:spacing w:val="0"/>
+          <w:position w:val="0"/>
+          <w:sz w:val="20"/>
+          <w:shd w:fill="auto" w:val="clear"/>
+        </w:rPr>
+      </w:pPr>
+    </w:p>
+    <w:p>
+      <w:pPr>
+        <w:spacing w:before="0" w:after="60" w:line="240"/>
+        <w:ind w:right="0" w:left="0" w:firstLine="0"/>
+        <w:jc w:val="left"/>
+        <w:rPr>
+          <w:rFonts w:ascii="Cascadia Code" w:hAnsi="Cascadia Code" w:cs="Cascadia Code" w:eastAsia="Cascadia Code"/>
+          <w:b/>
+          <w:color w:val="auto"/>
+          <w:spacing w:val="0"/>
+          <w:position w:val="0"/>
+          <w:sz w:val="20"/>
+          <w:shd w:fill="auto" w:val="clear"/>
+        </w:rPr>
+      </w:pPr>
+      <w:r>
+        <w:rPr>
+          <w:rFonts w:ascii="Cascadia Code" w:hAnsi="Cascadia Code" w:cs="Cascadia Code" w:eastAsia="Cascadia Code"/>
+          <w:b/>
+          <w:color w:val="auto"/>
+          <w:spacing w:val="0"/>
+          <w:position w:val="0"/>
+          <w:sz w:val="20"/>
+          <w:shd w:fill="auto" w:val="clear"/>
+        </w:rPr>
+        <w:t xml:space="preserve">Lecture :- ( Register new user using asp net core identity )</w:t>
+      </w:r>
+    </w:p>
+    <w:p>
+      <w:pPr>
+        <w:spacing w:before="0" w:after="60" w:line="240"/>
+        <w:ind w:right="0" w:left="0" w:firstLine="0"/>
+        <w:jc w:val="left"/>
+        <w:rPr>
+          <w:rFonts w:ascii="Cascadia Code" w:hAnsi="Cascadia Code" w:cs="Cascadia Code" w:eastAsia="Cascadia Code"/>
+          <w:b/>
+          <w:color w:val="auto"/>
+          <w:spacing w:val="0"/>
+          <w:position w:val="0"/>
+          <w:sz w:val="20"/>
+          <w:shd w:fill="auto" w:val="clear"/>
+        </w:rPr>
+      </w:pPr>
+    </w:p>
+    <w:p>
+      <w:pPr>
+        <w:spacing w:before="0" w:after="60" w:line="240"/>
+        <w:ind w:right="0" w:left="0" w:firstLine="0"/>
+        <w:jc w:val="left"/>
+        <w:rPr>
+          <w:rFonts w:ascii="Cascadia Code" w:hAnsi="Cascadia Code" w:cs="Cascadia Code" w:eastAsia="Cascadia Code"/>
+          <w:b/>
+          <w:color w:val="auto"/>
+          <w:spacing w:val="0"/>
+          <w:position w:val="0"/>
+          <w:sz w:val="20"/>
+          <w:shd w:fill="auto" w:val="clear"/>
+        </w:rPr>
+      </w:pPr>
+      <w:r>
+        <w:rPr>
+          <w:rFonts w:ascii="Cascadia Code" w:hAnsi="Cascadia Code" w:cs="Cascadia Code" w:eastAsia="Cascadia Code"/>
+          <w:b/>
+          <w:color w:val="auto"/>
+          <w:spacing w:val="0"/>
+          <w:position w:val="0"/>
+          <w:sz w:val="20"/>
+          <w:shd w:fill="auto" w:val="clear"/>
+        </w:rPr>
+        <w:t xml:space="preserve">What is it ?</w:t>
+      </w:r>
+    </w:p>
+    <w:p>
+      <w:pPr>
+        <w:numPr>
+          <w:ilvl w:val="0"/>
+          <w:numId w:val="183"/>
+        </w:numPr>
+        <w:spacing w:before="0" w:after="60" w:line="240"/>
+        <w:ind w:right="0" w:left="720" w:hanging="360"/>
+        <w:jc w:val="left"/>
+        <w:rPr>
+          <w:rFonts w:ascii="Cascadia Code" w:hAnsi="Cascadia Code" w:cs="Cascadia Code" w:eastAsia="Cascadia Code"/>
+          <w:color w:val="auto"/>
+          <w:spacing w:val="0"/>
+          <w:position w:val="0"/>
+          <w:sz w:val="20"/>
+          <w:shd w:fill="auto" w:val="clear"/>
+        </w:rPr>
+      </w:pPr>
+      <w:r>
+        <w:rPr>
+          <w:rFonts w:ascii="Cascadia Code" w:hAnsi="Cascadia Code" w:cs="Cascadia Code" w:eastAsia="Cascadia Code"/>
+          <w:color w:val="auto"/>
+          <w:spacing w:val="0"/>
+          <w:position w:val="0"/>
+          <w:sz w:val="20"/>
+          <w:shd w:fill="auto" w:val="clear"/>
+        </w:rPr>
+        <w:t xml:space="preserve">Creating a new user account</w:t>
+      </w:r>
+    </w:p>
+    <w:p>
+      <w:pPr>
+        <w:numPr>
+          <w:ilvl w:val="0"/>
+          <w:numId w:val="183"/>
+        </w:numPr>
+        <w:spacing w:before="0" w:after="60" w:line="240"/>
+        <w:ind w:right="0" w:left="720" w:hanging="360"/>
+        <w:jc w:val="left"/>
+        <w:rPr>
+          <w:rFonts w:ascii="Cascadia Code" w:hAnsi="Cascadia Code" w:cs="Cascadia Code" w:eastAsia="Cascadia Code"/>
+          <w:color w:val="auto"/>
+          <w:spacing w:val="0"/>
+          <w:position w:val="0"/>
+          <w:sz w:val="20"/>
+          <w:shd w:fill="auto" w:val="clear"/>
+        </w:rPr>
+      </w:pPr>
+      <w:r>
+        <w:rPr>
+          <w:rFonts w:ascii="Cascadia Code" w:hAnsi="Cascadia Code" w:cs="Cascadia Code" w:eastAsia="Cascadia Code"/>
+          <w:color w:val="auto"/>
+          <w:spacing w:val="0"/>
+          <w:position w:val="0"/>
+          <w:sz w:val="20"/>
+          <w:shd w:fill="auto" w:val="clear"/>
+        </w:rPr>
+        <w:t xml:space="preserve">storing details in db</w:t>
+      </w:r>
+    </w:p>
+    <w:p>
+      <w:pPr>
+        <w:numPr>
+          <w:ilvl w:val="0"/>
+          <w:numId w:val="183"/>
+        </w:numPr>
+        <w:spacing w:before="0" w:after="60" w:line="240"/>
+        <w:ind w:right="0" w:left="720" w:hanging="360"/>
+        <w:jc w:val="left"/>
+        <w:rPr>
+          <w:rFonts w:ascii="Cascadia Code" w:hAnsi="Cascadia Code" w:cs="Cascadia Code" w:eastAsia="Cascadia Code"/>
+          <w:color w:val="auto"/>
+          <w:spacing w:val="0"/>
+          <w:position w:val="0"/>
+          <w:sz w:val="20"/>
+          <w:shd w:fill="auto" w:val="clear"/>
+        </w:rPr>
+      </w:pPr>
+      <w:r>
+        <w:rPr>
+          <w:rFonts w:ascii="Cascadia Code" w:hAnsi="Cascadia Code" w:cs="Cascadia Code" w:eastAsia="Cascadia Code"/>
+          <w:color w:val="auto"/>
+          <w:spacing w:val="0"/>
+          <w:position w:val="0"/>
+          <w:sz w:val="20"/>
+          <w:shd w:fill="auto" w:val="clear"/>
+        </w:rPr>
+        <w:t xml:space="preserve">securly storing pswd</w:t>
+      </w:r>
+    </w:p>
+    <w:p>
+      <w:pPr>
+        <w:spacing w:before="0" w:after="60" w:line="240"/>
+        <w:ind w:right="0" w:left="0" w:firstLine="0"/>
+        <w:jc w:val="left"/>
+        <w:rPr>
+          <w:rFonts w:ascii="Cascadia Code" w:hAnsi="Cascadia Code" w:cs="Cascadia Code" w:eastAsia="Cascadia Code"/>
+          <w:color w:val="auto"/>
+          <w:spacing w:val="0"/>
+          <w:position w:val="0"/>
+          <w:sz w:val="20"/>
+          <w:shd w:fill="auto" w:val="clear"/>
+        </w:rPr>
+      </w:pPr>
+      <w:r>
+        <w:rPr>
+          <w:rFonts w:ascii="Cascadia Code" w:hAnsi="Cascadia Code" w:cs="Cascadia Code" w:eastAsia="Cascadia Code"/>
+          <w:color w:val="auto"/>
+          <w:spacing w:val="0"/>
+          <w:position w:val="0"/>
+          <w:sz w:val="20"/>
+          <w:shd w:fill="auto" w:val="clear"/>
+        </w:rPr>
+        <w:t xml:space="preserve">Asp.net core identity handles this automatically</w:t>
+      </w:r>
+    </w:p>
+    <w:p>
+      <w:pPr>
+        <w:spacing w:before="0" w:after="60" w:line="240"/>
+        <w:ind w:right="0" w:left="0" w:firstLine="0"/>
+        <w:jc w:val="left"/>
+        <w:rPr>
+          <w:rFonts w:ascii="Cascadia Code" w:hAnsi="Cascadia Code" w:cs="Cascadia Code" w:eastAsia="Cascadia Code"/>
+          <w:color w:val="auto"/>
+          <w:spacing w:val="0"/>
+          <w:position w:val="0"/>
+          <w:sz w:val="20"/>
+          <w:shd w:fill="auto" w:val="clear"/>
+        </w:rPr>
+      </w:pPr>
+    </w:p>
+    <w:p>
+      <w:pPr>
+        <w:numPr>
+          <w:ilvl w:val="0"/>
+          <w:numId w:val="185"/>
+        </w:numPr>
+        <w:spacing w:before="0" w:after="60" w:line="240"/>
+        <w:ind w:right="0" w:left="720" w:hanging="360"/>
+        <w:jc w:val="left"/>
+        <w:rPr>
+          <w:rFonts w:ascii="Cascadia Code" w:hAnsi="Cascadia Code" w:cs="Cascadia Code" w:eastAsia="Cascadia Code"/>
+          <w:color w:val="auto"/>
+          <w:spacing w:val="0"/>
+          <w:position w:val="0"/>
+          <w:sz w:val="20"/>
+          <w:shd w:fill="auto" w:val="clear"/>
+        </w:rPr>
+      </w:pPr>
+      <w:r>
+        <w:rPr>
+          <w:rFonts w:ascii="Cascadia Code" w:hAnsi="Cascadia Code" w:cs="Cascadia Code" w:eastAsia="Cascadia Code"/>
+          <w:color w:val="auto"/>
+          <w:spacing w:val="0"/>
+          <w:position w:val="0"/>
+          <w:sz w:val="20"/>
+          <w:shd w:fill="auto" w:val="clear"/>
+        </w:rPr>
+        <w:t xml:space="preserve">It's required because every app need this type of functionality</w:t>
+      </w:r>
+    </w:p>
+    <w:p>
+      <w:pPr>
+        <w:numPr>
+          <w:ilvl w:val="0"/>
+          <w:numId w:val="185"/>
+        </w:numPr>
+        <w:spacing w:before="0" w:after="60" w:line="240"/>
+        <w:ind w:right="0" w:left="720" w:hanging="360"/>
+        <w:jc w:val="left"/>
+        <w:rPr>
+          <w:rFonts w:ascii="Cascadia Code" w:hAnsi="Cascadia Code" w:cs="Cascadia Code" w:eastAsia="Cascadia Code"/>
+          <w:color w:val="auto"/>
+          <w:spacing w:val="0"/>
+          <w:position w:val="0"/>
+          <w:sz w:val="20"/>
+          <w:shd w:fill="auto" w:val="clear"/>
+        </w:rPr>
+      </w:pPr>
+      <w:r>
+        <w:rPr>
+          <w:rFonts w:ascii="Cascadia Code" w:hAnsi="Cascadia Code" w:cs="Cascadia Code" w:eastAsia="Cascadia Code"/>
+          <w:color w:val="auto"/>
+          <w:spacing w:val="0"/>
+          <w:position w:val="0"/>
+          <w:sz w:val="20"/>
+          <w:shd w:fill="auto" w:val="clear"/>
+        </w:rPr>
+        <w:t xml:space="preserve">Identity never stores plain password</w:t>
+      </w:r>
+    </w:p>
+    <w:p>
+      <w:pPr>
+        <w:numPr>
+          <w:ilvl w:val="0"/>
+          <w:numId w:val="185"/>
+        </w:numPr>
+        <w:spacing w:before="0" w:after="60" w:line="240"/>
+        <w:ind w:right="0" w:left="720" w:hanging="360"/>
+        <w:jc w:val="left"/>
+        <w:rPr>
+          <w:rFonts w:ascii="Cascadia Code" w:hAnsi="Cascadia Code" w:cs="Cascadia Code" w:eastAsia="Cascadia Code"/>
+          <w:color w:val="auto"/>
+          <w:spacing w:val="0"/>
+          <w:position w:val="0"/>
+          <w:sz w:val="20"/>
+          <w:shd w:fill="auto" w:val="clear"/>
+        </w:rPr>
+      </w:pPr>
+      <w:r>
+        <w:rPr>
+          <w:rFonts w:ascii="Cascadia Code" w:hAnsi="Cascadia Code" w:cs="Cascadia Code" w:eastAsia="Cascadia Code"/>
+          <w:color w:val="auto"/>
+          <w:spacing w:val="0"/>
+          <w:position w:val="0"/>
+          <w:sz w:val="20"/>
+          <w:shd w:fill="auto" w:val="clear"/>
+        </w:rPr>
+        <w:t xml:space="preserve">_usermanager.CreateAsync() :- basically these types of inbuilt methods do stuffs like validation and etc</w:t>
+      </w:r>
+    </w:p>
+    <w:p>
+      <w:pPr>
+        <w:spacing w:before="0" w:after="60" w:line="240"/>
+        <w:ind w:right="0" w:left="0" w:firstLine="0"/>
+        <w:jc w:val="left"/>
+        <w:rPr>
+          <w:rFonts w:ascii="Cascadia Code" w:hAnsi="Cascadia Code" w:cs="Cascadia Code" w:eastAsia="Cascadia Code"/>
+          <w:color w:val="auto"/>
+          <w:spacing w:val="0"/>
+          <w:position w:val="0"/>
+          <w:sz w:val="20"/>
+          <w:shd w:fill="auto" w:val="clear"/>
+        </w:rPr>
+      </w:pPr>
+      <w:r>
+        <w:object w:dxaOrig="8640" w:dyaOrig="4245">
+          <v:rect xmlns:o="urn:schemas-microsoft-com:office:office" xmlns:v="urn:schemas-microsoft-com:vml" id="rectole0000000002" style="width:432.000000pt;height:212.250000pt" o:preferrelative="t" o:ole="">
+            <o:lock v:ext="edit"/>
+            <v:imagedata xmlns:r="http://schemas.openxmlformats.org/officeDocument/2006/relationships" r:id="docRId5" o:title=""/>
+          </v:rect>
+          <o:OLEObject xmlns:r="http://schemas.openxmlformats.org/officeDocument/2006/relationships" xmlns:o="urn:schemas-microsoft-com:office:office" Type="Embed" ProgID="StaticDib" DrawAspect="Content" ObjectID="0000000002" ShapeID="rectole0000000002" r:id="docRId4"/>
+        </w:object>
+      </w:r>
+    </w:p>
+    <w:p>
+      <w:pPr>
+        <w:numPr>
+          <w:ilvl w:val="0"/>
+          <w:numId w:val="187"/>
+        </w:numPr>
+        <w:spacing w:before="0" w:after="60" w:line="240"/>
+        <w:ind w:right="0" w:left="720" w:hanging="360"/>
+        <w:jc w:val="left"/>
+        <w:rPr>
+          <w:rFonts w:ascii="Cascadia Code" w:hAnsi="Cascadia Code" w:cs="Cascadia Code" w:eastAsia="Cascadia Code"/>
+          <w:color w:val="auto"/>
+          <w:spacing w:val="0"/>
+          <w:position w:val="0"/>
+          <w:sz w:val="20"/>
+          <w:shd w:fill="auto" w:val="clear"/>
+        </w:rPr>
+      </w:pPr>
+      <w:r>
+        <w:rPr>
+          <w:rFonts w:ascii="Cascadia Code" w:hAnsi="Cascadia Code" w:cs="Cascadia Code" w:eastAsia="Cascadia Code"/>
+          <w:color w:val="auto"/>
+          <w:spacing w:val="0"/>
+          <w:position w:val="0"/>
+          <w:sz w:val="20"/>
+          <w:shd w:fill="auto" w:val="clear"/>
+        </w:rPr>
+        <w:t xml:space="preserve">To use identity class we have to installed ( Install-Package Microsoft.AspNetCore.Identity.EntityFrameworkCore ) also to use these classess like identityuser , usermanager , signinmanager &amp; etc</w:t>
+      </w:r>
+    </w:p>
+    <w:p>
+      <w:pPr>
+        <w:numPr>
+          <w:ilvl w:val="0"/>
+          <w:numId w:val="187"/>
+        </w:numPr>
+        <w:spacing w:before="0" w:after="60" w:line="240"/>
+        <w:ind w:right="0" w:left="720" w:hanging="360"/>
+        <w:jc w:val="left"/>
+        <w:rPr>
+          <w:rFonts w:ascii="Cascadia Code" w:hAnsi="Cascadia Code" w:cs="Cascadia Code" w:eastAsia="Cascadia Code"/>
+          <w:color w:val="auto"/>
+          <w:spacing w:val="0"/>
+          <w:position w:val="0"/>
+          <w:sz w:val="20"/>
+          <w:shd w:fill="auto" w:val="clear"/>
+        </w:rPr>
+      </w:pPr>
+      <w:r>
+        <w:rPr>
+          <w:rFonts w:ascii="Cascadia Code" w:hAnsi="Cascadia Code" w:cs="Cascadia Code" w:eastAsia="Cascadia Code"/>
+          <w:color w:val="auto"/>
+          <w:spacing w:val="0"/>
+          <w:position w:val="0"/>
+          <w:sz w:val="20"/>
+          <w:shd w:fill="auto" w:val="clear"/>
+        </w:rPr>
+        <w:t xml:space="preserve">And to use identity with our context file , we have tp inheirt identitydbcontext in our context file too</w:t>
+      </w:r>
+    </w:p>
+    <w:p>
+      <w:pPr>
+        <w:spacing w:before="0" w:after="60" w:line="240"/>
+        <w:ind w:right="0" w:left="0" w:firstLine="0"/>
+        <w:jc w:val="left"/>
+        <w:rPr>
+          <w:rFonts w:ascii="Cascadia Code" w:hAnsi="Cascadia Code" w:cs="Cascadia Code" w:eastAsia="Cascadia Code"/>
+          <w:color w:val="auto"/>
+          <w:spacing w:val="0"/>
+          <w:position w:val="0"/>
+          <w:sz w:val="20"/>
+          <w:shd w:fill="auto" w:val="clear"/>
+        </w:rPr>
+      </w:pPr>
+    </w:p>
+    <w:p>
+      <w:pPr>
+        <w:spacing w:before="0" w:after="60" w:line="240"/>
+        <w:ind w:right="0" w:left="0" w:firstLine="0"/>
+        <w:jc w:val="left"/>
+        <w:rPr>
+          <w:rFonts w:ascii="Cascadia Code" w:hAnsi="Cascadia Code" w:cs="Cascadia Code" w:eastAsia="Cascadia Code"/>
+          <w:color w:val="auto"/>
+          <w:spacing w:val="0"/>
+          <w:position w:val="0"/>
+          <w:sz w:val="20"/>
+          <w:shd w:fill="auto" w:val="clear"/>
+        </w:rPr>
+      </w:pPr>
+      <w:r>
+        <w:rPr>
+          <w:rFonts w:ascii="Cascadia Code" w:hAnsi="Cascadia Code" w:cs="Cascadia Code" w:eastAsia="Cascadia Code"/>
+          <w:b/>
+          <w:color w:val="auto"/>
+          <w:spacing w:val="0"/>
+          <w:position w:val="0"/>
+          <w:sz w:val="20"/>
+          <w:shd w:fill="auto" w:val="clear"/>
+        </w:rPr>
+        <w:t xml:space="preserve">NOTE :- ( IDENTITY PENDING LITTLE BIT )</w:t>
+      </w:r>
+    </w:p>
+    <w:p>
+      <w:pPr>
+        <w:spacing w:before="0" w:after="60" w:line="240"/>
+        <w:ind w:right="0" w:left="0" w:firstLine="0"/>
+        <w:jc w:val="left"/>
+        <w:rPr>
+          <w:rFonts w:ascii="Cascadia Code" w:hAnsi="Cascadia Code" w:cs="Cascadia Code" w:eastAsia="Cascadia Code"/>
+          <w:color w:val="auto"/>
+          <w:spacing w:val="0"/>
+          <w:position w:val="0"/>
+          <w:sz w:val="20"/>
+          <w:shd w:fill="auto" w:val="clear"/>
+        </w:rPr>
+      </w:pPr>
+    </w:p>
+    <w:p>
+      <w:pPr>
+        <w:spacing w:before="0" w:after="60" w:line="240"/>
+        <w:ind w:right="0" w:left="0" w:firstLine="0"/>
+        <w:jc w:val="left"/>
+        <w:rPr>
+          <w:rFonts w:ascii="Cascadia Code" w:hAnsi="Cascadia Code" w:cs="Cascadia Code" w:eastAsia="Cascadia Code"/>
+          <w:color w:val="auto"/>
+          <w:spacing w:val="0"/>
+          <w:position w:val="0"/>
+          <w:sz w:val="20"/>
+          <w:shd w:fill="auto" w:val="clear"/>
+        </w:rPr>
+      </w:pPr>
+    </w:p>
+    <w:p>
+      <w:pPr>
+        <w:spacing w:before="0" w:after="60" w:line="240"/>
+        <w:ind w:right="0" w:left="0" w:firstLine="0"/>
+        <w:jc w:val="left"/>
+        <w:rPr>
+          <w:rFonts w:ascii="Cascadia Code" w:hAnsi="Cascadia Code" w:cs="Cascadia Code" w:eastAsia="Cascadia Code"/>
+          <w:b/>
+          <w:color w:val="auto"/>
+          <w:spacing w:val="0"/>
+          <w:position w:val="0"/>
+          <w:sz w:val="20"/>
+          <w:shd w:fill="auto" w:val="clear"/>
+        </w:rPr>
+      </w:pPr>
+      <w:r>
+        <w:rPr>
+          <w:rFonts w:ascii="Cascadia Code" w:hAnsi="Cascadia Code" w:cs="Cascadia Code" w:eastAsia="Cascadia Code"/>
+          <w:b/>
+          <w:color w:val="auto"/>
+          <w:spacing w:val="0"/>
+          <w:position w:val="0"/>
+          <w:sz w:val="20"/>
+          <w:shd w:fill="auto" w:val="clear"/>
+        </w:rPr>
+        <w:t xml:space="preserve">Lecture :- ( Authorization in ASP NET Core )</w:t>
+      </w:r>
+    </w:p>
+    <w:p>
+      <w:pPr>
+        <w:numPr>
+          <w:ilvl w:val="0"/>
+          <w:numId w:val="189"/>
+        </w:numPr>
+        <w:spacing w:before="0" w:after="60" w:line="240"/>
+        <w:ind w:right="0" w:left="720" w:hanging="360"/>
+        <w:jc w:val="left"/>
+        <w:rPr>
+          <w:rFonts w:ascii="Cascadia Code" w:hAnsi="Cascadia Code" w:cs="Cascadia Code" w:eastAsia="Cascadia Code"/>
+          <w:color w:val="auto"/>
+          <w:spacing w:val="0"/>
+          <w:position w:val="0"/>
+          <w:sz w:val="20"/>
+          <w:shd w:fill="auto" w:val="clear"/>
+        </w:rPr>
+      </w:pPr>
+      <w:r>
+        <w:rPr>
+          <w:rFonts w:ascii="Cascadia Code" w:hAnsi="Cascadia Code" w:cs="Cascadia Code" w:eastAsia="Cascadia Code"/>
+          <w:color w:val="auto"/>
+          <w:spacing w:val="0"/>
+          <w:position w:val="0"/>
+          <w:sz w:val="20"/>
+          <w:shd w:fill="auto" w:val="clear"/>
+        </w:rPr>
+        <w:t xml:space="preserve">Authorization means what user can access</w:t>
+      </w:r>
+    </w:p>
+    <w:p>
+      <w:pPr>
+        <w:numPr>
+          <w:ilvl w:val="0"/>
+          <w:numId w:val="189"/>
+        </w:numPr>
+        <w:spacing w:before="0" w:after="60" w:line="240"/>
+        <w:ind w:right="0" w:left="720" w:hanging="360"/>
+        <w:jc w:val="left"/>
+        <w:rPr>
+          <w:rFonts w:ascii="Cascadia Code" w:hAnsi="Cascadia Code" w:cs="Cascadia Code" w:eastAsia="Cascadia Code"/>
+          <w:color w:val="auto"/>
+          <w:spacing w:val="0"/>
+          <w:position w:val="0"/>
+          <w:sz w:val="20"/>
+          <w:shd w:fill="auto" w:val="clear"/>
+        </w:rPr>
+      </w:pPr>
+      <w:r>
+        <w:rPr>
+          <w:rFonts w:ascii="Cascadia Code" w:hAnsi="Cascadia Code" w:cs="Cascadia Code" w:eastAsia="Cascadia Code"/>
+          <w:color w:val="auto"/>
+          <w:spacing w:val="0"/>
+          <w:position w:val="0"/>
+          <w:sz w:val="20"/>
+          <w:shd w:fill="auto" w:val="clear"/>
+        </w:rPr>
+        <w:t xml:space="preserve">It chceks permissions , access rights , roles</w:t>
+      </w:r>
+    </w:p>
+    <w:p>
+      <w:pPr>
+        <w:numPr>
+          <w:ilvl w:val="0"/>
+          <w:numId w:val="189"/>
+        </w:numPr>
+        <w:spacing w:before="0" w:after="60" w:line="240"/>
+        <w:ind w:right="0" w:left="720" w:hanging="360"/>
+        <w:jc w:val="left"/>
+        <w:rPr>
+          <w:rFonts w:ascii="Cascadia Code" w:hAnsi="Cascadia Code" w:cs="Cascadia Code" w:eastAsia="Cascadia Code"/>
+          <w:color w:val="auto"/>
+          <w:spacing w:val="0"/>
+          <w:position w:val="0"/>
+          <w:sz w:val="20"/>
+          <w:shd w:fill="auto" w:val="clear"/>
+        </w:rPr>
+      </w:pPr>
+      <w:r>
+        <w:rPr>
+          <w:rFonts w:ascii="Cascadia Code" w:hAnsi="Cascadia Code" w:cs="Cascadia Code" w:eastAsia="Cascadia Code"/>
+          <w:color w:val="auto"/>
+          <w:spacing w:val="0"/>
+          <w:position w:val="0"/>
+          <w:sz w:val="20"/>
+          <w:shd w:fill="auto" w:val="clear"/>
+        </w:rPr>
+        <w:t xml:space="preserve">Example :- employee cannot access admin pannel</w:t>
+      </w:r>
+    </w:p>
+    <w:p>
+      <w:pPr>
+        <w:numPr>
+          <w:ilvl w:val="0"/>
+          <w:numId w:val="189"/>
+        </w:numPr>
+        <w:spacing w:before="0" w:after="60" w:line="240"/>
+        <w:ind w:right="0" w:left="720" w:hanging="360"/>
+        <w:jc w:val="left"/>
+        <w:rPr>
+          <w:rFonts w:ascii="Cascadia Code" w:hAnsi="Cascadia Code" w:cs="Cascadia Code" w:eastAsia="Cascadia Code"/>
+          <w:color w:val="auto"/>
+          <w:spacing w:val="0"/>
+          <w:position w:val="0"/>
+          <w:sz w:val="20"/>
+          <w:shd w:fill="auto" w:val="clear"/>
+        </w:rPr>
+      </w:pPr>
+      <w:r>
+        <w:rPr>
+          <w:rFonts w:ascii="Cascadia Code" w:hAnsi="Cascadia Code" w:cs="Cascadia Code" w:eastAsia="Cascadia Code"/>
+          <w:color w:val="auto"/>
+          <w:spacing w:val="0"/>
+          <w:position w:val="0"/>
+          <w:sz w:val="20"/>
+          <w:shd w:fill="auto" w:val="clear"/>
+        </w:rPr>
+        <w:t xml:space="preserve">Basically it means what u are allowed to access</w:t>
+      </w:r>
+    </w:p>
+    <w:p>
+      <w:pPr>
+        <w:numPr>
+          <w:ilvl w:val="0"/>
+          <w:numId w:val="189"/>
+        </w:numPr>
+        <w:spacing w:before="0" w:after="60" w:line="240"/>
+        <w:ind w:right="0" w:left="720" w:hanging="360"/>
+        <w:jc w:val="left"/>
+        <w:rPr>
+          <w:rFonts w:ascii="Cascadia Code" w:hAnsi="Cascadia Code" w:cs="Cascadia Code" w:eastAsia="Cascadia Code"/>
+          <w:color w:val="auto"/>
+          <w:spacing w:val="0"/>
+          <w:position w:val="0"/>
+          <w:sz w:val="20"/>
+          <w:shd w:fill="auto" w:val="clear"/>
+        </w:rPr>
+      </w:pPr>
+      <w:r>
+        <w:rPr>
+          <w:rFonts w:ascii="Cascadia Code" w:hAnsi="Cascadia Code" w:cs="Cascadia Code" w:eastAsia="Cascadia Code"/>
+          <w:color w:val="auto"/>
+          <w:spacing w:val="0"/>
+          <w:position w:val="0"/>
+          <w:sz w:val="20"/>
+          <w:shd w:fill="auto" w:val="clear"/>
+        </w:rPr>
+        <w:t xml:space="preserve">Without this user can access everything</w:t>
+      </w:r>
+    </w:p>
+    <w:p>
+      <w:pPr>
+        <w:spacing w:before="0" w:after="60" w:line="240"/>
+        <w:ind w:right="0" w:left="0" w:firstLine="0"/>
+        <w:jc w:val="left"/>
+        <w:rPr>
+          <w:rFonts w:ascii="Cascadia Code" w:hAnsi="Cascadia Code" w:cs="Cascadia Code" w:eastAsia="Cascadia Code"/>
+          <w:color w:val="auto"/>
+          <w:spacing w:val="0"/>
+          <w:position w:val="0"/>
+          <w:sz w:val="20"/>
+          <w:shd w:fill="auto" w:val="clear"/>
+        </w:rPr>
+      </w:pPr>
+    </w:p>
+    <w:p>
+      <w:pPr>
+        <w:spacing w:before="0" w:after="60" w:line="240"/>
+        <w:ind w:right="0" w:left="0" w:firstLine="0"/>
+        <w:jc w:val="left"/>
+        <w:rPr>
+          <w:rFonts w:ascii="Cascadia Code" w:hAnsi="Cascadia Code" w:cs="Cascadia Code" w:eastAsia="Cascadia Code"/>
+          <w:b/>
+          <w:color w:val="auto"/>
+          <w:spacing w:val="0"/>
+          <w:position w:val="0"/>
+          <w:sz w:val="20"/>
+          <w:shd w:fill="auto" w:val="clear"/>
+        </w:rPr>
+      </w:pPr>
+      <w:r>
+        <w:rPr>
+          <w:rFonts w:ascii="Cascadia Code" w:hAnsi="Cascadia Code" w:cs="Cascadia Code" w:eastAsia="Cascadia Code"/>
+          <w:b/>
+          <w:color w:val="auto"/>
+          <w:spacing w:val="0"/>
+          <w:position w:val="0"/>
+          <w:sz w:val="20"/>
+          <w:shd w:fill="auto" w:val="clear"/>
+        </w:rPr>
+        <w:t xml:space="preserve">Most common authorization type :-</w:t>
+      </w:r>
+    </w:p>
+    <w:p>
+      <w:pPr>
+        <w:spacing w:before="0" w:after="60" w:line="240"/>
+        <w:ind w:right="0" w:left="0" w:firstLine="0"/>
+        <w:jc w:val="left"/>
+        <w:rPr>
+          <w:rFonts w:ascii="Cascadia Code" w:hAnsi="Cascadia Code" w:cs="Cascadia Code" w:eastAsia="Cascadia Code"/>
+          <w:color w:val="auto"/>
+          <w:spacing w:val="0"/>
+          <w:position w:val="0"/>
+          <w:sz w:val="20"/>
+          <w:shd w:fill="auto" w:val="clear"/>
+        </w:rPr>
+      </w:pPr>
+      <w:r>
+        <w:rPr>
+          <w:rFonts w:ascii="Cascadia Code" w:hAnsi="Cascadia Code" w:cs="Cascadia Code" w:eastAsia="Cascadia Code"/>
+          <w:color w:val="auto"/>
+          <w:spacing w:val="0"/>
+          <w:position w:val="0"/>
+          <w:sz w:val="20"/>
+          <w:shd w:fill="auto" w:val="clear"/>
+        </w:rPr>
+        <w:t xml:space="preserve">1. Role based authorization :- like admin , manager , employee</w:t>
+      </w:r>
+    </w:p>
+    <w:p>
+      <w:pPr>
+        <w:spacing w:before="0" w:after="60" w:line="240"/>
+        <w:ind w:right="0" w:left="0" w:firstLine="0"/>
+        <w:jc w:val="left"/>
+        <w:rPr>
+          <w:rFonts w:ascii="Cascadia Code" w:hAnsi="Cascadia Code" w:cs="Cascadia Code" w:eastAsia="Cascadia Code"/>
+          <w:color w:val="auto"/>
+          <w:spacing w:val="0"/>
+          <w:position w:val="0"/>
+          <w:sz w:val="20"/>
+          <w:shd w:fill="auto" w:val="clear"/>
+        </w:rPr>
+      </w:pPr>
+    </w:p>
+    <w:p>
+      <w:pPr>
+        <w:spacing w:before="0" w:after="60" w:line="240"/>
+        <w:ind w:right="0" w:left="0" w:firstLine="0"/>
+        <w:jc w:val="left"/>
+        <w:rPr>
+          <w:rFonts w:ascii="Cascadia Code" w:hAnsi="Cascadia Code" w:cs="Cascadia Code" w:eastAsia="Cascadia Code"/>
+          <w:b/>
+          <w:color w:val="auto"/>
+          <w:spacing w:val="0"/>
+          <w:position w:val="0"/>
+          <w:sz w:val="20"/>
+          <w:shd w:fill="auto" w:val="clear"/>
+        </w:rPr>
+      </w:pPr>
+      <w:r>
+        <w:rPr>
+          <w:rFonts w:ascii="Cascadia Code" w:hAnsi="Cascadia Code" w:cs="Cascadia Code" w:eastAsia="Cascadia Code"/>
+          <w:b/>
+          <w:color w:val="auto"/>
+          <w:spacing w:val="0"/>
+          <w:position w:val="0"/>
+          <w:sz w:val="20"/>
+          <w:shd w:fill="auto" w:val="clear"/>
+        </w:rPr>
+        <w:t xml:space="preserve">How authorization implemeneted :-</w:t>
+      </w:r>
+    </w:p>
+    <w:p>
+      <w:pPr>
+        <w:numPr>
+          <w:ilvl w:val="0"/>
+          <w:numId w:val="191"/>
+        </w:numPr>
+        <w:spacing w:before="0" w:after="60" w:line="240"/>
+        <w:ind w:right="0" w:left="720" w:hanging="360"/>
+        <w:jc w:val="left"/>
+        <w:rPr>
+          <w:rFonts w:ascii="Cascadia Code" w:hAnsi="Cascadia Code" w:cs="Cascadia Code" w:eastAsia="Cascadia Code"/>
+          <w:color w:val="auto"/>
+          <w:spacing w:val="0"/>
+          <w:position w:val="0"/>
+          <w:sz w:val="20"/>
+          <w:shd w:fill="auto" w:val="clear"/>
+        </w:rPr>
+      </w:pPr>
+      <w:r>
+        <w:rPr>
+          <w:rFonts w:ascii="Cascadia Code" w:hAnsi="Cascadia Code" w:cs="Cascadia Code" w:eastAsia="Cascadia Code"/>
+          <w:color w:val="auto"/>
+          <w:spacing w:val="0"/>
+          <w:position w:val="0"/>
+          <w:sz w:val="20"/>
+          <w:shd w:fill="auto" w:val="clear"/>
+        </w:rPr>
+        <w:t xml:space="preserve">using [authorize] attribute :- can be put above method or an controller too</w:t>
+      </w:r>
+    </w:p>
+    <w:p>
+      <w:pPr>
+        <w:numPr>
+          <w:ilvl w:val="0"/>
+          <w:numId w:val="191"/>
+        </w:numPr>
+        <w:spacing w:before="0" w:after="60" w:line="240"/>
+        <w:ind w:right="0" w:left="720" w:hanging="360"/>
+        <w:jc w:val="left"/>
+        <w:rPr>
+          <w:rFonts w:ascii="Cascadia Code" w:hAnsi="Cascadia Code" w:cs="Cascadia Code" w:eastAsia="Cascadia Code"/>
+          <w:color w:val="auto"/>
+          <w:spacing w:val="0"/>
+          <w:position w:val="0"/>
+          <w:sz w:val="20"/>
+          <w:shd w:fill="auto" w:val="clear"/>
+        </w:rPr>
+      </w:pPr>
+      <w:r>
+        <w:rPr>
+          <w:rFonts w:ascii="Cascadia Code" w:hAnsi="Cascadia Code" w:cs="Cascadia Code" w:eastAsia="Cascadia Code"/>
+          <w:color w:val="auto"/>
+          <w:spacing w:val="0"/>
+          <w:position w:val="0"/>
+          <w:sz w:val="20"/>
+          <w:shd w:fill="auto" w:val="clear"/>
+        </w:rPr>
+        <w:t xml:space="preserve">using [authorize(Roles="Admin")] :- by giving single role</w:t>
+      </w:r>
+    </w:p>
+    <w:p>
+      <w:pPr>
+        <w:numPr>
+          <w:ilvl w:val="0"/>
+          <w:numId w:val="191"/>
+        </w:numPr>
+        <w:spacing w:before="0" w:after="60" w:line="240"/>
+        <w:ind w:right="0" w:left="720" w:hanging="360"/>
+        <w:jc w:val="left"/>
+        <w:rPr>
+          <w:rFonts w:ascii="Cascadia Code" w:hAnsi="Cascadia Code" w:cs="Cascadia Code" w:eastAsia="Cascadia Code"/>
+          <w:color w:val="auto"/>
+          <w:spacing w:val="0"/>
+          <w:position w:val="0"/>
+          <w:sz w:val="20"/>
+          <w:shd w:fill="auto" w:val="clear"/>
+        </w:rPr>
+      </w:pPr>
+      <w:r>
+        <w:rPr>
+          <w:rFonts w:ascii="Cascadia Code" w:hAnsi="Cascadia Code" w:cs="Cascadia Code" w:eastAsia="Cascadia Code"/>
+          <w:color w:val="auto"/>
+          <w:spacing w:val="0"/>
+          <w:position w:val="0"/>
+          <w:sz w:val="20"/>
+          <w:shd w:fill="auto" w:val="clear"/>
+        </w:rPr>
+        <w:t xml:space="preserve">using [authorize(Roles="Admin , Manager")] :- by giving multiple role</w:t>
+      </w:r>
+    </w:p>
+    <w:p>
+      <w:pPr>
+        <w:numPr>
+          <w:ilvl w:val="0"/>
+          <w:numId w:val="191"/>
+        </w:numPr>
+        <w:spacing w:before="0" w:after="60" w:line="240"/>
+        <w:ind w:right="0" w:left="720" w:hanging="360"/>
+        <w:jc w:val="left"/>
+        <w:rPr>
+          <w:rFonts w:ascii="Cascadia Code" w:hAnsi="Cascadia Code" w:cs="Cascadia Code" w:eastAsia="Cascadia Code"/>
+          <w:color w:val="auto"/>
+          <w:spacing w:val="0"/>
+          <w:position w:val="0"/>
+          <w:sz w:val="20"/>
+          <w:shd w:fill="auto" w:val="clear"/>
+        </w:rPr>
+      </w:pPr>
+      <w:r>
+        <w:rPr>
+          <w:rFonts w:ascii="Cascadia Code" w:hAnsi="Cascadia Code" w:cs="Cascadia Code" w:eastAsia="Cascadia Code"/>
+          <w:color w:val="auto"/>
+          <w:spacing w:val="0"/>
+          <w:position w:val="0"/>
+          <w:sz w:val="20"/>
+          <w:shd w:fill="auto" w:val="clear"/>
+        </w:rPr>
+        <w:t xml:space="preserve">using [AllowAnonymous] :- to allow anoynmous which is before login</w:t>
+      </w:r>
+    </w:p>
+    <w:p>
+      <w:pPr>
+        <w:spacing w:before="0" w:after="60" w:line="240"/>
+        <w:ind w:right="0" w:left="0" w:firstLine="0"/>
+        <w:jc w:val="left"/>
+        <w:rPr>
+          <w:rFonts w:ascii="Cascadia Code" w:hAnsi="Cascadia Code" w:cs="Cascadia Code" w:eastAsia="Cascadia Code"/>
+          <w:color w:val="auto"/>
+          <w:spacing w:val="0"/>
+          <w:position w:val="0"/>
+          <w:sz w:val="20"/>
+          <w:shd w:fill="auto" w:val="clear"/>
+        </w:rPr>
+      </w:pPr>
+    </w:p>
+    <w:p>
+      <w:pPr>
+        <w:spacing w:before="0" w:after="60" w:line="240"/>
+        <w:ind w:right="0" w:left="0" w:firstLine="0"/>
+        <w:jc w:val="left"/>
+        <w:rPr>
+          <w:rFonts w:ascii="Cascadia Code" w:hAnsi="Cascadia Code" w:cs="Cascadia Code" w:eastAsia="Cascadia Code"/>
+          <w:color w:val="auto"/>
+          <w:spacing w:val="0"/>
+          <w:position w:val="0"/>
+          <w:sz w:val="20"/>
+          <w:shd w:fill="auto" w:val="clear"/>
+        </w:rPr>
+      </w:pPr>
+      <w:r>
+        <w:rPr>
+          <w:rFonts w:ascii="Cascadia Code" w:hAnsi="Cascadia Code" w:cs="Cascadia Code" w:eastAsia="Cascadia Code"/>
+          <w:color w:val="auto"/>
+          <w:spacing w:val="0"/>
+          <w:position w:val="0"/>
+          <w:sz w:val="20"/>
+          <w:shd w:fill="auto" w:val="clear"/>
+        </w:rPr>
+        <w:t xml:space="preserve">await _userManager.AddToRoleAsync(user, "Admin");</w:t>
+      </w:r>
+    </w:p>
+    <w:p>
+      <w:pPr>
+        <w:spacing w:before="0" w:after="60" w:line="240"/>
+        <w:ind w:right="0" w:left="0" w:firstLine="0"/>
+        <w:jc w:val="left"/>
+        <w:rPr>
+          <w:rFonts w:ascii="Cascadia Code" w:hAnsi="Cascadia Code" w:cs="Cascadia Code" w:eastAsia="Cascadia Code"/>
+          <w:color w:val="auto"/>
+          <w:spacing w:val="0"/>
+          <w:position w:val="0"/>
+          <w:sz w:val="20"/>
+          <w:shd w:fill="auto" w:val="clear"/>
+        </w:rPr>
+      </w:pPr>
     </w:p>
     <w:p>
       <w:pPr>
@@ -11260,215 +12205,265 @@
       <w:lvlText w:val="%1."/>
     </w:lvl>
   </w:abstractNum>
+  <w:abstractNum w:abstractNumId="402">
+    <w:lvl w:ilvl="0">
+      <w:start w:val="1"/>
+      <w:numFmt w:val="bullet"/>
+      <w:lvlText w:val="•"/>
+    </w:lvl>
+  </w:abstractNum>
+  <w:abstractNum w:abstractNumId="408">
+    <w:lvl w:ilvl="0">
+      <w:start w:val="1"/>
+      <w:numFmt w:val="bullet"/>
+      <w:lvlText w:val="•"/>
+    </w:lvl>
+  </w:abstractNum>
+  <w:abstractNum w:abstractNumId="414">
+    <w:lvl w:ilvl="0">
+      <w:start w:val="1"/>
+      <w:numFmt w:val="bullet"/>
+      <w:lvlText w:val="•"/>
+    </w:lvl>
+  </w:abstractNum>
+  <w:abstractNum w:abstractNumId="420">
+    <w:lvl w:ilvl="0">
+      <w:start w:val="1"/>
+      <w:numFmt w:val="bullet"/>
+      <w:lvlText w:val="•"/>
+    </w:lvl>
+  </w:abstractNum>
+  <w:abstractNum w:abstractNumId="426">
+    <w:lvl w:ilvl="0">
+      <w:start w:val="1"/>
+      <w:numFmt w:val="bullet"/>
+      <w:lvlText w:val="•"/>
+    </w:lvl>
+  </w:abstractNum>
   <w:num w:numId="2">
+    <w:abstractNumId w:val="426"/>
+  </w:num>
+  <w:num w:numId="5">
+    <w:abstractNumId w:val="420"/>
+  </w:num>
+  <w:num w:numId="8">
+    <w:abstractNumId w:val="414"/>
+  </w:num>
+  <w:num w:numId="10">
+    <w:abstractNumId w:val="408"/>
+  </w:num>
+  <w:num w:numId="13">
+    <w:abstractNumId w:val="402"/>
+  </w:num>
+  <w:num w:numId="19">
     <w:abstractNumId w:val="396"/>
   </w:num>
-  <w:num w:numId="5">
+  <w:num w:numId="22">
     <w:abstractNumId w:val="390"/>
   </w:num>
-  <w:num w:numId="8">
+  <w:num w:numId="25">
     <w:abstractNumId w:val="384"/>
   </w:num>
-  <w:num w:numId="10">
+  <w:num w:numId="30">
     <w:abstractNumId w:val="378"/>
   </w:num>
-  <w:num w:numId="13">
+  <w:num w:numId="33">
     <w:abstractNumId w:val="372"/>
   </w:num>
-  <w:num w:numId="19">
+  <w:num w:numId="36">
     <w:abstractNumId w:val="366"/>
   </w:num>
-  <w:num w:numId="22">
+  <w:num w:numId="39">
     <w:abstractNumId w:val="360"/>
   </w:num>
-  <w:num w:numId="25">
+  <w:num w:numId="42">
     <w:abstractNumId w:val="354"/>
   </w:num>
-  <w:num w:numId="30">
+  <w:num w:numId="46">
     <w:abstractNumId w:val="348"/>
   </w:num>
-  <w:num w:numId="33">
+  <w:num w:numId="49">
     <w:abstractNumId w:val="342"/>
   </w:num>
-  <w:num w:numId="36">
+  <w:num w:numId="52">
     <w:abstractNumId w:val="336"/>
   </w:num>
-  <w:num w:numId="39">
+  <w:num w:numId="55">
     <w:abstractNumId w:val="330"/>
   </w:num>
-  <w:num w:numId="42">
+  <w:num w:numId="57">
     <w:abstractNumId w:val="324"/>
   </w:num>
-  <w:num w:numId="46">
+  <w:num w:numId="59">
     <w:abstractNumId w:val="318"/>
   </w:num>
-  <w:num w:numId="49">
+  <w:num w:numId="62">
     <w:abstractNumId w:val="312"/>
   </w:num>
-  <w:num w:numId="52">
+  <w:num w:numId="65">
     <w:abstractNumId w:val="306"/>
   </w:num>
-  <w:num w:numId="55">
+  <w:num w:numId="68">
     <w:abstractNumId w:val="300"/>
   </w:num>
-  <w:num w:numId="57">
+  <w:num w:numId="71">
     <w:abstractNumId w:val="294"/>
   </w:num>
-  <w:num w:numId="59">
+  <w:num w:numId="74">
     <w:abstractNumId w:val="288"/>
   </w:num>
-  <w:num w:numId="62">
+  <w:num w:numId="77">
     <w:abstractNumId w:val="282"/>
   </w:num>
-  <w:num w:numId="65">
+  <w:num w:numId="80">
     <w:abstractNumId w:val="276"/>
   </w:num>
-  <w:num w:numId="68">
+  <w:num w:numId="83">
     <w:abstractNumId w:val="270"/>
   </w:num>
-  <w:num w:numId="71">
+  <w:num w:numId="86">
     <w:abstractNumId w:val="264"/>
   </w:num>
-  <w:num w:numId="74">
+  <w:num w:numId="88">
     <w:abstractNumId w:val="258"/>
   </w:num>
-  <w:num w:numId="77">
+  <w:num w:numId="91">
     <w:abstractNumId w:val="252"/>
   </w:num>
-  <w:num w:numId="80">
+  <w:num w:numId="94">
     <w:abstractNumId w:val="246"/>
   </w:num>
-  <w:num w:numId="83">
+  <w:num w:numId="97">
     <w:abstractNumId w:val="240"/>
   </w:num>
-  <w:num w:numId="86">
+  <w:num w:numId="99">
     <w:abstractNumId w:val="234"/>
   </w:num>
-  <w:num w:numId="88">
+  <w:num w:numId="101">
     <w:abstractNumId w:val="228"/>
   </w:num>
-  <w:num w:numId="91">
+  <w:num w:numId="103">
     <w:abstractNumId w:val="222"/>
   </w:num>
-  <w:num w:numId="94">
+  <w:num w:numId="106">
     <w:abstractNumId w:val="216"/>
   </w:num>
-  <w:num w:numId="97">
+  <w:num w:numId="108">
     <w:abstractNumId w:val="210"/>
   </w:num>
-  <w:num w:numId="99">
+  <w:num w:numId="110">
     <w:abstractNumId w:val="204"/>
   </w:num>
-  <w:num w:numId="101">
+  <w:num w:numId="112">
     <w:abstractNumId w:val="198"/>
   </w:num>
-  <w:num w:numId="103">
+  <w:num w:numId="115">
     <w:abstractNumId w:val="192"/>
   </w:num>
-  <w:num w:numId="106">
+  <w:num w:numId="118">
     <w:abstractNumId w:val="186"/>
   </w:num>
-  <w:num w:numId="108">
+  <w:num w:numId="121">
     <w:abstractNumId w:val="180"/>
   </w:num>
-  <w:num w:numId="110">
+  <w:num w:numId="124">
     <w:abstractNumId w:val="174"/>
   </w:num>
-  <w:num w:numId="112">
+  <w:num w:numId="127">
     <w:abstractNumId w:val="168"/>
   </w:num>
-  <w:num w:numId="115">
+  <w:num w:numId="130">
     <w:abstractNumId w:val="162"/>
   </w:num>
-  <w:num w:numId="118">
+  <w:num w:numId="133">
     <w:abstractNumId w:val="156"/>
   </w:num>
-  <w:num w:numId="121">
+  <w:num w:numId="136">
     <w:abstractNumId w:val="150"/>
   </w:num>
-  <w:num w:numId="124">
+  <w:num w:numId="138">
     <w:abstractNumId w:val="144"/>
   </w:num>
-  <w:num w:numId="127">
+  <w:num w:numId="140">
     <w:abstractNumId w:val="138"/>
   </w:num>
-  <w:num w:numId="130">
+  <w:num w:numId="142">
     <w:abstractNumId w:val="132"/>
   </w:num>
-  <w:num w:numId="133">
+  <w:num w:numId="144">
     <w:abstractNumId w:val="126"/>
   </w:num>
-  <w:num w:numId="136">
+  <w:num w:numId="146">
     <w:abstractNumId w:val="120"/>
   </w:num>
-  <w:num w:numId="138">
+  <w:num w:numId="148">
     <w:abstractNumId w:val="114"/>
-  </w:num>
-  <w:num w:numId="140">
-    <w:abstractNumId w:val="108"/>
-  </w:num>
-  <w:num w:numId="142">
-    <w:abstractNumId w:val="102"/>
-  </w:num>
-  <w:num w:numId="144">
-    <w:abstractNumId w:val="96"/>
-  </w:num>
-  <w:num w:numId="146">
-    <w:abstractNumId w:val="90"/>
-  </w:num>
-  <w:num w:numId="148">
-    <w:abstractNumId w:val="84"/>
   </w:num>
   <w:num w:numId="149">
     <w:abstractNumId w:val="13"/>
   </w:num>
-  <w:num w:numId="152">
+  <w:num w:numId="151">
+    <w:abstractNumId w:val="108"/>
+  </w:num>
+  <w:num w:numId="153">
+    <w:abstractNumId w:val="102"/>
+  </w:num>
+  <w:num w:numId="155">
+    <w:abstractNumId w:val="96"/>
+  </w:num>
+  <w:num w:numId="157">
+    <w:abstractNumId w:val="90"/>
+  </w:num>
+  <w:num w:numId="159">
+    <w:abstractNumId w:val="84"/>
+  </w:num>
+  <w:num w:numId="161">
     <w:abstractNumId w:val="78"/>
   </w:num>
-  <w:num w:numId="154">
+  <w:num w:numId="163">
     <w:abstractNumId w:val="72"/>
   </w:num>
-  <w:num w:numId="157">
+  <w:num w:numId="165">
     <w:abstractNumId w:val="66"/>
   </w:num>
-  <w:num w:numId="159">
+  <w:num w:numId="167">
     <w:abstractNumId w:val="60"/>
   </w:num>
-  <w:num w:numId="161">
+  <w:num w:numId="169">
     <w:abstractNumId w:val="54"/>
   </w:num>
-  <w:num w:numId="163">
+  <w:num w:numId="171">
     <w:abstractNumId w:val="48"/>
   </w:num>
-  <w:num w:numId="165">
+  <w:num w:numId="173">
     <w:abstractNumId w:val="42"/>
   </w:num>
-  <w:num w:numId="167">
+  <w:num w:numId="175">
     <w:abstractNumId w:val="36"/>
   </w:num>
-  <w:num w:numId="170">
+  <w:num w:numId="177">
     <w:abstractNumId w:val="30"/>
   </w:num>
-  <w:num w:numId="172">
+  <w:num w:numId="179">
+    <w:abstractNumId w:val="7"/>
+  </w:num>
+  <w:num w:numId="181">
+    <w:abstractNumId w:val="1"/>
+  </w:num>
+  <w:num w:numId="183">
     <w:abstractNumId w:val="24"/>
   </w:num>
-  <w:num w:numId="174">
+  <w:num w:numId="185">
     <w:abstractNumId w:val="18"/>
   </w:num>
-  <w:num w:numId="176">
+  <w:num w:numId="187">
     <w:abstractNumId w:val="12"/>
   </w:num>
-  <w:num w:numId="179">
+  <w:num w:numId="189">
     <w:abstractNumId w:val="6"/>
   </w:num>
-  <w:num w:numId="181">
+  <w:num w:numId="191">
     <w:abstractNumId w:val="0"/>
-  </w:num>
-  <w:num w:numId="183">
-    <w:abstractNumId w:val="7"/>
-  </w:num>
-  <w:num w:numId="185">
-    <w:abstractNumId w:val="1"/>
   </w:num>
 </w:numbering>
 </file>

</xml_diff>

<commit_message>
ASP NET Core client side validation
</commit_message>
<xml_diff>
--- a/Asp.Net Core Notes.docx
+++ b/Asp.Net Core Notes.docx
@@ -10853,6 +10853,298 @@
           <w:shd w:fill="auto" w:val="clear"/>
         </w:rPr>
       </w:pPr>
+    </w:p>
+    <w:p>
+      <w:pPr>
+        <w:spacing w:before="0" w:after="60" w:line="240"/>
+        <w:ind w:right="0" w:left="0" w:firstLine="0"/>
+        <w:jc w:val="left"/>
+        <w:rPr>
+          <w:rFonts w:ascii="Cascadia Code" w:hAnsi="Cascadia Code" w:cs="Cascadia Code" w:eastAsia="Cascadia Code"/>
+          <w:b/>
+          <w:color w:val="auto"/>
+          <w:spacing w:val="0"/>
+          <w:position w:val="0"/>
+          <w:sz w:val="20"/>
+          <w:shd w:fill="auto" w:val="clear"/>
+        </w:rPr>
+      </w:pPr>
+      <w:r>
+        <w:rPr>
+          <w:rFonts w:ascii="Cascadia Code" w:hAnsi="Cascadia Code" w:cs="Cascadia Code" w:eastAsia="Cascadia Code"/>
+          <w:b/>
+          <w:color w:val="auto"/>
+          <w:spacing w:val="0"/>
+          <w:position w:val="0"/>
+          <w:sz w:val="20"/>
+          <w:shd w:fill="auto" w:val="clear"/>
+        </w:rPr>
+        <w:t xml:space="preserve">Lecture :- ( ASP NET Core client side validation )</w:t>
+      </w:r>
+    </w:p>
+    <w:p>
+      <w:pPr>
+        <w:numPr>
+          <w:ilvl w:val="0"/>
+          <w:numId w:val="195"/>
+        </w:numPr>
+        <w:spacing w:before="0" w:after="60" w:line="240"/>
+        <w:ind w:right="0" w:left="720" w:hanging="360"/>
+        <w:jc w:val="left"/>
+        <w:rPr>
+          <w:rFonts w:ascii="Cascadia Code" w:hAnsi="Cascadia Code" w:cs="Cascadia Code" w:eastAsia="Cascadia Code"/>
+          <w:color w:val="auto"/>
+          <w:spacing w:val="0"/>
+          <w:position w:val="0"/>
+          <w:sz w:val="20"/>
+          <w:shd w:fill="auto" w:val="clear"/>
+        </w:rPr>
+      </w:pPr>
+      <w:r>
+        <w:rPr>
+          <w:rFonts w:ascii="Cascadia Code" w:hAnsi="Cascadia Code" w:cs="Cascadia Code" w:eastAsia="Cascadia Code"/>
+          <w:color w:val="auto"/>
+          <w:spacing w:val="0"/>
+          <w:position w:val="0"/>
+          <w:sz w:val="20"/>
+          <w:shd w:fill="auto" w:val="clear"/>
+        </w:rPr>
+        <w:t xml:space="preserve">A validation which happens on browser only before request reaches to server</w:t>
+      </w:r>
+    </w:p>
+    <w:p>
+      <w:pPr>
+        <w:numPr>
+          <w:ilvl w:val="0"/>
+          <w:numId w:val="195"/>
+        </w:numPr>
+        <w:spacing w:before="0" w:after="60" w:line="240"/>
+        <w:ind w:right="0" w:left="720" w:hanging="360"/>
+        <w:jc w:val="left"/>
+        <w:rPr>
+          <w:rFonts w:ascii="Cascadia Code" w:hAnsi="Cascadia Code" w:cs="Cascadia Code" w:eastAsia="Cascadia Code"/>
+          <w:color w:val="auto"/>
+          <w:spacing w:val="0"/>
+          <w:position w:val="0"/>
+          <w:sz w:val="20"/>
+          <w:shd w:fill="auto" w:val="clear"/>
+        </w:rPr>
+      </w:pPr>
+      <w:r>
+        <w:rPr>
+          <w:rFonts w:ascii="Cascadia Code" w:hAnsi="Cascadia Code" w:cs="Cascadia Code" w:eastAsia="Cascadia Code"/>
+          <w:color w:val="auto"/>
+          <w:spacing w:val="0"/>
+          <w:position w:val="0"/>
+          <w:sz w:val="20"/>
+          <w:shd w:fill="auto" w:val="clear"/>
+        </w:rPr>
+        <w:t xml:space="preserve">For example :- required filled, email format , password length</w:t>
+      </w:r>
+    </w:p>
+    <w:p>
+      <w:pPr>
+        <w:numPr>
+          <w:ilvl w:val="0"/>
+          <w:numId w:val="195"/>
+        </w:numPr>
+        <w:spacing w:before="0" w:after="60" w:line="240"/>
+        <w:ind w:right="0" w:left="720" w:hanging="360"/>
+        <w:jc w:val="left"/>
+        <w:rPr>
+          <w:rFonts w:ascii="Cascadia Code" w:hAnsi="Cascadia Code" w:cs="Cascadia Code" w:eastAsia="Cascadia Code"/>
+          <w:color w:val="auto"/>
+          <w:spacing w:val="0"/>
+          <w:position w:val="0"/>
+          <w:sz w:val="20"/>
+          <w:shd w:fill="auto" w:val="clear"/>
+        </w:rPr>
+      </w:pPr>
+      <w:r>
+        <w:rPr>
+          <w:rFonts w:ascii="Cascadia Code" w:hAnsi="Cascadia Code" w:cs="Cascadia Code" w:eastAsia="Cascadia Code"/>
+          <w:color w:val="auto"/>
+          <w:spacing w:val="0"/>
+          <w:position w:val="0"/>
+          <w:sz w:val="20"/>
+          <w:shd w:fill="auto" w:val="clear"/>
+        </w:rPr>
+        <w:t xml:space="preserve">Here browser will automatically show validation message</w:t>
+      </w:r>
+    </w:p>
+    <w:p>
+      <w:pPr>
+        <w:numPr>
+          <w:ilvl w:val="0"/>
+          <w:numId w:val="195"/>
+        </w:numPr>
+        <w:spacing w:before="0" w:after="60" w:line="240"/>
+        <w:ind w:right="0" w:left="720" w:hanging="360"/>
+        <w:jc w:val="left"/>
+        <w:rPr>
+          <w:rFonts w:ascii="Cascadia Code" w:hAnsi="Cascadia Code" w:cs="Cascadia Code" w:eastAsia="Cascadia Code"/>
+          <w:color w:val="auto"/>
+          <w:spacing w:val="0"/>
+          <w:position w:val="0"/>
+          <w:sz w:val="20"/>
+          <w:shd w:fill="auto" w:val="clear"/>
+        </w:rPr>
+      </w:pPr>
+      <w:r>
+        <w:rPr>
+          <w:rFonts w:ascii="Cascadia Code" w:hAnsi="Cascadia Code" w:cs="Cascadia Code" w:eastAsia="Cascadia Code"/>
+          <w:color w:val="auto"/>
+          <w:spacing w:val="0"/>
+          <w:position w:val="0"/>
+          <w:sz w:val="20"/>
+          <w:shd w:fill="auto" w:val="clear"/>
+        </w:rPr>
+        <w:t xml:space="preserve">Without this every invalid request goes to server &amp; because of which unexpected server calls , slower user experience and extra server load happens</w:t>
+      </w:r>
+    </w:p>
+    <w:p>
+      <w:pPr>
+        <w:spacing w:before="0" w:after="60" w:line="240"/>
+        <w:ind w:right="0" w:left="0" w:firstLine="0"/>
+        <w:jc w:val="left"/>
+        <w:rPr>
+          <w:rFonts w:ascii="Cascadia Code" w:hAnsi="Cascadia Code" w:cs="Cascadia Code" w:eastAsia="Cascadia Code"/>
+          <w:b/>
+          <w:color w:val="auto"/>
+          <w:spacing w:val="0"/>
+          <w:position w:val="0"/>
+          <w:sz w:val="20"/>
+          <w:shd w:fill="auto" w:val="clear"/>
+        </w:rPr>
+      </w:pPr>
+      <w:r>
+        <w:rPr>
+          <w:rFonts w:ascii="Cascadia Code" w:hAnsi="Cascadia Code" w:cs="Cascadia Code" w:eastAsia="Cascadia Code"/>
+          <w:b/>
+          <w:color w:val="auto"/>
+          <w:spacing w:val="0"/>
+          <w:position w:val="0"/>
+          <w:sz w:val="20"/>
+          <w:shd w:fill="auto" w:val="clear"/>
+        </w:rPr>
+        <w:t xml:space="preserve">How validation implemented ?</w:t>
+      </w:r>
+    </w:p>
+    <w:p>
+      <w:pPr>
+        <w:numPr>
+          <w:ilvl w:val="0"/>
+          <w:numId w:val="197"/>
+        </w:numPr>
+        <w:spacing w:before="0" w:after="60" w:line="240"/>
+        <w:ind w:right="0" w:left="720" w:hanging="360"/>
+        <w:jc w:val="left"/>
+        <w:rPr>
+          <w:rFonts w:ascii="Cascadia Code" w:hAnsi="Cascadia Code" w:cs="Cascadia Code" w:eastAsia="Cascadia Code"/>
+          <w:color w:val="auto"/>
+          <w:spacing w:val="0"/>
+          <w:position w:val="0"/>
+          <w:sz w:val="20"/>
+          <w:shd w:fill="auto" w:val="clear"/>
+        </w:rPr>
+      </w:pPr>
+      <w:r>
+        <w:rPr>
+          <w:rFonts w:ascii="Cascadia Code" w:hAnsi="Cascadia Code" w:cs="Cascadia Code" w:eastAsia="Cascadia Code"/>
+          <w:color w:val="auto"/>
+          <w:spacing w:val="0"/>
+          <w:position w:val="0"/>
+          <w:sz w:val="20"/>
+          <w:shd w:fill="auto" w:val="clear"/>
+        </w:rPr>
+        <w:t xml:space="preserve">using data annotations</w:t>
+      </w:r>
+    </w:p>
+    <w:p>
+      <w:pPr>
+        <w:numPr>
+          <w:ilvl w:val="0"/>
+          <w:numId w:val="197"/>
+        </w:numPr>
+        <w:spacing w:before="0" w:after="60" w:line="240"/>
+        <w:ind w:right="0" w:left="720" w:hanging="360"/>
+        <w:jc w:val="left"/>
+        <w:rPr>
+          <w:rFonts w:ascii="Cascadia Code" w:hAnsi="Cascadia Code" w:cs="Cascadia Code" w:eastAsia="Cascadia Code"/>
+          <w:color w:val="auto"/>
+          <w:spacing w:val="0"/>
+          <w:position w:val="0"/>
+          <w:sz w:val="20"/>
+          <w:shd w:fill="auto" w:val="clear"/>
+        </w:rPr>
+      </w:pPr>
+      <w:r>
+        <w:rPr>
+          <w:rFonts w:ascii="Cascadia Code" w:hAnsi="Cascadia Code" w:cs="Cascadia Code" w:eastAsia="Cascadia Code"/>
+          <w:color w:val="auto"/>
+          <w:spacing w:val="0"/>
+          <w:position w:val="0"/>
+          <w:sz w:val="20"/>
+          <w:shd w:fill="auto" w:val="clear"/>
+        </w:rPr>
+        <w:t xml:space="preserve">validation tag helpers ( like asp-validation-for)</w:t>
+      </w:r>
+    </w:p>
+    <w:p>
+      <w:pPr>
+        <w:numPr>
+          <w:ilvl w:val="0"/>
+          <w:numId w:val="197"/>
+        </w:numPr>
+        <w:spacing w:before="0" w:after="60" w:line="240"/>
+        <w:ind w:right="0" w:left="720" w:hanging="360"/>
+        <w:jc w:val="left"/>
+        <w:rPr>
+          <w:rFonts w:ascii="Cascadia Code" w:hAnsi="Cascadia Code" w:cs="Cascadia Code" w:eastAsia="Cascadia Code"/>
+          <w:color w:val="auto"/>
+          <w:spacing w:val="0"/>
+          <w:position w:val="0"/>
+          <w:sz w:val="20"/>
+          <w:shd w:fill="auto" w:val="clear"/>
+        </w:rPr>
+      </w:pPr>
+      <w:r>
+        <w:rPr>
+          <w:rFonts w:ascii="Cascadia Code" w:hAnsi="Cascadia Code" w:cs="Cascadia Code" w:eastAsia="Cascadia Code"/>
+          <w:color w:val="auto"/>
+          <w:spacing w:val="0"/>
+          <w:position w:val="0"/>
+          <w:sz w:val="20"/>
+          <w:shd w:fill="auto" w:val="clear"/>
+        </w:rPr>
+        <w:t xml:space="preserve">jquery validation </w:t>
+      </w:r>
+    </w:p>
+    <w:p>
+      <w:pPr>
+        <w:spacing w:before="0" w:after="60" w:line="240"/>
+        <w:ind w:right="0" w:left="0" w:firstLine="0"/>
+        <w:jc w:val="left"/>
+        <w:rPr>
+          <w:rFonts w:ascii="Cascadia Code" w:hAnsi="Cascadia Code" w:cs="Cascadia Code" w:eastAsia="Cascadia Code"/>
+          <w:color w:val="auto"/>
+          <w:spacing w:val="0"/>
+          <w:position w:val="0"/>
+          <w:sz w:val="20"/>
+          <w:shd w:fill="auto" w:val="clear"/>
+        </w:rPr>
+      </w:pPr>
+      <w:r>
+        <w:rPr>
+          <w:rFonts w:ascii="Cascadia Code" w:hAnsi="Cascadia Code" w:cs="Cascadia Code" w:eastAsia="Cascadia Code"/>
+          <w:color w:val="auto"/>
+          <w:spacing w:val="0"/>
+          <w:position w:val="0"/>
+          <w:sz w:val="20"/>
+          <w:shd w:fill="auto" w:val="clear"/>
+        </w:rPr>
+        <w:t xml:space="preserve">dataannotation &amp; validation tag helper can be use togther</w:t>
+      </w:r>
     </w:p>
     <w:p>
       <w:pPr>
@@ -12240,209 +12532,223 @@
       <w:lvlText w:val="•"/>
     </w:lvl>
   </w:abstractNum>
+  <w:abstractNum w:abstractNumId="432">
+    <w:lvl w:ilvl="0">
+      <w:start w:val="1"/>
+      <w:numFmt w:val="bullet"/>
+      <w:lvlText w:val="•"/>
+    </w:lvl>
+  </w:abstractNum>
+  <w:abstractNum w:abstractNumId="438">
+    <w:lvl w:ilvl="0">
+      <w:start w:val="1"/>
+      <w:numFmt w:val="bullet"/>
+      <w:lvlText w:val="•"/>
+    </w:lvl>
+  </w:abstractNum>
   <w:num w:numId="2">
+    <w:abstractNumId w:val="438"/>
+  </w:num>
+  <w:num w:numId="5">
+    <w:abstractNumId w:val="432"/>
+  </w:num>
+  <w:num w:numId="8">
     <w:abstractNumId w:val="426"/>
   </w:num>
-  <w:num w:numId="5">
+  <w:num w:numId="10">
     <w:abstractNumId w:val="420"/>
   </w:num>
-  <w:num w:numId="8">
+  <w:num w:numId="13">
     <w:abstractNumId w:val="414"/>
   </w:num>
-  <w:num w:numId="10">
+  <w:num w:numId="19">
     <w:abstractNumId w:val="408"/>
   </w:num>
-  <w:num w:numId="13">
+  <w:num w:numId="22">
     <w:abstractNumId w:val="402"/>
   </w:num>
-  <w:num w:numId="19">
+  <w:num w:numId="25">
     <w:abstractNumId w:val="396"/>
   </w:num>
-  <w:num w:numId="22">
+  <w:num w:numId="30">
     <w:abstractNumId w:val="390"/>
   </w:num>
-  <w:num w:numId="25">
+  <w:num w:numId="33">
     <w:abstractNumId w:val="384"/>
   </w:num>
-  <w:num w:numId="30">
+  <w:num w:numId="36">
     <w:abstractNumId w:val="378"/>
   </w:num>
-  <w:num w:numId="33">
+  <w:num w:numId="39">
     <w:abstractNumId w:val="372"/>
   </w:num>
-  <w:num w:numId="36">
+  <w:num w:numId="42">
     <w:abstractNumId w:val="366"/>
   </w:num>
-  <w:num w:numId="39">
+  <w:num w:numId="46">
     <w:abstractNumId w:val="360"/>
   </w:num>
-  <w:num w:numId="42">
+  <w:num w:numId="49">
     <w:abstractNumId w:val="354"/>
   </w:num>
-  <w:num w:numId="46">
+  <w:num w:numId="52">
     <w:abstractNumId w:val="348"/>
   </w:num>
-  <w:num w:numId="49">
+  <w:num w:numId="55">
     <w:abstractNumId w:val="342"/>
   </w:num>
-  <w:num w:numId="52">
+  <w:num w:numId="57">
     <w:abstractNumId w:val="336"/>
   </w:num>
-  <w:num w:numId="55">
+  <w:num w:numId="59">
     <w:abstractNumId w:val="330"/>
   </w:num>
-  <w:num w:numId="57">
+  <w:num w:numId="62">
     <w:abstractNumId w:val="324"/>
   </w:num>
-  <w:num w:numId="59">
+  <w:num w:numId="65">
     <w:abstractNumId w:val="318"/>
   </w:num>
-  <w:num w:numId="62">
+  <w:num w:numId="68">
     <w:abstractNumId w:val="312"/>
   </w:num>
-  <w:num w:numId="65">
+  <w:num w:numId="71">
     <w:abstractNumId w:val="306"/>
   </w:num>
-  <w:num w:numId="68">
+  <w:num w:numId="74">
     <w:abstractNumId w:val="300"/>
   </w:num>
-  <w:num w:numId="71">
+  <w:num w:numId="77">
     <w:abstractNumId w:val="294"/>
   </w:num>
-  <w:num w:numId="74">
+  <w:num w:numId="80">
     <w:abstractNumId w:val="288"/>
   </w:num>
-  <w:num w:numId="77">
+  <w:num w:numId="83">
     <w:abstractNumId w:val="282"/>
   </w:num>
-  <w:num w:numId="80">
+  <w:num w:numId="86">
     <w:abstractNumId w:val="276"/>
   </w:num>
-  <w:num w:numId="83">
+  <w:num w:numId="88">
     <w:abstractNumId w:val="270"/>
   </w:num>
-  <w:num w:numId="86">
+  <w:num w:numId="91">
     <w:abstractNumId w:val="264"/>
   </w:num>
-  <w:num w:numId="88">
+  <w:num w:numId="94">
     <w:abstractNumId w:val="258"/>
   </w:num>
-  <w:num w:numId="91">
+  <w:num w:numId="97">
     <w:abstractNumId w:val="252"/>
   </w:num>
-  <w:num w:numId="94">
+  <w:num w:numId="99">
     <w:abstractNumId w:val="246"/>
   </w:num>
-  <w:num w:numId="97">
+  <w:num w:numId="101">
     <w:abstractNumId w:val="240"/>
   </w:num>
-  <w:num w:numId="99">
+  <w:num w:numId="103">
     <w:abstractNumId w:val="234"/>
   </w:num>
-  <w:num w:numId="101">
+  <w:num w:numId="106">
     <w:abstractNumId w:val="228"/>
   </w:num>
-  <w:num w:numId="103">
+  <w:num w:numId="108">
     <w:abstractNumId w:val="222"/>
   </w:num>
-  <w:num w:numId="106">
+  <w:num w:numId="110">
     <w:abstractNumId w:val="216"/>
   </w:num>
-  <w:num w:numId="108">
+  <w:num w:numId="112">
     <w:abstractNumId w:val="210"/>
   </w:num>
-  <w:num w:numId="110">
+  <w:num w:numId="115">
     <w:abstractNumId w:val="204"/>
   </w:num>
-  <w:num w:numId="112">
+  <w:num w:numId="118">
     <w:abstractNumId w:val="198"/>
   </w:num>
-  <w:num w:numId="115">
+  <w:num w:numId="121">
     <w:abstractNumId w:val="192"/>
   </w:num>
-  <w:num w:numId="118">
+  <w:num w:numId="124">
     <w:abstractNumId w:val="186"/>
   </w:num>
-  <w:num w:numId="121">
+  <w:num w:numId="127">
     <w:abstractNumId w:val="180"/>
   </w:num>
-  <w:num w:numId="124">
+  <w:num w:numId="130">
     <w:abstractNumId w:val="174"/>
   </w:num>
-  <w:num w:numId="127">
+  <w:num w:numId="133">
     <w:abstractNumId w:val="168"/>
   </w:num>
-  <w:num w:numId="130">
+  <w:num w:numId="136">
     <w:abstractNumId w:val="162"/>
   </w:num>
-  <w:num w:numId="133">
+  <w:num w:numId="138">
     <w:abstractNumId w:val="156"/>
   </w:num>
-  <w:num w:numId="136">
+  <w:num w:numId="140">
     <w:abstractNumId w:val="150"/>
   </w:num>
-  <w:num w:numId="138">
+  <w:num w:numId="142">
     <w:abstractNumId w:val="144"/>
   </w:num>
-  <w:num w:numId="140">
+  <w:num w:numId="144">
     <w:abstractNumId w:val="138"/>
   </w:num>
-  <w:num w:numId="142">
+  <w:num w:numId="146">
     <w:abstractNumId w:val="132"/>
   </w:num>
-  <w:num w:numId="144">
+  <w:num w:numId="148">
     <w:abstractNumId w:val="126"/>
-  </w:num>
-  <w:num w:numId="146">
-    <w:abstractNumId w:val="120"/>
-  </w:num>
-  <w:num w:numId="148">
-    <w:abstractNumId w:val="114"/>
   </w:num>
   <w:num w:numId="149">
     <w:abstractNumId w:val="13"/>
   </w:num>
   <w:num w:numId="151">
+    <w:abstractNumId w:val="120"/>
+  </w:num>
+  <w:num w:numId="153">
+    <w:abstractNumId w:val="114"/>
+  </w:num>
+  <w:num w:numId="155">
     <w:abstractNumId w:val="108"/>
   </w:num>
-  <w:num w:numId="153">
+  <w:num w:numId="157">
     <w:abstractNumId w:val="102"/>
   </w:num>
-  <w:num w:numId="155">
+  <w:num w:numId="159">
     <w:abstractNumId w:val="96"/>
   </w:num>
-  <w:num w:numId="157">
+  <w:num w:numId="161">
     <w:abstractNumId w:val="90"/>
   </w:num>
-  <w:num w:numId="159">
+  <w:num w:numId="163">
     <w:abstractNumId w:val="84"/>
   </w:num>
-  <w:num w:numId="161">
+  <w:num w:numId="165">
     <w:abstractNumId w:val="78"/>
   </w:num>
-  <w:num w:numId="163">
+  <w:num w:numId="167">
     <w:abstractNumId w:val="72"/>
   </w:num>
-  <w:num w:numId="165">
+  <w:num w:numId="169">
     <w:abstractNumId w:val="66"/>
   </w:num>
-  <w:num w:numId="167">
+  <w:num w:numId="171">
     <w:abstractNumId w:val="60"/>
   </w:num>
-  <w:num w:numId="169">
+  <w:num w:numId="173">
     <w:abstractNumId w:val="54"/>
   </w:num>
-  <w:num w:numId="171">
+  <w:num w:numId="175">
     <w:abstractNumId w:val="48"/>
   </w:num>
-  <w:num w:numId="173">
+  <w:num w:numId="177">
     <w:abstractNumId w:val="42"/>
-  </w:num>
-  <w:num w:numId="175">
-    <w:abstractNumId w:val="36"/>
-  </w:num>
-  <w:num w:numId="177">
-    <w:abstractNumId w:val="30"/>
   </w:num>
   <w:num w:numId="179">
     <w:abstractNumId w:val="7"/>
@@ -12451,18 +12757,24 @@
     <w:abstractNumId w:val="1"/>
   </w:num>
   <w:num w:numId="183">
+    <w:abstractNumId w:val="36"/>
+  </w:num>
+  <w:num w:numId="185">
+    <w:abstractNumId w:val="30"/>
+  </w:num>
+  <w:num w:numId="187">
     <w:abstractNumId w:val="24"/>
   </w:num>
-  <w:num w:numId="185">
+  <w:num w:numId="189">
     <w:abstractNumId w:val="18"/>
   </w:num>
-  <w:num w:numId="187">
+  <w:num w:numId="191">
     <w:abstractNumId w:val="12"/>
   </w:num>
-  <w:num w:numId="189">
+  <w:num w:numId="195">
     <w:abstractNumId w:val="6"/>
   </w:num>
-  <w:num w:numId="191">
+  <w:num w:numId="197">
     <w:abstractNumId w:val="0"/>
   </w:num>
 </w:numbering>

</xml_diff>

<commit_message>
TempData in ASP.NET Core MVC
</commit_message>
<xml_diff>
--- a/Asp.Net Core Notes.docx
+++ b/Asp.Net Core Notes.docx
@@ -7240,8 +7240,8 @@
         </w:rPr>
       </w:pPr>
       <w:r>
-        <w:object w:dxaOrig="8685" w:dyaOrig="3644">
-          <v:rect xmlns:o="urn:schemas-microsoft-com:office:office" xmlns:v="urn:schemas-microsoft-com:vml" id="rectole0000000000" style="width:434.250000pt;height:182.200000pt" o:preferrelative="t" o:ole="">
+        <w:object w:dxaOrig="8787" w:dyaOrig="3685">
+          <v:rect xmlns:o="urn:schemas-microsoft-com:office:office" xmlns:v="urn:schemas-microsoft-com:vml" id="rectole0000000000" style="width:439.350000pt;height:184.250000pt" o:preferrelative="t" o:ole="">
             <o:lock v:ext="edit"/>
             <v:imagedata xmlns:r="http://schemas.openxmlformats.org/officeDocument/2006/relationships" r:id="docRId1" o:title=""/>
           </v:rect>
@@ -7549,8 +7549,8 @@
         </w:rPr>
       </w:pPr>
       <w:r>
-        <w:object w:dxaOrig="8301" w:dyaOrig="9496">
-          <v:rect xmlns:o="urn:schemas-microsoft-com:office:office" xmlns:v="urn:schemas-microsoft-com:vml" id="rectole0000000001" style="width:415.050000pt;height:474.800000pt" o:preferrelative="t" o:ole="">
+        <w:object w:dxaOrig="8402" w:dyaOrig="9617">
+          <v:rect xmlns:o="urn:schemas-microsoft-com:office:office" xmlns:v="urn:schemas-microsoft-com:vml" id="rectole0000000001" style="width:420.100000pt;height:480.850000pt" o:preferrelative="t" o:ole="">
             <o:lock v:ext="edit"/>
             <v:imagedata xmlns:r="http://schemas.openxmlformats.org/officeDocument/2006/relationships" r:id="docRId3" o:title=""/>
           </v:rect>
@@ -10232,8 +10232,8 @@
         </w:rPr>
       </w:pPr>
       <w:r>
-        <w:object w:dxaOrig="8640" w:dyaOrig="4245">
-          <v:rect xmlns:o="urn:schemas-microsoft-com:office:office" xmlns:v="urn:schemas-microsoft-com:vml" id="rectole0000000002" style="width:432.000000pt;height:212.250000pt" o:preferrelative="t" o:ole="">
+        <w:object w:dxaOrig="8747" w:dyaOrig="4292">
+          <v:rect xmlns:o="urn:schemas-microsoft-com:office:office" xmlns:v="urn:schemas-microsoft-com:vml" id="rectole0000000002" style="width:437.350000pt;height:214.600000pt" o:preferrelative="t" o:ole="">
             <o:lock v:ext="edit"/>
             <v:imagedata xmlns:r="http://schemas.openxmlformats.org/officeDocument/2006/relationships" r:id="docRId5" o:title=""/>
           </v:rect>
@@ -10886,6 +10886,154 @@
       <w:pPr>
         <w:numPr>
           <w:ilvl w:val="0"/>
+          <w:numId w:val="193"/>
+        </w:numPr>
+        <w:spacing w:before="0" w:after="60" w:line="240"/>
+        <w:ind w:right="0" w:left="720" w:hanging="360"/>
+        <w:jc w:val="left"/>
+        <w:rPr>
+          <w:rFonts w:ascii="Cascadia Code" w:hAnsi="Cascadia Code" w:cs="Cascadia Code" w:eastAsia="Cascadia Code"/>
+          <w:color w:val="auto"/>
+          <w:spacing w:val="0"/>
+          <w:position w:val="0"/>
+          <w:sz w:val="20"/>
+          <w:shd w:fill="auto" w:val="clear"/>
+        </w:rPr>
+      </w:pPr>
+      <w:r>
+        <w:rPr>
+          <w:rFonts w:ascii="Cascadia Code" w:hAnsi="Cascadia Code" w:cs="Cascadia Code" w:eastAsia="Cascadia Code"/>
+          <w:color w:val="auto"/>
+          <w:spacing w:val="0"/>
+          <w:position w:val="0"/>
+          <w:sz w:val="20"/>
+          <w:shd w:fill="auto" w:val="clear"/>
+        </w:rPr>
+        <w:t xml:space="preserve">A validation which happens on browser only before request reaches to server</w:t>
+      </w:r>
+    </w:p>
+    <w:p>
+      <w:pPr>
+        <w:numPr>
+          <w:ilvl w:val="0"/>
+          <w:numId w:val="193"/>
+        </w:numPr>
+        <w:spacing w:before="0" w:after="60" w:line="240"/>
+        <w:ind w:right="0" w:left="720" w:hanging="360"/>
+        <w:jc w:val="left"/>
+        <w:rPr>
+          <w:rFonts w:ascii="Cascadia Code" w:hAnsi="Cascadia Code" w:cs="Cascadia Code" w:eastAsia="Cascadia Code"/>
+          <w:color w:val="auto"/>
+          <w:spacing w:val="0"/>
+          <w:position w:val="0"/>
+          <w:sz w:val="20"/>
+          <w:shd w:fill="auto" w:val="clear"/>
+        </w:rPr>
+      </w:pPr>
+      <w:r>
+        <w:rPr>
+          <w:rFonts w:ascii="Cascadia Code" w:hAnsi="Cascadia Code" w:cs="Cascadia Code" w:eastAsia="Cascadia Code"/>
+          <w:color w:val="auto"/>
+          <w:spacing w:val="0"/>
+          <w:position w:val="0"/>
+          <w:sz w:val="20"/>
+          <w:shd w:fill="auto" w:val="clear"/>
+        </w:rPr>
+        <w:t xml:space="preserve">For example :- required filled, email format , password length</w:t>
+      </w:r>
+    </w:p>
+    <w:p>
+      <w:pPr>
+        <w:numPr>
+          <w:ilvl w:val="0"/>
+          <w:numId w:val="193"/>
+        </w:numPr>
+        <w:spacing w:before="0" w:after="60" w:line="240"/>
+        <w:ind w:right="0" w:left="720" w:hanging="360"/>
+        <w:jc w:val="left"/>
+        <w:rPr>
+          <w:rFonts w:ascii="Cascadia Code" w:hAnsi="Cascadia Code" w:cs="Cascadia Code" w:eastAsia="Cascadia Code"/>
+          <w:color w:val="auto"/>
+          <w:spacing w:val="0"/>
+          <w:position w:val="0"/>
+          <w:sz w:val="20"/>
+          <w:shd w:fill="auto" w:val="clear"/>
+        </w:rPr>
+      </w:pPr>
+      <w:r>
+        <w:rPr>
+          <w:rFonts w:ascii="Cascadia Code" w:hAnsi="Cascadia Code" w:cs="Cascadia Code" w:eastAsia="Cascadia Code"/>
+          <w:color w:val="auto"/>
+          <w:spacing w:val="0"/>
+          <w:position w:val="0"/>
+          <w:sz w:val="20"/>
+          <w:shd w:fill="auto" w:val="clear"/>
+        </w:rPr>
+        <w:t xml:space="preserve">Here browser will automatically show validation message</w:t>
+      </w:r>
+    </w:p>
+    <w:p>
+      <w:pPr>
+        <w:numPr>
+          <w:ilvl w:val="0"/>
+          <w:numId w:val="193"/>
+        </w:numPr>
+        <w:spacing w:before="0" w:after="60" w:line="240"/>
+        <w:ind w:right="0" w:left="720" w:hanging="360"/>
+        <w:jc w:val="left"/>
+        <w:rPr>
+          <w:rFonts w:ascii="Cascadia Code" w:hAnsi="Cascadia Code" w:cs="Cascadia Code" w:eastAsia="Cascadia Code"/>
+          <w:color w:val="auto"/>
+          <w:spacing w:val="0"/>
+          <w:position w:val="0"/>
+          <w:sz w:val="20"/>
+          <w:shd w:fill="auto" w:val="clear"/>
+        </w:rPr>
+      </w:pPr>
+      <w:r>
+        <w:rPr>
+          <w:rFonts w:ascii="Cascadia Code" w:hAnsi="Cascadia Code" w:cs="Cascadia Code" w:eastAsia="Cascadia Code"/>
+          <w:color w:val="auto"/>
+          <w:spacing w:val="0"/>
+          <w:position w:val="0"/>
+          <w:sz w:val="20"/>
+          <w:shd w:fill="auto" w:val="clear"/>
+        </w:rPr>
+        <w:t xml:space="preserve">Without this every invalid request goes to server &amp; because of which unexpected server calls , slower user experience and extra server load happens</w:t>
+      </w:r>
+    </w:p>
+    <w:p>
+      <w:pPr>
+        <w:spacing w:before="0" w:after="60" w:line="240"/>
+        <w:ind w:right="0" w:left="0" w:firstLine="0"/>
+        <w:jc w:val="left"/>
+        <w:rPr>
+          <w:rFonts w:ascii="Cascadia Code" w:hAnsi="Cascadia Code" w:cs="Cascadia Code" w:eastAsia="Cascadia Code"/>
+          <w:b/>
+          <w:color w:val="auto"/>
+          <w:spacing w:val="0"/>
+          <w:position w:val="0"/>
+          <w:sz w:val="20"/>
+          <w:shd w:fill="auto" w:val="clear"/>
+        </w:rPr>
+      </w:pPr>
+      <w:r>
+        <w:rPr>
+          <w:rFonts w:ascii="Cascadia Code" w:hAnsi="Cascadia Code" w:cs="Cascadia Code" w:eastAsia="Cascadia Code"/>
+          <w:b/>
+          <w:color w:val="auto"/>
+          <w:spacing w:val="0"/>
+          <w:position w:val="0"/>
+          <w:sz w:val="20"/>
+          <w:shd w:fill="auto" w:val="clear"/>
+        </w:rPr>
+        <w:t xml:space="preserve">How validation implemented ?</w:t>
+      </w:r>
+    </w:p>
+    <w:p>
+      <w:pPr>
+        <w:numPr>
+          <w:ilvl w:val="0"/>
           <w:numId w:val="195"/>
         </w:numPr>
         <w:spacing w:before="0" w:after="60" w:line="240"/>
@@ -10909,7 +11057,7 @@
           <w:sz w:val="20"/>
           <w:shd w:fill="auto" w:val="clear"/>
         </w:rPr>
-        <w:t xml:space="preserve">A validation which happens on browser only before request reaches to server</w:t>
+        <w:t xml:space="preserve">using data annotations</w:t>
       </w:r>
     </w:p>
     <w:p>
@@ -10939,7 +11087,7 @@
           <w:sz w:val="20"/>
           <w:shd w:fill="auto" w:val="clear"/>
         </w:rPr>
-        <w:t xml:space="preserve">For example :- required filled, email format , password length</w:t>
+        <w:t xml:space="preserve">validation tag helpers ( like asp-validation-for)</w:t>
       </w:r>
     </w:p>
     <w:p>
@@ -10969,65 +11117,76 @@
           <w:sz w:val="20"/>
           <w:shd w:fill="auto" w:val="clear"/>
         </w:rPr>
-        <w:t xml:space="preserve">Here browser will automatically show validation message</w:t>
-      </w:r>
-    </w:p>
-    <w:p>
-      <w:pPr>
-        <w:numPr>
-          <w:ilvl w:val="0"/>
-          <w:numId w:val="195"/>
-        </w:numPr>
-        <w:spacing w:before="0" w:after="60" w:line="240"/>
-        <w:ind w:right="0" w:left="720" w:hanging="360"/>
-        <w:jc w:val="left"/>
-        <w:rPr>
-          <w:rFonts w:ascii="Cascadia Code" w:hAnsi="Cascadia Code" w:cs="Cascadia Code" w:eastAsia="Cascadia Code"/>
-          <w:color w:val="auto"/>
-          <w:spacing w:val="0"/>
-          <w:position w:val="0"/>
-          <w:sz w:val="20"/>
-          <w:shd w:fill="auto" w:val="clear"/>
-        </w:rPr>
-      </w:pPr>
-      <w:r>
-        <w:rPr>
-          <w:rFonts w:ascii="Cascadia Code" w:hAnsi="Cascadia Code" w:cs="Cascadia Code" w:eastAsia="Cascadia Code"/>
-          <w:color w:val="auto"/>
-          <w:spacing w:val="0"/>
-          <w:position w:val="0"/>
-          <w:sz w:val="20"/>
-          <w:shd w:fill="auto" w:val="clear"/>
-        </w:rPr>
-        <w:t xml:space="preserve">Without this every invalid request goes to server &amp; because of which unexpected server calls , slower user experience and extra server load happens</w:t>
-      </w:r>
-    </w:p>
-    <w:p>
-      <w:pPr>
-        <w:spacing w:before="0" w:after="60" w:line="240"/>
-        <w:ind w:right="0" w:left="0" w:firstLine="0"/>
-        <w:jc w:val="left"/>
-        <w:rPr>
-          <w:rFonts w:ascii="Cascadia Code" w:hAnsi="Cascadia Code" w:cs="Cascadia Code" w:eastAsia="Cascadia Code"/>
-          <w:b/>
-          <w:color w:val="auto"/>
-          <w:spacing w:val="0"/>
-          <w:position w:val="0"/>
-          <w:sz w:val="20"/>
-          <w:shd w:fill="auto" w:val="clear"/>
-        </w:rPr>
-      </w:pPr>
-      <w:r>
-        <w:rPr>
-          <w:rFonts w:ascii="Cascadia Code" w:hAnsi="Cascadia Code" w:cs="Cascadia Code" w:eastAsia="Cascadia Code"/>
-          <w:b/>
-          <w:color w:val="auto"/>
-          <w:spacing w:val="0"/>
-          <w:position w:val="0"/>
-          <w:sz w:val="20"/>
-          <w:shd w:fill="auto" w:val="clear"/>
-        </w:rPr>
-        <w:t xml:space="preserve">How validation implemented ?</w:t>
+        <w:t xml:space="preserve">jquery validation </w:t>
+      </w:r>
+    </w:p>
+    <w:p>
+      <w:pPr>
+        <w:spacing w:before="0" w:after="60" w:line="240"/>
+        <w:ind w:right="0" w:left="0" w:firstLine="0"/>
+        <w:jc w:val="left"/>
+        <w:rPr>
+          <w:rFonts w:ascii="Cascadia Code" w:hAnsi="Cascadia Code" w:cs="Cascadia Code" w:eastAsia="Cascadia Code"/>
+          <w:color w:val="auto"/>
+          <w:spacing w:val="0"/>
+          <w:position w:val="0"/>
+          <w:sz w:val="20"/>
+          <w:shd w:fill="auto" w:val="clear"/>
+        </w:rPr>
+      </w:pPr>
+      <w:r>
+        <w:rPr>
+          <w:rFonts w:ascii="Cascadia Code" w:hAnsi="Cascadia Code" w:cs="Cascadia Code" w:eastAsia="Cascadia Code"/>
+          <w:color w:val="auto"/>
+          <w:spacing w:val="0"/>
+          <w:position w:val="0"/>
+          <w:sz w:val="20"/>
+          <w:shd w:fill="auto" w:val="clear"/>
+        </w:rPr>
+        <w:t xml:space="preserve">dataannotation &amp; validation tag helper can be use togther</w:t>
+      </w:r>
+    </w:p>
+    <w:p>
+      <w:pPr>
+        <w:spacing w:before="0" w:after="60" w:line="240"/>
+        <w:ind w:right="0" w:left="0" w:firstLine="0"/>
+        <w:jc w:val="left"/>
+        <w:rPr>
+          <w:rFonts w:ascii="Cascadia Code" w:hAnsi="Cascadia Code" w:cs="Cascadia Code" w:eastAsia="Cascadia Code"/>
+          <w:color w:val="auto"/>
+          <w:spacing w:val="0"/>
+          <w:position w:val="0"/>
+          <w:sz w:val="20"/>
+          <w:shd w:fill="auto" w:val="clear"/>
+        </w:rPr>
+      </w:pPr>
+    </w:p>
+    <w:p>
+      <w:pPr>
+        <w:spacing w:before="0" w:after="60" w:line="240"/>
+        <w:ind w:right="0" w:left="0" w:firstLine="0"/>
+        <w:jc w:val="left"/>
+        <w:rPr>
+          <w:rFonts w:ascii="Cascadia Code" w:hAnsi="Cascadia Code" w:cs="Cascadia Code" w:eastAsia="Cascadia Code"/>
+          <w:b/>
+          <w:color w:val="auto"/>
+          <w:spacing w:val="0"/>
+          <w:position w:val="0"/>
+          <w:sz w:val="20"/>
+          <w:shd w:fill="auto" w:val="clear"/>
+        </w:rPr>
+      </w:pPr>
+      <w:r>
+        <w:rPr>
+          <w:rFonts w:ascii="Cascadia Code" w:hAnsi="Cascadia Code" w:cs="Cascadia Code" w:eastAsia="Cascadia Code"/>
+          <w:b/>
+          <w:color w:val="auto"/>
+          <w:spacing w:val="0"/>
+          <w:position w:val="0"/>
+          <w:sz w:val="20"/>
+          <w:shd w:fill="auto" w:val="clear"/>
+        </w:rPr>
+        <w:t xml:space="preserve">Lecture :- ( TempData in ASP.NET Core MVC )</w:t>
       </w:r>
     </w:p>
     <w:p>
@@ -11057,7 +11216,7 @@
           <w:sz w:val="20"/>
           <w:shd w:fill="auto" w:val="clear"/>
         </w:rPr>
-        <w:t xml:space="preserve">using data annotations</w:t>
+        <w:t xml:space="preserve">It mena s transfer data from one request to another request temproraily</w:t>
       </w:r>
     </w:p>
     <w:p>
@@ -11087,7 +11246,7 @@
           <w:sz w:val="20"/>
           <w:shd w:fill="auto" w:val="clear"/>
         </w:rPr>
-        <w:t xml:space="preserve">validation tag helpers ( like asp-validation-for)</w:t>
+        <w:t xml:space="preserve">It holds data until it read</w:t>
       </w:r>
     </w:p>
     <w:p>
@@ -11117,33 +11276,67 @@
           <w:sz w:val="20"/>
           <w:shd w:fill="auto" w:val="clear"/>
         </w:rPr>
-        <w:t xml:space="preserve">jquery validation </w:t>
-      </w:r>
-    </w:p>
-    <w:p>
-      <w:pPr>
-        <w:spacing w:before="0" w:after="60" w:line="240"/>
-        <w:ind w:right="0" w:left="0" w:firstLine="0"/>
-        <w:jc w:val="left"/>
-        <w:rPr>
-          <w:rFonts w:ascii="Cascadia Code" w:hAnsi="Cascadia Code" w:cs="Cascadia Code" w:eastAsia="Cascadia Code"/>
-          <w:color w:val="auto"/>
-          <w:spacing w:val="0"/>
-          <w:position w:val="0"/>
-          <w:sz w:val="20"/>
-          <w:shd w:fill="auto" w:val="clear"/>
-        </w:rPr>
-      </w:pPr>
-      <w:r>
-        <w:rPr>
-          <w:rFonts w:ascii="Cascadia Code" w:hAnsi="Cascadia Code" w:cs="Cascadia Code" w:eastAsia="Cascadia Code"/>
-          <w:color w:val="auto"/>
-          <w:spacing w:val="0"/>
-          <w:position w:val="0"/>
-          <w:sz w:val="20"/>
-          <w:shd w:fill="auto" w:val="clear"/>
-        </w:rPr>
-        <w:t xml:space="preserve">dataannotation &amp; validation tag helper can be use togther</w:t>
+        <w:t xml:space="preserve">This internally use session or cookies to temporarily store data</w:t>
+      </w:r>
+    </w:p>
+    <w:p>
+      <w:pPr>
+        <w:numPr>
+          <w:ilvl w:val="0"/>
+          <w:numId w:val="197"/>
+        </w:numPr>
+        <w:spacing w:before="0" w:after="60" w:line="240"/>
+        <w:ind w:right="0" w:left="720" w:hanging="360"/>
+        <w:jc w:val="left"/>
+        <w:rPr>
+          <w:rFonts w:ascii="Cascadia Code" w:hAnsi="Cascadia Code" w:cs="Cascadia Code" w:eastAsia="Cascadia Code"/>
+          <w:color w:val="auto"/>
+          <w:spacing w:val="0"/>
+          <w:position w:val="0"/>
+          <w:sz w:val="20"/>
+          <w:shd w:fill="auto" w:val="clear"/>
+        </w:rPr>
+      </w:pPr>
+      <w:r>
+        <w:rPr>
+          <w:rFonts w:ascii="Cascadia Code" w:hAnsi="Cascadia Code" w:cs="Cascadia Code" w:eastAsia="Cascadia Code"/>
+          <w:color w:val="auto"/>
+          <w:spacing w:val="0"/>
+          <w:position w:val="0"/>
+          <w:sz w:val="20"/>
+          <w:shd w:fill="auto" w:val="clear"/>
+        </w:rPr>
+        <w:t xml:space="preserve">TempData.Keep() :- retains tempdata for next request too</w:t>
+      </w:r>
+    </w:p>
+    <w:p>
+      <w:pPr>
+        <w:numPr>
+          <w:ilvl w:val="0"/>
+          <w:numId w:val="197"/>
+        </w:numPr>
+        <w:spacing w:before="0" w:after="60" w:line="240"/>
+        <w:ind w:right="0" w:left="720" w:hanging="360"/>
+        <w:jc w:val="left"/>
+        <w:rPr>
+          <w:rFonts w:ascii="Cascadia Code" w:hAnsi="Cascadia Code" w:cs="Cascadia Code" w:eastAsia="Cascadia Code"/>
+          <w:color w:val="auto"/>
+          <w:spacing w:val="0"/>
+          <w:position w:val="0"/>
+          <w:sz w:val="20"/>
+          <w:shd w:fill="auto" w:val="clear"/>
+        </w:rPr>
+      </w:pPr>
+      <w:r>
+        <w:rPr>
+          <w:rFonts w:ascii="Cascadia Code" w:hAnsi="Cascadia Code" w:cs="Cascadia Code" w:eastAsia="Cascadia Code"/>
+          <w:color w:val="auto"/>
+          <w:spacing w:val="0"/>
+          <w:position w:val="0"/>
+          <w:sz w:val="20"/>
+          <w:shd w:fill="auto" w:val="clear"/>
+        </w:rPr>
+        <w:t xml:space="preserve">TempData.Peek() :- reads tempdata without making it for deletion</w:t>
       </w:r>
     </w:p>
     <w:p>
@@ -12546,209 +12739,216 @@
       <w:lvlText w:val="•"/>
     </w:lvl>
   </w:abstractNum>
+  <w:abstractNum w:abstractNumId="444">
+    <w:lvl w:ilvl="0">
+      <w:start w:val="1"/>
+      <w:numFmt w:val="bullet"/>
+      <w:lvlText w:val="•"/>
+    </w:lvl>
+  </w:abstractNum>
   <w:num w:numId="2">
+    <w:abstractNumId w:val="444"/>
+  </w:num>
+  <w:num w:numId="5">
     <w:abstractNumId w:val="438"/>
   </w:num>
-  <w:num w:numId="5">
+  <w:num w:numId="8">
     <w:abstractNumId w:val="432"/>
   </w:num>
-  <w:num w:numId="8">
+  <w:num w:numId="10">
     <w:abstractNumId w:val="426"/>
   </w:num>
-  <w:num w:numId="10">
+  <w:num w:numId="13">
     <w:abstractNumId w:val="420"/>
   </w:num>
-  <w:num w:numId="13">
+  <w:num w:numId="19">
     <w:abstractNumId w:val="414"/>
   </w:num>
-  <w:num w:numId="19">
+  <w:num w:numId="22">
     <w:abstractNumId w:val="408"/>
   </w:num>
-  <w:num w:numId="22">
+  <w:num w:numId="25">
     <w:abstractNumId w:val="402"/>
   </w:num>
-  <w:num w:numId="25">
+  <w:num w:numId="30">
     <w:abstractNumId w:val="396"/>
   </w:num>
-  <w:num w:numId="30">
+  <w:num w:numId="33">
     <w:abstractNumId w:val="390"/>
   </w:num>
-  <w:num w:numId="33">
+  <w:num w:numId="36">
     <w:abstractNumId w:val="384"/>
   </w:num>
-  <w:num w:numId="36">
+  <w:num w:numId="39">
     <w:abstractNumId w:val="378"/>
   </w:num>
-  <w:num w:numId="39">
+  <w:num w:numId="42">
     <w:abstractNumId w:val="372"/>
   </w:num>
-  <w:num w:numId="42">
+  <w:num w:numId="46">
     <w:abstractNumId w:val="366"/>
   </w:num>
-  <w:num w:numId="46">
+  <w:num w:numId="49">
     <w:abstractNumId w:val="360"/>
   </w:num>
-  <w:num w:numId="49">
+  <w:num w:numId="52">
     <w:abstractNumId w:val="354"/>
   </w:num>
-  <w:num w:numId="52">
+  <w:num w:numId="55">
     <w:abstractNumId w:val="348"/>
   </w:num>
-  <w:num w:numId="55">
+  <w:num w:numId="57">
     <w:abstractNumId w:val="342"/>
   </w:num>
-  <w:num w:numId="57">
+  <w:num w:numId="59">
     <w:abstractNumId w:val="336"/>
   </w:num>
-  <w:num w:numId="59">
+  <w:num w:numId="62">
     <w:abstractNumId w:val="330"/>
   </w:num>
-  <w:num w:numId="62">
+  <w:num w:numId="65">
     <w:abstractNumId w:val="324"/>
   </w:num>
-  <w:num w:numId="65">
+  <w:num w:numId="68">
     <w:abstractNumId w:val="318"/>
   </w:num>
-  <w:num w:numId="68">
+  <w:num w:numId="71">
     <w:abstractNumId w:val="312"/>
   </w:num>
-  <w:num w:numId="71">
+  <w:num w:numId="74">
     <w:abstractNumId w:val="306"/>
   </w:num>
-  <w:num w:numId="74">
+  <w:num w:numId="77">
     <w:abstractNumId w:val="300"/>
   </w:num>
-  <w:num w:numId="77">
+  <w:num w:numId="80">
     <w:abstractNumId w:val="294"/>
   </w:num>
-  <w:num w:numId="80">
+  <w:num w:numId="83">
     <w:abstractNumId w:val="288"/>
   </w:num>
-  <w:num w:numId="83">
+  <w:num w:numId="86">
     <w:abstractNumId w:val="282"/>
   </w:num>
-  <w:num w:numId="86">
+  <w:num w:numId="88">
     <w:abstractNumId w:val="276"/>
   </w:num>
-  <w:num w:numId="88">
+  <w:num w:numId="91">
     <w:abstractNumId w:val="270"/>
   </w:num>
-  <w:num w:numId="91">
+  <w:num w:numId="94">
     <w:abstractNumId w:val="264"/>
   </w:num>
-  <w:num w:numId="94">
+  <w:num w:numId="97">
     <w:abstractNumId w:val="258"/>
   </w:num>
-  <w:num w:numId="97">
+  <w:num w:numId="99">
     <w:abstractNumId w:val="252"/>
   </w:num>
-  <w:num w:numId="99">
+  <w:num w:numId="101">
     <w:abstractNumId w:val="246"/>
   </w:num>
-  <w:num w:numId="101">
+  <w:num w:numId="103">
     <w:abstractNumId w:val="240"/>
   </w:num>
-  <w:num w:numId="103">
+  <w:num w:numId="106">
     <w:abstractNumId w:val="234"/>
   </w:num>
-  <w:num w:numId="106">
+  <w:num w:numId="108">
     <w:abstractNumId w:val="228"/>
   </w:num>
-  <w:num w:numId="108">
+  <w:num w:numId="110">
     <w:abstractNumId w:val="222"/>
   </w:num>
-  <w:num w:numId="110">
+  <w:num w:numId="112">
     <w:abstractNumId w:val="216"/>
   </w:num>
-  <w:num w:numId="112">
+  <w:num w:numId="115">
     <w:abstractNumId w:val="210"/>
   </w:num>
-  <w:num w:numId="115">
+  <w:num w:numId="118">
     <w:abstractNumId w:val="204"/>
   </w:num>
-  <w:num w:numId="118">
+  <w:num w:numId="121">
     <w:abstractNumId w:val="198"/>
   </w:num>
-  <w:num w:numId="121">
+  <w:num w:numId="124">
     <w:abstractNumId w:val="192"/>
   </w:num>
-  <w:num w:numId="124">
+  <w:num w:numId="127">
     <w:abstractNumId w:val="186"/>
   </w:num>
-  <w:num w:numId="127">
+  <w:num w:numId="130">
     <w:abstractNumId w:val="180"/>
   </w:num>
-  <w:num w:numId="130">
+  <w:num w:numId="133">
     <w:abstractNumId w:val="174"/>
   </w:num>
-  <w:num w:numId="133">
+  <w:num w:numId="136">
     <w:abstractNumId w:val="168"/>
   </w:num>
-  <w:num w:numId="136">
+  <w:num w:numId="138">
     <w:abstractNumId w:val="162"/>
   </w:num>
-  <w:num w:numId="138">
+  <w:num w:numId="140">
     <w:abstractNumId w:val="156"/>
   </w:num>
-  <w:num w:numId="140">
+  <w:num w:numId="142">
     <w:abstractNumId w:val="150"/>
   </w:num>
-  <w:num w:numId="142">
+  <w:num w:numId="144">
     <w:abstractNumId w:val="144"/>
   </w:num>
-  <w:num w:numId="144">
+  <w:num w:numId="146">
     <w:abstractNumId w:val="138"/>
   </w:num>
-  <w:num w:numId="146">
+  <w:num w:numId="148">
     <w:abstractNumId w:val="132"/>
-  </w:num>
-  <w:num w:numId="148">
-    <w:abstractNumId w:val="126"/>
   </w:num>
   <w:num w:numId="149">
     <w:abstractNumId w:val="13"/>
   </w:num>
   <w:num w:numId="151">
+    <w:abstractNumId w:val="126"/>
+  </w:num>
+  <w:num w:numId="153">
     <w:abstractNumId w:val="120"/>
   </w:num>
-  <w:num w:numId="153">
+  <w:num w:numId="155">
     <w:abstractNumId w:val="114"/>
   </w:num>
-  <w:num w:numId="155">
+  <w:num w:numId="157">
     <w:abstractNumId w:val="108"/>
   </w:num>
-  <w:num w:numId="157">
+  <w:num w:numId="159">
     <w:abstractNumId w:val="102"/>
   </w:num>
-  <w:num w:numId="159">
+  <w:num w:numId="161">
     <w:abstractNumId w:val="96"/>
   </w:num>
-  <w:num w:numId="161">
+  <w:num w:numId="163">
     <w:abstractNumId w:val="90"/>
   </w:num>
-  <w:num w:numId="163">
+  <w:num w:numId="165">
     <w:abstractNumId w:val="84"/>
   </w:num>
-  <w:num w:numId="165">
+  <w:num w:numId="167">
     <w:abstractNumId w:val="78"/>
   </w:num>
-  <w:num w:numId="167">
+  <w:num w:numId="169">
     <w:abstractNumId w:val="72"/>
   </w:num>
-  <w:num w:numId="169">
+  <w:num w:numId="171">
     <w:abstractNumId w:val="66"/>
   </w:num>
-  <w:num w:numId="171">
+  <w:num w:numId="173">
     <w:abstractNumId w:val="60"/>
   </w:num>
-  <w:num w:numId="173">
+  <w:num w:numId="175">
     <w:abstractNumId w:val="54"/>
   </w:num>
-  <w:num w:numId="175">
+  <w:num w:numId="177">
     <w:abstractNumId w:val="48"/>
-  </w:num>
-  <w:num w:numId="177">
-    <w:abstractNumId w:val="42"/>
   </w:num>
   <w:num w:numId="179">
     <w:abstractNumId w:val="7"/>
@@ -12757,18 +12957,21 @@
     <w:abstractNumId w:val="1"/>
   </w:num>
   <w:num w:numId="183">
+    <w:abstractNumId w:val="42"/>
+  </w:num>
+  <w:num w:numId="185">
     <w:abstractNumId w:val="36"/>
   </w:num>
-  <w:num w:numId="185">
+  <w:num w:numId="187">
     <w:abstractNumId w:val="30"/>
   </w:num>
-  <w:num w:numId="187">
+  <w:num w:numId="189">
     <w:abstractNumId w:val="24"/>
   </w:num>
-  <w:num w:numId="189">
+  <w:num w:numId="191">
     <w:abstractNumId w:val="18"/>
   </w:num>
-  <w:num w:numId="191">
+  <w:num w:numId="193">
     <w:abstractNumId w:val="12"/>
   </w:num>
   <w:num w:numId="195">

</xml_diff>

<commit_message>
Action Results in ASP.NET Core MVC
</commit_message>
<xml_diff>
--- a/Asp.Net Core Notes.docx
+++ b/Asp.Net Core Notes.docx
@@ -11353,6 +11353,472 @@
           <w:shd w:fill="auto" w:val="clear"/>
         </w:rPr>
       </w:pPr>
+    </w:p>
+    <w:p>
+      <w:pPr>
+        <w:spacing w:before="0" w:after="60" w:line="240"/>
+        <w:ind w:right="0" w:left="0" w:firstLine="0"/>
+        <w:jc w:val="left"/>
+        <w:rPr>
+          <w:rFonts w:ascii="Cascadia Code" w:hAnsi="Cascadia Code" w:cs="Cascadia Code" w:eastAsia="Cascadia Code"/>
+          <w:b/>
+          <w:color w:val="auto"/>
+          <w:spacing w:val="0"/>
+          <w:position w:val="0"/>
+          <w:sz w:val="20"/>
+          <w:shd w:fill="auto" w:val="clear"/>
+        </w:rPr>
+      </w:pPr>
+      <w:r>
+        <w:rPr>
+          <w:rFonts w:ascii="Cascadia Code" w:hAnsi="Cascadia Code" w:cs="Cascadia Code" w:eastAsia="Cascadia Code"/>
+          <w:b/>
+          <w:color w:val="auto"/>
+          <w:spacing w:val="0"/>
+          <w:position w:val="0"/>
+          <w:sz w:val="20"/>
+          <w:shd w:fill="auto" w:val="clear"/>
+        </w:rPr>
+        <w:t xml:space="preserve">Lecture :- ( Action Results in ASP.NET Core MVC )</w:t>
+      </w:r>
+    </w:p>
+    <w:p>
+      <w:pPr>
+        <w:numPr>
+          <w:ilvl w:val="0"/>
+          <w:numId w:val="199"/>
+        </w:numPr>
+        <w:spacing w:before="0" w:after="60" w:line="240"/>
+        <w:ind w:right="0" w:left="720" w:hanging="360"/>
+        <w:jc w:val="left"/>
+        <w:rPr>
+          <w:rFonts w:ascii="Cascadia Code" w:hAnsi="Cascadia Code" w:cs="Cascadia Code" w:eastAsia="Cascadia Code"/>
+          <w:color w:val="auto"/>
+          <w:spacing w:val="0"/>
+          <w:position w:val="0"/>
+          <w:sz w:val="20"/>
+          <w:shd w:fill="auto" w:val="clear"/>
+        </w:rPr>
+      </w:pPr>
+      <w:r>
+        <w:rPr>
+          <w:rFonts w:ascii="Cascadia Code" w:hAnsi="Cascadia Code" w:cs="Cascadia Code" w:eastAsia="Cascadia Code"/>
+          <w:color w:val="auto"/>
+          <w:spacing w:val="0"/>
+          <w:position w:val="0"/>
+          <w:sz w:val="20"/>
+          <w:shd w:fill="auto" w:val="clear"/>
+        </w:rPr>
+        <w:t xml:space="preserve">The result returned by a controller action method</w:t>
+      </w:r>
+    </w:p>
+    <w:p>
+      <w:pPr>
+        <w:numPr>
+          <w:ilvl w:val="0"/>
+          <w:numId w:val="199"/>
+        </w:numPr>
+        <w:spacing w:before="0" w:after="60" w:line="240"/>
+        <w:ind w:right="0" w:left="720" w:hanging="360"/>
+        <w:jc w:val="left"/>
+        <w:rPr>
+          <w:rFonts w:ascii="Cascadia Code" w:hAnsi="Cascadia Code" w:cs="Cascadia Code" w:eastAsia="Cascadia Code"/>
+          <w:color w:val="auto"/>
+          <w:spacing w:val="0"/>
+          <w:position w:val="0"/>
+          <w:sz w:val="20"/>
+          <w:shd w:fill="auto" w:val="clear"/>
+        </w:rPr>
+      </w:pPr>
+      <w:r>
+        <w:rPr>
+          <w:rFonts w:ascii="Cascadia Code" w:hAnsi="Cascadia Code" w:cs="Cascadia Code" w:eastAsia="Cascadia Code"/>
+          <w:color w:val="auto"/>
+          <w:spacing w:val="0"/>
+          <w:position w:val="0"/>
+          <w:sz w:val="20"/>
+          <w:shd w:fill="auto" w:val="clear"/>
+        </w:rPr>
+        <w:t xml:space="preserve">Type of Action Result :-</w:t>
+      </w:r>
+    </w:p>
+    <w:p>
+      <w:pPr>
+        <w:spacing w:before="0" w:after="60" w:line="240"/>
+        <w:ind w:right="0" w:left="0" w:firstLine="0"/>
+        <w:jc w:val="left"/>
+        <w:rPr>
+          <w:rFonts w:ascii="Cascadia Code" w:hAnsi="Cascadia Code" w:cs="Cascadia Code" w:eastAsia="Cascadia Code"/>
+          <w:color w:val="auto"/>
+          <w:spacing w:val="0"/>
+          <w:position w:val="0"/>
+          <w:sz w:val="20"/>
+          <w:shd w:fill="auto" w:val="clear"/>
+        </w:rPr>
+      </w:pPr>
+      <w:r>
+        <w:rPr>
+          <w:rFonts w:ascii="Cascadia Code" w:hAnsi="Cascadia Code" w:cs="Cascadia Code" w:eastAsia="Cascadia Code"/>
+          <w:color w:val="auto"/>
+          <w:spacing w:val="0"/>
+          <w:position w:val="0"/>
+          <w:sz w:val="20"/>
+          <w:shd w:fill="auto" w:val="clear"/>
+        </w:rPr>
+        <w:tab/>
+        <w:t xml:space="preserve">1. ViewResult :- return View()</w:t>
+      </w:r>
+    </w:p>
+    <w:p>
+      <w:pPr>
+        <w:spacing w:before="0" w:after="60" w:line="240"/>
+        <w:ind w:right="0" w:left="0" w:firstLine="0"/>
+        <w:jc w:val="left"/>
+        <w:rPr>
+          <w:rFonts w:ascii="Cascadia Code" w:hAnsi="Cascadia Code" w:cs="Cascadia Code" w:eastAsia="Cascadia Code"/>
+          <w:color w:val="auto"/>
+          <w:spacing w:val="0"/>
+          <w:position w:val="0"/>
+          <w:sz w:val="20"/>
+          <w:shd w:fill="auto" w:val="clear"/>
+        </w:rPr>
+      </w:pPr>
+      <w:r>
+        <w:rPr>
+          <w:rFonts w:ascii="Cascadia Code" w:hAnsi="Cascadia Code" w:cs="Cascadia Code" w:eastAsia="Cascadia Code"/>
+          <w:color w:val="auto"/>
+          <w:spacing w:val="0"/>
+          <w:position w:val="0"/>
+          <w:sz w:val="20"/>
+          <w:shd w:fill="auto" w:val="clear"/>
+        </w:rPr>
+        <w:tab/>
+        <w:t xml:space="preserve">2. JsonResult :- return Json()</w:t>
+      </w:r>
+    </w:p>
+    <w:p>
+      <w:pPr>
+        <w:spacing w:before="0" w:after="60" w:line="240"/>
+        <w:ind w:right="0" w:left="0" w:firstLine="0"/>
+        <w:jc w:val="left"/>
+        <w:rPr>
+          <w:rFonts w:ascii="Cascadia Code" w:hAnsi="Cascadia Code" w:cs="Cascadia Code" w:eastAsia="Cascadia Code"/>
+          <w:color w:val="auto"/>
+          <w:spacing w:val="0"/>
+          <w:position w:val="0"/>
+          <w:sz w:val="20"/>
+          <w:shd w:fill="auto" w:val="clear"/>
+        </w:rPr>
+      </w:pPr>
+      <w:r>
+        <w:rPr>
+          <w:rFonts w:ascii="Cascadia Code" w:hAnsi="Cascadia Code" w:cs="Cascadia Code" w:eastAsia="Cascadia Code"/>
+          <w:color w:val="auto"/>
+          <w:spacing w:val="0"/>
+          <w:position w:val="0"/>
+          <w:sz w:val="20"/>
+          <w:shd w:fill="auto" w:val="clear"/>
+        </w:rPr>
+        <w:tab/>
+        <w:t xml:space="preserve">3. Redirect Result :- return redirect()</w:t>
+      </w:r>
+    </w:p>
+    <w:p>
+      <w:pPr>
+        <w:spacing w:before="0" w:after="60" w:line="240"/>
+        <w:ind w:right="0" w:left="0" w:firstLine="0"/>
+        <w:jc w:val="left"/>
+        <w:rPr>
+          <w:rFonts w:ascii="Cascadia Code" w:hAnsi="Cascadia Code" w:cs="Cascadia Code" w:eastAsia="Cascadia Code"/>
+          <w:color w:val="auto"/>
+          <w:spacing w:val="0"/>
+          <w:position w:val="0"/>
+          <w:sz w:val="20"/>
+          <w:shd w:fill="auto" w:val="clear"/>
+        </w:rPr>
+      </w:pPr>
+      <w:r>
+        <w:rPr>
+          <w:rFonts w:ascii="Cascadia Code" w:hAnsi="Cascadia Code" w:cs="Cascadia Code" w:eastAsia="Cascadia Code"/>
+          <w:color w:val="auto"/>
+          <w:spacing w:val="0"/>
+          <w:position w:val="0"/>
+          <w:sz w:val="20"/>
+          <w:shd w:fill="auto" w:val="clear"/>
+        </w:rPr>
+        <w:tab/>
+        <w:t xml:space="preserve">4. RedirectToActionResult :- return redirecttoaction()</w:t>
+      </w:r>
+    </w:p>
+    <w:p>
+      <w:pPr>
+        <w:spacing w:before="0" w:after="60" w:line="240"/>
+        <w:ind w:right="0" w:left="0" w:firstLine="0"/>
+        <w:jc w:val="left"/>
+        <w:rPr>
+          <w:rFonts w:ascii="Cascadia Code" w:hAnsi="Cascadia Code" w:cs="Cascadia Code" w:eastAsia="Cascadia Code"/>
+          <w:color w:val="auto"/>
+          <w:spacing w:val="0"/>
+          <w:position w:val="0"/>
+          <w:sz w:val="20"/>
+          <w:shd w:fill="auto" w:val="clear"/>
+        </w:rPr>
+      </w:pPr>
+      <w:r>
+        <w:rPr>
+          <w:rFonts w:ascii="Cascadia Code" w:hAnsi="Cascadia Code" w:cs="Cascadia Code" w:eastAsia="Cascadia Code"/>
+          <w:color w:val="auto"/>
+          <w:spacing w:val="0"/>
+          <w:position w:val="0"/>
+          <w:sz w:val="20"/>
+          <w:shd w:fill="auto" w:val="clear"/>
+        </w:rPr>
+        <w:tab/>
+        <w:t xml:space="preserve">5. ContentResult :- return content()</w:t>
+      </w:r>
+    </w:p>
+    <w:p>
+      <w:pPr>
+        <w:spacing w:before="0" w:after="60" w:line="240"/>
+        <w:ind w:right="0" w:left="0" w:firstLine="0"/>
+        <w:jc w:val="left"/>
+        <w:rPr>
+          <w:rFonts w:ascii="Cascadia Code" w:hAnsi="Cascadia Code" w:cs="Cascadia Code" w:eastAsia="Cascadia Code"/>
+          <w:color w:val="auto"/>
+          <w:spacing w:val="0"/>
+          <w:position w:val="0"/>
+          <w:sz w:val="20"/>
+          <w:shd w:fill="auto" w:val="clear"/>
+        </w:rPr>
+      </w:pPr>
+      <w:r>
+        <w:rPr>
+          <w:rFonts w:ascii="Cascadia Code" w:hAnsi="Cascadia Code" w:cs="Cascadia Code" w:eastAsia="Cascadia Code"/>
+          <w:color w:val="auto"/>
+          <w:spacing w:val="0"/>
+          <w:position w:val="0"/>
+          <w:sz w:val="20"/>
+          <w:shd w:fill="auto" w:val="clear"/>
+        </w:rPr>
+        <w:tab/>
+        <w:t xml:space="preserve">6. Emptyresult :- return new emptyresult()</w:t>
+      </w:r>
+    </w:p>
+    <w:p>
+      <w:pPr>
+        <w:spacing w:before="0" w:after="60" w:line="240"/>
+        <w:ind w:right="0" w:left="0" w:firstLine="0"/>
+        <w:jc w:val="left"/>
+        <w:rPr>
+          <w:rFonts w:ascii="Cascadia Code" w:hAnsi="Cascadia Code" w:cs="Cascadia Code" w:eastAsia="Cascadia Code"/>
+          <w:color w:val="auto"/>
+          <w:spacing w:val="0"/>
+          <w:position w:val="0"/>
+          <w:sz w:val="20"/>
+          <w:shd w:fill="auto" w:val="clear"/>
+        </w:rPr>
+      </w:pPr>
+      <w:r>
+        <w:rPr>
+          <w:rFonts w:ascii="Cascadia Code" w:hAnsi="Cascadia Code" w:cs="Cascadia Code" w:eastAsia="Cascadia Code"/>
+          <w:color w:val="auto"/>
+          <w:spacing w:val="0"/>
+          <w:position w:val="0"/>
+          <w:sz w:val="20"/>
+          <w:shd w:fill="auto" w:val="clear"/>
+        </w:rPr>
+        <w:tab/>
+        <w:t xml:space="preserve">7. FileResult :- return file(bytes , "filename")</w:t>
+      </w:r>
+    </w:p>
+    <w:p>
+      <w:pPr>
+        <w:spacing w:before="0" w:after="60" w:line="240"/>
+        <w:ind w:right="0" w:left="0" w:firstLine="0"/>
+        <w:jc w:val="left"/>
+        <w:rPr>
+          <w:rFonts w:ascii="Cascadia Code" w:hAnsi="Cascadia Code" w:cs="Cascadia Code" w:eastAsia="Cascadia Code"/>
+          <w:color w:val="auto"/>
+          <w:spacing w:val="0"/>
+          <w:position w:val="0"/>
+          <w:sz w:val="20"/>
+          <w:shd w:fill="auto" w:val="clear"/>
+        </w:rPr>
+      </w:pPr>
+      <w:r>
+        <w:rPr>
+          <w:rFonts w:ascii="Cascadia Code" w:hAnsi="Cascadia Code" w:cs="Cascadia Code" w:eastAsia="Cascadia Code"/>
+          <w:color w:val="auto"/>
+          <w:spacing w:val="0"/>
+          <w:position w:val="0"/>
+          <w:sz w:val="20"/>
+          <w:shd w:fill="auto" w:val="clear"/>
+        </w:rPr>
+        <w:tab/>
+        <w:t xml:space="preserve">8. StatusCodeResult :- return statuscode()</w:t>
+      </w:r>
+    </w:p>
+    <w:p>
+      <w:pPr>
+        <w:spacing w:before="0" w:after="60" w:line="240"/>
+        <w:ind w:right="0" w:left="0" w:firstLine="0"/>
+        <w:jc w:val="left"/>
+        <w:rPr>
+          <w:rFonts w:ascii="Cascadia Code" w:hAnsi="Cascadia Code" w:cs="Cascadia Code" w:eastAsia="Cascadia Code"/>
+          <w:color w:val="auto"/>
+          <w:spacing w:val="0"/>
+          <w:position w:val="0"/>
+          <w:sz w:val="20"/>
+          <w:shd w:fill="auto" w:val="clear"/>
+        </w:rPr>
+      </w:pPr>
+      <w:r>
+        <w:rPr>
+          <w:rFonts w:ascii="Cascadia Code" w:hAnsi="Cascadia Code" w:cs="Cascadia Code" w:eastAsia="Cascadia Code"/>
+          <w:color w:val="auto"/>
+          <w:spacing w:val="0"/>
+          <w:position w:val="0"/>
+          <w:sz w:val="20"/>
+          <w:shd w:fill="auto" w:val="clear"/>
+        </w:rPr>
+        <w:tab/>
+        <w:t xml:space="preserve">9. NotFoundResult() :- return notfound()</w:t>
+      </w:r>
+    </w:p>
+    <w:p>
+      <w:pPr>
+        <w:spacing w:before="0" w:after="60" w:line="240"/>
+        <w:ind w:right="0" w:left="0" w:firstLine="0"/>
+        <w:jc w:val="left"/>
+        <w:rPr>
+          <w:rFonts w:ascii="Cascadia Code" w:hAnsi="Cascadia Code" w:cs="Cascadia Code" w:eastAsia="Cascadia Code"/>
+          <w:color w:val="auto"/>
+          <w:spacing w:val="0"/>
+          <w:position w:val="0"/>
+          <w:sz w:val="20"/>
+          <w:shd w:fill="auto" w:val="clear"/>
+        </w:rPr>
+      </w:pPr>
+      <w:r>
+        <w:rPr>
+          <w:rFonts w:ascii="Cascadia Code" w:hAnsi="Cascadia Code" w:cs="Cascadia Code" w:eastAsia="Cascadia Code"/>
+          <w:color w:val="auto"/>
+          <w:spacing w:val="0"/>
+          <w:position w:val="0"/>
+          <w:sz w:val="20"/>
+          <w:shd w:fill="auto" w:val="clear"/>
+        </w:rPr>
+        <w:tab/>
+        <w:t xml:space="preserve">10. Unauthorized Result :- return unaothrized()</w:t>
+      </w:r>
+    </w:p>
+    <w:p>
+      <w:pPr>
+        <w:spacing w:before="0" w:after="60" w:line="240"/>
+        <w:ind w:right="0" w:left="0" w:firstLine="0"/>
+        <w:jc w:val="left"/>
+        <w:rPr>
+          <w:rFonts w:ascii="Cascadia Code" w:hAnsi="Cascadia Code" w:cs="Cascadia Code" w:eastAsia="Cascadia Code"/>
+          <w:color w:val="auto"/>
+          <w:spacing w:val="0"/>
+          <w:position w:val="0"/>
+          <w:sz w:val="20"/>
+          <w:shd w:fill="auto" w:val="clear"/>
+        </w:rPr>
+      </w:pPr>
+      <w:r>
+        <w:rPr>
+          <w:rFonts w:ascii="Cascadia Code" w:hAnsi="Cascadia Code" w:cs="Cascadia Code" w:eastAsia="Cascadia Code"/>
+          <w:color w:val="auto"/>
+          <w:spacing w:val="0"/>
+          <w:position w:val="0"/>
+          <w:sz w:val="20"/>
+          <w:shd w:fill="auto" w:val="clear"/>
+        </w:rPr>
+        <w:tab/>
+        <w:t xml:space="preserve">11. BadRequestResult :- return badrequest()</w:t>
+      </w:r>
+    </w:p>
+    <w:p>
+      <w:pPr>
+        <w:spacing w:before="0" w:after="60" w:line="240"/>
+        <w:ind w:right="0" w:left="0" w:firstLine="0"/>
+        <w:jc w:val="left"/>
+        <w:rPr>
+          <w:rFonts w:ascii="Cascadia Code" w:hAnsi="Cascadia Code" w:cs="Cascadia Code" w:eastAsia="Cascadia Code"/>
+          <w:color w:val="auto"/>
+          <w:spacing w:val="0"/>
+          <w:position w:val="0"/>
+          <w:sz w:val="20"/>
+          <w:shd w:fill="auto" w:val="clear"/>
+        </w:rPr>
+      </w:pPr>
+      <w:r>
+        <w:rPr>
+          <w:rFonts w:ascii="Cascadia Code" w:hAnsi="Cascadia Code" w:cs="Cascadia Code" w:eastAsia="Cascadia Code"/>
+          <w:color w:val="auto"/>
+          <w:spacing w:val="0"/>
+          <w:position w:val="0"/>
+          <w:sz w:val="20"/>
+          <w:shd w:fill="auto" w:val="clear"/>
+        </w:rPr>
+        <w:tab/>
+        <w:t xml:space="preserve">12. OkResult :- return ok()</w:t>
+      </w:r>
+    </w:p>
+    <w:p>
+      <w:pPr>
+        <w:spacing w:before="0" w:after="60" w:line="240"/>
+        <w:ind w:right="0" w:left="0" w:firstLine="0"/>
+        <w:jc w:val="left"/>
+        <w:rPr>
+          <w:rFonts w:ascii="Cascadia Code" w:hAnsi="Cascadia Code" w:cs="Cascadia Code" w:eastAsia="Cascadia Code"/>
+          <w:color w:val="auto"/>
+          <w:spacing w:val="0"/>
+          <w:position w:val="0"/>
+          <w:sz w:val="20"/>
+          <w:shd w:fill="auto" w:val="clear"/>
+        </w:rPr>
+      </w:pPr>
+      <w:r>
+        <w:rPr>
+          <w:rFonts w:ascii="Cascadia Code" w:hAnsi="Cascadia Code" w:cs="Cascadia Code" w:eastAsia="Cascadia Code"/>
+          <w:color w:val="auto"/>
+          <w:spacing w:val="0"/>
+          <w:position w:val="0"/>
+          <w:sz w:val="20"/>
+          <w:shd w:fill="auto" w:val="clear"/>
+        </w:rPr>
+        <w:tab/>
+        <w:t xml:space="preserve">13. IActionResult :- can return multiple return types</w:t>
+      </w:r>
+    </w:p>
+    <w:p>
+      <w:pPr>
+        <w:spacing w:before="0" w:after="60" w:line="240"/>
+        <w:ind w:right="0" w:left="0" w:firstLine="0"/>
+        <w:jc w:val="left"/>
+        <w:rPr>
+          <w:rFonts w:ascii="Cascadia Code" w:hAnsi="Cascadia Code" w:cs="Cascadia Code" w:eastAsia="Cascadia Code"/>
+          <w:color w:val="auto"/>
+          <w:spacing w:val="0"/>
+          <w:position w:val="0"/>
+          <w:sz w:val="20"/>
+          <w:shd w:fill="auto" w:val="clear"/>
+        </w:rPr>
+      </w:pPr>
+      <w:r>
+        <w:rPr>
+          <w:rFonts w:ascii="Cascadia Code" w:hAnsi="Cascadia Code" w:cs="Cascadia Code" w:eastAsia="Cascadia Code"/>
+          <w:color w:val="auto"/>
+          <w:spacing w:val="0"/>
+          <w:position w:val="0"/>
+          <w:sz w:val="20"/>
+          <w:shd w:fill="auto" w:val="clear"/>
+        </w:rPr>
+        <w:tab/>
+        <w:t xml:space="preserve">14. ActionResult&lt;T&gt; :- can return a strongly typed response</w:t>
+      </w:r>
     </w:p>
     <w:p>
       <w:pPr>
@@ -12746,209 +13212,216 @@
       <w:lvlText w:val="•"/>
     </w:lvl>
   </w:abstractNum>
+  <w:abstractNum w:abstractNumId="450">
+    <w:lvl w:ilvl="0">
+      <w:start w:val="1"/>
+      <w:numFmt w:val="bullet"/>
+      <w:lvlText w:val="•"/>
+    </w:lvl>
+  </w:abstractNum>
   <w:num w:numId="2">
+    <w:abstractNumId w:val="450"/>
+  </w:num>
+  <w:num w:numId="5">
     <w:abstractNumId w:val="444"/>
   </w:num>
-  <w:num w:numId="5">
+  <w:num w:numId="8">
     <w:abstractNumId w:val="438"/>
   </w:num>
-  <w:num w:numId="8">
+  <w:num w:numId="10">
     <w:abstractNumId w:val="432"/>
   </w:num>
-  <w:num w:numId="10">
+  <w:num w:numId="13">
     <w:abstractNumId w:val="426"/>
   </w:num>
-  <w:num w:numId="13">
+  <w:num w:numId="19">
     <w:abstractNumId w:val="420"/>
   </w:num>
-  <w:num w:numId="19">
+  <w:num w:numId="22">
     <w:abstractNumId w:val="414"/>
   </w:num>
-  <w:num w:numId="22">
+  <w:num w:numId="25">
     <w:abstractNumId w:val="408"/>
   </w:num>
-  <w:num w:numId="25">
+  <w:num w:numId="30">
     <w:abstractNumId w:val="402"/>
   </w:num>
-  <w:num w:numId="30">
+  <w:num w:numId="33">
     <w:abstractNumId w:val="396"/>
   </w:num>
-  <w:num w:numId="33">
+  <w:num w:numId="36">
     <w:abstractNumId w:val="390"/>
   </w:num>
-  <w:num w:numId="36">
+  <w:num w:numId="39">
     <w:abstractNumId w:val="384"/>
   </w:num>
-  <w:num w:numId="39">
+  <w:num w:numId="42">
     <w:abstractNumId w:val="378"/>
   </w:num>
-  <w:num w:numId="42">
+  <w:num w:numId="46">
     <w:abstractNumId w:val="372"/>
   </w:num>
-  <w:num w:numId="46">
+  <w:num w:numId="49">
     <w:abstractNumId w:val="366"/>
   </w:num>
-  <w:num w:numId="49">
+  <w:num w:numId="52">
     <w:abstractNumId w:val="360"/>
   </w:num>
-  <w:num w:numId="52">
+  <w:num w:numId="55">
     <w:abstractNumId w:val="354"/>
   </w:num>
-  <w:num w:numId="55">
+  <w:num w:numId="57">
     <w:abstractNumId w:val="348"/>
   </w:num>
-  <w:num w:numId="57">
+  <w:num w:numId="59">
     <w:abstractNumId w:val="342"/>
   </w:num>
-  <w:num w:numId="59">
+  <w:num w:numId="62">
     <w:abstractNumId w:val="336"/>
   </w:num>
-  <w:num w:numId="62">
+  <w:num w:numId="65">
     <w:abstractNumId w:val="330"/>
   </w:num>
-  <w:num w:numId="65">
+  <w:num w:numId="68">
     <w:abstractNumId w:val="324"/>
   </w:num>
-  <w:num w:numId="68">
+  <w:num w:numId="71">
     <w:abstractNumId w:val="318"/>
   </w:num>
-  <w:num w:numId="71">
+  <w:num w:numId="74">
     <w:abstractNumId w:val="312"/>
   </w:num>
-  <w:num w:numId="74">
+  <w:num w:numId="77">
     <w:abstractNumId w:val="306"/>
   </w:num>
-  <w:num w:numId="77">
+  <w:num w:numId="80">
     <w:abstractNumId w:val="300"/>
   </w:num>
-  <w:num w:numId="80">
+  <w:num w:numId="83">
     <w:abstractNumId w:val="294"/>
   </w:num>
-  <w:num w:numId="83">
+  <w:num w:numId="86">
     <w:abstractNumId w:val="288"/>
   </w:num>
-  <w:num w:numId="86">
+  <w:num w:numId="88">
     <w:abstractNumId w:val="282"/>
   </w:num>
-  <w:num w:numId="88">
+  <w:num w:numId="91">
     <w:abstractNumId w:val="276"/>
   </w:num>
-  <w:num w:numId="91">
+  <w:num w:numId="94">
     <w:abstractNumId w:val="270"/>
   </w:num>
-  <w:num w:numId="94">
+  <w:num w:numId="97">
     <w:abstractNumId w:val="264"/>
   </w:num>
-  <w:num w:numId="97">
+  <w:num w:numId="99">
     <w:abstractNumId w:val="258"/>
   </w:num>
-  <w:num w:numId="99">
+  <w:num w:numId="101">
     <w:abstractNumId w:val="252"/>
   </w:num>
-  <w:num w:numId="101">
+  <w:num w:numId="103">
     <w:abstractNumId w:val="246"/>
   </w:num>
-  <w:num w:numId="103">
+  <w:num w:numId="106">
     <w:abstractNumId w:val="240"/>
   </w:num>
-  <w:num w:numId="106">
+  <w:num w:numId="108">
     <w:abstractNumId w:val="234"/>
   </w:num>
-  <w:num w:numId="108">
+  <w:num w:numId="110">
     <w:abstractNumId w:val="228"/>
   </w:num>
-  <w:num w:numId="110">
+  <w:num w:numId="112">
     <w:abstractNumId w:val="222"/>
   </w:num>
-  <w:num w:numId="112">
+  <w:num w:numId="115">
     <w:abstractNumId w:val="216"/>
   </w:num>
-  <w:num w:numId="115">
+  <w:num w:numId="118">
     <w:abstractNumId w:val="210"/>
   </w:num>
-  <w:num w:numId="118">
+  <w:num w:numId="121">
     <w:abstractNumId w:val="204"/>
   </w:num>
-  <w:num w:numId="121">
+  <w:num w:numId="124">
     <w:abstractNumId w:val="198"/>
   </w:num>
-  <w:num w:numId="124">
+  <w:num w:numId="127">
     <w:abstractNumId w:val="192"/>
   </w:num>
-  <w:num w:numId="127">
+  <w:num w:numId="130">
     <w:abstractNumId w:val="186"/>
   </w:num>
-  <w:num w:numId="130">
+  <w:num w:numId="133">
     <w:abstractNumId w:val="180"/>
   </w:num>
-  <w:num w:numId="133">
+  <w:num w:numId="136">
     <w:abstractNumId w:val="174"/>
   </w:num>
-  <w:num w:numId="136">
+  <w:num w:numId="138">
     <w:abstractNumId w:val="168"/>
   </w:num>
-  <w:num w:numId="138">
+  <w:num w:numId="140">
     <w:abstractNumId w:val="162"/>
   </w:num>
-  <w:num w:numId="140">
+  <w:num w:numId="142">
     <w:abstractNumId w:val="156"/>
   </w:num>
-  <w:num w:numId="142">
+  <w:num w:numId="144">
     <w:abstractNumId w:val="150"/>
   </w:num>
-  <w:num w:numId="144">
+  <w:num w:numId="146">
     <w:abstractNumId w:val="144"/>
   </w:num>
-  <w:num w:numId="146">
+  <w:num w:numId="148">
     <w:abstractNumId w:val="138"/>
-  </w:num>
-  <w:num w:numId="148">
-    <w:abstractNumId w:val="132"/>
   </w:num>
   <w:num w:numId="149">
     <w:abstractNumId w:val="13"/>
   </w:num>
   <w:num w:numId="151">
+    <w:abstractNumId w:val="132"/>
+  </w:num>
+  <w:num w:numId="153">
     <w:abstractNumId w:val="126"/>
   </w:num>
-  <w:num w:numId="153">
+  <w:num w:numId="155">
     <w:abstractNumId w:val="120"/>
   </w:num>
-  <w:num w:numId="155">
+  <w:num w:numId="157">
     <w:abstractNumId w:val="114"/>
   </w:num>
-  <w:num w:numId="157">
+  <w:num w:numId="159">
     <w:abstractNumId w:val="108"/>
   </w:num>
-  <w:num w:numId="159">
+  <w:num w:numId="161">
     <w:abstractNumId w:val="102"/>
   </w:num>
-  <w:num w:numId="161">
+  <w:num w:numId="163">
     <w:abstractNumId w:val="96"/>
   </w:num>
-  <w:num w:numId="163">
+  <w:num w:numId="165">
     <w:abstractNumId w:val="90"/>
   </w:num>
-  <w:num w:numId="165">
+  <w:num w:numId="167">
     <w:abstractNumId w:val="84"/>
   </w:num>
-  <w:num w:numId="167">
+  <w:num w:numId="169">
     <w:abstractNumId w:val="78"/>
   </w:num>
-  <w:num w:numId="169">
+  <w:num w:numId="171">
     <w:abstractNumId w:val="72"/>
   </w:num>
-  <w:num w:numId="171">
+  <w:num w:numId="173">
     <w:abstractNumId w:val="66"/>
   </w:num>
-  <w:num w:numId="173">
+  <w:num w:numId="175">
     <w:abstractNumId w:val="60"/>
   </w:num>
-  <w:num w:numId="175">
+  <w:num w:numId="177">
     <w:abstractNumId w:val="54"/>
-  </w:num>
-  <w:num w:numId="177">
-    <w:abstractNumId w:val="48"/>
   </w:num>
   <w:num w:numId="179">
     <w:abstractNumId w:val="7"/>
@@ -12957,27 +13430,30 @@
     <w:abstractNumId w:val="1"/>
   </w:num>
   <w:num w:numId="183">
+    <w:abstractNumId w:val="48"/>
+  </w:num>
+  <w:num w:numId="185">
     <w:abstractNumId w:val="42"/>
   </w:num>
-  <w:num w:numId="185">
+  <w:num w:numId="187">
     <w:abstractNumId w:val="36"/>
   </w:num>
-  <w:num w:numId="187">
+  <w:num w:numId="189">
     <w:abstractNumId w:val="30"/>
   </w:num>
-  <w:num w:numId="189">
+  <w:num w:numId="191">
     <w:abstractNumId w:val="24"/>
   </w:num>
-  <w:num w:numId="191">
+  <w:num w:numId="193">
     <w:abstractNumId w:val="18"/>
   </w:num>
-  <w:num w:numId="193">
+  <w:num w:numId="195">
     <w:abstractNumId w:val="12"/>
   </w:num>
-  <w:num w:numId="195">
+  <w:num w:numId="197">
     <w:abstractNumId w:val="6"/>
   </w:num>
-  <w:num w:numId="197">
+  <w:num w:numId="199">
     <w:abstractNumId w:val="0"/>
   </w:num>
 </w:numbering>

</xml_diff>

<commit_message>
Cookies in ASP.NET Core MVC
</commit_message>
<xml_diff>
--- a/Asp.Net Core Notes.docx
+++ b/Asp.Net Core Notes.docx
@@ -11834,6 +11834,124 @@
           <w:shd w:fill="auto" w:val="clear"/>
         </w:rPr>
       </w:pPr>
+    </w:p>
+    <w:p>
+      <w:pPr>
+        <w:spacing w:before="0" w:after="60" w:line="240"/>
+        <w:ind w:right="0" w:left="0" w:firstLine="0"/>
+        <w:jc w:val="left"/>
+        <w:rPr>
+          <w:rFonts w:ascii="Cascadia Code" w:hAnsi="Cascadia Code" w:cs="Cascadia Code" w:eastAsia="Cascadia Code"/>
+          <w:b/>
+          <w:color w:val="auto"/>
+          <w:spacing w:val="0"/>
+          <w:position w:val="0"/>
+          <w:sz w:val="20"/>
+          <w:shd w:fill="auto" w:val="clear"/>
+        </w:rPr>
+      </w:pPr>
+      <w:r>
+        <w:rPr>
+          <w:rFonts w:ascii="Cascadia Code" w:hAnsi="Cascadia Code" w:cs="Cascadia Code" w:eastAsia="Cascadia Code"/>
+          <w:b/>
+          <w:color w:val="auto"/>
+          <w:spacing w:val="0"/>
+          <w:position w:val="0"/>
+          <w:sz w:val="20"/>
+          <w:shd w:fill="auto" w:val="clear"/>
+        </w:rPr>
+        <w:t xml:space="preserve">Lecture :- ( Cookies in ASP.NET Core MVC )</w:t>
+      </w:r>
+    </w:p>
+    <w:p>
+      <w:pPr>
+        <w:numPr>
+          <w:ilvl w:val="0"/>
+          <w:numId w:val="202"/>
+        </w:numPr>
+        <w:spacing w:before="0" w:after="60" w:line="240"/>
+        <w:ind w:right="0" w:left="720" w:hanging="360"/>
+        <w:jc w:val="left"/>
+        <w:rPr>
+          <w:rFonts w:ascii="Cascadia Code" w:hAnsi="Cascadia Code" w:cs="Cascadia Code" w:eastAsia="Cascadia Code"/>
+          <w:color w:val="auto"/>
+          <w:spacing w:val="0"/>
+          <w:position w:val="0"/>
+          <w:sz w:val="20"/>
+          <w:shd w:fill="auto" w:val="clear"/>
+        </w:rPr>
+      </w:pPr>
+      <w:r>
+        <w:rPr>
+          <w:rFonts w:ascii="Cascadia Code" w:hAnsi="Cascadia Code" w:cs="Cascadia Code" w:eastAsia="Cascadia Code"/>
+          <w:color w:val="auto"/>
+          <w:spacing w:val="0"/>
+          <w:position w:val="0"/>
+          <w:sz w:val="20"/>
+          <w:shd w:fill="auto" w:val="clear"/>
+        </w:rPr>
+        <w:t xml:space="preserve">A small peice of data stored in the user's browser</w:t>
+      </w:r>
+    </w:p>
+    <w:p>
+      <w:pPr>
+        <w:numPr>
+          <w:ilvl w:val="0"/>
+          <w:numId w:val="202"/>
+        </w:numPr>
+        <w:spacing w:before="0" w:after="60" w:line="240"/>
+        <w:ind w:right="0" w:left="720" w:hanging="360"/>
+        <w:jc w:val="left"/>
+        <w:rPr>
+          <w:rFonts w:ascii="Cascadia Code" w:hAnsi="Cascadia Code" w:cs="Cascadia Code" w:eastAsia="Cascadia Code"/>
+          <w:color w:val="auto"/>
+          <w:spacing w:val="0"/>
+          <w:position w:val="0"/>
+          <w:sz w:val="20"/>
+          <w:shd w:fill="auto" w:val="clear"/>
+        </w:rPr>
+      </w:pPr>
+      <w:r>
+        <w:rPr>
+          <w:rFonts w:ascii="Cascadia Code" w:hAnsi="Cascadia Code" w:cs="Cascadia Code" w:eastAsia="Cascadia Code"/>
+          <w:color w:val="auto"/>
+          <w:spacing w:val="0"/>
+          <w:position w:val="0"/>
+          <w:sz w:val="20"/>
+          <w:shd w:fill="auto" w:val="clear"/>
+        </w:rPr>
+        <w:t xml:space="preserve">Its required because http is stateless which means every request is independent and server forgot previous request</w:t>
+      </w:r>
+    </w:p>
+    <w:p>
+      <w:pPr>
+        <w:numPr>
+          <w:ilvl w:val="0"/>
+          <w:numId w:val="202"/>
+        </w:numPr>
+        <w:spacing w:before="0" w:after="60" w:line="240"/>
+        <w:ind w:right="0" w:left="720" w:hanging="360"/>
+        <w:jc w:val="left"/>
+        <w:rPr>
+          <w:rFonts w:ascii="Cascadia Code" w:hAnsi="Cascadia Code" w:cs="Cascadia Code" w:eastAsia="Cascadia Code"/>
+          <w:color w:val="auto"/>
+          <w:spacing w:val="0"/>
+          <w:position w:val="0"/>
+          <w:sz w:val="20"/>
+          <w:shd w:fill="auto" w:val="clear"/>
+        </w:rPr>
+      </w:pPr>
+      <w:r>
+        <w:rPr>
+          <w:rFonts w:ascii="Cascadia Code" w:hAnsi="Cascadia Code" w:cs="Cascadia Code" w:eastAsia="Cascadia Code"/>
+          <w:color w:val="auto"/>
+          <w:spacing w:val="0"/>
+          <w:position w:val="0"/>
+          <w:sz w:val="20"/>
+          <w:shd w:fill="auto" w:val="clear"/>
+        </w:rPr>
+        <w:t xml:space="preserve">Cookies help maintain continuity between request</w:t>
+      </w:r>
     </w:p>
     <w:p>
       <w:pPr>
@@ -13219,209 +13337,216 @@
       <w:lvlText w:val="•"/>
     </w:lvl>
   </w:abstractNum>
+  <w:abstractNum w:abstractNumId="456">
+    <w:lvl w:ilvl="0">
+      <w:start w:val="1"/>
+      <w:numFmt w:val="bullet"/>
+      <w:lvlText w:val="•"/>
+    </w:lvl>
+  </w:abstractNum>
   <w:num w:numId="2">
+    <w:abstractNumId w:val="456"/>
+  </w:num>
+  <w:num w:numId="5">
     <w:abstractNumId w:val="450"/>
   </w:num>
-  <w:num w:numId="5">
+  <w:num w:numId="8">
     <w:abstractNumId w:val="444"/>
   </w:num>
-  <w:num w:numId="8">
+  <w:num w:numId="10">
     <w:abstractNumId w:val="438"/>
   </w:num>
-  <w:num w:numId="10">
+  <w:num w:numId="13">
     <w:abstractNumId w:val="432"/>
   </w:num>
-  <w:num w:numId="13">
+  <w:num w:numId="19">
     <w:abstractNumId w:val="426"/>
   </w:num>
-  <w:num w:numId="19">
+  <w:num w:numId="22">
     <w:abstractNumId w:val="420"/>
   </w:num>
-  <w:num w:numId="22">
+  <w:num w:numId="25">
     <w:abstractNumId w:val="414"/>
   </w:num>
-  <w:num w:numId="25">
+  <w:num w:numId="30">
     <w:abstractNumId w:val="408"/>
   </w:num>
-  <w:num w:numId="30">
+  <w:num w:numId="33">
     <w:abstractNumId w:val="402"/>
   </w:num>
-  <w:num w:numId="33">
+  <w:num w:numId="36">
     <w:abstractNumId w:val="396"/>
   </w:num>
-  <w:num w:numId="36">
+  <w:num w:numId="39">
     <w:abstractNumId w:val="390"/>
   </w:num>
-  <w:num w:numId="39">
+  <w:num w:numId="42">
     <w:abstractNumId w:val="384"/>
   </w:num>
-  <w:num w:numId="42">
+  <w:num w:numId="46">
     <w:abstractNumId w:val="378"/>
   </w:num>
-  <w:num w:numId="46">
+  <w:num w:numId="49">
     <w:abstractNumId w:val="372"/>
   </w:num>
-  <w:num w:numId="49">
+  <w:num w:numId="52">
     <w:abstractNumId w:val="366"/>
   </w:num>
-  <w:num w:numId="52">
+  <w:num w:numId="55">
     <w:abstractNumId w:val="360"/>
   </w:num>
-  <w:num w:numId="55">
+  <w:num w:numId="57">
     <w:abstractNumId w:val="354"/>
   </w:num>
-  <w:num w:numId="57">
+  <w:num w:numId="59">
     <w:abstractNumId w:val="348"/>
   </w:num>
-  <w:num w:numId="59">
+  <w:num w:numId="62">
     <w:abstractNumId w:val="342"/>
   </w:num>
-  <w:num w:numId="62">
+  <w:num w:numId="65">
     <w:abstractNumId w:val="336"/>
   </w:num>
-  <w:num w:numId="65">
+  <w:num w:numId="68">
     <w:abstractNumId w:val="330"/>
   </w:num>
-  <w:num w:numId="68">
+  <w:num w:numId="71">
     <w:abstractNumId w:val="324"/>
   </w:num>
-  <w:num w:numId="71">
+  <w:num w:numId="74">
     <w:abstractNumId w:val="318"/>
   </w:num>
-  <w:num w:numId="74">
+  <w:num w:numId="77">
     <w:abstractNumId w:val="312"/>
   </w:num>
-  <w:num w:numId="77">
+  <w:num w:numId="80">
     <w:abstractNumId w:val="306"/>
   </w:num>
-  <w:num w:numId="80">
+  <w:num w:numId="83">
     <w:abstractNumId w:val="300"/>
   </w:num>
-  <w:num w:numId="83">
+  <w:num w:numId="86">
     <w:abstractNumId w:val="294"/>
   </w:num>
-  <w:num w:numId="86">
+  <w:num w:numId="88">
     <w:abstractNumId w:val="288"/>
   </w:num>
-  <w:num w:numId="88">
+  <w:num w:numId="91">
     <w:abstractNumId w:val="282"/>
   </w:num>
-  <w:num w:numId="91">
+  <w:num w:numId="94">
     <w:abstractNumId w:val="276"/>
   </w:num>
-  <w:num w:numId="94">
+  <w:num w:numId="97">
     <w:abstractNumId w:val="270"/>
   </w:num>
-  <w:num w:numId="97">
+  <w:num w:numId="99">
     <w:abstractNumId w:val="264"/>
   </w:num>
-  <w:num w:numId="99">
+  <w:num w:numId="101">
     <w:abstractNumId w:val="258"/>
   </w:num>
-  <w:num w:numId="101">
+  <w:num w:numId="103">
     <w:abstractNumId w:val="252"/>
   </w:num>
-  <w:num w:numId="103">
+  <w:num w:numId="106">
     <w:abstractNumId w:val="246"/>
   </w:num>
-  <w:num w:numId="106">
+  <w:num w:numId="108">
     <w:abstractNumId w:val="240"/>
   </w:num>
-  <w:num w:numId="108">
+  <w:num w:numId="110">
     <w:abstractNumId w:val="234"/>
   </w:num>
-  <w:num w:numId="110">
+  <w:num w:numId="112">
     <w:abstractNumId w:val="228"/>
   </w:num>
-  <w:num w:numId="112">
+  <w:num w:numId="115">
     <w:abstractNumId w:val="222"/>
   </w:num>
-  <w:num w:numId="115">
+  <w:num w:numId="118">
     <w:abstractNumId w:val="216"/>
   </w:num>
-  <w:num w:numId="118">
+  <w:num w:numId="121">
     <w:abstractNumId w:val="210"/>
   </w:num>
-  <w:num w:numId="121">
+  <w:num w:numId="124">
     <w:abstractNumId w:val="204"/>
   </w:num>
-  <w:num w:numId="124">
+  <w:num w:numId="127">
     <w:abstractNumId w:val="198"/>
   </w:num>
-  <w:num w:numId="127">
+  <w:num w:numId="130">
     <w:abstractNumId w:val="192"/>
   </w:num>
-  <w:num w:numId="130">
+  <w:num w:numId="133">
     <w:abstractNumId w:val="186"/>
   </w:num>
-  <w:num w:numId="133">
+  <w:num w:numId="136">
     <w:abstractNumId w:val="180"/>
   </w:num>
-  <w:num w:numId="136">
+  <w:num w:numId="138">
     <w:abstractNumId w:val="174"/>
   </w:num>
-  <w:num w:numId="138">
+  <w:num w:numId="140">
     <w:abstractNumId w:val="168"/>
   </w:num>
-  <w:num w:numId="140">
+  <w:num w:numId="142">
     <w:abstractNumId w:val="162"/>
   </w:num>
-  <w:num w:numId="142">
+  <w:num w:numId="144">
     <w:abstractNumId w:val="156"/>
   </w:num>
-  <w:num w:numId="144">
+  <w:num w:numId="146">
     <w:abstractNumId w:val="150"/>
   </w:num>
-  <w:num w:numId="146">
+  <w:num w:numId="148">
     <w:abstractNumId w:val="144"/>
-  </w:num>
-  <w:num w:numId="148">
-    <w:abstractNumId w:val="138"/>
   </w:num>
   <w:num w:numId="149">
     <w:abstractNumId w:val="13"/>
   </w:num>
   <w:num w:numId="151">
+    <w:abstractNumId w:val="138"/>
+  </w:num>
+  <w:num w:numId="153">
     <w:abstractNumId w:val="132"/>
   </w:num>
-  <w:num w:numId="153">
+  <w:num w:numId="155">
     <w:abstractNumId w:val="126"/>
   </w:num>
-  <w:num w:numId="155">
+  <w:num w:numId="157">
     <w:abstractNumId w:val="120"/>
   </w:num>
-  <w:num w:numId="157">
+  <w:num w:numId="159">
     <w:abstractNumId w:val="114"/>
   </w:num>
-  <w:num w:numId="159">
+  <w:num w:numId="161">
     <w:abstractNumId w:val="108"/>
   </w:num>
-  <w:num w:numId="161">
+  <w:num w:numId="163">
     <w:abstractNumId w:val="102"/>
   </w:num>
-  <w:num w:numId="163">
+  <w:num w:numId="165">
     <w:abstractNumId w:val="96"/>
   </w:num>
-  <w:num w:numId="165">
+  <w:num w:numId="167">
     <w:abstractNumId w:val="90"/>
   </w:num>
-  <w:num w:numId="167">
+  <w:num w:numId="169">
     <w:abstractNumId w:val="84"/>
   </w:num>
-  <w:num w:numId="169">
+  <w:num w:numId="171">
     <w:abstractNumId w:val="78"/>
   </w:num>
-  <w:num w:numId="171">
+  <w:num w:numId="173">
     <w:abstractNumId w:val="72"/>
   </w:num>
-  <w:num w:numId="173">
+  <w:num w:numId="175">
     <w:abstractNumId w:val="66"/>
   </w:num>
-  <w:num w:numId="175">
+  <w:num w:numId="177">
     <w:abstractNumId w:val="60"/>
-  </w:num>
-  <w:num w:numId="177">
-    <w:abstractNumId w:val="54"/>
   </w:num>
   <w:num w:numId="179">
     <w:abstractNumId w:val="7"/>
@@ -13430,30 +13555,33 @@
     <w:abstractNumId w:val="1"/>
   </w:num>
   <w:num w:numId="183">
+    <w:abstractNumId w:val="54"/>
+  </w:num>
+  <w:num w:numId="185">
     <w:abstractNumId w:val="48"/>
   </w:num>
-  <w:num w:numId="185">
+  <w:num w:numId="187">
     <w:abstractNumId w:val="42"/>
   </w:num>
-  <w:num w:numId="187">
+  <w:num w:numId="189">
     <w:abstractNumId w:val="36"/>
   </w:num>
-  <w:num w:numId="189">
+  <w:num w:numId="191">
     <w:abstractNumId w:val="30"/>
   </w:num>
-  <w:num w:numId="191">
+  <w:num w:numId="193">
     <w:abstractNumId w:val="24"/>
   </w:num>
-  <w:num w:numId="193">
+  <w:num w:numId="195">
     <w:abstractNumId w:val="18"/>
   </w:num>
-  <w:num w:numId="195">
+  <w:num w:numId="197">
     <w:abstractNumId w:val="12"/>
   </w:num>
-  <w:num w:numId="197">
+  <w:num w:numId="199">
     <w:abstractNumId w:val="6"/>
   </w:num>
-  <w:num w:numId="199">
+  <w:num w:numId="202">
     <w:abstractNumId w:val="0"/>
   </w:num>
 </w:numbering>

</xml_diff>

<commit_message>
Sessions in ASP.NET Core MVC
</commit_message>
<xml_diff>
--- a/Asp.Net Core Notes.docx
+++ b/Asp.Net Core Notes.docx
@@ -11967,6 +11967,94 @@
           <w:shd w:fill="auto" w:val="clear"/>
         </w:rPr>
       </w:pPr>
+    </w:p>
+    <w:p>
+      <w:pPr>
+        <w:spacing w:before="0" w:after="60" w:line="240"/>
+        <w:ind w:right="0" w:left="0" w:firstLine="0"/>
+        <w:jc w:val="left"/>
+        <w:rPr>
+          <w:rFonts w:ascii="Cascadia Code" w:hAnsi="Cascadia Code" w:cs="Cascadia Code" w:eastAsia="Cascadia Code"/>
+          <w:b/>
+          <w:color w:val="auto"/>
+          <w:spacing w:val="0"/>
+          <w:position w:val="0"/>
+          <w:sz w:val="20"/>
+          <w:shd w:fill="auto" w:val="clear"/>
+        </w:rPr>
+      </w:pPr>
+      <w:r>
+        <w:rPr>
+          <w:rFonts w:ascii="Cascadia Code" w:hAnsi="Cascadia Code" w:cs="Cascadia Code" w:eastAsia="Cascadia Code"/>
+          <w:b/>
+          <w:color w:val="auto"/>
+          <w:spacing w:val="0"/>
+          <w:position w:val="0"/>
+          <w:sz w:val="20"/>
+          <w:shd w:fill="auto" w:val="clear"/>
+        </w:rPr>
+        <w:t xml:space="preserve">Lecture :- ( Sessions in ASP.NET Core MVC )</w:t>
+      </w:r>
+    </w:p>
+    <w:p>
+      <w:pPr>
+        <w:numPr>
+          <w:ilvl w:val="0"/>
+          <w:numId w:val="204"/>
+        </w:numPr>
+        <w:spacing w:before="0" w:after="60" w:line="240"/>
+        <w:ind w:right="0" w:left="720" w:hanging="360"/>
+        <w:jc w:val="left"/>
+        <w:rPr>
+          <w:rFonts w:ascii="Cascadia Code" w:hAnsi="Cascadia Code" w:cs="Cascadia Code" w:eastAsia="Cascadia Code"/>
+          <w:color w:val="auto"/>
+          <w:spacing w:val="0"/>
+          <w:position w:val="0"/>
+          <w:sz w:val="20"/>
+          <w:shd w:fill="auto" w:val="clear"/>
+        </w:rPr>
+      </w:pPr>
+      <w:r>
+        <w:rPr>
+          <w:rFonts w:ascii="Cascadia Code" w:hAnsi="Cascadia Code" w:cs="Cascadia Code" w:eastAsia="Cascadia Code"/>
+          <w:color w:val="auto"/>
+          <w:spacing w:val="0"/>
+          <w:position w:val="0"/>
+          <w:sz w:val="20"/>
+          <w:shd w:fill="auto" w:val="clear"/>
+        </w:rPr>
+        <w:t xml:space="preserve">A server side mechanism used to store user-specific data across multiple request</w:t>
+      </w:r>
+    </w:p>
+    <w:p>
+      <w:pPr>
+        <w:numPr>
+          <w:ilvl w:val="0"/>
+          <w:numId w:val="204"/>
+        </w:numPr>
+        <w:spacing w:before="0" w:after="60" w:line="240"/>
+        <w:ind w:right="0" w:left="720" w:hanging="360"/>
+        <w:jc w:val="left"/>
+        <w:rPr>
+          <w:rFonts w:ascii="Cascadia Code" w:hAnsi="Cascadia Code" w:cs="Cascadia Code" w:eastAsia="Cascadia Code"/>
+          <w:color w:val="auto"/>
+          <w:spacing w:val="0"/>
+          <w:position w:val="0"/>
+          <w:sz w:val="20"/>
+          <w:shd w:fill="auto" w:val="clear"/>
+        </w:rPr>
+      </w:pPr>
+      <w:r>
+        <w:rPr>
+          <w:rFonts w:ascii="Cascadia Code" w:hAnsi="Cascadia Code" w:cs="Cascadia Code" w:eastAsia="Cascadia Code"/>
+          <w:color w:val="auto"/>
+          <w:spacing w:val="0"/>
+          <w:position w:val="0"/>
+          <w:sz w:val="20"/>
+          <w:shd w:fill="auto" w:val="clear"/>
+        </w:rPr>
+        <w:t xml:space="preserve">Session data remains on server not in browser</w:t>
+      </w:r>
     </w:p>
     <w:p>
       <w:pPr>
@@ -13344,209 +13432,216 @@
       <w:lvlText w:val="•"/>
     </w:lvl>
   </w:abstractNum>
+  <w:abstractNum w:abstractNumId="462">
+    <w:lvl w:ilvl="0">
+      <w:start w:val="1"/>
+      <w:numFmt w:val="bullet"/>
+      <w:lvlText w:val="•"/>
+    </w:lvl>
+  </w:abstractNum>
   <w:num w:numId="2">
+    <w:abstractNumId w:val="462"/>
+  </w:num>
+  <w:num w:numId="5">
     <w:abstractNumId w:val="456"/>
   </w:num>
-  <w:num w:numId="5">
+  <w:num w:numId="8">
     <w:abstractNumId w:val="450"/>
   </w:num>
-  <w:num w:numId="8">
+  <w:num w:numId="10">
     <w:abstractNumId w:val="444"/>
   </w:num>
-  <w:num w:numId="10">
+  <w:num w:numId="13">
     <w:abstractNumId w:val="438"/>
   </w:num>
-  <w:num w:numId="13">
+  <w:num w:numId="19">
     <w:abstractNumId w:val="432"/>
   </w:num>
-  <w:num w:numId="19">
+  <w:num w:numId="22">
     <w:abstractNumId w:val="426"/>
   </w:num>
-  <w:num w:numId="22">
+  <w:num w:numId="25">
     <w:abstractNumId w:val="420"/>
   </w:num>
-  <w:num w:numId="25">
+  <w:num w:numId="30">
     <w:abstractNumId w:val="414"/>
   </w:num>
-  <w:num w:numId="30">
+  <w:num w:numId="33">
     <w:abstractNumId w:val="408"/>
   </w:num>
-  <w:num w:numId="33">
+  <w:num w:numId="36">
     <w:abstractNumId w:val="402"/>
   </w:num>
-  <w:num w:numId="36">
+  <w:num w:numId="39">
     <w:abstractNumId w:val="396"/>
   </w:num>
-  <w:num w:numId="39">
+  <w:num w:numId="42">
     <w:abstractNumId w:val="390"/>
   </w:num>
-  <w:num w:numId="42">
+  <w:num w:numId="46">
     <w:abstractNumId w:val="384"/>
   </w:num>
-  <w:num w:numId="46">
+  <w:num w:numId="49">
     <w:abstractNumId w:val="378"/>
   </w:num>
-  <w:num w:numId="49">
+  <w:num w:numId="52">
     <w:abstractNumId w:val="372"/>
   </w:num>
-  <w:num w:numId="52">
+  <w:num w:numId="55">
     <w:abstractNumId w:val="366"/>
   </w:num>
-  <w:num w:numId="55">
+  <w:num w:numId="57">
     <w:abstractNumId w:val="360"/>
   </w:num>
-  <w:num w:numId="57">
+  <w:num w:numId="59">
     <w:abstractNumId w:val="354"/>
   </w:num>
-  <w:num w:numId="59">
+  <w:num w:numId="62">
     <w:abstractNumId w:val="348"/>
   </w:num>
-  <w:num w:numId="62">
+  <w:num w:numId="65">
     <w:abstractNumId w:val="342"/>
   </w:num>
-  <w:num w:numId="65">
+  <w:num w:numId="68">
     <w:abstractNumId w:val="336"/>
   </w:num>
-  <w:num w:numId="68">
+  <w:num w:numId="71">
     <w:abstractNumId w:val="330"/>
   </w:num>
-  <w:num w:numId="71">
+  <w:num w:numId="74">
     <w:abstractNumId w:val="324"/>
   </w:num>
-  <w:num w:numId="74">
+  <w:num w:numId="77">
     <w:abstractNumId w:val="318"/>
   </w:num>
-  <w:num w:numId="77">
+  <w:num w:numId="80">
     <w:abstractNumId w:val="312"/>
   </w:num>
-  <w:num w:numId="80">
+  <w:num w:numId="83">
     <w:abstractNumId w:val="306"/>
   </w:num>
-  <w:num w:numId="83">
+  <w:num w:numId="86">
     <w:abstractNumId w:val="300"/>
   </w:num>
-  <w:num w:numId="86">
+  <w:num w:numId="88">
     <w:abstractNumId w:val="294"/>
   </w:num>
-  <w:num w:numId="88">
+  <w:num w:numId="91">
     <w:abstractNumId w:val="288"/>
   </w:num>
-  <w:num w:numId="91">
+  <w:num w:numId="94">
     <w:abstractNumId w:val="282"/>
   </w:num>
-  <w:num w:numId="94">
+  <w:num w:numId="97">
     <w:abstractNumId w:val="276"/>
   </w:num>
-  <w:num w:numId="97">
+  <w:num w:numId="99">
     <w:abstractNumId w:val="270"/>
   </w:num>
-  <w:num w:numId="99">
+  <w:num w:numId="101">
     <w:abstractNumId w:val="264"/>
   </w:num>
-  <w:num w:numId="101">
+  <w:num w:numId="103">
     <w:abstractNumId w:val="258"/>
   </w:num>
-  <w:num w:numId="103">
+  <w:num w:numId="106">
     <w:abstractNumId w:val="252"/>
   </w:num>
-  <w:num w:numId="106">
+  <w:num w:numId="108">
     <w:abstractNumId w:val="246"/>
   </w:num>
-  <w:num w:numId="108">
+  <w:num w:numId="110">
     <w:abstractNumId w:val="240"/>
   </w:num>
-  <w:num w:numId="110">
+  <w:num w:numId="112">
     <w:abstractNumId w:val="234"/>
   </w:num>
-  <w:num w:numId="112">
+  <w:num w:numId="115">
     <w:abstractNumId w:val="228"/>
   </w:num>
-  <w:num w:numId="115">
+  <w:num w:numId="118">
     <w:abstractNumId w:val="222"/>
   </w:num>
-  <w:num w:numId="118">
+  <w:num w:numId="121">
     <w:abstractNumId w:val="216"/>
   </w:num>
-  <w:num w:numId="121">
+  <w:num w:numId="124">
     <w:abstractNumId w:val="210"/>
   </w:num>
-  <w:num w:numId="124">
+  <w:num w:numId="127">
     <w:abstractNumId w:val="204"/>
   </w:num>
-  <w:num w:numId="127">
+  <w:num w:numId="130">
     <w:abstractNumId w:val="198"/>
   </w:num>
-  <w:num w:numId="130">
+  <w:num w:numId="133">
     <w:abstractNumId w:val="192"/>
   </w:num>
-  <w:num w:numId="133">
+  <w:num w:numId="136">
     <w:abstractNumId w:val="186"/>
   </w:num>
-  <w:num w:numId="136">
+  <w:num w:numId="138">
     <w:abstractNumId w:val="180"/>
   </w:num>
-  <w:num w:numId="138">
+  <w:num w:numId="140">
     <w:abstractNumId w:val="174"/>
   </w:num>
-  <w:num w:numId="140">
+  <w:num w:numId="142">
     <w:abstractNumId w:val="168"/>
   </w:num>
-  <w:num w:numId="142">
+  <w:num w:numId="144">
     <w:abstractNumId w:val="162"/>
   </w:num>
-  <w:num w:numId="144">
+  <w:num w:numId="146">
     <w:abstractNumId w:val="156"/>
   </w:num>
-  <w:num w:numId="146">
+  <w:num w:numId="148">
     <w:abstractNumId w:val="150"/>
-  </w:num>
-  <w:num w:numId="148">
-    <w:abstractNumId w:val="144"/>
   </w:num>
   <w:num w:numId="149">
     <w:abstractNumId w:val="13"/>
   </w:num>
   <w:num w:numId="151">
+    <w:abstractNumId w:val="144"/>
+  </w:num>
+  <w:num w:numId="153">
     <w:abstractNumId w:val="138"/>
   </w:num>
-  <w:num w:numId="153">
+  <w:num w:numId="155">
     <w:abstractNumId w:val="132"/>
   </w:num>
-  <w:num w:numId="155">
+  <w:num w:numId="157">
     <w:abstractNumId w:val="126"/>
   </w:num>
-  <w:num w:numId="157">
+  <w:num w:numId="159">
     <w:abstractNumId w:val="120"/>
   </w:num>
-  <w:num w:numId="159">
+  <w:num w:numId="161">
     <w:abstractNumId w:val="114"/>
   </w:num>
-  <w:num w:numId="161">
+  <w:num w:numId="163">
     <w:abstractNumId w:val="108"/>
   </w:num>
-  <w:num w:numId="163">
+  <w:num w:numId="165">
     <w:abstractNumId w:val="102"/>
   </w:num>
-  <w:num w:numId="165">
+  <w:num w:numId="167">
     <w:abstractNumId w:val="96"/>
   </w:num>
-  <w:num w:numId="167">
+  <w:num w:numId="169">
     <w:abstractNumId w:val="90"/>
   </w:num>
-  <w:num w:numId="169">
+  <w:num w:numId="171">
     <w:abstractNumId w:val="84"/>
   </w:num>
-  <w:num w:numId="171">
+  <w:num w:numId="173">
     <w:abstractNumId w:val="78"/>
   </w:num>
-  <w:num w:numId="173">
+  <w:num w:numId="175">
     <w:abstractNumId w:val="72"/>
   </w:num>
-  <w:num w:numId="175">
+  <w:num w:numId="177">
     <w:abstractNumId w:val="66"/>
-  </w:num>
-  <w:num w:numId="177">
-    <w:abstractNumId w:val="60"/>
   </w:num>
   <w:num w:numId="179">
     <w:abstractNumId w:val="7"/>
@@ -13555,33 +13650,36 @@
     <w:abstractNumId w:val="1"/>
   </w:num>
   <w:num w:numId="183">
+    <w:abstractNumId w:val="60"/>
+  </w:num>
+  <w:num w:numId="185">
     <w:abstractNumId w:val="54"/>
   </w:num>
-  <w:num w:numId="185">
+  <w:num w:numId="187">
     <w:abstractNumId w:val="48"/>
   </w:num>
-  <w:num w:numId="187">
+  <w:num w:numId="189">
     <w:abstractNumId w:val="42"/>
   </w:num>
-  <w:num w:numId="189">
+  <w:num w:numId="191">
     <w:abstractNumId w:val="36"/>
   </w:num>
-  <w:num w:numId="191">
+  <w:num w:numId="193">
     <w:abstractNumId w:val="30"/>
   </w:num>
-  <w:num w:numId="193">
+  <w:num w:numId="195">
     <w:abstractNumId w:val="24"/>
   </w:num>
-  <w:num w:numId="195">
+  <w:num w:numId="197">
     <w:abstractNumId w:val="18"/>
   </w:num>
-  <w:num w:numId="197">
+  <w:num w:numId="199">
     <w:abstractNumId w:val="12"/>
   </w:num>
-  <w:num w:numId="199">
+  <w:num w:numId="202">
     <w:abstractNumId w:val="6"/>
   </w:num>
-  <w:num w:numId="202">
+  <w:num w:numId="204">
     <w:abstractNumId w:val="0"/>
   </w:num>
 </w:numbering>

</xml_diff>

<commit_message>
FluentAPI in ASP.NET Core MVC
</commit_message>
<xml_diff>
--- a/Asp.Net Core Notes.docx
+++ b/Asp.Net Core Notes.docx
@@ -7240,8 +7240,8 @@
         </w:rPr>
       </w:pPr>
       <w:r>
-        <w:object w:dxaOrig="8888" w:dyaOrig="3725">
-          <v:rect xmlns:o="urn:schemas-microsoft-com:office:office" xmlns:v="urn:schemas-microsoft-com:vml" id="rectole0000000000" style="width:444.400000pt;height:186.250000pt" o:preferrelative="t" o:ole="">
+        <w:object w:dxaOrig="8989" w:dyaOrig="3766">
+          <v:rect xmlns:o="urn:schemas-microsoft-com:office:office" xmlns:v="urn:schemas-microsoft-com:vml" id="rectole0000000000" style="width:449.450000pt;height:188.300000pt" o:preferrelative="t" o:ole="">
             <o:lock v:ext="edit"/>
             <v:imagedata xmlns:r="http://schemas.openxmlformats.org/officeDocument/2006/relationships" r:id="docRId1" o:title=""/>
           </v:rect>
@@ -7549,8 +7549,8 @@
         </w:rPr>
       </w:pPr>
       <w:r>
-        <w:object w:dxaOrig="8503" w:dyaOrig="9739">
-          <v:rect xmlns:o="urn:schemas-microsoft-com:office:office" xmlns:v="urn:schemas-microsoft-com:vml" id="rectole0000000001" style="width:425.150000pt;height:486.950000pt" o:preferrelative="t" o:ole="">
+        <w:object w:dxaOrig="8605" w:dyaOrig="9860">
+          <v:rect xmlns:o="urn:schemas-microsoft-com:office:office" xmlns:v="urn:schemas-microsoft-com:vml" id="rectole0000000001" style="width:430.250000pt;height:493.000000pt" o:preferrelative="t" o:ole="">
             <o:lock v:ext="edit"/>
             <v:imagedata xmlns:r="http://schemas.openxmlformats.org/officeDocument/2006/relationships" r:id="docRId3" o:title=""/>
           </v:rect>
@@ -10232,8 +10232,8 @@
         </w:rPr>
       </w:pPr>
       <w:r>
-        <w:object w:dxaOrig="8848" w:dyaOrig="4353">
-          <v:rect xmlns:o="urn:schemas-microsoft-com:office:office" xmlns:v="urn:schemas-microsoft-com:vml" id="rectole0000000002" style="width:442.400000pt;height:217.650000pt" o:preferrelative="t" o:ole="">
+        <w:object w:dxaOrig="8949" w:dyaOrig="4414">
+          <v:rect xmlns:o="urn:schemas-microsoft-com:office:office" xmlns:v="urn:schemas-microsoft-com:vml" id="rectole0000000002" style="width:447.450000pt;height:220.700000pt" o:preferrelative="t" o:ole="">
             <o:lock v:ext="edit"/>
             <v:imagedata xmlns:r="http://schemas.openxmlformats.org/officeDocument/2006/relationships" r:id="docRId5" o:title=""/>
           </v:rect>
@@ -12095,23 +12095,240 @@
           <w:sz w:val="20"/>
           <w:shd w:fill="auto" w:val="clear"/>
         </w:rPr>
-        <w:t xml:space="preserve">Lecture :- ( Filters in ASP.NET Core MVC )</w:t>
-      </w:r>
-    </w:p>
-    <w:p>
-      <w:pPr>
-        <w:spacing w:before="0" w:after="60" w:line="240"/>
-        <w:ind w:right="0" w:left="0" w:firstLine="0"/>
-        <w:jc w:val="left"/>
-        <w:rPr>
-          <w:rFonts w:ascii="Cascadia Code" w:hAnsi="Cascadia Code" w:cs="Cascadia Code" w:eastAsia="Cascadia Code"/>
-          <w:color w:val="auto"/>
-          <w:spacing w:val="0"/>
-          <w:position w:val="0"/>
-          <w:sz w:val="20"/>
-          <w:shd w:fill="auto" w:val="clear"/>
-        </w:rPr>
-      </w:pPr>
+        <w:t xml:space="preserve">Lecture :- ( FluentAPI in ASP.NET Core MVC )</w:t>
+      </w:r>
+    </w:p>
+    <w:p>
+      <w:pPr>
+        <w:numPr>
+          <w:ilvl w:val="0"/>
+          <w:numId w:val="205"/>
+        </w:numPr>
+        <w:spacing w:before="0" w:after="60" w:line="240"/>
+        <w:ind w:right="0" w:left="720" w:hanging="360"/>
+        <w:jc w:val="left"/>
+        <w:rPr>
+          <w:rFonts w:ascii="Cascadia Code" w:hAnsi="Cascadia Code" w:cs="Cascadia Code" w:eastAsia="Cascadia Code"/>
+          <w:color w:val="auto"/>
+          <w:spacing w:val="0"/>
+          <w:position w:val="0"/>
+          <w:sz w:val="20"/>
+          <w:shd w:fill="auto" w:val="clear"/>
+        </w:rPr>
+      </w:pPr>
+      <w:r>
+        <w:rPr>
+          <w:rFonts w:ascii="Cascadia Code" w:hAnsi="Cascadia Code" w:cs="Cascadia Code" w:eastAsia="Cascadia Code"/>
+          <w:color w:val="auto"/>
+          <w:spacing w:val="0"/>
+          <w:position w:val="0"/>
+          <w:sz w:val="20"/>
+          <w:shd w:fill="auto" w:val="clear"/>
+        </w:rPr>
+        <w:t xml:space="preserve">Its a way of configuring entities &amp; database relationships using C# code inside the dbcontext class instead of data annotation</w:t>
+      </w:r>
+    </w:p>
+    <w:p>
+      <w:pPr>
+        <w:numPr>
+          <w:ilvl w:val="0"/>
+          <w:numId w:val="205"/>
+        </w:numPr>
+        <w:spacing w:before="0" w:after="60" w:line="240"/>
+        <w:ind w:right="0" w:left="720" w:hanging="360"/>
+        <w:jc w:val="left"/>
+        <w:rPr>
+          <w:rFonts w:ascii="Cascadia Code" w:hAnsi="Cascadia Code" w:cs="Cascadia Code" w:eastAsia="Cascadia Code"/>
+          <w:color w:val="auto"/>
+          <w:spacing w:val="0"/>
+          <w:position w:val="0"/>
+          <w:sz w:val="20"/>
+          <w:shd w:fill="auto" w:val="clear"/>
+        </w:rPr>
+      </w:pPr>
+      <w:r>
+        <w:rPr>
+          <w:rFonts w:ascii="Cascadia Code" w:hAnsi="Cascadia Code" w:cs="Cascadia Code" w:eastAsia="Cascadia Code"/>
+          <w:color w:val="auto"/>
+          <w:spacing w:val="0"/>
+          <w:position w:val="0"/>
+          <w:sz w:val="20"/>
+          <w:shd w:fill="auto" w:val="clear"/>
+        </w:rPr>
+        <w:t xml:space="preserve">Data Annotation have limitations and not everything can be configured using attributes</w:t>
+      </w:r>
+    </w:p>
+    <w:p>
+      <w:pPr>
+        <w:numPr>
+          <w:ilvl w:val="0"/>
+          <w:numId w:val="205"/>
+        </w:numPr>
+        <w:spacing w:before="0" w:after="60" w:line="240"/>
+        <w:ind w:right="0" w:left="720" w:hanging="360"/>
+        <w:jc w:val="left"/>
+        <w:rPr>
+          <w:rFonts w:ascii="Cascadia Code" w:hAnsi="Cascadia Code" w:cs="Cascadia Code" w:eastAsia="Cascadia Code"/>
+          <w:color w:val="auto"/>
+          <w:spacing w:val="0"/>
+          <w:position w:val="0"/>
+          <w:sz w:val="20"/>
+          <w:shd w:fill="auto" w:val="clear"/>
+        </w:rPr>
+      </w:pPr>
+      <w:r>
+        <w:rPr>
+          <w:rFonts w:ascii="Cascadia Code" w:hAnsi="Cascadia Code" w:cs="Cascadia Code" w:eastAsia="Cascadia Code"/>
+          <w:color w:val="auto"/>
+          <w:spacing w:val="0"/>
+          <w:position w:val="0"/>
+          <w:sz w:val="20"/>
+          <w:shd w:fill="auto" w:val="clear"/>
+        </w:rPr>
+        <w:t xml:space="preserve">Its written in dbcontext file specially inside onmodelcreationg method</w:t>
+      </w:r>
+    </w:p>
+    <w:p>
+      <w:pPr>
+        <w:numPr>
+          <w:ilvl w:val="0"/>
+          <w:numId w:val="205"/>
+        </w:numPr>
+        <w:spacing w:before="0" w:after="60" w:line="240"/>
+        <w:ind w:right="0" w:left="720" w:hanging="360"/>
+        <w:jc w:val="left"/>
+        <w:rPr>
+          <w:rFonts w:ascii="Cascadia Code" w:hAnsi="Cascadia Code" w:cs="Cascadia Code" w:eastAsia="Cascadia Code"/>
+          <w:color w:val="auto"/>
+          <w:spacing w:val="0"/>
+          <w:position w:val="0"/>
+          <w:sz w:val="20"/>
+          <w:shd w:fill="auto" w:val="clear"/>
+        </w:rPr>
+      </w:pPr>
+      <w:r>
+        <w:rPr>
+          <w:rFonts w:ascii="Cascadia Code" w:hAnsi="Cascadia Code" w:cs="Cascadia Code" w:eastAsia="Cascadia Code"/>
+          <w:color w:val="auto"/>
+          <w:spacing w:val="0"/>
+          <w:position w:val="0"/>
+          <w:sz w:val="20"/>
+          <w:shd w:fill="auto" w:val="clear"/>
+        </w:rPr>
+        <w:t xml:space="preserve">Mjority times in fluent api we use has with configuration whatever we required</w:t>
+      </w:r>
+    </w:p>
+    <w:p>
+      <w:pPr>
+        <w:numPr>
+          <w:ilvl w:val="0"/>
+          <w:numId w:val="205"/>
+        </w:numPr>
+        <w:spacing w:before="0" w:after="60" w:line="240"/>
+        <w:ind w:right="0" w:left="720" w:hanging="360"/>
+        <w:jc w:val="left"/>
+        <w:rPr>
+          <w:rFonts w:ascii="Cascadia Code" w:hAnsi="Cascadia Code" w:cs="Cascadia Code" w:eastAsia="Cascadia Code"/>
+          <w:color w:val="auto"/>
+          <w:spacing w:val="0"/>
+          <w:position w:val="0"/>
+          <w:sz w:val="20"/>
+          <w:shd w:fill="auto" w:val="clear"/>
+        </w:rPr>
+      </w:pPr>
+      <w:r>
+        <w:rPr>
+          <w:rFonts w:ascii="Cascadia Code" w:hAnsi="Cascadia Code" w:cs="Cascadia Code" w:eastAsia="Cascadia Code"/>
+          <w:color w:val="auto"/>
+          <w:spacing w:val="0"/>
+          <w:position w:val="0"/>
+          <w:sz w:val="20"/>
+          <w:shd w:fill="auto" w:val="clear"/>
+        </w:rPr>
+        <w:t xml:space="preserve">We ca create different configuration class then call something like this and majority times we use this in real projects in same way</w:t>
+      </w:r>
+    </w:p>
+    <w:p>
+      <w:pPr>
+        <w:spacing w:before="0" w:after="60" w:line="240"/>
+        <w:ind w:right="0" w:left="0" w:firstLine="0"/>
+        <w:jc w:val="left"/>
+        <w:rPr>
+          <w:rFonts w:ascii="Cascadia Code" w:hAnsi="Cascadia Code" w:cs="Cascadia Code" w:eastAsia="Cascadia Code"/>
+          <w:color w:val="auto"/>
+          <w:spacing w:val="0"/>
+          <w:position w:val="0"/>
+          <w:sz w:val="20"/>
+          <w:shd w:fill="auto" w:val="clear"/>
+        </w:rPr>
+      </w:pPr>
+      <w:r>
+        <w:rPr>
+          <w:rFonts w:ascii="Cascadia Code" w:hAnsi="Cascadia Code" w:cs="Cascadia Code" w:eastAsia="Cascadia Code"/>
+          <w:color w:val="auto"/>
+          <w:spacing w:val="0"/>
+          <w:position w:val="0"/>
+          <w:sz w:val="20"/>
+          <w:shd w:fill="auto" w:val="clear"/>
+        </w:rPr>
+        <w:t xml:space="preserve">modelBuilder.ApplyConfiguration(</w:t>
+      </w:r>
+    </w:p>
+    <w:p>
+      <w:pPr>
+        <w:spacing w:before="0" w:after="60" w:line="240"/>
+        <w:ind w:right="0" w:left="0" w:firstLine="0"/>
+        <w:jc w:val="left"/>
+        <w:rPr>
+          <w:rFonts w:ascii="Cascadia Code" w:hAnsi="Cascadia Code" w:cs="Cascadia Code" w:eastAsia="Cascadia Code"/>
+          <w:color w:val="auto"/>
+          <w:spacing w:val="0"/>
+          <w:position w:val="0"/>
+          <w:sz w:val="20"/>
+          <w:shd w:fill="auto" w:val="clear"/>
+        </w:rPr>
+      </w:pPr>
+      <w:r>
+        <w:rPr>
+          <w:rFonts w:ascii="Cascadia Code" w:hAnsi="Cascadia Code" w:cs="Cascadia Code" w:eastAsia="Cascadia Code"/>
+          <w:color w:val="auto"/>
+          <w:spacing w:val="0"/>
+          <w:position w:val="0"/>
+          <w:sz w:val="20"/>
+          <w:shd w:fill="auto" w:val="clear"/>
+        </w:rPr>
+        <w:t xml:space="preserve">        new EmployeeConfiguration());</w:t>
+      </w:r>
+    </w:p>
+    <w:p>
+      <w:pPr>
+        <w:numPr>
+          <w:ilvl w:val="0"/>
+          <w:numId w:val="207"/>
+        </w:numPr>
+        <w:spacing w:before="0" w:after="60" w:line="240"/>
+        <w:ind w:right="0" w:left="720" w:hanging="360"/>
+        <w:jc w:val="left"/>
+        <w:rPr>
+          <w:rFonts w:ascii="Cascadia Code" w:hAnsi="Cascadia Code" w:cs="Cascadia Code" w:eastAsia="Cascadia Code"/>
+          <w:color w:val="auto"/>
+          <w:spacing w:val="0"/>
+          <w:position w:val="0"/>
+          <w:sz w:val="20"/>
+          <w:shd w:fill="auto" w:val="clear"/>
+        </w:rPr>
+      </w:pPr>
+      <w:r>
+        <w:rPr>
+          <w:rFonts w:ascii="Cascadia Code" w:hAnsi="Cascadia Code" w:cs="Cascadia Code" w:eastAsia="Cascadia Code"/>
+          <w:color w:val="auto"/>
+          <w:spacing w:val="0"/>
+          <w:position w:val="0"/>
+          <w:sz w:val="20"/>
+          <w:shd w:fill="auto" w:val="clear"/>
+        </w:rPr>
+        <w:t xml:space="preserve">Fluent API overrides data annotation</w:t>
+      </w:r>
     </w:p>
     <w:p>
       <w:pPr>
@@ -13481,209 +13698,223 @@
       <w:lvlText w:val="•"/>
     </w:lvl>
   </w:abstractNum>
+  <w:abstractNum w:abstractNumId="468">
+    <w:lvl w:ilvl="0">
+      <w:start w:val="1"/>
+      <w:numFmt w:val="bullet"/>
+      <w:lvlText w:val="•"/>
+    </w:lvl>
+  </w:abstractNum>
+  <w:abstractNum w:abstractNumId="474">
+    <w:lvl w:ilvl="0">
+      <w:start w:val="1"/>
+      <w:numFmt w:val="bullet"/>
+      <w:lvlText w:val="•"/>
+    </w:lvl>
+  </w:abstractNum>
   <w:num w:numId="2">
+    <w:abstractNumId w:val="474"/>
+  </w:num>
+  <w:num w:numId="5">
+    <w:abstractNumId w:val="468"/>
+  </w:num>
+  <w:num w:numId="8">
     <w:abstractNumId w:val="462"/>
   </w:num>
-  <w:num w:numId="5">
+  <w:num w:numId="10">
     <w:abstractNumId w:val="456"/>
   </w:num>
-  <w:num w:numId="8">
+  <w:num w:numId="13">
     <w:abstractNumId w:val="450"/>
   </w:num>
-  <w:num w:numId="10">
+  <w:num w:numId="19">
     <w:abstractNumId w:val="444"/>
   </w:num>
-  <w:num w:numId="13">
+  <w:num w:numId="22">
     <w:abstractNumId w:val="438"/>
   </w:num>
-  <w:num w:numId="19">
+  <w:num w:numId="25">
     <w:abstractNumId w:val="432"/>
   </w:num>
-  <w:num w:numId="22">
+  <w:num w:numId="30">
     <w:abstractNumId w:val="426"/>
   </w:num>
-  <w:num w:numId="25">
+  <w:num w:numId="33">
     <w:abstractNumId w:val="420"/>
   </w:num>
-  <w:num w:numId="30">
+  <w:num w:numId="36">
     <w:abstractNumId w:val="414"/>
   </w:num>
-  <w:num w:numId="33">
+  <w:num w:numId="39">
     <w:abstractNumId w:val="408"/>
   </w:num>
-  <w:num w:numId="36">
+  <w:num w:numId="42">
     <w:abstractNumId w:val="402"/>
   </w:num>
-  <w:num w:numId="39">
+  <w:num w:numId="46">
     <w:abstractNumId w:val="396"/>
   </w:num>
-  <w:num w:numId="42">
+  <w:num w:numId="49">
     <w:abstractNumId w:val="390"/>
   </w:num>
-  <w:num w:numId="46">
+  <w:num w:numId="52">
     <w:abstractNumId w:val="384"/>
   </w:num>
-  <w:num w:numId="49">
+  <w:num w:numId="55">
     <w:abstractNumId w:val="378"/>
   </w:num>
-  <w:num w:numId="52">
+  <w:num w:numId="57">
     <w:abstractNumId w:val="372"/>
   </w:num>
-  <w:num w:numId="55">
+  <w:num w:numId="59">
     <w:abstractNumId w:val="366"/>
   </w:num>
-  <w:num w:numId="57">
+  <w:num w:numId="62">
     <w:abstractNumId w:val="360"/>
   </w:num>
-  <w:num w:numId="59">
+  <w:num w:numId="65">
     <w:abstractNumId w:val="354"/>
   </w:num>
-  <w:num w:numId="62">
+  <w:num w:numId="68">
     <w:abstractNumId w:val="348"/>
   </w:num>
-  <w:num w:numId="65">
+  <w:num w:numId="71">
     <w:abstractNumId w:val="342"/>
   </w:num>
-  <w:num w:numId="68">
+  <w:num w:numId="74">
     <w:abstractNumId w:val="336"/>
   </w:num>
-  <w:num w:numId="71">
+  <w:num w:numId="77">
     <w:abstractNumId w:val="330"/>
   </w:num>
-  <w:num w:numId="74">
+  <w:num w:numId="80">
     <w:abstractNumId w:val="324"/>
   </w:num>
-  <w:num w:numId="77">
+  <w:num w:numId="83">
     <w:abstractNumId w:val="318"/>
   </w:num>
-  <w:num w:numId="80">
+  <w:num w:numId="86">
     <w:abstractNumId w:val="312"/>
   </w:num>
-  <w:num w:numId="83">
+  <w:num w:numId="88">
     <w:abstractNumId w:val="306"/>
   </w:num>
-  <w:num w:numId="86">
+  <w:num w:numId="91">
     <w:abstractNumId w:val="300"/>
   </w:num>
-  <w:num w:numId="88">
+  <w:num w:numId="94">
     <w:abstractNumId w:val="294"/>
   </w:num>
-  <w:num w:numId="91">
+  <w:num w:numId="97">
     <w:abstractNumId w:val="288"/>
   </w:num>
-  <w:num w:numId="94">
+  <w:num w:numId="99">
     <w:abstractNumId w:val="282"/>
   </w:num>
-  <w:num w:numId="97">
+  <w:num w:numId="101">
     <w:abstractNumId w:val="276"/>
   </w:num>
-  <w:num w:numId="99">
+  <w:num w:numId="103">
     <w:abstractNumId w:val="270"/>
   </w:num>
-  <w:num w:numId="101">
+  <w:num w:numId="106">
     <w:abstractNumId w:val="264"/>
   </w:num>
-  <w:num w:numId="103">
+  <w:num w:numId="108">
     <w:abstractNumId w:val="258"/>
   </w:num>
-  <w:num w:numId="106">
+  <w:num w:numId="110">
     <w:abstractNumId w:val="252"/>
   </w:num>
-  <w:num w:numId="108">
+  <w:num w:numId="112">
     <w:abstractNumId w:val="246"/>
   </w:num>
-  <w:num w:numId="110">
+  <w:num w:numId="115">
     <w:abstractNumId w:val="240"/>
   </w:num>
-  <w:num w:numId="112">
+  <w:num w:numId="118">
     <w:abstractNumId w:val="234"/>
   </w:num>
-  <w:num w:numId="115">
+  <w:num w:numId="121">
     <w:abstractNumId w:val="228"/>
   </w:num>
-  <w:num w:numId="118">
+  <w:num w:numId="124">
     <w:abstractNumId w:val="222"/>
   </w:num>
-  <w:num w:numId="121">
+  <w:num w:numId="127">
     <w:abstractNumId w:val="216"/>
   </w:num>
-  <w:num w:numId="124">
+  <w:num w:numId="130">
     <w:abstractNumId w:val="210"/>
   </w:num>
-  <w:num w:numId="127">
+  <w:num w:numId="133">
     <w:abstractNumId w:val="204"/>
   </w:num>
-  <w:num w:numId="130">
+  <w:num w:numId="136">
     <w:abstractNumId w:val="198"/>
   </w:num>
-  <w:num w:numId="133">
+  <w:num w:numId="138">
     <w:abstractNumId w:val="192"/>
   </w:num>
-  <w:num w:numId="136">
+  <w:num w:numId="140">
     <w:abstractNumId w:val="186"/>
   </w:num>
-  <w:num w:numId="138">
+  <w:num w:numId="142">
     <w:abstractNumId w:val="180"/>
   </w:num>
-  <w:num w:numId="140">
+  <w:num w:numId="144">
     <w:abstractNumId w:val="174"/>
   </w:num>
-  <w:num w:numId="142">
+  <w:num w:numId="146">
     <w:abstractNumId w:val="168"/>
   </w:num>
-  <w:num w:numId="144">
+  <w:num w:numId="148">
     <w:abstractNumId w:val="162"/>
-  </w:num>
-  <w:num w:numId="146">
-    <w:abstractNumId w:val="156"/>
-  </w:num>
-  <w:num w:numId="148">
-    <w:abstractNumId w:val="150"/>
   </w:num>
   <w:num w:numId="149">
     <w:abstractNumId w:val="13"/>
   </w:num>
   <w:num w:numId="151">
+    <w:abstractNumId w:val="156"/>
+  </w:num>
+  <w:num w:numId="153">
+    <w:abstractNumId w:val="150"/>
+  </w:num>
+  <w:num w:numId="155">
     <w:abstractNumId w:val="144"/>
   </w:num>
-  <w:num w:numId="153">
+  <w:num w:numId="157">
     <w:abstractNumId w:val="138"/>
   </w:num>
-  <w:num w:numId="155">
+  <w:num w:numId="159">
     <w:abstractNumId w:val="132"/>
   </w:num>
-  <w:num w:numId="157">
+  <w:num w:numId="161">
     <w:abstractNumId w:val="126"/>
   </w:num>
-  <w:num w:numId="159">
+  <w:num w:numId="163">
     <w:abstractNumId w:val="120"/>
   </w:num>
-  <w:num w:numId="161">
+  <w:num w:numId="165">
     <w:abstractNumId w:val="114"/>
   </w:num>
-  <w:num w:numId="163">
+  <w:num w:numId="167">
     <w:abstractNumId w:val="108"/>
   </w:num>
-  <w:num w:numId="165">
+  <w:num w:numId="169">
     <w:abstractNumId w:val="102"/>
   </w:num>
-  <w:num w:numId="167">
+  <w:num w:numId="171">
     <w:abstractNumId w:val="96"/>
   </w:num>
-  <w:num w:numId="169">
+  <w:num w:numId="173">
     <w:abstractNumId w:val="90"/>
   </w:num>
-  <w:num w:numId="171">
+  <w:num w:numId="175">
     <w:abstractNumId w:val="84"/>
   </w:num>
-  <w:num w:numId="173">
+  <w:num w:numId="177">
     <w:abstractNumId w:val="78"/>
-  </w:num>
-  <w:num w:numId="175">
-    <w:abstractNumId w:val="72"/>
-  </w:num>
-  <w:num w:numId="177">
-    <w:abstractNumId w:val="66"/>
   </w:num>
   <w:num w:numId="179">
     <w:abstractNumId w:val="7"/>
@@ -13692,36 +13923,42 @@
     <w:abstractNumId w:val="1"/>
   </w:num>
   <w:num w:numId="183">
+    <w:abstractNumId w:val="72"/>
+  </w:num>
+  <w:num w:numId="185">
+    <w:abstractNumId w:val="66"/>
+  </w:num>
+  <w:num w:numId="187">
     <w:abstractNumId w:val="60"/>
   </w:num>
-  <w:num w:numId="185">
+  <w:num w:numId="189">
     <w:abstractNumId w:val="54"/>
   </w:num>
-  <w:num w:numId="187">
+  <w:num w:numId="191">
     <w:abstractNumId w:val="48"/>
   </w:num>
-  <w:num w:numId="189">
+  <w:num w:numId="193">
     <w:abstractNumId w:val="42"/>
   </w:num>
-  <w:num w:numId="191">
+  <w:num w:numId="195">
     <w:abstractNumId w:val="36"/>
   </w:num>
-  <w:num w:numId="193">
+  <w:num w:numId="197">
     <w:abstractNumId w:val="30"/>
   </w:num>
-  <w:num w:numId="195">
+  <w:num w:numId="199">
     <w:abstractNumId w:val="24"/>
   </w:num>
-  <w:num w:numId="197">
+  <w:num w:numId="201">
     <w:abstractNumId w:val="18"/>
   </w:num>
-  <w:num w:numId="199">
+  <w:num w:numId="203">
     <w:abstractNumId w:val="12"/>
   </w:num>
-  <w:num w:numId="201">
+  <w:num w:numId="205">
     <w:abstractNumId w:val="6"/>
   </w:num>
-  <w:num w:numId="203">
+  <w:num w:numId="207">
     <w:abstractNumId w:val="0"/>
   </w:num>
 </w:numbering>

</xml_diff>

<commit_message>
Fluent API Async Validators in ASP.NET Core MVC
</commit_message>
<xml_diff>
--- a/Asp.Net Core Notes.docx
+++ b/Asp.Net Core Notes.docx
@@ -12352,6 +12352,294 @@
         <w:jc w:val="left"/>
         <w:rPr>
           <w:rFonts w:ascii="Cascadia Code" w:hAnsi="Cascadia Code" w:cs="Cascadia Code" w:eastAsia="Cascadia Code"/>
+          <w:color w:val="auto"/>
+          <w:spacing w:val="0"/>
+          <w:position w:val="0"/>
+          <w:sz w:val="20"/>
+          <w:shd w:fill="auto" w:val="clear"/>
+        </w:rPr>
+      </w:pPr>
+    </w:p>
+    <w:p>
+      <w:pPr>
+        <w:spacing w:before="0" w:after="60" w:line="240"/>
+        <w:ind w:right="0" w:left="0" w:firstLine="0"/>
+        <w:jc w:val="left"/>
+        <w:rPr>
+          <w:rFonts w:ascii="Cascadia Code" w:hAnsi="Cascadia Code" w:cs="Cascadia Code" w:eastAsia="Cascadia Code"/>
+          <w:b/>
+          <w:color w:val="auto"/>
+          <w:spacing w:val="0"/>
+          <w:position w:val="0"/>
+          <w:sz w:val="20"/>
+          <w:shd w:fill="auto" w:val="clear"/>
+        </w:rPr>
+      </w:pPr>
+      <w:r>
+        <w:rPr>
+          <w:rFonts w:ascii="Cascadia Code" w:hAnsi="Cascadia Code" w:cs="Cascadia Code" w:eastAsia="Cascadia Code"/>
+          <w:b/>
+          <w:color w:val="auto"/>
+          <w:spacing w:val="0"/>
+          <w:position w:val="0"/>
+          <w:sz w:val="20"/>
+          <w:shd w:fill="auto" w:val="clear"/>
+        </w:rPr>
+        <w:t xml:space="preserve">Lecture :- ( Fluent API Async Validators in ASP.NET Core MVC )</w:t>
+      </w:r>
+    </w:p>
+    <w:p>
+      <w:pPr>
+        <w:numPr>
+          <w:ilvl w:val="0"/>
+          <w:numId w:val="209"/>
+        </w:numPr>
+        <w:spacing w:before="0" w:after="60" w:line="240"/>
+        <w:ind w:right="0" w:left="720" w:hanging="360"/>
+        <w:jc w:val="left"/>
+        <w:rPr>
+          <w:rFonts w:ascii="Cascadia Code" w:hAnsi="Cascadia Code" w:cs="Cascadia Code" w:eastAsia="Cascadia Code"/>
+          <w:b/>
+          <w:color w:val="auto"/>
+          <w:spacing w:val="0"/>
+          <w:position w:val="0"/>
+          <w:sz w:val="20"/>
+          <w:shd w:fill="auto" w:val="clear"/>
+        </w:rPr>
+      </w:pPr>
+      <w:r>
+        <w:rPr>
+          <w:rFonts w:ascii="Cascadia Code" w:hAnsi="Cascadia Code" w:cs="Cascadia Code" w:eastAsia="Cascadia Code"/>
+          <w:color w:val="auto"/>
+          <w:spacing w:val="0"/>
+          <w:position w:val="0"/>
+          <w:sz w:val="20"/>
+          <w:shd w:fill="auto" w:val="clear"/>
+        </w:rPr>
+        <w:t xml:space="preserve">When someone talk about this that means they are talking about fluentvalidation which is a validation library not efcore fluent api</w:t>
+      </w:r>
+    </w:p>
+    <w:p>
+      <w:pPr>
+        <w:numPr>
+          <w:ilvl w:val="0"/>
+          <w:numId w:val="209"/>
+        </w:numPr>
+        <w:spacing w:before="0" w:after="60" w:line="240"/>
+        <w:ind w:right="0" w:left="720" w:hanging="360"/>
+        <w:jc w:val="left"/>
+        <w:rPr>
+          <w:rFonts w:ascii="Cascadia Code" w:hAnsi="Cascadia Code" w:cs="Cascadia Code" w:eastAsia="Cascadia Code"/>
+          <w:b/>
+          <w:color w:val="auto"/>
+          <w:spacing w:val="0"/>
+          <w:position w:val="0"/>
+          <w:sz w:val="20"/>
+          <w:shd w:fill="auto" w:val="clear"/>
+        </w:rPr>
+      </w:pPr>
+      <w:r>
+        <w:rPr>
+          <w:rFonts w:ascii="Cascadia Code" w:hAnsi="Cascadia Code" w:cs="Cascadia Code" w:eastAsia="Cascadia Code"/>
+          <w:color w:val="auto"/>
+          <w:spacing w:val="0"/>
+          <w:position w:val="0"/>
+          <w:sz w:val="20"/>
+          <w:shd w:fill="auto" w:val="clear"/>
+        </w:rPr>
+        <w:t xml:space="preserve">To use fluentvalidation we have to install fluentvaludation library or package , And we can use like this</w:t>
+      </w:r>
+    </w:p>
+    <w:p>
+      <w:pPr>
+        <w:spacing w:before="0" w:after="60" w:line="240"/>
+        <w:ind w:right="0" w:left="0" w:firstLine="0"/>
+        <w:jc w:val="left"/>
+        <w:rPr>
+          <w:rFonts w:ascii="Cascadia Code" w:hAnsi="Cascadia Code" w:cs="Cascadia Code" w:eastAsia="Cascadia Code"/>
+          <w:color w:val="auto"/>
+          <w:spacing w:val="0"/>
+          <w:position w:val="0"/>
+          <w:sz w:val="20"/>
+          <w:shd w:fill="auto" w:val="clear"/>
+        </w:rPr>
+      </w:pPr>
+      <w:r>
+        <w:rPr>
+          <w:rFonts w:ascii="Cascadia Code" w:hAnsi="Cascadia Code" w:cs="Cascadia Code" w:eastAsia="Cascadia Code"/>
+          <w:color w:val="auto"/>
+          <w:spacing w:val="0"/>
+          <w:position w:val="0"/>
+          <w:sz w:val="20"/>
+          <w:shd w:fill="auto" w:val="clear"/>
+        </w:rPr>
+        <w:t xml:space="preserve">public class EmployeeValidator :AbstractValidator&lt;Employee&gt;</w:t>
+      </w:r>
+    </w:p>
+    <w:p>
+      <w:pPr>
+        <w:spacing w:before="0" w:after="60" w:line="240"/>
+        <w:ind w:right="0" w:left="0" w:firstLine="0"/>
+        <w:jc w:val="left"/>
+        <w:rPr>
+          <w:rFonts w:ascii="Cascadia Code" w:hAnsi="Cascadia Code" w:cs="Cascadia Code" w:eastAsia="Cascadia Code"/>
+          <w:color w:val="auto"/>
+          <w:spacing w:val="0"/>
+          <w:position w:val="0"/>
+          <w:sz w:val="20"/>
+          <w:shd w:fill="auto" w:val="clear"/>
+        </w:rPr>
+      </w:pPr>
+      <w:r>
+        <w:rPr>
+          <w:rFonts w:ascii="Cascadia Code" w:hAnsi="Cascadia Code" w:cs="Cascadia Code" w:eastAsia="Cascadia Code"/>
+          <w:color w:val="auto"/>
+          <w:spacing w:val="0"/>
+          <w:position w:val="0"/>
+          <w:sz w:val="20"/>
+          <w:shd w:fill="auto" w:val="clear"/>
+        </w:rPr>
+        <w:t xml:space="preserve">{</w:t>
+      </w:r>
+    </w:p>
+    <w:p>
+      <w:pPr>
+        <w:spacing w:before="0" w:after="60" w:line="240"/>
+        <w:ind w:right="0" w:left="0" w:firstLine="0"/>
+        <w:jc w:val="left"/>
+        <w:rPr>
+          <w:rFonts w:ascii="Cascadia Code" w:hAnsi="Cascadia Code" w:cs="Cascadia Code" w:eastAsia="Cascadia Code"/>
+          <w:color w:val="auto"/>
+          <w:spacing w:val="0"/>
+          <w:position w:val="0"/>
+          <w:sz w:val="20"/>
+          <w:shd w:fill="auto" w:val="clear"/>
+        </w:rPr>
+      </w:pPr>
+      <w:r>
+        <w:rPr>
+          <w:rFonts w:ascii="Cascadia Code" w:hAnsi="Cascadia Code" w:cs="Cascadia Code" w:eastAsia="Cascadia Code"/>
+          <w:color w:val="auto"/>
+          <w:spacing w:val="0"/>
+          <w:position w:val="0"/>
+          <w:sz w:val="20"/>
+          <w:shd w:fill="auto" w:val="clear"/>
+        </w:rPr>
+        <w:t xml:space="preserve">    public EmployeeValidator()</w:t>
+      </w:r>
+    </w:p>
+    <w:p>
+      <w:pPr>
+        <w:spacing w:before="0" w:after="60" w:line="240"/>
+        <w:ind w:right="0" w:left="0" w:firstLine="0"/>
+        <w:jc w:val="left"/>
+        <w:rPr>
+          <w:rFonts w:ascii="Cascadia Code" w:hAnsi="Cascadia Code" w:cs="Cascadia Code" w:eastAsia="Cascadia Code"/>
+          <w:color w:val="auto"/>
+          <w:spacing w:val="0"/>
+          <w:position w:val="0"/>
+          <w:sz w:val="20"/>
+          <w:shd w:fill="auto" w:val="clear"/>
+        </w:rPr>
+      </w:pPr>
+      <w:r>
+        <w:rPr>
+          <w:rFonts w:ascii="Cascadia Code" w:hAnsi="Cascadia Code" w:cs="Cascadia Code" w:eastAsia="Cascadia Code"/>
+          <w:color w:val="auto"/>
+          <w:spacing w:val="0"/>
+          <w:position w:val="0"/>
+          <w:sz w:val="20"/>
+          <w:shd w:fill="auto" w:val="clear"/>
+        </w:rPr>
+        <w:t xml:space="preserve">    {</w:t>
+      </w:r>
+    </w:p>
+    <w:p>
+      <w:pPr>
+        <w:spacing w:before="0" w:after="60" w:line="240"/>
+        <w:ind w:right="0" w:left="0" w:firstLine="0"/>
+        <w:jc w:val="left"/>
+        <w:rPr>
+          <w:rFonts w:ascii="Cascadia Code" w:hAnsi="Cascadia Code" w:cs="Cascadia Code" w:eastAsia="Cascadia Code"/>
+          <w:color w:val="auto"/>
+          <w:spacing w:val="0"/>
+          <w:position w:val="0"/>
+          <w:sz w:val="20"/>
+          <w:shd w:fill="auto" w:val="clear"/>
+        </w:rPr>
+      </w:pPr>
+      <w:r>
+        <w:rPr>
+          <w:rFonts w:ascii="Cascadia Code" w:hAnsi="Cascadia Code" w:cs="Cascadia Code" w:eastAsia="Cascadia Code"/>
+          <w:color w:val="auto"/>
+          <w:spacing w:val="0"/>
+          <w:position w:val="0"/>
+          <w:sz w:val="20"/>
+          <w:shd w:fill="auto" w:val="clear"/>
+        </w:rPr>
+        <w:t xml:space="preserve">        RuleFor(s =&gt; s.Email).NotEmpty().EmailAddress();</w:t>
+      </w:r>
+    </w:p>
+    <w:p>
+      <w:pPr>
+        <w:spacing w:before="0" w:after="60" w:line="240"/>
+        <w:ind w:right="0" w:left="0" w:firstLine="0"/>
+        <w:jc w:val="left"/>
+        <w:rPr>
+          <w:rFonts w:ascii="Cascadia Code" w:hAnsi="Cascadia Code" w:cs="Cascadia Code" w:eastAsia="Cascadia Code"/>
+          <w:color w:val="auto"/>
+          <w:spacing w:val="0"/>
+          <w:position w:val="0"/>
+          <w:sz w:val="20"/>
+          <w:shd w:fill="auto" w:val="clear"/>
+        </w:rPr>
+      </w:pPr>
+      <w:r>
+        <w:rPr>
+          <w:rFonts w:ascii="Cascadia Code" w:hAnsi="Cascadia Code" w:cs="Cascadia Code" w:eastAsia="Cascadia Code"/>
+          <w:color w:val="auto"/>
+          <w:spacing w:val="0"/>
+          <w:position w:val="0"/>
+          <w:sz w:val="20"/>
+          <w:shd w:fill="auto" w:val="clear"/>
+        </w:rPr>
+        <w:t xml:space="preserve">    }</w:t>
+      </w:r>
+    </w:p>
+    <w:p>
+      <w:pPr>
+        <w:spacing w:before="0" w:after="60" w:line="240"/>
+        <w:ind w:right="0" w:left="0" w:firstLine="0"/>
+        <w:jc w:val="left"/>
+        <w:rPr>
+          <w:rFonts w:ascii="Cascadia Code" w:hAnsi="Cascadia Code" w:cs="Cascadia Code" w:eastAsia="Cascadia Code"/>
+          <w:color w:val="auto"/>
+          <w:spacing w:val="0"/>
+          <w:position w:val="0"/>
+          <w:sz w:val="20"/>
+          <w:shd w:fill="auto" w:val="clear"/>
+        </w:rPr>
+      </w:pPr>
+      <w:r>
+        <w:rPr>
+          <w:rFonts w:ascii="Cascadia Code" w:hAnsi="Cascadia Code" w:cs="Cascadia Code" w:eastAsia="Cascadia Code"/>
+          <w:color w:val="auto"/>
+          <w:spacing w:val="0"/>
+          <w:position w:val="0"/>
+          <w:sz w:val="20"/>
+          <w:shd w:fill="auto" w:val="clear"/>
+        </w:rPr>
+        <w:t xml:space="preserve">}</w:t>
+      </w:r>
+    </w:p>
+    <w:p>
+      <w:pPr>
+        <w:spacing w:before="0" w:after="60" w:line="240"/>
+        <w:ind w:right="0" w:left="0" w:firstLine="0"/>
+        <w:jc w:val="left"/>
+        <w:rPr>
+          <w:rFonts w:ascii="Cascadia Code" w:hAnsi="Cascadia Code" w:cs="Cascadia Code" w:eastAsia="Cascadia Code"/>
+          <w:b/>
           <w:color w:val="auto"/>
           <w:spacing w:val="0"/>
           <w:position w:val="0"/>
@@ -13712,209 +14000,216 @@
       <w:lvlText w:val="•"/>
     </w:lvl>
   </w:abstractNum>
+  <w:abstractNum w:abstractNumId="480">
+    <w:lvl w:ilvl="0">
+      <w:start w:val="1"/>
+      <w:numFmt w:val="bullet"/>
+      <w:lvlText w:val="•"/>
+    </w:lvl>
+  </w:abstractNum>
   <w:num w:numId="2">
+    <w:abstractNumId w:val="480"/>
+  </w:num>
+  <w:num w:numId="5">
     <w:abstractNumId w:val="474"/>
   </w:num>
-  <w:num w:numId="5">
+  <w:num w:numId="8">
     <w:abstractNumId w:val="468"/>
   </w:num>
-  <w:num w:numId="8">
+  <w:num w:numId="10">
     <w:abstractNumId w:val="462"/>
   </w:num>
-  <w:num w:numId="10">
+  <w:num w:numId="13">
     <w:abstractNumId w:val="456"/>
   </w:num>
-  <w:num w:numId="13">
+  <w:num w:numId="19">
     <w:abstractNumId w:val="450"/>
   </w:num>
-  <w:num w:numId="19">
+  <w:num w:numId="22">
     <w:abstractNumId w:val="444"/>
   </w:num>
-  <w:num w:numId="22">
+  <w:num w:numId="25">
     <w:abstractNumId w:val="438"/>
   </w:num>
-  <w:num w:numId="25">
+  <w:num w:numId="30">
     <w:abstractNumId w:val="432"/>
   </w:num>
-  <w:num w:numId="30">
+  <w:num w:numId="33">
     <w:abstractNumId w:val="426"/>
   </w:num>
-  <w:num w:numId="33">
+  <w:num w:numId="36">
     <w:abstractNumId w:val="420"/>
   </w:num>
-  <w:num w:numId="36">
+  <w:num w:numId="39">
     <w:abstractNumId w:val="414"/>
   </w:num>
-  <w:num w:numId="39">
+  <w:num w:numId="42">
     <w:abstractNumId w:val="408"/>
   </w:num>
-  <w:num w:numId="42">
+  <w:num w:numId="46">
     <w:abstractNumId w:val="402"/>
   </w:num>
-  <w:num w:numId="46">
+  <w:num w:numId="49">
     <w:abstractNumId w:val="396"/>
   </w:num>
-  <w:num w:numId="49">
+  <w:num w:numId="52">
     <w:abstractNumId w:val="390"/>
   </w:num>
-  <w:num w:numId="52">
+  <w:num w:numId="55">
     <w:abstractNumId w:val="384"/>
   </w:num>
-  <w:num w:numId="55">
+  <w:num w:numId="57">
     <w:abstractNumId w:val="378"/>
   </w:num>
-  <w:num w:numId="57">
+  <w:num w:numId="59">
     <w:abstractNumId w:val="372"/>
   </w:num>
-  <w:num w:numId="59">
+  <w:num w:numId="62">
     <w:abstractNumId w:val="366"/>
   </w:num>
-  <w:num w:numId="62">
+  <w:num w:numId="65">
     <w:abstractNumId w:val="360"/>
   </w:num>
-  <w:num w:numId="65">
+  <w:num w:numId="68">
     <w:abstractNumId w:val="354"/>
   </w:num>
-  <w:num w:numId="68">
+  <w:num w:numId="71">
     <w:abstractNumId w:val="348"/>
   </w:num>
-  <w:num w:numId="71">
+  <w:num w:numId="74">
     <w:abstractNumId w:val="342"/>
   </w:num>
-  <w:num w:numId="74">
+  <w:num w:numId="77">
     <w:abstractNumId w:val="336"/>
   </w:num>
-  <w:num w:numId="77">
+  <w:num w:numId="80">
     <w:abstractNumId w:val="330"/>
   </w:num>
-  <w:num w:numId="80">
+  <w:num w:numId="83">
     <w:abstractNumId w:val="324"/>
   </w:num>
-  <w:num w:numId="83">
+  <w:num w:numId="86">
     <w:abstractNumId w:val="318"/>
   </w:num>
-  <w:num w:numId="86">
+  <w:num w:numId="88">
     <w:abstractNumId w:val="312"/>
   </w:num>
-  <w:num w:numId="88">
+  <w:num w:numId="91">
     <w:abstractNumId w:val="306"/>
   </w:num>
-  <w:num w:numId="91">
+  <w:num w:numId="94">
     <w:abstractNumId w:val="300"/>
   </w:num>
-  <w:num w:numId="94">
+  <w:num w:numId="97">
     <w:abstractNumId w:val="294"/>
   </w:num>
-  <w:num w:numId="97">
+  <w:num w:numId="99">
     <w:abstractNumId w:val="288"/>
   </w:num>
-  <w:num w:numId="99">
+  <w:num w:numId="101">
     <w:abstractNumId w:val="282"/>
   </w:num>
-  <w:num w:numId="101">
+  <w:num w:numId="103">
     <w:abstractNumId w:val="276"/>
   </w:num>
-  <w:num w:numId="103">
+  <w:num w:numId="106">
     <w:abstractNumId w:val="270"/>
   </w:num>
-  <w:num w:numId="106">
+  <w:num w:numId="108">
     <w:abstractNumId w:val="264"/>
   </w:num>
-  <w:num w:numId="108">
+  <w:num w:numId="110">
     <w:abstractNumId w:val="258"/>
   </w:num>
-  <w:num w:numId="110">
+  <w:num w:numId="112">
     <w:abstractNumId w:val="252"/>
   </w:num>
-  <w:num w:numId="112">
+  <w:num w:numId="115">
     <w:abstractNumId w:val="246"/>
   </w:num>
-  <w:num w:numId="115">
+  <w:num w:numId="118">
     <w:abstractNumId w:val="240"/>
   </w:num>
-  <w:num w:numId="118">
+  <w:num w:numId="121">
     <w:abstractNumId w:val="234"/>
   </w:num>
-  <w:num w:numId="121">
+  <w:num w:numId="124">
     <w:abstractNumId w:val="228"/>
   </w:num>
-  <w:num w:numId="124">
+  <w:num w:numId="127">
     <w:abstractNumId w:val="222"/>
   </w:num>
-  <w:num w:numId="127">
+  <w:num w:numId="130">
     <w:abstractNumId w:val="216"/>
   </w:num>
-  <w:num w:numId="130">
+  <w:num w:numId="133">
     <w:abstractNumId w:val="210"/>
   </w:num>
-  <w:num w:numId="133">
+  <w:num w:numId="136">
     <w:abstractNumId w:val="204"/>
   </w:num>
-  <w:num w:numId="136">
+  <w:num w:numId="138">
     <w:abstractNumId w:val="198"/>
   </w:num>
-  <w:num w:numId="138">
+  <w:num w:numId="140">
     <w:abstractNumId w:val="192"/>
   </w:num>
-  <w:num w:numId="140">
+  <w:num w:numId="142">
     <w:abstractNumId w:val="186"/>
   </w:num>
-  <w:num w:numId="142">
+  <w:num w:numId="144">
     <w:abstractNumId w:val="180"/>
   </w:num>
-  <w:num w:numId="144">
+  <w:num w:numId="146">
     <w:abstractNumId w:val="174"/>
   </w:num>
-  <w:num w:numId="146">
+  <w:num w:numId="148">
     <w:abstractNumId w:val="168"/>
-  </w:num>
-  <w:num w:numId="148">
-    <w:abstractNumId w:val="162"/>
   </w:num>
   <w:num w:numId="149">
     <w:abstractNumId w:val="13"/>
   </w:num>
   <w:num w:numId="151">
+    <w:abstractNumId w:val="162"/>
+  </w:num>
+  <w:num w:numId="153">
     <w:abstractNumId w:val="156"/>
   </w:num>
-  <w:num w:numId="153">
+  <w:num w:numId="155">
     <w:abstractNumId w:val="150"/>
   </w:num>
-  <w:num w:numId="155">
+  <w:num w:numId="157">
     <w:abstractNumId w:val="144"/>
   </w:num>
-  <w:num w:numId="157">
+  <w:num w:numId="159">
     <w:abstractNumId w:val="138"/>
   </w:num>
-  <w:num w:numId="159">
+  <w:num w:numId="161">
     <w:abstractNumId w:val="132"/>
   </w:num>
-  <w:num w:numId="161">
+  <w:num w:numId="163">
     <w:abstractNumId w:val="126"/>
   </w:num>
-  <w:num w:numId="163">
+  <w:num w:numId="165">
     <w:abstractNumId w:val="120"/>
   </w:num>
-  <w:num w:numId="165">
+  <w:num w:numId="167">
     <w:abstractNumId w:val="114"/>
   </w:num>
-  <w:num w:numId="167">
+  <w:num w:numId="169">
     <w:abstractNumId w:val="108"/>
   </w:num>
-  <w:num w:numId="169">
+  <w:num w:numId="171">
     <w:abstractNumId w:val="102"/>
   </w:num>
-  <w:num w:numId="171">
+  <w:num w:numId="173">
     <w:abstractNumId w:val="96"/>
   </w:num>
-  <w:num w:numId="173">
+  <w:num w:numId="175">
     <w:abstractNumId w:val="90"/>
   </w:num>
-  <w:num w:numId="175">
+  <w:num w:numId="177">
     <w:abstractNumId w:val="84"/>
-  </w:num>
-  <w:num w:numId="177">
-    <w:abstractNumId w:val="78"/>
   </w:num>
   <w:num w:numId="179">
     <w:abstractNumId w:val="7"/>
@@ -13923,42 +14218,45 @@
     <w:abstractNumId w:val="1"/>
   </w:num>
   <w:num w:numId="183">
+    <w:abstractNumId w:val="78"/>
+  </w:num>
+  <w:num w:numId="185">
     <w:abstractNumId w:val="72"/>
   </w:num>
-  <w:num w:numId="185">
+  <w:num w:numId="187">
     <w:abstractNumId w:val="66"/>
   </w:num>
-  <w:num w:numId="187">
+  <w:num w:numId="189">
     <w:abstractNumId w:val="60"/>
   </w:num>
-  <w:num w:numId="189">
+  <w:num w:numId="191">
     <w:abstractNumId w:val="54"/>
   </w:num>
-  <w:num w:numId="191">
+  <w:num w:numId="193">
     <w:abstractNumId w:val="48"/>
   </w:num>
-  <w:num w:numId="193">
+  <w:num w:numId="195">
     <w:abstractNumId w:val="42"/>
   </w:num>
-  <w:num w:numId="195">
+  <w:num w:numId="197">
     <w:abstractNumId w:val="36"/>
   </w:num>
-  <w:num w:numId="197">
+  <w:num w:numId="199">
     <w:abstractNumId w:val="30"/>
   </w:num>
-  <w:num w:numId="199">
+  <w:num w:numId="201">
     <w:abstractNumId w:val="24"/>
   </w:num>
-  <w:num w:numId="201">
+  <w:num w:numId="203">
     <w:abstractNumId w:val="18"/>
   </w:num>
-  <w:num w:numId="203">
+  <w:num w:numId="205">
     <w:abstractNumId w:val="12"/>
   </w:num>
-  <w:num w:numId="205">
+  <w:num w:numId="207">
     <w:abstractNumId w:val="6"/>
   </w:num>
-  <w:num w:numId="207">
+  <w:num w:numId="209">
     <w:abstractNumId w:val="0"/>
   </w:num>
 </w:numbering>

</xml_diff>

<commit_message>
Filters in ASP.NET Core MVC
</commit_message>
<xml_diff>
--- a/Asp.Net Core Notes.docx
+++ b/Asp.Net Core Notes.docx
@@ -13764,6 +13764,1311 @@
           <w:shd w:fill="auto" w:val="clear"/>
         </w:rPr>
         <w:t xml:space="preserve">});</w:t>
+      </w:r>
+    </w:p>
+    <w:p>
+      <w:pPr>
+        <w:spacing w:before="0" w:after="60" w:line="240"/>
+        <w:ind w:right="0" w:left="0" w:firstLine="0"/>
+        <w:jc w:val="left"/>
+        <w:rPr>
+          <w:rFonts w:ascii="Cascadia Code" w:hAnsi="Cascadia Code" w:cs="Cascadia Code" w:eastAsia="Cascadia Code"/>
+          <w:color w:val="auto"/>
+          <w:spacing w:val="0"/>
+          <w:position w:val="0"/>
+          <w:sz w:val="20"/>
+          <w:shd w:fill="auto" w:val="clear"/>
+        </w:rPr>
+      </w:pPr>
+    </w:p>
+    <w:p>
+      <w:pPr>
+        <w:spacing w:before="0" w:after="60" w:line="240"/>
+        <w:ind w:right="0" w:left="0" w:firstLine="0"/>
+        <w:jc w:val="left"/>
+        <w:rPr>
+          <w:rFonts w:ascii="Cascadia Code" w:hAnsi="Cascadia Code" w:cs="Cascadia Code" w:eastAsia="Cascadia Code"/>
+          <w:color w:val="auto"/>
+          <w:spacing w:val="0"/>
+          <w:position w:val="0"/>
+          <w:sz w:val="20"/>
+          <w:shd w:fill="auto" w:val="clear"/>
+        </w:rPr>
+      </w:pPr>
+    </w:p>
+    <w:p>
+      <w:pPr>
+        <w:spacing w:before="0" w:after="60" w:line="240"/>
+        <w:ind w:right="0" w:left="0" w:firstLine="0"/>
+        <w:jc w:val="left"/>
+        <w:rPr>
+          <w:rFonts w:ascii="Cascadia Code" w:hAnsi="Cascadia Code" w:cs="Cascadia Code" w:eastAsia="Cascadia Code"/>
+          <w:b/>
+          <w:color w:val="auto"/>
+          <w:spacing w:val="0"/>
+          <w:position w:val="0"/>
+          <w:sz w:val="20"/>
+          <w:shd w:fill="auto" w:val="clear"/>
+        </w:rPr>
+      </w:pPr>
+      <w:r>
+        <w:rPr>
+          <w:rFonts w:ascii="Cascadia Code" w:hAnsi="Cascadia Code" w:cs="Cascadia Code" w:eastAsia="Cascadia Code"/>
+          <w:b/>
+          <w:color w:val="auto"/>
+          <w:spacing w:val="0"/>
+          <w:position w:val="0"/>
+          <w:sz w:val="20"/>
+          <w:shd w:fill="auto" w:val="clear"/>
+        </w:rPr>
+        <w:t xml:space="preserve">Lecture :- ( Filters in ASP.NET Core MVC )</w:t>
+      </w:r>
+    </w:p>
+    <w:p>
+      <w:pPr>
+        <w:numPr>
+          <w:ilvl w:val="0"/>
+          <w:numId w:val="220"/>
+        </w:numPr>
+        <w:spacing w:before="0" w:after="60" w:line="240"/>
+        <w:ind w:right="0" w:left="720" w:hanging="360"/>
+        <w:jc w:val="left"/>
+        <w:rPr>
+          <w:rFonts w:ascii="Cascadia Code" w:hAnsi="Cascadia Code" w:cs="Cascadia Code" w:eastAsia="Cascadia Code"/>
+          <w:color w:val="auto"/>
+          <w:spacing w:val="0"/>
+          <w:position w:val="0"/>
+          <w:sz w:val="20"/>
+          <w:shd w:fill="auto" w:val="clear"/>
+        </w:rPr>
+      </w:pPr>
+      <w:r>
+        <w:rPr>
+          <w:rFonts w:ascii="Cascadia Code" w:hAnsi="Cascadia Code" w:cs="Cascadia Code" w:eastAsia="Cascadia Code"/>
+          <w:color w:val="auto"/>
+          <w:spacing w:val="0"/>
+          <w:position w:val="0"/>
+          <w:sz w:val="20"/>
+          <w:shd w:fill="auto" w:val="clear"/>
+        </w:rPr>
+        <w:t xml:space="preserve">Filters are components that executes code before or after a request reaches on action method</w:t>
+      </w:r>
+    </w:p>
+    <w:p>
+      <w:pPr>
+        <w:numPr>
+          <w:ilvl w:val="0"/>
+          <w:numId w:val="220"/>
+        </w:numPr>
+        <w:spacing w:before="0" w:after="60" w:line="240"/>
+        <w:ind w:right="0" w:left="720" w:hanging="360"/>
+        <w:jc w:val="left"/>
+        <w:rPr>
+          <w:rFonts w:ascii="Cascadia Code" w:hAnsi="Cascadia Code" w:cs="Cascadia Code" w:eastAsia="Cascadia Code"/>
+          <w:color w:val="auto"/>
+          <w:spacing w:val="0"/>
+          <w:position w:val="0"/>
+          <w:sz w:val="20"/>
+          <w:shd w:fill="auto" w:val="clear"/>
+        </w:rPr>
+      </w:pPr>
+      <w:r>
+        <w:rPr>
+          <w:rFonts w:ascii="Cascadia Code" w:hAnsi="Cascadia Code" w:cs="Cascadia Code" w:eastAsia="Cascadia Code"/>
+          <w:color w:val="auto"/>
+          <w:spacing w:val="0"/>
+          <w:position w:val="0"/>
+          <w:sz w:val="20"/>
+          <w:shd w:fill="auto" w:val="clear"/>
+        </w:rPr>
+        <w:t xml:space="preserve">They allow use to inject into the mvc request pipeline without modifying controller actions</w:t>
+      </w:r>
+    </w:p>
+    <w:p>
+      <w:pPr>
+        <w:spacing w:before="0" w:after="60" w:line="240"/>
+        <w:ind w:right="0" w:left="0" w:firstLine="0"/>
+        <w:jc w:val="left"/>
+        <w:rPr>
+          <w:rFonts w:ascii="Cascadia Code" w:hAnsi="Cascadia Code" w:cs="Cascadia Code" w:eastAsia="Cascadia Code"/>
+          <w:color w:val="auto"/>
+          <w:spacing w:val="0"/>
+          <w:position w:val="0"/>
+          <w:sz w:val="20"/>
+          <w:shd w:fill="auto" w:val="clear"/>
+        </w:rPr>
+      </w:pPr>
+    </w:p>
+    <w:p>
+      <w:pPr>
+        <w:spacing w:before="0" w:after="60" w:line="240"/>
+        <w:ind w:right="0" w:left="0" w:firstLine="0"/>
+        <w:jc w:val="left"/>
+        <w:rPr>
+          <w:rFonts w:ascii="Cascadia Code" w:hAnsi="Cascadia Code" w:cs="Cascadia Code" w:eastAsia="Cascadia Code"/>
+          <w:color w:val="auto"/>
+          <w:spacing w:val="0"/>
+          <w:position w:val="0"/>
+          <w:sz w:val="20"/>
+          <w:shd w:fill="auto" w:val="clear"/>
+        </w:rPr>
+      </w:pPr>
+      <w:r>
+        <w:rPr>
+          <w:rFonts w:ascii="Cascadia Code" w:hAnsi="Cascadia Code" w:cs="Cascadia Code" w:eastAsia="Cascadia Code"/>
+          <w:color w:val="auto"/>
+          <w:spacing w:val="0"/>
+          <w:position w:val="0"/>
+          <w:sz w:val="20"/>
+          <w:shd w:fill="auto" w:val="clear"/>
+        </w:rPr>
+        <w:t xml:space="preserve">Why do we need filters ?</w:t>
+      </w:r>
+    </w:p>
+    <w:p>
+      <w:pPr>
+        <w:numPr>
+          <w:ilvl w:val="0"/>
+          <w:numId w:val="222"/>
+        </w:numPr>
+        <w:spacing w:before="0" w:after="60" w:line="240"/>
+        <w:ind w:right="0" w:left="720" w:hanging="360"/>
+        <w:jc w:val="left"/>
+        <w:rPr>
+          <w:rFonts w:ascii="Cascadia Code" w:hAnsi="Cascadia Code" w:cs="Cascadia Code" w:eastAsia="Cascadia Code"/>
+          <w:color w:val="auto"/>
+          <w:spacing w:val="0"/>
+          <w:position w:val="0"/>
+          <w:sz w:val="20"/>
+          <w:shd w:fill="auto" w:val="clear"/>
+        </w:rPr>
+      </w:pPr>
+      <w:r>
+        <w:rPr>
+          <w:rFonts w:ascii="Cascadia Code" w:hAnsi="Cascadia Code" w:cs="Cascadia Code" w:eastAsia="Cascadia Code"/>
+          <w:color w:val="auto"/>
+          <w:spacing w:val="0"/>
+          <w:position w:val="0"/>
+          <w:sz w:val="20"/>
+          <w:shd w:fill="auto" w:val="clear"/>
+        </w:rPr>
+        <w:t xml:space="preserve">suppose every actions or method requires logging , authorization , authetication and exception handling , so for this u hva e to call these methods inside every other method wherever it requires , if u are not using filter</w:t>
+      </w:r>
+    </w:p>
+    <w:p>
+      <w:pPr>
+        <w:spacing w:before="0" w:after="60" w:line="240"/>
+        <w:ind w:right="0" w:left="0" w:firstLine="0"/>
+        <w:jc w:val="left"/>
+        <w:rPr>
+          <w:rFonts w:ascii="Cascadia Code" w:hAnsi="Cascadia Code" w:cs="Cascadia Code" w:eastAsia="Cascadia Code"/>
+          <w:color w:val="auto"/>
+          <w:spacing w:val="0"/>
+          <w:position w:val="0"/>
+          <w:sz w:val="20"/>
+          <w:shd w:fill="auto" w:val="clear"/>
+        </w:rPr>
+      </w:pPr>
+    </w:p>
+    <w:p>
+      <w:pPr>
+        <w:spacing w:before="0" w:after="60" w:line="240"/>
+        <w:ind w:right="0" w:left="0" w:firstLine="0"/>
+        <w:jc w:val="left"/>
+        <w:rPr>
+          <w:rFonts w:ascii="Cascadia Code" w:hAnsi="Cascadia Code" w:cs="Cascadia Code" w:eastAsia="Cascadia Code"/>
+          <w:color w:val="auto"/>
+          <w:spacing w:val="0"/>
+          <w:position w:val="0"/>
+          <w:sz w:val="20"/>
+          <w:shd w:fill="auto" w:val="clear"/>
+        </w:rPr>
+      </w:pPr>
+      <w:r>
+        <w:rPr>
+          <w:rFonts w:ascii="Cascadia Code" w:hAnsi="Cascadia Code" w:cs="Cascadia Code" w:eastAsia="Cascadia Code"/>
+          <w:color w:val="auto"/>
+          <w:spacing w:val="0"/>
+          <w:position w:val="0"/>
+          <w:sz w:val="20"/>
+          <w:shd w:fill="auto" w:val="clear"/>
+        </w:rPr>
+        <w:t xml:space="preserve">Type of filters :- And this order needs to be asme</w:t>
+      </w:r>
+    </w:p>
+    <w:p>
+      <w:pPr>
+        <w:numPr>
+          <w:ilvl w:val="0"/>
+          <w:numId w:val="224"/>
+        </w:numPr>
+        <w:spacing w:before="0" w:after="60" w:line="240"/>
+        <w:ind w:right="0" w:left="720" w:hanging="360"/>
+        <w:jc w:val="left"/>
+        <w:rPr>
+          <w:rFonts w:ascii="Cascadia Code" w:hAnsi="Cascadia Code" w:cs="Cascadia Code" w:eastAsia="Cascadia Code"/>
+          <w:color w:val="auto"/>
+          <w:spacing w:val="0"/>
+          <w:position w:val="0"/>
+          <w:sz w:val="20"/>
+          <w:shd w:fill="auto" w:val="clear"/>
+        </w:rPr>
+      </w:pPr>
+      <w:r>
+        <w:rPr>
+          <w:rFonts w:ascii="Cascadia Code" w:hAnsi="Cascadia Code" w:cs="Cascadia Code" w:eastAsia="Cascadia Code"/>
+          <w:color w:val="auto"/>
+          <w:spacing w:val="0"/>
+          <w:position w:val="0"/>
+          <w:sz w:val="20"/>
+          <w:shd w:fill="auto" w:val="clear"/>
+        </w:rPr>
+        <w:t xml:space="preserve">Authorization filter</w:t>
+      </w:r>
+    </w:p>
+    <w:p>
+      <w:pPr>
+        <w:numPr>
+          <w:ilvl w:val="0"/>
+          <w:numId w:val="224"/>
+        </w:numPr>
+        <w:spacing w:before="0" w:after="60" w:line="240"/>
+        <w:ind w:right="0" w:left="720" w:hanging="360"/>
+        <w:jc w:val="left"/>
+        <w:rPr>
+          <w:rFonts w:ascii="Cascadia Code" w:hAnsi="Cascadia Code" w:cs="Cascadia Code" w:eastAsia="Cascadia Code"/>
+          <w:color w:val="auto"/>
+          <w:spacing w:val="0"/>
+          <w:position w:val="0"/>
+          <w:sz w:val="20"/>
+          <w:shd w:fill="auto" w:val="clear"/>
+        </w:rPr>
+      </w:pPr>
+      <w:r>
+        <w:rPr>
+          <w:rFonts w:ascii="Cascadia Code" w:hAnsi="Cascadia Code" w:cs="Cascadia Code" w:eastAsia="Cascadia Code"/>
+          <w:color w:val="auto"/>
+          <w:spacing w:val="0"/>
+          <w:position w:val="0"/>
+          <w:sz w:val="20"/>
+          <w:shd w:fill="auto" w:val="clear"/>
+        </w:rPr>
+        <w:t xml:space="preserve">Resource filter</w:t>
+      </w:r>
+    </w:p>
+    <w:p>
+      <w:pPr>
+        <w:numPr>
+          <w:ilvl w:val="0"/>
+          <w:numId w:val="224"/>
+        </w:numPr>
+        <w:spacing w:before="0" w:after="60" w:line="240"/>
+        <w:ind w:right="0" w:left="720" w:hanging="360"/>
+        <w:jc w:val="left"/>
+        <w:rPr>
+          <w:rFonts w:ascii="Cascadia Code" w:hAnsi="Cascadia Code" w:cs="Cascadia Code" w:eastAsia="Cascadia Code"/>
+          <w:color w:val="auto"/>
+          <w:spacing w:val="0"/>
+          <w:position w:val="0"/>
+          <w:sz w:val="20"/>
+          <w:shd w:fill="auto" w:val="clear"/>
+        </w:rPr>
+      </w:pPr>
+      <w:r>
+        <w:rPr>
+          <w:rFonts w:ascii="Cascadia Code" w:hAnsi="Cascadia Code" w:cs="Cascadia Code" w:eastAsia="Cascadia Code"/>
+          <w:color w:val="auto"/>
+          <w:spacing w:val="0"/>
+          <w:position w:val="0"/>
+          <w:sz w:val="20"/>
+          <w:shd w:fill="auto" w:val="clear"/>
+        </w:rPr>
+        <w:t xml:space="preserve">action filter</w:t>
+      </w:r>
+    </w:p>
+    <w:p>
+      <w:pPr>
+        <w:numPr>
+          <w:ilvl w:val="0"/>
+          <w:numId w:val="224"/>
+        </w:numPr>
+        <w:spacing w:before="0" w:after="60" w:line="240"/>
+        <w:ind w:right="0" w:left="720" w:hanging="360"/>
+        <w:jc w:val="left"/>
+        <w:rPr>
+          <w:rFonts w:ascii="Cascadia Code" w:hAnsi="Cascadia Code" w:cs="Cascadia Code" w:eastAsia="Cascadia Code"/>
+          <w:color w:val="auto"/>
+          <w:spacing w:val="0"/>
+          <w:position w:val="0"/>
+          <w:sz w:val="20"/>
+          <w:shd w:fill="auto" w:val="clear"/>
+        </w:rPr>
+      </w:pPr>
+      <w:r>
+        <w:rPr>
+          <w:rFonts w:ascii="Cascadia Code" w:hAnsi="Cascadia Code" w:cs="Cascadia Code" w:eastAsia="Cascadia Code"/>
+          <w:color w:val="auto"/>
+          <w:spacing w:val="0"/>
+          <w:position w:val="0"/>
+          <w:sz w:val="20"/>
+          <w:shd w:fill="auto" w:val="clear"/>
+        </w:rPr>
+        <w:t xml:space="preserve">exception filter</w:t>
+      </w:r>
+    </w:p>
+    <w:p>
+      <w:pPr>
+        <w:numPr>
+          <w:ilvl w:val="0"/>
+          <w:numId w:val="224"/>
+        </w:numPr>
+        <w:spacing w:before="0" w:after="60" w:line="240"/>
+        <w:ind w:right="0" w:left="720" w:hanging="360"/>
+        <w:jc w:val="left"/>
+        <w:rPr>
+          <w:rFonts w:ascii="Cascadia Code" w:hAnsi="Cascadia Code" w:cs="Cascadia Code" w:eastAsia="Cascadia Code"/>
+          <w:color w:val="auto"/>
+          <w:spacing w:val="0"/>
+          <w:position w:val="0"/>
+          <w:sz w:val="20"/>
+          <w:shd w:fill="auto" w:val="clear"/>
+        </w:rPr>
+      </w:pPr>
+      <w:r>
+        <w:rPr>
+          <w:rFonts w:ascii="Cascadia Code" w:hAnsi="Cascadia Code" w:cs="Cascadia Code" w:eastAsia="Cascadia Code"/>
+          <w:color w:val="auto"/>
+          <w:spacing w:val="0"/>
+          <w:position w:val="0"/>
+          <w:sz w:val="20"/>
+          <w:shd w:fill="auto" w:val="clear"/>
+        </w:rPr>
+        <w:t xml:space="preserve">Result filter</w:t>
+      </w:r>
+    </w:p>
+    <w:p>
+      <w:pPr>
+        <w:spacing w:before="0" w:after="60" w:line="240"/>
+        <w:ind w:right="0" w:left="0" w:firstLine="0"/>
+        <w:jc w:val="left"/>
+        <w:rPr>
+          <w:rFonts w:ascii="Cascadia Code" w:hAnsi="Cascadia Code" w:cs="Cascadia Code" w:eastAsia="Cascadia Code"/>
+          <w:color w:val="auto"/>
+          <w:spacing w:val="0"/>
+          <w:position w:val="0"/>
+          <w:sz w:val="20"/>
+          <w:shd w:fill="auto" w:val="clear"/>
+        </w:rPr>
+      </w:pPr>
+    </w:p>
+    <w:p>
+      <w:pPr>
+        <w:spacing w:before="0" w:after="60" w:line="240"/>
+        <w:ind w:right="0" w:left="0" w:firstLine="0"/>
+        <w:jc w:val="left"/>
+        <w:rPr>
+          <w:rFonts w:ascii="Cascadia Code" w:hAnsi="Cascadia Code" w:cs="Cascadia Code" w:eastAsia="Cascadia Code"/>
+          <w:color w:val="auto"/>
+          <w:spacing w:val="0"/>
+          <w:position w:val="0"/>
+          <w:sz w:val="20"/>
+          <w:shd w:fill="auto" w:val="clear"/>
+        </w:rPr>
+      </w:pPr>
+      <w:r>
+        <w:rPr>
+          <w:rFonts w:ascii="Cascadia Code" w:hAnsi="Cascadia Code" w:cs="Cascadia Code" w:eastAsia="Cascadia Code"/>
+          <w:color w:val="auto"/>
+          <w:spacing w:val="0"/>
+          <w:position w:val="0"/>
+          <w:sz w:val="20"/>
+          <w:shd w:fill="auto" w:val="clear"/>
+        </w:rPr>
+        <w:t xml:space="preserve">In every type of filter we have to inherit that type of filter which mean let suppose we are using ActionFilter , so we have to inherit ActionFilterAttribute in a class which we are using</w:t>
+      </w:r>
+    </w:p>
+    <w:p>
+      <w:pPr>
+        <w:spacing w:before="0" w:after="60" w:line="240"/>
+        <w:ind w:right="0" w:left="0" w:firstLine="0"/>
+        <w:jc w:val="left"/>
+        <w:rPr>
+          <w:rFonts w:ascii="Cascadia Code" w:hAnsi="Cascadia Code" w:cs="Cascadia Code" w:eastAsia="Cascadia Code"/>
+          <w:color w:val="auto"/>
+          <w:spacing w:val="0"/>
+          <w:position w:val="0"/>
+          <w:sz w:val="20"/>
+          <w:shd w:fill="auto" w:val="clear"/>
+        </w:rPr>
+      </w:pPr>
+    </w:p>
+    <w:p>
+      <w:pPr>
+        <w:spacing w:before="0" w:after="60" w:line="240"/>
+        <w:ind w:right="0" w:left="0" w:firstLine="0"/>
+        <w:jc w:val="left"/>
+        <w:rPr>
+          <w:rFonts w:ascii="Cascadia Code" w:hAnsi="Cascadia Code" w:cs="Cascadia Code" w:eastAsia="Cascadia Code"/>
+          <w:color w:val="auto"/>
+          <w:spacing w:val="0"/>
+          <w:position w:val="0"/>
+          <w:sz w:val="20"/>
+          <w:shd w:fill="auto" w:val="clear"/>
+        </w:rPr>
+      </w:pPr>
+      <w:r>
+        <w:rPr>
+          <w:rFonts w:ascii="Cascadia Code" w:hAnsi="Cascadia Code" w:cs="Cascadia Code" w:eastAsia="Cascadia Code"/>
+          <w:color w:val="auto"/>
+          <w:spacing w:val="0"/>
+          <w:position w:val="0"/>
+          <w:sz w:val="20"/>
+          <w:shd w:fill="auto" w:val="clear"/>
+        </w:rPr>
+        <w:t xml:space="preserve">And also method which we are using inside that class that's also related with same filter which we are using like OnActionExecuting </w:t>
+      </w:r>
+    </w:p>
+    <w:p>
+      <w:pPr>
+        <w:spacing w:before="0" w:after="60" w:line="240"/>
+        <w:ind w:right="0" w:left="0" w:firstLine="0"/>
+        <w:jc w:val="left"/>
+        <w:rPr>
+          <w:rFonts w:ascii="Cascadia Code" w:hAnsi="Cascadia Code" w:cs="Cascadia Code" w:eastAsia="Cascadia Code"/>
+          <w:color w:val="auto"/>
+          <w:spacing w:val="0"/>
+          <w:position w:val="0"/>
+          <w:sz w:val="20"/>
+          <w:shd w:fill="auto" w:val="clear"/>
+        </w:rPr>
+      </w:pPr>
+    </w:p>
+    <w:p>
+      <w:pPr>
+        <w:spacing w:before="0" w:after="60" w:line="240"/>
+        <w:ind w:right="0" w:left="0" w:firstLine="0"/>
+        <w:jc w:val="left"/>
+        <w:rPr>
+          <w:rFonts w:ascii="Cascadia Code" w:hAnsi="Cascadia Code" w:cs="Cascadia Code" w:eastAsia="Cascadia Code"/>
+          <w:color w:val="auto"/>
+          <w:spacing w:val="0"/>
+          <w:position w:val="0"/>
+          <w:sz w:val="20"/>
+          <w:shd w:fill="auto" w:val="clear"/>
+        </w:rPr>
+      </w:pPr>
+      <w:r>
+        <w:rPr>
+          <w:rFonts w:ascii="Cascadia Code" w:hAnsi="Cascadia Code" w:cs="Cascadia Code" w:eastAsia="Cascadia Code"/>
+          <w:b/>
+          <w:color w:val="auto"/>
+          <w:spacing w:val="0"/>
+          <w:position w:val="0"/>
+          <w:sz w:val="20"/>
+          <w:shd w:fill="auto" w:val="clear"/>
+        </w:rPr>
+        <w:t xml:space="preserve">Authorization filter</w:t>
+      </w:r>
+      <w:r>
+        <w:rPr>
+          <w:rFonts w:ascii="Cascadia Code" w:hAnsi="Cascadia Code" w:cs="Cascadia Code" w:eastAsia="Cascadia Code"/>
+          <w:color w:val="auto"/>
+          <w:spacing w:val="0"/>
+          <w:position w:val="0"/>
+          <w:sz w:val="20"/>
+          <w:shd w:fill="auto" w:val="clear"/>
+        </w:rPr>
+        <w:t xml:space="preserve"> :- </w:t>
+      </w:r>
+    </w:p>
+    <w:p>
+      <w:pPr>
+        <w:numPr>
+          <w:ilvl w:val="0"/>
+          <w:numId w:val="226"/>
+        </w:numPr>
+        <w:spacing w:before="0" w:after="60" w:line="240"/>
+        <w:ind w:right="0" w:left="720" w:hanging="360"/>
+        <w:jc w:val="left"/>
+        <w:rPr>
+          <w:rFonts w:ascii="Cascadia Code" w:hAnsi="Cascadia Code" w:cs="Cascadia Code" w:eastAsia="Cascadia Code"/>
+          <w:color w:val="auto"/>
+          <w:spacing w:val="0"/>
+          <w:position w:val="0"/>
+          <w:sz w:val="20"/>
+          <w:shd w:fill="auto" w:val="clear"/>
+        </w:rPr>
+      </w:pPr>
+      <w:r>
+        <w:rPr>
+          <w:rFonts w:ascii="Cascadia Code" w:hAnsi="Cascadia Code" w:cs="Cascadia Code" w:eastAsia="Cascadia Code"/>
+          <w:color w:val="auto"/>
+          <w:spacing w:val="0"/>
+          <w:position w:val="0"/>
+          <w:sz w:val="20"/>
+          <w:shd w:fill="auto" w:val="clear"/>
+        </w:rPr>
+        <w:t xml:space="preserve">It runs first &amp; used for authetication , authorization &amp; role validation</w:t>
+      </w:r>
+    </w:p>
+    <w:p>
+      <w:pPr>
+        <w:numPr>
+          <w:ilvl w:val="0"/>
+          <w:numId w:val="226"/>
+        </w:numPr>
+        <w:spacing w:before="0" w:after="60" w:line="240"/>
+        <w:ind w:right="0" w:left="720" w:hanging="360"/>
+        <w:jc w:val="left"/>
+        <w:rPr>
+          <w:rFonts w:ascii="Cascadia Code" w:hAnsi="Cascadia Code" w:cs="Cascadia Code" w:eastAsia="Cascadia Code"/>
+          <w:color w:val="auto"/>
+          <w:spacing w:val="0"/>
+          <w:position w:val="0"/>
+          <w:sz w:val="20"/>
+          <w:shd w:fill="auto" w:val="clear"/>
+        </w:rPr>
+      </w:pPr>
+      <w:r>
+        <w:rPr>
+          <w:rFonts w:ascii="Cascadia Code" w:hAnsi="Cascadia Code" w:cs="Cascadia Code" w:eastAsia="Cascadia Code"/>
+          <w:color w:val="auto"/>
+          <w:spacing w:val="0"/>
+          <w:position w:val="0"/>
+          <w:sz w:val="20"/>
+          <w:shd w:fill="auto" w:val="clear"/>
+        </w:rPr>
+        <w:t xml:space="preserve">And for this wqe use Mvc.Authorization with using</w:t>
+      </w:r>
+    </w:p>
+    <w:p>
+      <w:pPr>
+        <w:spacing w:before="0" w:after="60" w:line="240"/>
+        <w:ind w:right="0" w:left="0" w:firstLine="0"/>
+        <w:jc w:val="left"/>
+        <w:rPr>
+          <w:rFonts w:ascii="Cascadia Code" w:hAnsi="Cascadia Code" w:cs="Cascadia Code" w:eastAsia="Cascadia Code"/>
+          <w:color w:val="auto"/>
+          <w:spacing w:val="0"/>
+          <w:position w:val="0"/>
+          <w:sz w:val="20"/>
+          <w:shd w:fill="auto" w:val="clear"/>
+        </w:rPr>
+      </w:pPr>
+    </w:p>
+    <w:p>
+      <w:pPr>
+        <w:spacing w:before="0" w:after="60" w:line="240"/>
+        <w:ind w:right="0" w:left="0" w:firstLine="0"/>
+        <w:jc w:val="left"/>
+        <w:rPr>
+          <w:rFonts w:ascii="Cascadia Code" w:hAnsi="Cascadia Code" w:cs="Cascadia Code" w:eastAsia="Cascadia Code"/>
+          <w:color w:val="auto"/>
+          <w:spacing w:val="0"/>
+          <w:position w:val="0"/>
+          <w:sz w:val="20"/>
+          <w:shd w:fill="auto" w:val="clear"/>
+        </w:rPr>
+      </w:pPr>
+      <w:r>
+        <w:rPr>
+          <w:rFonts w:ascii="Cascadia Code" w:hAnsi="Cascadia Code" w:cs="Cascadia Code" w:eastAsia="Cascadia Code"/>
+          <w:b/>
+          <w:color w:val="auto"/>
+          <w:spacing w:val="0"/>
+          <w:position w:val="0"/>
+          <w:sz w:val="20"/>
+          <w:shd w:fill="auto" w:val="clear"/>
+        </w:rPr>
+        <w:t xml:space="preserve">Action Filter </w:t>
+      </w:r>
+      <w:r>
+        <w:rPr>
+          <w:rFonts w:ascii="Cascadia Code" w:hAnsi="Cascadia Code" w:cs="Cascadia Code" w:eastAsia="Cascadia Code"/>
+          <w:color w:val="auto"/>
+          <w:spacing w:val="0"/>
+          <w:position w:val="0"/>
+          <w:sz w:val="20"/>
+          <w:shd w:fill="auto" w:val="clear"/>
+        </w:rPr>
+        <w:t xml:space="preserve">:-</w:t>
+      </w:r>
+    </w:p>
+    <w:p>
+      <w:pPr>
+        <w:numPr>
+          <w:ilvl w:val="0"/>
+          <w:numId w:val="228"/>
+        </w:numPr>
+        <w:spacing w:before="0" w:after="60" w:line="240"/>
+        <w:ind w:right="0" w:left="720" w:hanging="360"/>
+        <w:jc w:val="left"/>
+        <w:rPr>
+          <w:rFonts w:ascii="Cascadia Code" w:hAnsi="Cascadia Code" w:cs="Cascadia Code" w:eastAsia="Cascadia Code"/>
+          <w:color w:val="auto"/>
+          <w:spacing w:val="0"/>
+          <w:position w:val="0"/>
+          <w:sz w:val="20"/>
+          <w:shd w:fill="auto" w:val="clear"/>
+        </w:rPr>
+      </w:pPr>
+      <w:r>
+        <w:rPr>
+          <w:rFonts w:ascii="Cascadia Code" w:hAnsi="Cascadia Code" w:cs="Cascadia Code" w:eastAsia="Cascadia Code"/>
+          <w:color w:val="auto"/>
+          <w:spacing w:val="0"/>
+          <w:position w:val="0"/>
+          <w:sz w:val="20"/>
+          <w:shd w:fill="auto" w:val="clear"/>
+        </w:rPr>
+        <w:t xml:space="preserve">It runs before action or after action</w:t>
+      </w:r>
+    </w:p>
+    <w:p>
+      <w:pPr>
+        <w:numPr>
+          <w:ilvl w:val="0"/>
+          <w:numId w:val="228"/>
+        </w:numPr>
+        <w:spacing w:before="0" w:after="60" w:line="240"/>
+        <w:ind w:right="0" w:left="720" w:hanging="360"/>
+        <w:jc w:val="left"/>
+        <w:rPr>
+          <w:rFonts w:ascii="Cascadia Code" w:hAnsi="Cascadia Code" w:cs="Cascadia Code" w:eastAsia="Cascadia Code"/>
+          <w:color w:val="auto"/>
+          <w:spacing w:val="0"/>
+          <w:position w:val="0"/>
+          <w:sz w:val="20"/>
+          <w:shd w:fill="auto" w:val="clear"/>
+        </w:rPr>
+      </w:pPr>
+      <w:r>
+        <w:rPr>
+          <w:rFonts w:ascii="Cascadia Code" w:hAnsi="Cascadia Code" w:cs="Cascadia Code" w:eastAsia="Cascadia Code"/>
+          <w:color w:val="auto"/>
+          <w:spacing w:val="0"/>
+          <w:position w:val="0"/>
+          <w:sz w:val="20"/>
+          <w:shd w:fill="auto" w:val="clear"/>
+        </w:rPr>
+        <w:t xml:space="preserve">useful for logging , validation and auditing</w:t>
+      </w:r>
+    </w:p>
+    <w:p>
+      <w:pPr>
+        <w:numPr>
+          <w:ilvl w:val="0"/>
+          <w:numId w:val="228"/>
+        </w:numPr>
+        <w:spacing w:before="0" w:after="60" w:line="240"/>
+        <w:ind w:right="0" w:left="720" w:hanging="360"/>
+        <w:jc w:val="left"/>
+        <w:rPr>
+          <w:rFonts w:ascii="Cascadia Code" w:hAnsi="Cascadia Code" w:cs="Cascadia Code" w:eastAsia="Cascadia Code"/>
+          <w:color w:val="auto"/>
+          <w:spacing w:val="0"/>
+          <w:position w:val="0"/>
+          <w:sz w:val="20"/>
+          <w:shd w:fill="auto" w:val="clear"/>
+        </w:rPr>
+      </w:pPr>
+      <w:r>
+        <w:rPr>
+          <w:rFonts w:ascii="Cascadia Code" w:hAnsi="Cascadia Code" w:cs="Cascadia Code" w:eastAsia="Cascadia Code"/>
+          <w:color w:val="auto"/>
+          <w:spacing w:val="0"/>
+          <w:position w:val="0"/>
+          <w:sz w:val="20"/>
+          <w:shd w:fill="auto" w:val="clear"/>
+        </w:rPr>
+        <w:t xml:space="preserve">need to inherit ActionFilterAttribute &amp; with using u have to use mvc.filters</w:t>
+      </w:r>
+    </w:p>
+    <w:p>
+      <w:pPr>
+        <w:spacing w:before="0" w:after="60" w:line="240"/>
+        <w:ind w:right="0" w:left="0" w:firstLine="0"/>
+        <w:jc w:val="left"/>
+        <w:rPr>
+          <w:rFonts w:ascii="Cascadia Code" w:hAnsi="Cascadia Code" w:cs="Cascadia Code" w:eastAsia="Cascadia Code"/>
+          <w:color w:val="auto"/>
+          <w:spacing w:val="0"/>
+          <w:position w:val="0"/>
+          <w:sz w:val="20"/>
+          <w:shd w:fill="auto" w:val="clear"/>
+        </w:rPr>
+      </w:pPr>
+    </w:p>
+    <w:p>
+      <w:pPr>
+        <w:spacing w:before="0" w:after="60" w:line="240"/>
+        <w:ind w:right="0" w:left="0" w:firstLine="0"/>
+        <w:jc w:val="left"/>
+        <w:rPr>
+          <w:rFonts w:ascii="Cascadia Code" w:hAnsi="Cascadia Code" w:cs="Cascadia Code" w:eastAsia="Cascadia Code"/>
+          <w:color w:val="auto"/>
+          <w:spacing w:val="0"/>
+          <w:position w:val="0"/>
+          <w:sz w:val="20"/>
+          <w:shd w:fill="auto" w:val="clear"/>
+        </w:rPr>
+      </w:pPr>
+      <w:r>
+        <w:rPr>
+          <w:rFonts w:ascii="Cascadia Code" w:hAnsi="Cascadia Code" w:cs="Cascadia Code" w:eastAsia="Cascadia Code"/>
+          <w:b/>
+          <w:color w:val="auto"/>
+          <w:spacing w:val="0"/>
+          <w:position w:val="0"/>
+          <w:sz w:val="20"/>
+          <w:shd w:fill="auto" w:val="clear"/>
+        </w:rPr>
+        <w:t xml:space="preserve">Exception filte</w:t>
+      </w:r>
+      <w:r>
+        <w:rPr>
+          <w:rFonts w:ascii="Cascadia Code" w:hAnsi="Cascadia Code" w:cs="Cascadia Code" w:eastAsia="Cascadia Code"/>
+          <w:color w:val="auto"/>
+          <w:spacing w:val="0"/>
+          <w:position w:val="0"/>
+          <w:sz w:val="20"/>
+          <w:shd w:fill="auto" w:val="clear"/>
+        </w:rPr>
+        <w:t xml:space="preserve">r :- which handled unhandled exception</w:t>
+      </w:r>
+    </w:p>
+    <w:p>
+      <w:pPr>
+        <w:spacing w:before="0" w:after="60" w:line="240"/>
+        <w:ind w:right="0" w:left="0" w:firstLine="0"/>
+        <w:jc w:val="left"/>
+        <w:rPr>
+          <w:rFonts w:ascii="Cascadia Code" w:hAnsi="Cascadia Code" w:cs="Cascadia Code" w:eastAsia="Cascadia Code"/>
+          <w:color w:val="auto"/>
+          <w:spacing w:val="0"/>
+          <w:position w:val="0"/>
+          <w:sz w:val="20"/>
+          <w:shd w:fill="auto" w:val="clear"/>
+        </w:rPr>
+      </w:pPr>
+    </w:p>
+    <w:p>
+      <w:pPr>
+        <w:spacing w:before="0" w:after="60" w:line="240"/>
+        <w:ind w:right="0" w:left="0" w:firstLine="0"/>
+        <w:jc w:val="left"/>
+        <w:rPr>
+          <w:rFonts w:ascii="Cascadia Code" w:hAnsi="Cascadia Code" w:cs="Cascadia Code" w:eastAsia="Cascadia Code"/>
+          <w:color w:val="auto"/>
+          <w:spacing w:val="0"/>
+          <w:position w:val="0"/>
+          <w:sz w:val="20"/>
+          <w:shd w:fill="auto" w:val="clear"/>
+        </w:rPr>
+      </w:pPr>
+      <w:r>
+        <w:rPr>
+          <w:rFonts w:ascii="Cascadia Code" w:hAnsi="Cascadia Code" w:cs="Cascadia Code" w:eastAsia="Cascadia Code"/>
+          <w:color w:val="auto"/>
+          <w:spacing w:val="0"/>
+          <w:position w:val="0"/>
+          <w:sz w:val="20"/>
+          <w:shd w:fill="auto" w:val="clear"/>
+        </w:rPr>
+        <w:t xml:space="preserve">Basically there are three things onlnuy how to use pacakage , how to inehrit &amp; what method need to use including what to paas in a parameter</w:t>
+      </w:r>
+    </w:p>
+    <w:p>
+      <w:pPr>
+        <w:spacing w:before="0" w:after="60" w:line="240"/>
+        <w:ind w:right="0" w:left="0" w:firstLine="0"/>
+        <w:jc w:val="left"/>
+        <w:rPr>
+          <w:rFonts w:ascii="Cascadia Code" w:hAnsi="Cascadia Code" w:cs="Cascadia Code" w:eastAsia="Cascadia Code"/>
+          <w:color w:val="auto"/>
+          <w:spacing w:val="0"/>
+          <w:position w:val="0"/>
+          <w:sz w:val="20"/>
+          <w:shd w:fill="auto" w:val="clear"/>
+        </w:rPr>
+      </w:pPr>
+    </w:p>
+    <w:p>
+      <w:pPr>
+        <w:spacing w:before="0" w:after="60" w:line="240"/>
+        <w:ind w:right="0" w:left="0" w:firstLine="0"/>
+        <w:jc w:val="left"/>
+        <w:rPr>
+          <w:rFonts w:ascii="Cascadia Code" w:hAnsi="Cascadia Code" w:cs="Cascadia Code" w:eastAsia="Cascadia Code"/>
+          <w:color w:val="auto"/>
+          <w:spacing w:val="0"/>
+          <w:position w:val="0"/>
+          <w:sz w:val="20"/>
+          <w:shd w:fill="auto" w:val="clear"/>
+        </w:rPr>
+      </w:pPr>
+      <w:r>
+        <w:rPr>
+          <w:rFonts w:ascii="Cascadia Code" w:hAnsi="Cascadia Code" w:cs="Cascadia Code" w:eastAsia="Cascadia Code"/>
+          <w:b/>
+          <w:color w:val="auto"/>
+          <w:spacing w:val="0"/>
+          <w:position w:val="0"/>
+          <w:sz w:val="20"/>
+          <w:shd w:fill="auto" w:val="clear"/>
+        </w:rPr>
+        <w:t xml:space="preserve">Service Filter </w:t>
+      </w:r>
+      <w:r>
+        <w:rPr>
+          <w:rFonts w:ascii="Cascadia Code" w:hAnsi="Cascadia Code" w:cs="Cascadia Code" w:eastAsia="Cascadia Code"/>
+          <w:color w:val="auto"/>
+          <w:spacing w:val="0"/>
+          <w:position w:val="0"/>
+          <w:sz w:val="20"/>
+          <w:shd w:fill="auto" w:val="clear"/>
+        </w:rPr>
+        <w:t xml:space="preserve">:-</w:t>
+      </w:r>
+    </w:p>
+    <w:p>
+      <w:pPr>
+        <w:numPr>
+          <w:ilvl w:val="0"/>
+          <w:numId w:val="230"/>
+        </w:numPr>
+        <w:spacing w:before="0" w:after="60" w:line="240"/>
+        <w:ind w:right="0" w:left="720" w:hanging="360"/>
+        <w:jc w:val="left"/>
+        <w:rPr>
+          <w:rFonts w:ascii="Cascadia Code" w:hAnsi="Cascadia Code" w:cs="Cascadia Code" w:eastAsia="Cascadia Code"/>
+          <w:color w:val="auto"/>
+          <w:spacing w:val="0"/>
+          <w:position w:val="0"/>
+          <w:sz w:val="20"/>
+          <w:shd w:fill="auto" w:val="clear"/>
+        </w:rPr>
+      </w:pPr>
+      <w:r>
+        <w:rPr>
+          <w:rFonts w:ascii="Cascadia Code" w:hAnsi="Cascadia Code" w:cs="Cascadia Code" w:eastAsia="Cascadia Code"/>
+          <w:color w:val="auto"/>
+          <w:spacing w:val="0"/>
+          <w:position w:val="0"/>
+          <w:sz w:val="20"/>
+          <w:shd w:fill="auto" w:val="clear"/>
+        </w:rPr>
+        <w:t xml:space="preserve">When filters requires DI</w:t>
+      </w:r>
+    </w:p>
+    <w:p>
+      <w:pPr>
+        <w:numPr>
+          <w:ilvl w:val="0"/>
+          <w:numId w:val="230"/>
+        </w:numPr>
+        <w:spacing w:before="0" w:after="60" w:line="240"/>
+        <w:ind w:right="0" w:left="720" w:hanging="360"/>
+        <w:jc w:val="left"/>
+        <w:rPr>
+          <w:rFonts w:ascii="Cascadia Code" w:hAnsi="Cascadia Code" w:cs="Cascadia Code" w:eastAsia="Cascadia Code"/>
+          <w:color w:val="auto"/>
+          <w:spacing w:val="0"/>
+          <w:position w:val="0"/>
+          <w:sz w:val="20"/>
+          <w:shd w:fill="auto" w:val="clear"/>
+        </w:rPr>
+      </w:pPr>
+      <w:r>
+        <w:rPr>
+          <w:rFonts w:ascii="Cascadia Code" w:hAnsi="Cascadia Code" w:cs="Cascadia Code" w:eastAsia="Cascadia Code"/>
+          <w:color w:val="auto"/>
+          <w:spacing w:val="0"/>
+          <w:position w:val="0"/>
+          <w:sz w:val="20"/>
+          <w:shd w:fill="auto" w:val="clear"/>
+        </w:rPr>
+        <w:t xml:space="preserve">To use we have to use DI &amp; IActionFilter which needs to inherit</w:t>
+      </w:r>
+    </w:p>
+    <w:p>
+      <w:pPr>
+        <w:spacing w:before="0" w:after="60" w:line="240"/>
+        <w:ind w:right="0" w:left="0" w:firstLine="0"/>
+        <w:jc w:val="left"/>
+        <w:rPr>
+          <w:rFonts w:ascii="Cascadia Code" w:hAnsi="Cascadia Code" w:cs="Cascadia Code" w:eastAsia="Cascadia Code"/>
+          <w:color w:val="auto"/>
+          <w:spacing w:val="0"/>
+          <w:position w:val="0"/>
+          <w:sz w:val="20"/>
+          <w:shd w:fill="auto" w:val="clear"/>
+        </w:rPr>
+      </w:pPr>
+      <w:r>
+        <w:rPr>
+          <w:rFonts w:ascii="Cascadia Code" w:hAnsi="Cascadia Code" w:cs="Cascadia Code" w:eastAsia="Cascadia Code"/>
+          <w:color w:val="auto"/>
+          <w:spacing w:val="0"/>
+          <w:position w:val="0"/>
+          <w:sz w:val="20"/>
+          <w:shd w:fill="auto" w:val="clear"/>
+        </w:rPr>
+        <w:t xml:space="preserve">To use we can use in this way</w:t>
+      </w:r>
+    </w:p>
+    <w:p>
+      <w:pPr>
+        <w:spacing w:before="0" w:after="60" w:line="240"/>
+        <w:ind w:right="0" w:left="0" w:firstLine="0"/>
+        <w:jc w:val="left"/>
+        <w:rPr>
+          <w:rFonts w:ascii="Cascadia Code" w:hAnsi="Cascadia Code" w:cs="Cascadia Code" w:eastAsia="Cascadia Code"/>
+          <w:color w:val="auto"/>
+          <w:spacing w:val="0"/>
+          <w:position w:val="0"/>
+          <w:sz w:val="20"/>
+          <w:shd w:fill="auto" w:val="clear"/>
+        </w:rPr>
+      </w:pPr>
+      <w:r>
+        <w:rPr>
+          <w:rFonts w:ascii="Cascadia Code" w:hAnsi="Cascadia Code" w:cs="Cascadia Code" w:eastAsia="Cascadia Code"/>
+          <w:color w:val="auto"/>
+          <w:spacing w:val="0"/>
+          <w:position w:val="0"/>
+          <w:sz w:val="20"/>
+          <w:shd w:fill="auto" w:val="clear"/>
+        </w:rPr>
+        <w:t xml:space="preserve">[ServiceFilter(typeof(LoggingFilter))]</w:t>
+      </w:r>
+    </w:p>
+    <w:p>
+      <w:pPr>
+        <w:spacing w:before="0" w:after="60" w:line="240"/>
+        <w:ind w:right="0" w:left="0" w:firstLine="0"/>
+        <w:jc w:val="left"/>
+        <w:rPr>
+          <w:rFonts w:ascii="Cascadia Code" w:hAnsi="Cascadia Code" w:cs="Cascadia Code" w:eastAsia="Cascadia Code"/>
+          <w:color w:val="auto"/>
+          <w:spacing w:val="0"/>
+          <w:position w:val="0"/>
+          <w:sz w:val="20"/>
+          <w:shd w:fill="auto" w:val="clear"/>
+        </w:rPr>
+      </w:pPr>
+      <w:r>
+        <w:rPr>
+          <w:rFonts w:ascii="Cascadia Code" w:hAnsi="Cascadia Code" w:cs="Cascadia Code" w:eastAsia="Cascadia Code"/>
+          <w:color w:val="auto"/>
+          <w:spacing w:val="0"/>
+          <w:position w:val="0"/>
+          <w:sz w:val="20"/>
+          <w:shd w:fill="auto" w:val="clear"/>
+        </w:rPr>
+        <w:t xml:space="preserve">public IActionResult Index()</w:t>
+      </w:r>
+    </w:p>
+    <w:p>
+      <w:pPr>
+        <w:spacing w:before="0" w:after="60" w:line="240"/>
+        <w:ind w:right="0" w:left="0" w:firstLine="0"/>
+        <w:jc w:val="left"/>
+        <w:rPr>
+          <w:rFonts w:ascii="Cascadia Code" w:hAnsi="Cascadia Code" w:cs="Cascadia Code" w:eastAsia="Cascadia Code"/>
+          <w:color w:val="auto"/>
+          <w:spacing w:val="0"/>
+          <w:position w:val="0"/>
+          <w:sz w:val="20"/>
+          <w:shd w:fill="auto" w:val="clear"/>
+        </w:rPr>
+      </w:pPr>
+      <w:r>
+        <w:rPr>
+          <w:rFonts w:ascii="Cascadia Code" w:hAnsi="Cascadia Code" w:cs="Cascadia Code" w:eastAsia="Cascadia Code"/>
+          <w:color w:val="auto"/>
+          <w:spacing w:val="0"/>
+          <w:position w:val="0"/>
+          <w:sz w:val="20"/>
+          <w:shd w:fill="auto" w:val="clear"/>
+        </w:rPr>
+        <w:t xml:space="preserve">{</w:t>
+      </w:r>
+    </w:p>
+    <w:p>
+      <w:pPr>
+        <w:spacing w:before="0" w:after="60" w:line="240"/>
+        <w:ind w:right="0" w:left="0" w:firstLine="0"/>
+        <w:jc w:val="left"/>
+        <w:rPr>
+          <w:rFonts w:ascii="Cascadia Code" w:hAnsi="Cascadia Code" w:cs="Cascadia Code" w:eastAsia="Cascadia Code"/>
+          <w:color w:val="auto"/>
+          <w:spacing w:val="0"/>
+          <w:position w:val="0"/>
+          <w:sz w:val="20"/>
+          <w:shd w:fill="auto" w:val="clear"/>
+        </w:rPr>
+      </w:pPr>
+      <w:r>
+        <w:rPr>
+          <w:rFonts w:ascii="Cascadia Code" w:hAnsi="Cascadia Code" w:cs="Cascadia Code" w:eastAsia="Cascadia Code"/>
+          <w:color w:val="auto"/>
+          <w:spacing w:val="0"/>
+          <w:position w:val="0"/>
+          <w:sz w:val="20"/>
+          <w:shd w:fill="auto" w:val="clear"/>
+        </w:rPr>
+        <w:t xml:space="preserve">    return View();</w:t>
+      </w:r>
+    </w:p>
+    <w:p>
+      <w:pPr>
+        <w:spacing w:before="0" w:after="60" w:line="240"/>
+        <w:ind w:right="0" w:left="0" w:firstLine="0"/>
+        <w:jc w:val="left"/>
+        <w:rPr>
+          <w:rFonts w:ascii="Cascadia Code" w:hAnsi="Cascadia Code" w:cs="Cascadia Code" w:eastAsia="Cascadia Code"/>
+          <w:color w:val="auto"/>
+          <w:spacing w:val="0"/>
+          <w:position w:val="0"/>
+          <w:sz w:val="20"/>
+          <w:shd w:fill="auto" w:val="clear"/>
+        </w:rPr>
+      </w:pPr>
+      <w:r>
+        <w:rPr>
+          <w:rFonts w:ascii="Cascadia Code" w:hAnsi="Cascadia Code" w:cs="Cascadia Code" w:eastAsia="Cascadia Code"/>
+          <w:color w:val="auto"/>
+          <w:spacing w:val="0"/>
+          <w:position w:val="0"/>
+          <w:sz w:val="20"/>
+          <w:shd w:fill="auto" w:val="clear"/>
+        </w:rPr>
+        <w:t xml:space="preserve">}</w:t>
+      </w:r>
+    </w:p>
+    <w:p>
+      <w:pPr>
+        <w:spacing w:before="0" w:after="60" w:line="240"/>
+        <w:ind w:right="0" w:left="0" w:firstLine="0"/>
+        <w:jc w:val="left"/>
+        <w:rPr>
+          <w:rFonts w:ascii="Cascadia Code" w:hAnsi="Cascadia Code" w:cs="Cascadia Code" w:eastAsia="Cascadia Code"/>
+          <w:color w:val="auto"/>
+          <w:spacing w:val="0"/>
+          <w:position w:val="0"/>
+          <w:sz w:val="20"/>
+          <w:shd w:fill="auto" w:val="clear"/>
+        </w:rPr>
+      </w:pPr>
+    </w:p>
+    <w:p>
+      <w:pPr>
+        <w:spacing w:before="0" w:after="60" w:line="240"/>
+        <w:ind w:right="0" w:left="0" w:firstLine="0"/>
+        <w:jc w:val="left"/>
+        <w:rPr>
+          <w:rFonts w:ascii="Cascadia Code" w:hAnsi="Cascadia Code" w:cs="Cascadia Code" w:eastAsia="Cascadia Code"/>
+          <w:color w:val="auto"/>
+          <w:spacing w:val="0"/>
+          <w:position w:val="0"/>
+          <w:sz w:val="20"/>
+          <w:shd w:fill="auto" w:val="clear"/>
+        </w:rPr>
+      </w:pPr>
+      <w:r>
+        <w:rPr>
+          <w:rFonts w:ascii="Cascadia Code" w:hAnsi="Cascadia Code" w:cs="Cascadia Code" w:eastAsia="Cascadia Code"/>
+          <w:b/>
+          <w:color w:val="auto"/>
+          <w:spacing w:val="0"/>
+          <w:position w:val="0"/>
+          <w:sz w:val="20"/>
+          <w:shd w:fill="auto" w:val="clear"/>
+        </w:rPr>
+        <w:t xml:space="preserve">Global Filter </w:t>
+      </w:r>
+      <w:r>
+        <w:rPr>
+          <w:rFonts w:ascii="Cascadia Code" w:hAnsi="Cascadia Code" w:cs="Cascadia Code" w:eastAsia="Cascadia Code"/>
+          <w:color w:val="auto"/>
+          <w:spacing w:val="0"/>
+          <w:position w:val="0"/>
+          <w:sz w:val="20"/>
+          <w:shd w:fill="auto" w:val="clear"/>
+        </w:rPr>
+        <w:t xml:space="preserve">:- apply filter to entire application</w:t>
+      </w:r>
+    </w:p>
+    <w:p>
+      <w:pPr>
+        <w:spacing w:before="0" w:after="60" w:line="240"/>
+        <w:ind w:right="0" w:left="0" w:firstLine="0"/>
+        <w:jc w:val="left"/>
+        <w:rPr>
+          <w:rFonts w:ascii="Cascadia Code" w:hAnsi="Cascadia Code" w:cs="Cascadia Code" w:eastAsia="Cascadia Code"/>
+          <w:color w:val="auto"/>
+          <w:spacing w:val="0"/>
+          <w:position w:val="0"/>
+          <w:sz w:val="20"/>
+          <w:shd w:fill="auto" w:val="clear"/>
+        </w:rPr>
+      </w:pPr>
+      <w:r>
+        <w:rPr>
+          <w:rFonts w:ascii="Cascadia Code" w:hAnsi="Cascadia Code" w:cs="Cascadia Code" w:eastAsia="Cascadia Code"/>
+          <w:color w:val="auto"/>
+          <w:spacing w:val="0"/>
+          <w:position w:val="0"/>
+          <w:sz w:val="20"/>
+          <w:shd w:fill="auto" w:val="clear"/>
+        </w:rPr>
+        <w:t xml:space="preserve">builder.Services</w:t>
+      </w:r>
+    </w:p>
+    <w:p>
+      <w:pPr>
+        <w:spacing w:before="0" w:after="60" w:line="240"/>
+        <w:ind w:right="0" w:left="0" w:firstLine="0"/>
+        <w:jc w:val="left"/>
+        <w:rPr>
+          <w:rFonts w:ascii="Cascadia Code" w:hAnsi="Cascadia Code" w:cs="Cascadia Code" w:eastAsia="Cascadia Code"/>
+          <w:color w:val="auto"/>
+          <w:spacing w:val="0"/>
+          <w:position w:val="0"/>
+          <w:sz w:val="20"/>
+          <w:shd w:fill="auto" w:val="clear"/>
+        </w:rPr>
+      </w:pPr>
+      <w:r>
+        <w:rPr>
+          <w:rFonts w:ascii="Cascadia Code" w:hAnsi="Cascadia Code" w:cs="Cascadia Code" w:eastAsia="Cascadia Code"/>
+          <w:color w:val="auto"/>
+          <w:spacing w:val="0"/>
+          <w:position w:val="0"/>
+          <w:sz w:val="20"/>
+          <w:shd w:fill="auto" w:val="clear"/>
+        </w:rPr>
+        <w:t xml:space="preserve">.AddControllersWithViews(options =&gt;</w:t>
+      </w:r>
+    </w:p>
+    <w:p>
+      <w:pPr>
+        <w:spacing w:before="0" w:after="60" w:line="240"/>
+        <w:ind w:right="0" w:left="0" w:firstLine="0"/>
+        <w:jc w:val="left"/>
+        <w:rPr>
+          <w:rFonts w:ascii="Cascadia Code" w:hAnsi="Cascadia Code" w:cs="Cascadia Code" w:eastAsia="Cascadia Code"/>
+          <w:color w:val="auto"/>
+          <w:spacing w:val="0"/>
+          <w:position w:val="0"/>
+          <w:sz w:val="20"/>
+          <w:shd w:fill="auto" w:val="clear"/>
+        </w:rPr>
+      </w:pPr>
+      <w:r>
+        <w:rPr>
+          <w:rFonts w:ascii="Cascadia Code" w:hAnsi="Cascadia Code" w:cs="Cascadia Code" w:eastAsia="Cascadia Code"/>
+          <w:color w:val="auto"/>
+          <w:spacing w:val="0"/>
+          <w:position w:val="0"/>
+          <w:sz w:val="20"/>
+          <w:shd w:fill="auto" w:val="clear"/>
+        </w:rPr>
+        <w:t xml:space="preserve">{</w:t>
+      </w:r>
+    </w:p>
+    <w:p>
+      <w:pPr>
+        <w:spacing w:before="0" w:after="60" w:line="240"/>
+        <w:ind w:right="0" w:left="0" w:firstLine="0"/>
+        <w:jc w:val="left"/>
+        <w:rPr>
+          <w:rFonts w:ascii="Cascadia Code" w:hAnsi="Cascadia Code" w:cs="Cascadia Code" w:eastAsia="Cascadia Code"/>
+          <w:color w:val="auto"/>
+          <w:spacing w:val="0"/>
+          <w:position w:val="0"/>
+          <w:sz w:val="20"/>
+          <w:shd w:fill="auto" w:val="clear"/>
+        </w:rPr>
+      </w:pPr>
+      <w:r>
+        <w:rPr>
+          <w:rFonts w:ascii="Cascadia Code" w:hAnsi="Cascadia Code" w:cs="Cascadia Code" w:eastAsia="Cascadia Code"/>
+          <w:color w:val="auto"/>
+          <w:spacing w:val="0"/>
+          <w:position w:val="0"/>
+          <w:sz w:val="20"/>
+          <w:shd w:fill="auto" w:val="clear"/>
+        </w:rPr>
+        <w:t xml:space="preserve">    options.Filters.Add&lt;MyActionFilter&gt;();</w:t>
+      </w:r>
+    </w:p>
+    <w:p>
+      <w:pPr>
+        <w:spacing w:before="0" w:after="60" w:line="240"/>
+        <w:ind w:right="0" w:left="0" w:firstLine="0"/>
+        <w:jc w:val="left"/>
+        <w:rPr>
+          <w:rFonts w:ascii="Cascadia Code" w:hAnsi="Cascadia Code" w:cs="Cascadia Code" w:eastAsia="Cascadia Code"/>
+          <w:color w:val="auto"/>
+          <w:spacing w:val="0"/>
+          <w:position w:val="0"/>
+          <w:sz w:val="20"/>
+          <w:shd w:fill="auto" w:val="clear"/>
+        </w:rPr>
+      </w:pPr>
+      <w:r>
+        <w:rPr>
+          <w:rFonts w:ascii="Cascadia Code" w:hAnsi="Cascadia Code" w:cs="Cascadia Code" w:eastAsia="Cascadia Code"/>
+          <w:color w:val="auto"/>
+          <w:spacing w:val="0"/>
+          <w:position w:val="0"/>
+          <w:sz w:val="20"/>
+          <w:shd w:fill="auto" w:val="clear"/>
+        </w:rPr>
+        <w:t xml:space="preserve">});</w:t>
+      </w:r>
+    </w:p>
+    <w:p>
+      <w:pPr>
+        <w:spacing w:before="0" w:after="60" w:line="240"/>
+        <w:ind w:right="0" w:left="0" w:firstLine="0"/>
+        <w:jc w:val="left"/>
+        <w:rPr>
+          <w:rFonts w:ascii="Cascadia Code" w:hAnsi="Cascadia Code" w:cs="Cascadia Code" w:eastAsia="Cascadia Code"/>
+          <w:color w:val="auto"/>
+          <w:spacing w:val="0"/>
+          <w:position w:val="0"/>
+          <w:sz w:val="20"/>
+          <w:shd w:fill="auto" w:val="clear"/>
+        </w:rPr>
+      </w:pPr>
+    </w:p>
+    <w:p>
+      <w:pPr>
+        <w:spacing w:before="0" w:after="60" w:line="240"/>
+        <w:ind w:right="0" w:left="0" w:firstLine="0"/>
+        <w:jc w:val="left"/>
+        <w:rPr>
+          <w:rFonts w:ascii="Cascadia Code" w:hAnsi="Cascadia Code" w:cs="Cascadia Code" w:eastAsia="Cascadia Code"/>
+          <w:color w:val="auto"/>
+          <w:spacing w:val="0"/>
+          <w:position w:val="0"/>
+          <w:sz w:val="20"/>
+          <w:shd w:fill="auto" w:val="clear"/>
+        </w:rPr>
+      </w:pPr>
+      <w:r>
+        <w:rPr>
+          <w:rFonts w:ascii="Cascadia Code" w:hAnsi="Cascadia Code" w:cs="Cascadia Code" w:eastAsia="Cascadia Code"/>
+          <w:color w:val="auto"/>
+          <w:spacing w:val="0"/>
+          <w:position w:val="0"/>
+          <w:sz w:val="20"/>
+          <w:shd w:fill="auto" w:val="clear"/>
+        </w:rPr>
+        <w:t xml:space="preserve">Async Filter :- IAsyncActionFilter</w:t>
       </w:r>
     </w:p>
     <w:p>
@@ -15153,209 +16458,251 @@
       <w:lvlText w:val="•"/>
     </w:lvl>
   </w:abstractNum>
+  <w:abstractNum w:abstractNumId="510">
+    <w:lvl w:ilvl="0">
+      <w:start w:val="1"/>
+      <w:numFmt w:val="bullet"/>
+      <w:lvlText w:val="•"/>
+    </w:lvl>
+  </w:abstractNum>
+  <w:abstractNum w:abstractNumId="516">
+    <w:lvl w:ilvl="0">
+      <w:start w:val="1"/>
+      <w:numFmt w:val="bullet"/>
+      <w:lvlText w:val="•"/>
+    </w:lvl>
+  </w:abstractNum>
+  <w:abstractNum w:abstractNumId="522">
+    <w:lvl w:ilvl="0">
+      <w:start w:val="1"/>
+      <w:numFmt w:val="bullet"/>
+      <w:lvlText w:val="•"/>
+    </w:lvl>
+  </w:abstractNum>
+  <w:abstractNum w:abstractNumId="528">
+    <w:lvl w:ilvl="0">
+      <w:start w:val="1"/>
+      <w:numFmt w:val="bullet"/>
+      <w:lvlText w:val="•"/>
+    </w:lvl>
+  </w:abstractNum>
+  <w:abstractNum w:abstractNumId="534">
+    <w:lvl w:ilvl="0">
+      <w:start w:val="1"/>
+      <w:numFmt w:val="bullet"/>
+      <w:lvlText w:val="•"/>
+    </w:lvl>
+  </w:abstractNum>
+  <w:abstractNum w:abstractNumId="540">
+    <w:lvl w:ilvl="0">
+      <w:start w:val="1"/>
+      <w:numFmt w:val="bullet"/>
+      <w:lvlText w:val="•"/>
+    </w:lvl>
+  </w:abstractNum>
   <w:num w:numId="2">
+    <w:abstractNumId w:val="540"/>
+  </w:num>
+  <w:num w:numId="5">
+    <w:abstractNumId w:val="534"/>
+  </w:num>
+  <w:num w:numId="8">
+    <w:abstractNumId w:val="528"/>
+  </w:num>
+  <w:num w:numId="10">
+    <w:abstractNumId w:val="522"/>
+  </w:num>
+  <w:num w:numId="13">
+    <w:abstractNumId w:val="516"/>
+  </w:num>
+  <w:num w:numId="19">
+    <w:abstractNumId w:val="510"/>
+  </w:num>
+  <w:num w:numId="22">
     <w:abstractNumId w:val="504"/>
   </w:num>
-  <w:num w:numId="5">
+  <w:num w:numId="25">
     <w:abstractNumId w:val="498"/>
   </w:num>
-  <w:num w:numId="8">
+  <w:num w:numId="30">
     <w:abstractNumId w:val="492"/>
   </w:num>
-  <w:num w:numId="10">
+  <w:num w:numId="33">
     <w:abstractNumId w:val="486"/>
   </w:num>
-  <w:num w:numId="13">
+  <w:num w:numId="36">
     <w:abstractNumId w:val="480"/>
   </w:num>
-  <w:num w:numId="19">
+  <w:num w:numId="39">
     <w:abstractNumId w:val="474"/>
   </w:num>
-  <w:num w:numId="22">
+  <w:num w:numId="42">
     <w:abstractNumId w:val="468"/>
   </w:num>
-  <w:num w:numId="25">
+  <w:num w:numId="46">
     <w:abstractNumId w:val="462"/>
   </w:num>
-  <w:num w:numId="30">
+  <w:num w:numId="49">
     <w:abstractNumId w:val="456"/>
   </w:num>
-  <w:num w:numId="33">
+  <w:num w:numId="52">
     <w:abstractNumId w:val="450"/>
   </w:num>
-  <w:num w:numId="36">
+  <w:num w:numId="55">
     <w:abstractNumId w:val="444"/>
   </w:num>
-  <w:num w:numId="39">
+  <w:num w:numId="57">
     <w:abstractNumId w:val="438"/>
   </w:num>
-  <w:num w:numId="42">
+  <w:num w:numId="59">
     <w:abstractNumId w:val="432"/>
   </w:num>
-  <w:num w:numId="46">
+  <w:num w:numId="62">
     <w:abstractNumId w:val="426"/>
   </w:num>
-  <w:num w:numId="49">
+  <w:num w:numId="65">
     <w:abstractNumId w:val="420"/>
   </w:num>
-  <w:num w:numId="52">
+  <w:num w:numId="68">
     <w:abstractNumId w:val="414"/>
   </w:num>
-  <w:num w:numId="55">
+  <w:num w:numId="71">
     <w:abstractNumId w:val="408"/>
   </w:num>
-  <w:num w:numId="57">
+  <w:num w:numId="74">
     <w:abstractNumId w:val="402"/>
   </w:num>
-  <w:num w:numId="59">
+  <w:num w:numId="77">
     <w:abstractNumId w:val="396"/>
   </w:num>
-  <w:num w:numId="62">
+  <w:num w:numId="80">
     <w:abstractNumId w:val="390"/>
   </w:num>
-  <w:num w:numId="65">
+  <w:num w:numId="83">
     <w:abstractNumId w:val="384"/>
   </w:num>
-  <w:num w:numId="68">
+  <w:num w:numId="86">
     <w:abstractNumId w:val="378"/>
   </w:num>
-  <w:num w:numId="71">
+  <w:num w:numId="88">
     <w:abstractNumId w:val="372"/>
   </w:num>
-  <w:num w:numId="74">
+  <w:num w:numId="91">
     <w:abstractNumId w:val="366"/>
   </w:num>
-  <w:num w:numId="77">
+  <w:num w:numId="94">
     <w:abstractNumId w:val="360"/>
   </w:num>
-  <w:num w:numId="80">
+  <w:num w:numId="97">
     <w:abstractNumId w:val="354"/>
   </w:num>
-  <w:num w:numId="83">
+  <w:num w:numId="99">
     <w:abstractNumId w:val="348"/>
   </w:num>
-  <w:num w:numId="86">
+  <w:num w:numId="101">
     <w:abstractNumId w:val="342"/>
   </w:num>
-  <w:num w:numId="88">
+  <w:num w:numId="103">
     <w:abstractNumId w:val="336"/>
   </w:num>
-  <w:num w:numId="91">
+  <w:num w:numId="106">
     <w:abstractNumId w:val="330"/>
   </w:num>
-  <w:num w:numId="94">
+  <w:num w:numId="108">
     <w:abstractNumId w:val="324"/>
   </w:num>
-  <w:num w:numId="97">
+  <w:num w:numId="110">
     <w:abstractNumId w:val="318"/>
   </w:num>
-  <w:num w:numId="99">
+  <w:num w:numId="112">
     <w:abstractNumId w:val="312"/>
   </w:num>
-  <w:num w:numId="101">
+  <w:num w:numId="115">
     <w:abstractNumId w:val="306"/>
   </w:num>
-  <w:num w:numId="103">
+  <w:num w:numId="118">
     <w:abstractNumId w:val="300"/>
   </w:num>
-  <w:num w:numId="106">
+  <w:num w:numId="121">
     <w:abstractNumId w:val="294"/>
   </w:num>
-  <w:num w:numId="108">
+  <w:num w:numId="124">
     <w:abstractNumId w:val="288"/>
   </w:num>
-  <w:num w:numId="110">
+  <w:num w:numId="127">
     <w:abstractNumId w:val="282"/>
   </w:num>
-  <w:num w:numId="112">
+  <w:num w:numId="130">
     <w:abstractNumId w:val="276"/>
   </w:num>
-  <w:num w:numId="115">
+  <w:num w:numId="133">
     <w:abstractNumId w:val="270"/>
   </w:num>
-  <w:num w:numId="118">
+  <w:num w:numId="136">
     <w:abstractNumId w:val="264"/>
   </w:num>
-  <w:num w:numId="121">
+  <w:num w:numId="138">
     <w:abstractNumId w:val="258"/>
   </w:num>
-  <w:num w:numId="124">
+  <w:num w:numId="140">
     <w:abstractNumId w:val="252"/>
   </w:num>
-  <w:num w:numId="127">
+  <w:num w:numId="142">
     <w:abstractNumId w:val="246"/>
   </w:num>
-  <w:num w:numId="130">
+  <w:num w:numId="144">
     <w:abstractNumId w:val="240"/>
   </w:num>
-  <w:num w:numId="133">
+  <w:num w:numId="146">
     <w:abstractNumId w:val="234"/>
   </w:num>
-  <w:num w:numId="136">
+  <w:num w:numId="148">
     <w:abstractNumId w:val="228"/>
-  </w:num>
-  <w:num w:numId="138">
-    <w:abstractNumId w:val="222"/>
-  </w:num>
-  <w:num w:numId="140">
-    <w:abstractNumId w:val="216"/>
-  </w:num>
-  <w:num w:numId="142">
-    <w:abstractNumId w:val="210"/>
-  </w:num>
-  <w:num w:numId="144">
-    <w:abstractNumId w:val="204"/>
-  </w:num>
-  <w:num w:numId="146">
-    <w:abstractNumId w:val="198"/>
-  </w:num>
-  <w:num w:numId="148">
-    <w:abstractNumId w:val="192"/>
   </w:num>
   <w:num w:numId="149">
     <w:abstractNumId w:val="13"/>
   </w:num>
   <w:num w:numId="151">
+    <w:abstractNumId w:val="222"/>
+  </w:num>
+  <w:num w:numId="153">
+    <w:abstractNumId w:val="216"/>
+  </w:num>
+  <w:num w:numId="155">
+    <w:abstractNumId w:val="210"/>
+  </w:num>
+  <w:num w:numId="157">
+    <w:abstractNumId w:val="204"/>
+  </w:num>
+  <w:num w:numId="159">
+    <w:abstractNumId w:val="198"/>
+  </w:num>
+  <w:num w:numId="161">
+    <w:abstractNumId w:val="192"/>
+  </w:num>
+  <w:num w:numId="163">
     <w:abstractNumId w:val="186"/>
   </w:num>
-  <w:num w:numId="153">
+  <w:num w:numId="165">
     <w:abstractNumId w:val="180"/>
   </w:num>
-  <w:num w:numId="155">
+  <w:num w:numId="167">
     <w:abstractNumId w:val="174"/>
   </w:num>
-  <w:num w:numId="157">
+  <w:num w:numId="169">
     <w:abstractNumId w:val="168"/>
   </w:num>
-  <w:num w:numId="159">
+  <w:num w:numId="171">
     <w:abstractNumId w:val="162"/>
   </w:num>
-  <w:num w:numId="161">
+  <w:num w:numId="173">
     <w:abstractNumId w:val="156"/>
   </w:num>
-  <w:num w:numId="163">
+  <w:num w:numId="175">
     <w:abstractNumId w:val="150"/>
   </w:num>
-  <w:num w:numId="165">
+  <w:num w:numId="177">
     <w:abstractNumId w:val="144"/>
-  </w:num>
-  <w:num w:numId="167">
-    <w:abstractNumId w:val="138"/>
-  </w:num>
-  <w:num w:numId="169">
-    <w:abstractNumId w:val="132"/>
-  </w:num>
-  <w:num w:numId="171">
-    <w:abstractNumId w:val="126"/>
-  </w:num>
-  <w:num w:numId="173">
-    <w:abstractNumId w:val="120"/>
-  </w:num>
-  <w:num w:numId="175">
-    <w:abstractNumId w:val="114"/>
-  </w:num>
-  <w:num w:numId="177">
-    <w:abstractNumId w:val="108"/>
   </w:num>
   <w:num w:numId="179">
     <w:abstractNumId w:val="7"/>
@@ -15364,57 +16711,75 @@
     <w:abstractNumId w:val="1"/>
   </w:num>
   <w:num w:numId="183">
+    <w:abstractNumId w:val="138"/>
+  </w:num>
+  <w:num w:numId="185">
+    <w:abstractNumId w:val="132"/>
+  </w:num>
+  <w:num w:numId="187">
+    <w:abstractNumId w:val="126"/>
+  </w:num>
+  <w:num w:numId="189">
+    <w:abstractNumId w:val="120"/>
+  </w:num>
+  <w:num w:numId="191">
+    <w:abstractNumId w:val="114"/>
+  </w:num>
+  <w:num w:numId="193">
+    <w:abstractNumId w:val="108"/>
+  </w:num>
+  <w:num w:numId="195">
     <w:abstractNumId w:val="102"/>
   </w:num>
-  <w:num w:numId="185">
+  <w:num w:numId="197">
     <w:abstractNumId w:val="96"/>
   </w:num>
-  <w:num w:numId="187">
+  <w:num w:numId="199">
     <w:abstractNumId w:val="90"/>
   </w:num>
-  <w:num w:numId="189">
+  <w:num w:numId="201">
     <w:abstractNumId w:val="84"/>
   </w:num>
-  <w:num w:numId="191">
+  <w:num w:numId="203">
     <w:abstractNumId w:val="78"/>
   </w:num>
-  <w:num w:numId="193">
+  <w:num w:numId="205">
     <w:abstractNumId w:val="72"/>
   </w:num>
-  <w:num w:numId="195">
+  <w:num w:numId="207">
     <w:abstractNumId w:val="66"/>
   </w:num>
-  <w:num w:numId="197">
+  <w:num w:numId="209">
     <w:abstractNumId w:val="60"/>
   </w:num>
-  <w:num w:numId="199">
+  <w:num w:numId="211">
     <w:abstractNumId w:val="54"/>
   </w:num>
-  <w:num w:numId="201">
+  <w:num w:numId="214">
     <w:abstractNumId w:val="48"/>
   </w:num>
-  <w:num w:numId="203">
+  <w:num w:numId="216">
     <w:abstractNumId w:val="42"/>
   </w:num>
-  <w:num w:numId="205">
+  <w:num w:numId="218">
     <w:abstractNumId w:val="36"/>
   </w:num>
-  <w:num w:numId="207">
+  <w:num w:numId="220">
     <w:abstractNumId w:val="30"/>
   </w:num>
-  <w:num w:numId="209">
+  <w:num w:numId="222">
     <w:abstractNumId w:val="24"/>
   </w:num>
-  <w:num w:numId="211">
+  <w:num w:numId="224">
     <w:abstractNumId w:val="18"/>
   </w:num>
-  <w:num w:numId="214">
+  <w:num w:numId="226">
     <w:abstractNumId w:val="12"/>
   </w:num>
-  <w:num w:numId="216">
+  <w:num w:numId="228">
     <w:abstractNumId w:val="6"/>
   </w:num>
-  <w:num w:numId="218">
+  <w:num w:numId="230">
     <w:abstractNumId w:val="0"/>
   </w:num>
 </w:numbering>

</xml_diff>

<commit_message>
AntiForgery Token in ASP.NET Core MVC  ( Pending ) & Repository Pattern ( Pending )
</commit_message>
<xml_diff>
--- a/Asp.Net Core Notes.docx
+++ b/Asp.Net Core Notes.docx
@@ -15062,13 +15062,169 @@
       <w:r>
         <w:rPr>
           <w:rFonts w:ascii="Cascadia Code" w:hAnsi="Cascadia Code" w:cs="Cascadia Code" w:eastAsia="Cascadia Code"/>
-          <w:color w:val="auto"/>
-          <w:spacing w:val="0"/>
-          <w:position w:val="0"/>
-          <w:sz w:val="20"/>
-          <w:shd w:fill="auto" w:val="clear"/>
-        </w:rPr>
-        <w:t xml:space="preserve">Async Filter :- IAsyncActionFilter</w:t>
+          <w:b/>
+          <w:color w:val="auto"/>
+          <w:spacing w:val="0"/>
+          <w:position w:val="0"/>
+          <w:sz w:val="20"/>
+          <w:shd w:fill="auto" w:val="clear"/>
+        </w:rPr>
+        <w:t xml:space="preserve">Async Filter</w:t>
+      </w:r>
+      <w:r>
+        <w:rPr>
+          <w:rFonts w:ascii="Cascadia Code" w:hAnsi="Cascadia Code" w:cs="Cascadia Code" w:eastAsia="Cascadia Code"/>
+          <w:color w:val="auto"/>
+          <w:spacing w:val="0"/>
+          <w:position w:val="0"/>
+          <w:sz w:val="20"/>
+          <w:shd w:fill="auto" w:val="clear"/>
+        </w:rPr>
+        <w:t xml:space="preserve"> :- IAsyncActionFilter</w:t>
+      </w:r>
+    </w:p>
+    <w:p>
+      <w:pPr>
+        <w:spacing w:before="0" w:after="60" w:line="240"/>
+        <w:ind w:right="0" w:left="0" w:firstLine="0"/>
+        <w:jc w:val="left"/>
+        <w:rPr>
+          <w:rFonts w:ascii="Cascadia Code" w:hAnsi="Cascadia Code" w:cs="Cascadia Code" w:eastAsia="Cascadia Code"/>
+          <w:color w:val="auto"/>
+          <w:spacing w:val="0"/>
+          <w:position w:val="0"/>
+          <w:sz w:val="20"/>
+          <w:shd w:fill="auto" w:val="clear"/>
+        </w:rPr>
+      </w:pPr>
+    </w:p>
+    <w:p>
+      <w:pPr>
+        <w:spacing w:before="0" w:after="60" w:line="240"/>
+        <w:ind w:right="0" w:left="0" w:firstLine="0"/>
+        <w:jc w:val="left"/>
+        <w:rPr>
+          <w:rFonts w:ascii="Cascadia Code" w:hAnsi="Cascadia Code" w:cs="Cascadia Code" w:eastAsia="Cascadia Code"/>
+          <w:color w:val="auto"/>
+          <w:spacing w:val="0"/>
+          <w:position w:val="0"/>
+          <w:sz w:val="20"/>
+          <w:shd w:fill="auto" w:val="clear"/>
+        </w:rPr>
+      </w:pPr>
+      <w:r>
+        <w:rPr>
+          <w:rFonts w:ascii="Cascadia Code" w:hAnsi="Cascadia Code" w:cs="Cascadia Code" w:eastAsia="Cascadia Code"/>
+          <w:color w:val="auto"/>
+          <w:spacing w:val="0"/>
+          <w:position w:val="0"/>
+          <w:sz w:val="20"/>
+          <w:shd w:fill="auto" w:val="clear"/>
+        </w:rPr>
+        <w:t xml:space="preserve">TypeFilter :- did not required to registered in program.cs , it automatically creates instance but in service filter it requires</w:t>
+      </w:r>
+    </w:p>
+    <w:p>
+      <w:pPr>
+        <w:spacing w:before="0" w:after="60" w:line="240"/>
+        <w:ind w:right="0" w:left="0" w:firstLine="0"/>
+        <w:jc w:val="left"/>
+        <w:rPr>
+          <w:rFonts w:ascii="Cascadia Code" w:hAnsi="Cascadia Code" w:cs="Cascadia Code" w:eastAsia="Cascadia Code"/>
+          <w:color w:val="auto"/>
+          <w:spacing w:val="0"/>
+          <w:position w:val="0"/>
+          <w:sz w:val="20"/>
+          <w:shd w:fill="auto" w:val="clear"/>
+        </w:rPr>
+      </w:pPr>
+    </w:p>
+    <w:p>
+      <w:pPr>
+        <w:spacing w:before="0" w:after="60" w:line="240"/>
+        <w:ind w:right="0" w:left="0" w:firstLine="0"/>
+        <w:jc w:val="left"/>
+        <w:rPr>
+          <w:rFonts w:ascii="Cascadia Code" w:hAnsi="Cascadia Code" w:cs="Cascadia Code" w:eastAsia="Cascadia Code"/>
+          <w:b/>
+          <w:color w:val="auto"/>
+          <w:spacing w:val="0"/>
+          <w:position w:val="0"/>
+          <w:sz w:val="20"/>
+          <w:shd w:fill="auto" w:val="clear"/>
+        </w:rPr>
+      </w:pPr>
+      <w:r>
+        <w:rPr>
+          <w:rFonts w:ascii="Cascadia Code" w:hAnsi="Cascadia Code" w:cs="Cascadia Code" w:eastAsia="Cascadia Code"/>
+          <w:b/>
+          <w:color w:val="auto"/>
+          <w:spacing w:val="0"/>
+          <w:position w:val="0"/>
+          <w:sz w:val="20"/>
+          <w:shd w:fill="auto" w:val="clear"/>
+        </w:rPr>
+        <w:t xml:space="preserve">Lecture :- ( AntiForgery Token in ASP.NET Core MVC )</w:t>
+      </w:r>
+    </w:p>
+    <w:p>
+      <w:pPr>
+        <w:numPr>
+          <w:ilvl w:val="0"/>
+          <w:numId w:val="232"/>
+        </w:numPr>
+        <w:spacing w:before="0" w:after="60" w:line="240"/>
+        <w:ind w:right="0" w:left="720" w:hanging="360"/>
+        <w:jc w:val="left"/>
+        <w:rPr>
+          <w:rFonts w:ascii="Cascadia Code" w:hAnsi="Cascadia Code" w:cs="Cascadia Code" w:eastAsia="Cascadia Code"/>
+          <w:color w:val="auto"/>
+          <w:spacing w:val="0"/>
+          <w:position w:val="0"/>
+          <w:sz w:val="20"/>
+          <w:shd w:fill="auto" w:val="clear"/>
+        </w:rPr>
+      </w:pPr>
+      <w:r>
+        <w:rPr>
+          <w:rFonts w:ascii="Cascadia Code" w:hAnsi="Cascadia Code" w:cs="Cascadia Code" w:eastAsia="Cascadia Code"/>
+          <w:color w:val="auto"/>
+          <w:spacing w:val="0"/>
+          <w:position w:val="0"/>
+          <w:sz w:val="20"/>
+          <w:shd w:fill="auto" w:val="clear"/>
+        </w:rPr>
+        <w:t xml:space="preserve">Its a security mechanism used to protect web application from csrf ( cross site request forgery ) attacks</w:t>
+      </w:r>
+    </w:p>
+    <w:p>
+      <w:pPr>
+        <w:numPr>
+          <w:ilvl w:val="0"/>
+          <w:numId w:val="232"/>
+        </w:numPr>
+        <w:spacing w:before="0" w:after="60" w:line="240"/>
+        <w:ind w:right="0" w:left="720" w:hanging="360"/>
+        <w:jc w:val="left"/>
+        <w:rPr>
+          <w:rFonts w:ascii="Cascadia Code" w:hAnsi="Cascadia Code" w:cs="Cascadia Code" w:eastAsia="Cascadia Code"/>
+          <w:color w:val="auto"/>
+          <w:spacing w:val="0"/>
+          <w:position w:val="0"/>
+          <w:sz w:val="20"/>
+          <w:shd w:fill="auto" w:val="clear"/>
+        </w:rPr>
+      </w:pPr>
+      <w:r>
+        <w:rPr>
+          <w:rFonts w:ascii="Cascadia Code" w:hAnsi="Cascadia Code" w:cs="Cascadia Code" w:eastAsia="Cascadia Code"/>
+          <w:color w:val="auto"/>
+          <w:spacing w:val="0"/>
+          <w:position w:val="0"/>
+          <w:sz w:val="20"/>
+          <w:shd w:fill="auto" w:val="clear"/>
+        </w:rPr>
+        <w:t xml:space="preserve">It verifies that request is originated from your application only</w:t>
       </w:r>
     </w:p>
     <w:p>
@@ -16500,209 +16656,216 @@
       <w:lvlText w:val="•"/>
     </w:lvl>
   </w:abstractNum>
+  <w:abstractNum w:abstractNumId="546">
+    <w:lvl w:ilvl="0">
+      <w:start w:val="1"/>
+      <w:numFmt w:val="bullet"/>
+      <w:lvlText w:val="•"/>
+    </w:lvl>
+  </w:abstractNum>
   <w:num w:numId="2">
+    <w:abstractNumId w:val="546"/>
+  </w:num>
+  <w:num w:numId="5">
     <w:abstractNumId w:val="540"/>
   </w:num>
-  <w:num w:numId="5">
+  <w:num w:numId="8">
     <w:abstractNumId w:val="534"/>
   </w:num>
-  <w:num w:numId="8">
+  <w:num w:numId="10">
     <w:abstractNumId w:val="528"/>
   </w:num>
-  <w:num w:numId="10">
+  <w:num w:numId="13">
     <w:abstractNumId w:val="522"/>
   </w:num>
-  <w:num w:numId="13">
+  <w:num w:numId="19">
     <w:abstractNumId w:val="516"/>
   </w:num>
-  <w:num w:numId="19">
+  <w:num w:numId="22">
     <w:abstractNumId w:val="510"/>
   </w:num>
-  <w:num w:numId="22">
+  <w:num w:numId="25">
     <w:abstractNumId w:val="504"/>
   </w:num>
-  <w:num w:numId="25">
+  <w:num w:numId="30">
     <w:abstractNumId w:val="498"/>
   </w:num>
-  <w:num w:numId="30">
+  <w:num w:numId="33">
     <w:abstractNumId w:val="492"/>
   </w:num>
-  <w:num w:numId="33">
+  <w:num w:numId="36">
     <w:abstractNumId w:val="486"/>
   </w:num>
-  <w:num w:numId="36">
+  <w:num w:numId="39">
     <w:abstractNumId w:val="480"/>
   </w:num>
-  <w:num w:numId="39">
+  <w:num w:numId="42">
     <w:abstractNumId w:val="474"/>
   </w:num>
-  <w:num w:numId="42">
+  <w:num w:numId="46">
     <w:abstractNumId w:val="468"/>
   </w:num>
-  <w:num w:numId="46">
+  <w:num w:numId="49">
     <w:abstractNumId w:val="462"/>
   </w:num>
-  <w:num w:numId="49">
+  <w:num w:numId="52">
     <w:abstractNumId w:val="456"/>
   </w:num>
-  <w:num w:numId="52">
+  <w:num w:numId="55">
     <w:abstractNumId w:val="450"/>
   </w:num>
-  <w:num w:numId="55">
+  <w:num w:numId="57">
     <w:abstractNumId w:val="444"/>
   </w:num>
-  <w:num w:numId="57">
+  <w:num w:numId="59">
     <w:abstractNumId w:val="438"/>
   </w:num>
-  <w:num w:numId="59">
+  <w:num w:numId="62">
     <w:abstractNumId w:val="432"/>
   </w:num>
-  <w:num w:numId="62">
+  <w:num w:numId="65">
     <w:abstractNumId w:val="426"/>
   </w:num>
-  <w:num w:numId="65">
+  <w:num w:numId="68">
     <w:abstractNumId w:val="420"/>
   </w:num>
-  <w:num w:numId="68">
+  <w:num w:numId="71">
     <w:abstractNumId w:val="414"/>
   </w:num>
-  <w:num w:numId="71">
+  <w:num w:numId="74">
     <w:abstractNumId w:val="408"/>
   </w:num>
-  <w:num w:numId="74">
+  <w:num w:numId="77">
     <w:abstractNumId w:val="402"/>
   </w:num>
-  <w:num w:numId="77">
+  <w:num w:numId="80">
     <w:abstractNumId w:val="396"/>
   </w:num>
-  <w:num w:numId="80">
+  <w:num w:numId="83">
     <w:abstractNumId w:val="390"/>
   </w:num>
-  <w:num w:numId="83">
+  <w:num w:numId="86">
     <w:abstractNumId w:val="384"/>
   </w:num>
-  <w:num w:numId="86">
+  <w:num w:numId="88">
     <w:abstractNumId w:val="378"/>
   </w:num>
-  <w:num w:numId="88">
+  <w:num w:numId="91">
     <w:abstractNumId w:val="372"/>
   </w:num>
-  <w:num w:numId="91">
+  <w:num w:numId="94">
     <w:abstractNumId w:val="366"/>
   </w:num>
-  <w:num w:numId="94">
+  <w:num w:numId="97">
     <w:abstractNumId w:val="360"/>
   </w:num>
-  <w:num w:numId="97">
+  <w:num w:numId="99">
     <w:abstractNumId w:val="354"/>
   </w:num>
-  <w:num w:numId="99">
+  <w:num w:numId="101">
     <w:abstractNumId w:val="348"/>
   </w:num>
-  <w:num w:numId="101">
+  <w:num w:numId="103">
     <w:abstractNumId w:val="342"/>
   </w:num>
-  <w:num w:numId="103">
+  <w:num w:numId="106">
     <w:abstractNumId w:val="336"/>
   </w:num>
-  <w:num w:numId="106">
+  <w:num w:numId="108">
     <w:abstractNumId w:val="330"/>
   </w:num>
-  <w:num w:numId="108">
+  <w:num w:numId="110">
     <w:abstractNumId w:val="324"/>
   </w:num>
-  <w:num w:numId="110">
+  <w:num w:numId="112">
     <w:abstractNumId w:val="318"/>
   </w:num>
-  <w:num w:numId="112">
+  <w:num w:numId="115">
     <w:abstractNumId w:val="312"/>
   </w:num>
-  <w:num w:numId="115">
+  <w:num w:numId="118">
     <w:abstractNumId w:val="306"/>
   </w:num>
-  <w:num w:numId="118">
+  <w:num w:numId="121">
     <w:abstractNumId w:val="300"/>
   </w:num>
-  <w:num w:numId="121">
+  <w:num w:numId="124">
     <w:abstractNumId w:val="294"/>
   </w:num>
-  <w:num w:numId="124">
+  <w:num w:numId="127">
     <w:abstractNumId w:val="288"/>
   </w:num>
-  <w:num w:numId="127">
+  <w:num w:numId="130">
     <w:abstractNumId w:val="282"/>
   </w:num>
-  <w:num w:numId="130">
+  <w:num w:numId="133">
     <w:abstractNumId w:val="276"/>
   </w:num>
-  <w:num w:numId="133">
+  <w:num w:numId="136">
     <w:abstractNumId w:val="270"/>
   </w:num>
-  <w:num w:numId="136">
+  <w:num w:numId="138">
     <w:abstractNumId w:val="264"/>
   </w:num>
-  <w:num w:numId="138">
+  <w:num w:numId="140">
     <w:abstractNumId w:val="258"/>
   </w:num>
-  <w:num w:numId="140">
+  <w:num w:numId="142">
     <w:abstractNumId w:val="252"/>
   </w:num>
-  <w:num w:numId="142">
+  <w:num w:numId="144">
     <w:abstractNumId w:val="246"/>
   </w:num>
-  <w:num w:numId="144">
+  <w:num w:numId="146">
     <w:abstractNumId w:val="240"/>
   </w:num>
-  <w:num w:numId="146">
+  <w:num w:numId="148">
     <w:abstractNumId w:val="234"/>
-  </w:num>
-  <w:num w:numId="148">
-    <w:abstractNumId w:val="228"/>
   </w:num>
   <w:num w:numId="149">
     <w:abstractNumId w:val="13"/>
   </w:num>
   <w:num w:numId="151">
+    <w:abstractNumId w:val="228"/>
+  </w:num>
+  <w:num w:numId="153">
     <w:abstractNumId w:val="222"/>
   </w:num>
-  <w:num w:numId="153">
+  <w:num w:numId="155">
     <w:abstractNumId w:val="216"/>
   </w:num>
-  <w:num w:numId="155">
+  <w:num w:numId="157">
     <w:abstractNumId w:val="210"/>
   </w:num>
-  <w:num w:numId="157">
+  <w:num w:numId="159">
     <w:abstractNumId w:val="204"/>
   </w:num>
-  <w:num w:numId="159">
+  <w:num w:numId="161">
     <w:abstractNumId w:val="198"/>
   </w:num>
-  <w:num w:numId="161">
+  <w:num w:numId="163">
     <w:abstractNumId w:val="192"/>
   </w:num>
-  <w:num w:numId="163">
+  <w:num w:numId="165">
     <w:abstractNumId w:val="186"/>
   </w:num>
-  <w:num w:numId="165">
+  <w:num w:numId="167">
     <w:abstractNumId w:val="180"/>
   </w:num>
-  <w:num w:numId="167">
+  <w:num w:numId="169">
     <w:abstractNumId w:val="174"/>
   </w:num>
-  <w:num w:numId="169">
+  <w:num w:numId="171">
     <w:abstractNumId w:val="168"/>
   </w:num>
-  <w:num w:numId="171">
+  <w:num w:numId="173">
     <w:abstractNumId w:val="162"/>
   </w:num>
-  <w:num w:numId="173">
+  <w:num w:numId="175">
     <w:abstractNumId w:val="156"/>
   </w:num>
-  <w:num w:numId="175">
+  <w:num w:numId="177">
     <w:abstractNumId w:val="150"/>
-  </w:num>
-  <w:num w:numId="177">
-    <w:abstractNumId w:val="144"/>
   </w:num>
   <w:num w:numId="179">
     <w:abstractNumId w:val="7"/>
@@ -16711,75 +16874,78 @@
     <w:abstractNumId w:val="1"/>
   </w:num>
   <w:num w:numId="183">
+    <w:abstractNumId w:val="144"/>
+  </w:num>
+  <w:num w:numId="185">
     <w:abstractNumId w:val="138"/>
   </w:num>
-  <w:num w:numId="185">
+  <w:num w:numId="187">
     <w:abstractNumId w:val="132"/>
   </w:num>
-  <w:num w:numId="187">
+  <w:num w:numId="189">
     <w:abstractNumId w:val="126"/>
   </w:num>
-  <w:num w:numId="189">
+  <w:num w:numId="191">
     <w:abstractNumId w:val="120"/>
   </w:num>
-  <w:num w:numId="191">
+  <w:num w:numId="193">
     <w:abstractNumId w:val="114"/>
   </w:num>
-  <w:num w:numId="193">
+  <w:num w:numId="195">
     <w:abstractNumId w:val="108"/>
   </w:num>
-  <w:num w:numId="195">
+  <w:num w:numId="197">
     <w:abstractNumId w:val="102"/>
   </w:num>
-  <w:num w:numId="197">
+  <w:num w:numId="199">
     <w:abstractNumId w:val="96"/>
   </w:num>
-  <w:num w:numId="199">
+  <w:num w:numId="201">
     <w:abstractNumId w:val="90"/>
   </w:num>
-  <w:num w:numId="201">
+  <w:num w:numId="203">
     <w:abstractNumId w:val="84"/>
   </w:num>
-  <w:num w:numId="203">
+  <w:num w:numId="205">
     <w:abstractNumId w:val="78"/>
   </w:num>
-  <w:num w:numId="205">
+  <w:num w:numId="207">
     <w:abstractNumId w:val="72"/>
   </w:num>
-  <w:num w:numId="207">
+  <w:num w:numId="209">
     <w:abstractNumId w:val="66"/>
   </w:num>
-  <w:num w:numId="209">
+  <w:num w:numId="211">
     <w:abstractNumId w:val="60"/>
   </w:num>
-  <w:num w:numId="211">
+  <w:num w:numId="214">
     <w:abstractNumId w:val="54"/>
   </w:num>
-  <w:num w:numId="214">
+  <w:num w:numId="216">
     <w:abstractNumId w:val="48"/>
   </w:num>
-  <w:num w:numId="216">
+  <w:num w:numId="218">
     <w:abstractNumId w:val="42"/>
   </w:num>
-  <w:num w:numId="218">
+  <w:num w:numId="220">
     <w:abstractNumId w:val="36"/>
   </w:num>
-  <w:num w:numId="220">
+  <w:num w:numId="222">
     <w:abstractNumId w:val="30"/>
   </w:num>
-  <w:num w:numId="222">
+  <w:num w:numId="224">
     <w:abstractNumId w:val="24"/>
   </w:num>
-  <w:num w:numId="224">
+  <w:num w:numId="226">
     <w:abstractNumId w:val="18"/>
   </w:num>
-  <w:num w:numId="226">
+  <w:num w:numId="228">
     <w:abstractNumId w:val="12"/>
   </w:num>
-  <w:num w:numId="228">
+  <w:num w:numId="230">
     <w:abstractNumId w:val="6"/>
   </w:num>
-  <w:num w:numId="230">
+  <w:num w:numId="232">
     <w:abstractNumId w:val="0"/>
   </w:num>
 </w:numbering>

</xml_diff>